<commit_message>
Make final reports self-contained
</commit_message>
<xml_diff>
--- a/air_drum_pad/docs/FINAL_REPORT_AI_AIR_DRUM_PAD.docx
+++ b/air_drum_pad/docs/FINAL_REPORT_AI_AIR_DRUM_PAD.docx
@@ -1939,7 +1939,444 @@
         <w:pStyle w:val="Normal"/>
       </w:pPr>
       <w:r>
-        <w:t xml:space="preserve">Prototype backend latency values are summarized from docs/EXPERIMENTS.md. Figure 7 visualizes the approximate end-to-end vision latency for each backend.</w:t>
+        <w:t xml:space="preserve">The backend evaluation was designed to separate three questions that are often conflated in a real-time vision instrument:</w:t>
+      </w:r>
+    </w:p>
+    <w:p>
+      <w:pPr>
+        <w:pStyle w:val="ListParagraph"/>
+      </w:pPr>
+      <w:r>
+        <w:t xml:space="preserve">1. How fast is a simple CPU-only hand-tracking baseline?</w:t>
+      </w:r>
+    </w:p>
+    <w:p>
+      <w:pPr>
+        <w:pStyle w:val="ListParagraph"/>
+      </w:pPr>
+      <w:r>
+        <w:t xml:space="preserve">2. How much of the latency comes from palm detection versus hand landmark inference?</w:t>
+      </w:r>
+    </w:p>
+    <w:p>
+      <w:pPr>
+        <w:pStyle w:val="ListParagraph"/>
+      </w:pPr>
+      <w:r>
+        <w:t xml:space="preserve">3. Does the NPU accelerate the part of the pipeline that is actually deployed on the NPU, and what accuracy risks are introduced by faster approximations?</w:t>
+      </w:r>
+    </w:p>
+    <w:p>
+      <w:pPr>
+        <w:pStyle w:val="Normal"/>
+      </w:pPr>
+      <w:r>
+        <w:t xml:space="preserve">For that reason, four runtime configurations were evaluated rather than a single prototype.</w:t>
+      </w:r>
+    </w:p>
+    <w:tbl>
+      <w:tblPr>
+        <w:tblStyle w:val="TableGrid"/>
+        <w:tblW w:w="0" w:type="auto"/>
+        <w:tblBorders>
+          <w:top w:val="single" w:sz="4" w:space="0" w:color="CBD5E1"/>
+          <w:left w:val="single" w:sz="4" w:space="0" w:color="CBD5E1"/>
+          <w:bottom w:val="single" w:sz="4" w:space="0" w:color="CBD5E1"/>
+          <w:right w:val="single" w:sz="4" w:space="0" w:color="CBD5E1"/>
+          <w:insideH w:val="single" w:sz="4" w:space="0" w:color="CBD5E1"/>
+          <w:insideV w:val="single" w:sz="4" w:space="0" w:color="CBD5E1"/>
+        </w:tblBorders>
+      </w:tblPr>
+      <w:tr>
+        <w:tc>
+          <w:tcPr>
+            <w:shd w:fill="E2E8F0"/>
+          </w:tcPr>
+          <w:p>
+            <w:pPr>
+              <w:pStyle w:val="Normal"/>
+            </w:pPr>
+            <w:r>
+              <w:t xml:space="preserve">Configuration</w:t>
+            </w:r>
+          </w:p>
+        </w:tc>
+        <w:tc>
+          <w:tcPr>
+            <w:shd w:fill="E2E8F0"/>
+          </w:tcPr>
+          <w:p>
+            <w:pPr>
+              <w:pStyle w:val="Normal"/>
+            </w:pPr>
+            <w:r>
+              <w:t xml:space="preserve">What it evaluates</w:t>
+            </w:r>
+          </w:p>
+        </w:tc>
+        <w:tc>
+          <w:tcPr>
+            <w:shd w:fill="E2E8F0"/>
+          </w:tcPr>
+          <w:p>
+            <w:pPr>
+              <w:pStyle w:val="Normal"/>
+            </w:pPr>
+            <w:r>
+              <w:t xml:space="preserve">Why this baseline is required</w:t>
+            </w:r>
+          </w:p>
+        </w:tc>
+      </w:tr>
+      <w:tr>
+        <w:tc>
+          <w:tcPr/>
+          <w:p>
+            <w:pPr>
+              <w:pStyle w:val="Normal"/>
+            </w:pPr>
+            <w:r>
+              <w:t xml:space="preserve">cpu / MediaPipe</w:t>
+            </w:r>
+          </w:p>
+        </w:tc>
+        <w:tc>
+          <w:tcPr/>
+          <w:p>
+            <w:pPr>
+              <w:pStyle w:val="Normal"/>
+            </w:pPr>
+            <w:r>
+              <w:t xml:space="preserve">End-to-end CPU reference using MediaPipe's built-in palm and hand stack</w:t>
+            </w:r>
+          </w:p>
+        </w:tc>
+        <w:tc>
+          <w:tcPr/>
+          <w:p>
+            <w:pPr>
+              <w:pStyle w:val="Normal"/>
+            </w:pPr>
+            <w:r>
+              <w:t xml:space="preserve">Establishes the simplest robust baseline and verifies that the musical logic works without model-conversion dependencies</w:t>
+            </w:r>
+          </w:p>
+        </w:tc>
+      </w:tr>
+      <w:tr>
+        <w:tc>
+          <w:tcPr/>
+          <w:p>
+            <w:pPr>
+              <w:pStyle w:val="Normal"/>
+            </w:pPr>
+            <w:r>
+              <w:t xml:space="preserve">cpu-baseline</w:t>
+            </w:r>
+          </w:p>
+        </w:tc>
+        <w:tc>
+          <w:tcPr/>
+          <w:p>
+            <w:pPr>
+              <w:pStyle w:val="Normal"/>
+            </w:pPr>
+            <w:r>
+              <w:t xml:space="preserve">Palm TFLite + hand landmark TFLite, both on CPU</w:t>
+            </w:r>
+          </w:p>
+        </w:tc>
+        <w:tc>
+          <w:tcPr/>
+          <w:p>
+            <w:pPr>
+              <w:pStyle w:val="Normal"/>
+            </w:pPr>
+            <w:r>
+              <w:t xml:space="preserve">Uses the same two-stage palm→ROI→hand structure as npu-full, so it isolates whether replacing only hand inference with NPU is beneficial</w:t>
+            </w:r>
+          </w:p>
+        </w:tc>
+      </w:tr>
+      <w:tr>
+        <w:tc>
+          <w:tcPr/>
+          <w:p>
+            <w:pPr>
+              <w:pStyle w:val="Normal"/>
+            </w:pPr>
+            <w:r>
+              <w:t xml:space="preserve">npu-full</w:t>
+            </w:r>
+          </w:p>
+        </w:tc>
+        <w:tc>
+          <w:tcPr/>
+          <w:p>
+            <w:pPr>
+              <w:pStyle w:val="Normal"/>
+            </w:pPr>
+            <w:r>
+              <w:t xml:space="preserve">Palm TFLite on CPU + hand landmark .dxnn on NPU</w:t>
+            </w:r>
+          </w:p>
+        </w:tc>
+        <w:tc>
+          <w:tcPr/>
+          <w:p>
+            <w:pPr>
+              <w:pStyle w:val="Normal"/>
+            </w:pPr>
+            <w:r>
+              <w:t xml:space="preserve">Tests the intended accurate hybrid edge-AI pipeline while preserving reliable float32 palm detection</w:t>
+            </w:r>
+          </w:p>
+        </w:tc>
+      </w:tr>
+      <w:tr>
+        <w:tc>
+          <w:tcPr/>
+          <w:p>
+            <w:pPr>
+              <w:pStyle w:val="Normal"/>
+            </w:pPr>
+            <w:r>
+              <w:t xml:space="preserve">npu dual-halves</w:t>
+            </w:r>
+          </w:p>
+        </w:tc>
+        <w:tc>
+          <w:tcPr/>
+          <w:p>
+            <w:pPr>
+              <w:pStyle w:val="Normal"/>
+            </w:pPr>
+            <w:r>
+              <w:t xml:space="preserve">No palm detector; screen split into two approximate hand regions; hand landmark .dxnn on NPU</w:t>
+            </w:r>
+          </w:p>
+        </w:tc>
+        <w:tc>
+          <w:tcPr/>
+          <w:p>
+            <w:pPr>
+              <w:pStyle w:val="Normal"/>
+            </w:pPr>
+            <w:r>
+              <w:t xml:space="preserve">Estimates the low-latency lower bound when palm detection is removed, useful for live demos but less robust to hand placement</w:t>
+            </w:r>
+          </w:p>
+        </w:tc>
+      </w:tr>
+    </w:tbl>
+    <w:p>
+      <w:pPr>
+        <w:pStyle w:val="Normal"/>
+      </w:pPr>
+      <w:r>
+        <w:t xml:space="preserve">The main evaluation metric in this report is vision-loop latency: time spent in camera-frame processing, palm/hand inference, ROI handling, and landmark production before the audio trigger logic. This is not a full acoustic end-to-end latency measurement. The target interactive frame budget is 16.7 ms for 60 FPS, while the final acoustic measurement should separately report motion-to-sound latency.</w:t>
+      </w:r>
+    </w:p>
+    <w:p>
+      <w:pPr>
+        <w:pStyle w:val="Normal"/>
+      </w:pPr>
+      <w:r>
+        <w:t xml:space="preserve">The hardware/software environment for the recorded prototype measurements was:</w:t>
+      </w:r>
+    </w:p>
+    <w:tbl>
+      <w:tblPr>
+        <w:tblStyle w:val="TableGrid"/>
+        <w:tblW w:w="0" w:type="auto"/>
+        <w:tblBorders>
+          <w:top w:val="single" w:sz="4" w:space="0" w:color="CBD5E1"/>
+          <w:left w:val="single" w:sz="4" w:space="0" w:color="CBD5E1"/>
+          <w:bottom w:val="single" w:sz="4" w:space="0" w:color="CBD5E1"/>
+          <w:right w:val="single" w:sz="4" w:space="0" w:color="CBD5E1"/>
+          <w:insideH w:val="single" w:sz="4" w:space="0" w:color="CBD5E1"/>
+          <w:insideV w:val="single" w:sz="4" w:space="0" w:color="CBD5E1"/>
+        </w:tblBorders>
+      </w:tblPr>
+      <w:tr>
+        <w:tc>
+          <w:tcPr>
+            <w:shd w:fill="E2E8F0"/>
+          </w:tcPr>
+          <w:p>
+            <w:pPr>
+              <w:pStyle w:val="Normal"/>
+            </w:pPr>
+            <w:r>
+              <w:t xml:space="preserve">Item</w:t>
+            </w:r>
+          </w:p>
+        </w:tc>
+        <w:tc>
+          <w:tcPr>
+            <w:shd w:fill="E2E8F0"/>
+          </w:tcPr>
+          <w:p>
+            <w:pPr>
+              <w:pStyle w:val="Normal"/>
+            </w:pPr>
+            <w:r>
+              <w:t xml:space="preserve">Value</w:t>
+            </w:r>
+          </w:p>
+        </w:tc>
+      </w:tr>
+      <w:tr>
+        <w:tc>
+          <w:tcPr/>
+          <w:p>
+            <w:pPr>
+              <w:pStyle w:val="Normal"/>
+            </w:pPr>
+            <w:r>
+              <w:t xml:space="preserve">Board</w:t>
+            </w:r>
+          </w:p>
+        </w:tc>
+        <w:tc>
+          <w:tcPr/>
+          <w:p>
+            <w:pPr>
+              <w:pStyle w:val="Normal"/>
+            </w:pPr>
+            <w:r>
+              <w:t xml:space="preserve">Orange Pi 5 Plus (RK3588, aarch64)</w:t>
+            </w:r>
+          </w:p>
+        </w:tc>
+      </w:tr>
+      <w:tr>
+        <w:tc>
+          <w:tcPr/>
+          <w:p>
+            <w:pPr>
+              <w:pStyle w:val="Normal"/>
+            </w:pPr>
+            <w:r>
+              <w:t xml:space="preserve">OS / Python</w:t>
+            </w:r>
+          </w:p>
+        </w:tc>
+        <w:tc>
+          <w:tcPr/>
+          <w:p>
+            <w:pPr>
+              <w:pStyle w:val="Normal"/>
+            </w:pPr>
+            <w:r>
+              <w:t xml:space="preserve">Linux, Python 3.10.12</w:t>
+            </w:r>
+          </w:p>
+        </w:tc>
+      </w:tr>
+      <w:tr>
+        <w:tc>
+          <w:tcPr/>
+          <w:p>
+            <w:pPr>
+              <w:pStyle w:val="Normal"/>
+            </w:pPr>
+            <w:r>
+              <w:t xml:space="preserve">DX-RT / dx_engine</w:t>
+            </w:r>
+          </w:p>
+        </w:tc>
+        <w:tc>
+          <w:tcPr/>
+          <w:p>
+            <w:pPr>
+              <w:pStyle w:val="Normal"/>
+            </w:pPr>
+            <w:r>
+              <w:t xml:space="preserve">1.1.4</w:t>
+            </w:r>
+          </w:p>
+        </w:tc>
+      </w:tr>
+      <w:tr>
+        <w:tc>
+          <w:tcPr/>
+          <w:p>
+            <w:pPr>
+              <w:pStyle w:val="Normal"/>
+            </w:pPr>
+            <w:r>
+              <w:t xml:space="preserve">DX-COM</w:t>
+            </w:r>
+          </w:p>
+        </w:tc>
+        <w:tc>
+          <w:tcPr/>
+          <w:p>
+            <w:pPr>
+              <w:pStyle w:val="Normal"/>
+            </w:pPr>
+            <w:r>
+              <w:t xml:space="preserve">v2.1.0-rc.4 on external compile server</w:t>
+            </w:r>
+          </w:p>
+        </w:tc>
+      </w:tr>
+      <w:tr>
+        <w:tc>
+          <w:tcPr/>
+          <w:p>
+            <w:pPr>
+              <w:pStyle w:val="Normal"/>
+            </w:pPr>
+            <w:r>
+              <w:t xml:space="preserve">Camera</w:t>
+            </w:r>
+          </w:p>
+        </w:tc>
+        <w:tc>
+          <w:tcPr/>
+          <w:p>
+            <w:pPr>
+              <w:pStyle w:val="Normal"/>
+            </w:pPr>
+            <w:r>
+              <w:t xml:space="preserve">USB camera, 640×480</w:t>
+            </w:r>
+          </w:p>
+        </w:tc>
+      </w:tr>
+      <w:tr>
+        <w:tc>
+          <w:tcPr/>
+          <w:p>
+            <w:pPr>
+              <w:pStyle w:val="Normal"/>
+            </w:pPr>
+            <w:r>
+              <w:t xml:space="preserve">Offline dataset</w:t>
+            </w:r>
+          </w:p>
+        </w:tc>
+        <w:tc>
+          <w:tcPr/>
+          <w:p>
+            <w:pPr>
+              <w:pStyle w:val="Normal"/>
+            </w:pPr>
+            <w:r>
+              <w:t xml:space="preserve">90 captured frames in dataset/frame_*.png</w:t>
+            </w:r>
+          </w:p>
+        </w:tc>
+      </w:tr>
+    </w:tbl>
+    <w:p>
+      <w:pPr>
+        <w:pStyle w:val="Normal"/>
+      </w:pPr>
+      <w:r>
+        <w:t xml:space="preserve">The palm detector was also tested as an NPU .dxnn candidate. Although the NPU palm model was fast at roughly 12 ms, INT8 quantization damaged the score head: ONNX-to-NPU score correlation was approximately -0.11, making real hand detection unreliable. Therefore, all accurate palm-based configurations use CPU TFLite palm detection, and palm detection remains the main latency bottleneck.</w:t>
       </w:r>
     </w:p>
     <w:p>
@@ -1949,7 +2386,7 @@
       <w:r>
         <w:drawing>
           <wp:inline distT="0" distB="0" distL="0" distR="0">
-            <wp:extent cx="5669280" cy="3353511"/>
+            <wp:extent cx="5669280" cy="2508969"/>
             <wp:docPr id="7" name="backend_latency.png"/>
             <wp:cNvGraphicFramePr>
               <a:graphicFrameLocks noChangeAspect="1"/>
@@ -1970,7 +2407,7 @@
                   <pic:spPr>
                     <a:xfrm>
                       <a:off x="0" y="0"/>
-                      <a:ext cx="5669280" cy="3353511"/>
+                      <a:ext cx="5669280" cy="2508969"/>
                     </a:xfrm>
                     <a:prstGeom prst="rect">
                       <a:avLst/>
@@ -2004,7 +2441,7 @@
         <w:pStyle w:val="Normal"/>
       </w:pPr>
       <w:r>
-        <w:t xml:space="preserve">A complete academic evaluation should include at least two manual measurements that are not fully captured in the current repository:</w:t>
+        <w:t xml:space="preserve">A complete academic evaluation still requires manual measurements of the physical interaction loop. The protocols are defined here so that the missing data can be inserted directly into this report rather than stored only in auxiliary notes.</w:t>
       </w:r>
     </w:p>
     <w:p>
@@ -2012,7 +2449,7 @@
         <w:pStyle w:val="ListParagraph"/>
       </w:pPr>
       <w:r>
-        <w:t xml:space="preserve">1. End-to-end audio latency: record hand motion and speaker output with a high-speed camera or synchronized audio/video setup.</w:t>
+        <w:t xml:space="preserve">1. End-to-end audio latency: record the performer's hand and the speaker output simultaneously using a high-speed camera or synchronized audio/video setup. For each strike, identify the video frame where the downward hit begins and the first audio waveform onset at the speaker. Compute Delta t = t_audio - t_video. Use at least 30 strikes per mode and report mean, standard deviation, and P95 latency.</w:t>
       </w:r>
     </w:p>
     <w:p>
@@ -2020,15 +2457,23 @@
         <w:pStyle w:val="ListParagraph"/>
       </w:pPr>
       <w:r>
-        <w:t xml:space="preserve">2. Hit accuracy: count true positives, false positives, and false negatives over metronome-guided trials.</w:t>
-      </w:r>
-    </w:p>
-    <w:p>
-      <w:pPr>
-        <w:pStyle w:val="Normal"/>
-      </w:pPr>
-      <w:r>
-        <w:t xml:space="preserve">The report reserves placeholders for these data.</w:t>
+        <w:t xml:space="preserve">2. Hit accuracy: run metronome-guided trials in both drum and piano modes. A true positive is an intended strike detected within the allowed time window. A false negative is an intended strike with no valid event. A false positive is an unintended or duplicate event outside the allowed window. Report TP, FP, FN, precision, recall, and qualitative failure cases.</w:t>
+      </w:r>
+    </w:p>
+    <w:p>
+      <w:pPr>
+        <w:pStyle w:val="ListParagraph"/>
+      </w:pPr>
+      <w:r>
+        <w:t xml:space="preserve">3. Per-run logging: retain the git commit, backend, camera resolution, model paths/checksums, vy_trigger, joint_dps, cooldown, lighting conditions, and raw event log fields such as t, frame_id, infer_ms, hand_id, finger_id, pad/note, and trigger.</w:t>
+      </w:r>
+    </w:p>
+    <w:p>
+      <w:pPr>
+        <w:pStyle w:val="Normal"/>
+      </w:pPr>
+      <w:r>
+        <w:t xml:space="preserve">The following figures are still placeholders because they require live hardware capture.</w:t>
       </w:r>
     </w:p>
     <w:p>
@@ -2302,7 +2747,7 @@
         <w:pStyle w:val="Normal"/>
       </w:pPr>
       <w:r>
-        <w:t xml:space="preserve">Prototype measurements from the repository's experiment log are summarized below.</w:t>
+        <w:t xml:space="preserve">The table below reports the high-level latency comparison for the four evaluated runtime configurations. The cpu row is a practical reference path. The cpu-baseline and npu-full rows form the controlled CPU-vs-NPU comparison because they share the same palm→ROI→hand pipeline and differ only in hand landmark inference. The npu dual-halves row is not an accuracy-equivalent baseline; it is a low-latency approximation that removes palm detection to estimate the best-case live-demo path.</w:t>
       </w:r>
     </w:p>
     <w:tbl>
@@ -2341,7 +2786,7 @@
               <w:pStyle w:val="Normal"/>
             </w:pPr>
             <w:r>
-              <w:t xml:space="preserve">Approx. latency</w:t>
+              <w:t xml:space="preserve">Palm stage</w:t>
             </w:r>
           </w:p>
         </w:tc>
@@ -2354,20 +2799,68 @@
               <w:pStyle w:val="Normal"/>
             </w:pPr>
             <w:r>
-              <w:t xml:space="preserve">Notes</w:t>
-            </w:r>
-          </w:p>
-        </w:tc>
-      </w:tr>
-      <w:tr>
-        <w:tc>
-          <w:tcPr/>
-          <w:p>
-            <w:pPr>
-              <w:pStyle w:val="Normal"/>
-            </w:pPr>
-            <w:r>
-              <w:t xml:space="preserve">cpu</w:t>
+              <w:t xml:space="preserve">Hand stage</w:t>
+            </w:r>
+          </w:p>
+        </w:tc>
+        <w:tc>
+          <w:tcPr>
+            <w:shd w:fill="E2E8F0"/>
+          </w:tcPr>
+          <w:p>
+            <w:pPr>
+              <w:pStyle w:val="Normal"/>
+            </w:pPr>
+            <w:r>
+              <w:t xml:space="preserve">Approx. total for 2 hands</w:t>
+            </w:r>
+          </w:p>
+        </w:tc>
+        <w:tc>
+          <w:tcPr>
+            <w:shd w:fill="E2E8F0"/>
+          </w:tcPr>
+          <w:p>
+            <w:pPr>
+              <w:pStyle w:val="Normal"/>
+            </w:pPr>
+            <w:r>
+              <w:t xml:space="preserve">Interpretation</w:t>
+            </w:r>
+          </w:p>
+        </w:tc>
+      </w:tr>
+      <w:tr>
+        <w:tc>
+          <w:tcPr/>
+          <w:p>
+            <w:pPr>
+              <w:pStyle w:val="Normal"/>
+            </w:pPr>
+            <w:r>
+              <w:t xml:space="preserve">cpu (MediaPipe)</w:t>
+            </w:r>
+          </w:p>
+        </w:tc>
+        <w:tc>
+          <w:tcPr/>
+          <w:p>
+            <w:pPr>
+              <w:pStyle w:val="Normal"/>
+            </w:pPr>
+            <w:r>
+              <w:t xml:space="preserve">~15 ms</w:t>
+            </w:r>
+          </w:p>
+        </w:tc>
+        <w:tc>
+          <w:tcPr/>
+          <w:p>
+            <w:pPr>
+              <w:pStyle w:val="Normal"/>
+            </w:pPr>
+            <w:r>
+              <w:t xml:space="preserve">~10 ms</w:t>
             </w:r>
           </w:p>
         </w:tc>
@@ -2389,20 +2882,42 @@
               <w:pStyle w:val="Normal"/>
             </w:pPr>
             <w:r>
-              <w:t xml:space="preserve">MediaPipe CPU path; simple and robust</w:t>
-            </w:r>
-          </w:p>
-        </w:tc>
-      </w:tr>
-      <w:tr>
-        <w:tc>
-          <w:tcPr/>
-          <w:p>
-            <w:pPr>
-              <w:pStyle w:val="Normal"/>
-            </w:pPr>
-            <w:r>
-              <w:t xml:space="preserve">cpu-baseline</w:t>
+              <w:t xml:space="preserve">Simple CPU-only functional baseline; no extra model files required</w:t>
+            </w:r>
+          </w:p>
+        </w:tc>
+      </w:tr>
+      <w:tr>
+        <w:tc>
+          <w:tcPr/>
+          <w:p>
+            <w:pPr>
+              <w:pStyle w:val="Normal"/>
+            </w:pPr>
+            <w:r>
+              <w:t xml:space="preserve">cpu-baseline (TFLite)</w:t>
+            </w:r>
+          </w:p>
+        </w:tc>
+        <w:tc>
+          <w:tcPr/>
+          <w:p>
+            <w:pPr>
+              <w:pStyle w:val="Normal"/>
+            </w:pPr>
+            <w:r>
+              <w:t xml:space="preserve">~95 ms</w:t>
+            </w:r>
+          </w:p>
+        </w:tc>
+        <w:tc>
+          <w:tcPr/>
+          <w:p>
+            <w:pPr>
+              <w:pStyle w:val="Normal"/>
+            </w:pPr>
+            <w:r>
+              <w:t xml:space="preserve">~5 ms</w:t>
             </w:r>
           </w:p>
         </w:tc>
@@ -2424,20 +2939,42 @@
               <w:pStyle w:val="Normal"/>
             </w:pPr>
             <w:r>
-              <w:t xml:space="preserve">Palm+hand TFLite CPU comparison baseline</w:t>
-            </w:r>
-          </w:p>
-        </w:tc>
-      </w:tr>
-      <w:tr>
-        <w:tc>
-          <w:tcPr/>
-          <w:p>
-            <w:pPr>
-              <w:pStyle w:val="Normal"/>
-            </w:pPr>
-            <w:r>
-              <w:t xml:space="preserve">npu-full</w:t>
+              <w:t xml:space="preserve">Same two-stage structure as npu-full; isolates the hand-landmark accelerator comparison</w:t>
+            </w:r>
+          </w:p>
+        </w:tc>
+      </w:tr>
+      <w:tr>
+        <w:tc>
+          <w:tcPr/>
+          <w:p>
+            <w:pPr>
+              <w:pStyle w:val="Normal"/>
+            </w:pPr>
+            <w:r>
+              <w:t xml:space="preserve">npu-full (TFLite + NPU)</w:t>
+            </w:r>
+          </w:p>
+        </w:tc>
+        <w:tc>
+          <w:tcPr/>
+          <w:p>
+            <w:pPr>
+              <w:pStyle w:val="Normal"/>
+            </w:pPr>
+            <w:r>
+              <w:t xml:space="preserve">~95 ms</w:t>
+            </w:r>
+          </w:p>
+        </w:tc>
+        <w:tc>
+          <w:tcPr/>
+          <w:p>
+            <w:pPr>
+              <w:pStyle w:val="Normal"/>
+            </w:pPr>
+            <w:r>
+              <w:t xml:space="preserve">~8 ms</w:t>
             </w:r>
           </w:p>
         </w:tc>
@@ -2459,7 +2996,7 @@
               <w:pStyle w:val="Normal"/>
             </w:pPr>
             <w:r>
-              <w:t xml:space="preserve">CPU palm detection plus NPU hand landmark; palm dominates total time</w:t>
+              <w:t xml:space="preserve">Accurate hybrid path, but CPU palm detection dominates total time</w:t>
             </w:r>
           </w:p>
         </w:tc>
@@ -2483,6 +3020,28 @@
               <w:pStyle w:val="Normal"/>
             </w:pPr>
             <w:r>
+              <w:t xml:space="preserve">0 ms</w:t>
+            </w:r>
+          </w:p>
+        </w:tc>
+        <w:tc>
+          <w:tcPr/>
+          <w:p>
+            <w:pPr>
+              <w:pStyle w:val="Normal"/>
+            </w:pPr>
+            <w:r>
+              <w:t xml:space="preserve">~8 ms × 2</w:t>
+            </w:r>
+          </w:p>
+        </w:tc>
+        <w:tc>
+          <w:tcPr/>
+          <w:p>
+            <w:pPr>
+              <w:pStyle w:val="Normal"/>
+            </w:pPr>
+            <w:r>
               <w:t xml:space="preserve">~16 ms</w:t>
             </w:r>
           </w:p>
@@ -2494,7 +3053,7 @@
               <w:pStyle w:val="Normal"/>
             </w:pPr>
             <w:r>
-              <w:t xml:space="preserve">Fastest path; no palm detector; geometric approximation</w:t>
+              <w:t xml:space="preserve">Fastest path and close to 60 FPS budget, but it approximates hand location without palm detection</w:t>
             </w:r>
           </w:p>
         </w:tc>
@@ -2505,7 +3064,7 @@
         <w:pStyle w:val="Normal"/>
       </w:pPr>
       <w:r>
-        <w:t xml:space="preserve">The results indicate that the fastest NPU-only approximation is suitable for low-latency demonstrations, while the more accurate palm-based pipeline requires further optimization or a reliable accelerated palm detector.</w:t>
+        <w:t xml:space="preserve">The result has two important implications. First, moving only the hand landmark model to NPU is insufficient when CPU palm detection still dominates the accurate pipeline. Second, the low-latency dual-halves path is valuable for demonstrations, but it should not be treated as accuracy-equivalent to the palm-based configurations because it assumes stable hand placement.</w:t>
       </w:r>
     </w:p>
     <w:p>
@@ -2521,7 +3080,808 @@
         <w:pStyle w:val="Normal"/>
       </w:pPr>
       <w:r>
-        <w:t xml:space="preserve">The experiment notes include a 90-frame offline benchmark. In that benchmark, npu-full reduced hand landmark time compared with a CPU-baseline pipeline, but overall runtime was still dominated by palm detection. NPU landmark affine correction reduced mean landmark error on the same dataset, but a hold-out set is required before claiming generalization.</w:t>
+        <w:t xml:space="preserve">A 90-frame offline benchmark was run to compare the two structurally matched pipelines, cpu-baseline and npu-full, using the same captured input frames. This benchmark removes live camera variability and focuses on per-frame processing latency and landmark agreement.</w:t>
+      </w:r>
+    </w:p>
+    <w:tbl>
+      <w:tblPr>
+        <w:tblStyle w:val="TableGrid"/>
+        <w:tblW w:w="0" w:type="auto"/>
+        <w:tblBorders>
+          <w:top w:val="single" w:sz="4" w:space="0" w:color="CBD5E1"/>
+          <w:left w:val="single" w:sz="4" w:space="0" w:color="CBD5E1"/>
+          <w:bottom w:val="single" w:sz="4" w:space="0" w:color="CBD5E1"/>
+          <w:right w:val="single" w:sz="4" w:space="0" w:color="CBD5E1"/>
+          <w:insideH w:val="single" w:sz="4" w:space="0" w:color="CBD5E1"/>
+          <w:insideV w:val="single" w:sz="4" w:space="0" w:color="CBD5E1"/>
+        </w:tblBorders>
+      </w:tblPr>
+      <w:tr>
+        <w:tc>
+          <w:tcPr>
+            <w:shd w:fill="E2E8F0"/>
+          </w:tcPr>
+          <w:p>
+            <w:pPr>
+              <w:pStyle w:val="Normal"/>
+            </w:pPr>
+            <w:r>
+              <w:t xml:space="preserve">Configuration</w:t>
+            </w:r>
+          </w:p>
+        </w:tc>
+        <w:tc>
+          <w:tcPr>
+            <w:shd w:fill="E2E8F0"/>
+          </w:tcPr>
+          <w:p>
+            <w:pPr>
+              <w:pStyle w:val="Normal"/>
+            </w:pPr>
+            <w:r>
+              <w:t xml:space="preserve">Mean latency</w:t>
+            </w:r>
+          </w:p>
+        </w:tc>
+        <w:tc>
+          <w:tcPr>
+            <w:shd w:fill="E2E8F0"/>
+          </w:tcPr>
+          <w:p>
+            <w:pPr>
+              <w:pStyle w:val="Normal"/>
+            </w:pPr>
+            <w:r>
+              <w:t xml:space="preserve">P95 latency</w:t>
+            </w:r>
+          </w:p>
+        </w:tc>
+        <w:tc>
+          <w:tcPr>
+            <w:shd w:fill="E2E8F0"/>
+          </w:tcPr>
+          <w:p>
+            <w:pPr>
+              <w:pStyle w:val="Normal"/>
+            </w:pPr>
+            <w:r>
+              <w:t xml:space="preserve">Component profile</w:t>
+            </w:r>
+          </w:p>
+        </w:tc>
+        <w:tc>
+          <w:tcPr>
+            <w:shd w:fill="E2E8F0"/>
+          </w:tcPr>
+          <w:p>
+            <w:pPr>
+              <w:pStyle w:val="Normal"/>
+            </w:pPr>
+            <w:r>
+              <w:t xml:space="preserve">Interpretation</w:t>
+            </w:r>
+          </w:p>
+        </w:tc>
+      </w:tr>
+      <w:tr>
+        <w:tc>
+          <w:tcPr/>
+          <w:p>
+            <w:pPr>
+              <w:pStyle w:val="Normal"/>
+            </w:pPr>
+            <w:r>
+              <w:t xml:space="preserve">cpu-baseline, palm every frame</w:t>
+            </w:r>
+          </w:p>
+        </w:tc>
+        <w:tc>
+          <w:tcPr/>
+          <w:p>
+            <w:pPr>
+              <w:pStyle w:val="Normal"/>
+            </w:pPr>
+            <w:r>
+              <w:t xml:space="preserve">84.40 ms</w:t>
+            </w:r>
+          </w:p>
+        </w:tc>
+        <w:tc>
+          <w:tcPr/>
+          <w:p>
+            <w:pPr>
+              <w:pStyle w:val="Normal"/>
+            </w:pPr>
+            <w:r>
+              <w:t xml:space="preserve">86.78 ms</w:t>
+            </w:r>
+          </w:p>
+        </w:tc>
+        <w:tc>
+          <w:tcPr/>
+          <w:p>
+            <w:pPr>
+              <w:pStyle w:val="Normal"/>
+            </w:pPr>
+            <w:r>
+              <w:t xml:space="preserve">palm 39.26 ms + hand 44.80 ms</w:t>
+            </w:r>
+          </w:p>
+        </w:tc>
+        <w:tc>
+          <w:tcPr/>
+          <w:p>
+            <w:pPr>
+              <w:pStyle w:val="Normal"/>
+            </w:pPr>
+            <w:r>
+              <w:t xml:space="preserve">CPU TFLite reference for the two-stage pipeline</w:t>
+            </w:r>
+          </w:p>
+        </w:tc>
+      </w:tr>
+      <w:tr>
+        <w:tc>
+          <w:tcPr/>
+          <w:p>
+            <w:pPr>
+              <w:pStyle w:val="Normal"/>
+            </w:pPr>
+            <w:r>
+              <w:t xml:space="preserve">npu-full, palm every frame</w:t>
+            </w:r>
+          </w:p>
+        </w:tc>
+        <w:tc>
+          <w:tcPr/>
+          <w:p>
+            <w:pPr>
+              <w:pStyle w:val="Normal"/>
+            </w:pPr>
+            <w:r>
+              <w:t xml:space="preserve">50.32 ms</w:t>
+            </w:r>
+          </w:p>
+        </w:tc>
+        <w:tc>
+          <w:tcPr/>
+          <w:p>
+            <w:pPr>
+              <w:pStyle w:val="Normal"/>
+            </w:pPr>
+            <w:r>
+              <w:t xml:space="preserve">54.52 ms</w:t>
+            </w:r>
+          </w:p>
+        </w:tc>
+        <w:tc>
+          <w:tcPr/>
+          <w:p>
+            <w:pPr>
+              <w:pStyle w:val="Normal"/>
+            </w:pPr>
+            <w:r>
+              <w:t xml:space="preserve">palm 40.93 ms + hand 9.13 ms</w:t>
+            </w:r>
+          </w:p>
+        </w:tc>
+        <w:tc>
+          <w:tcPr/>
+          <w:p>
+            <w:pPr>
+              <w:pStyle w:val="Normal"/>
+            </w:pPr>
+            <w:r>
+              <w:t xml:space="preserve">Same palm/ROI path, but hand inference is moved to NPU</w:t>
+            </w:r>
+          </w:p>
+        </w:tc>
+      </w:tr>
+      <w:tr>
+        <w:tc>
+          <w:tcPr/>
+          <w:p>
+            <w:pPr>
+              <w:pStyle w:val="Normal"/>
+            </w:pPr>
+            <w:r>
+              <w:t xml:space="preserve">npu-full, --palm-redetect-every 5 (20-frame smoke)</w:t>
+            </w:r>
+          </w:p>
+        </w:tc>
+        <w:tc>
+          <w:tcPr/>
+          <w:p>
+            <w:pPr>
+              <w:pStyle w:val="Normal"/>
+            </w:pPr>
+            <w:r>
+              <w:t xml:space="preserve">15.29 ms</w:t>
+            </w:r>
+          </w:p>
+        </w:tc>
+        <w:tc>
+          <w:tcPr/>
+          <w:p>
+            <w:pPr>
+              <w:pStyle w:val="Normal"/>
+            </w:pPr>
+            <w:r>
+              <w:t xml:space="preserve">50.96 ms</w:t>
+            </w:r>
+          </w:p>
+        </w:tc>
+        <w:tc>
+          <w:tcPr/>
+          <w:p>
+            <w:pPr>
+              <w:pStyle w:val="Normal"/>
+            </w:pPr>
+            <w:r>
+              <w:t xml:space="preserve">palm frames 3/20, tracking frames 17/20</w:t>
+            </w:r>
+          </w:p>
+        </w:tc>
+        <w:tc>
+          <w:tcPr/>
+          <w:p>
+            <w:pPr>
+              <w:pStyle w:val="Normal"/>
+            </w:pPr>
+            <w:r>
+              <w:t xml:space="preserve">Shows latency potential of palm skipping, but drift and hit accuracy must be verified</w:t>
+            </w:r>
+          </w:p>
+        </w:tc>
+      </w:tr>
+      <w:tr>
+        <w:tc>
+          <w:tcPr/>
+          <w:p>
+            <w:pPr>
+              <w:pStyle w:val="Normal"/>
+            </w:pPr>
+            <w:r>
+              <w:t xml:space="preserve">npu-full, --async-palm smoke</w:t>
+            </w:r>
+          </w:p>
+        </w:tc>
+        <w:tc>
+          <w:tcPr/>
+          <w:p>
+            <w:pPr>
+              <w:pStyle w:val="Normal"/>
+            </w:pPr>
+            <w:r>
+              <w:t xml:space="preserve">10–20 ms range</w:t>
+            </w:r>
+          </w:p>
+        </w:tc>
+        <w:tc>
+          <w:tcPr/>
+          <w:p>
+            <w:pPr>
+              <w:pStyle w:val="Normal"/>
+            </w:pPr>
+            <w:r>
+              <w:t xml:space="preserve">input-pacing dependent</w:t>
+            </w:r>
+          </w:p>
+        </w:tc>
+        <w:tc>
+          <w:tcPr/>
+          <w:p>
+            <w:pPr>
+              <w:pStyle w:val="Normal"/>
+            </w:pPr>
+            <w:r>
+              <w:t xml:space="preserve">tracking with asynchronous palm refresh</w:t>
+            </w:r>
+          </w:p>
+        </w:tc>
+        <w:tc>
+          <w:tcPr/>
+          <w:p>
+            <w:pPr>
+              <w:pStyle w:val="Normal"/>
+            </w:pPr>
+            <w:r>
+              <w:t xml:space="preserve">Experimental path; live stability still needs validation</w:t>
+            </w:r>
+          </w:p>
+        </w:tc>
+      </w:tr>
+    </w:tbl>
+    <w:p>
+      <w:pPr>
+        <w:pStyle w:val="Normal"/>
+      </w:pPr>
+      <w:r>
+        <w:t xml:space="preserve">The matched cpu-baseline vs. npu-full comparison shows that the NPU substantially reduces hand-landmark time in the TFLite-style pipeline (44.80 ms to 9.13 ms in the recorded 90-frame run). However, palm detection remains about 40 ms, so the accurate pipeline still exceeds the 60 FPS target unless palm frequency is reduced or palm detection is accelerated.</w:t>
+      </w:r>
+    </w:p>
+    <w:p>
+      <w:pPr>
+        <w:pStyle w:val="Normal"/>
+      </w:pPr>
+      <w:r>
+        <w:t xml:space="preserve">Landmark accuracy was estimated by comparing npu-full landmarks against the CPU-baseline reference in normalized image coordinates.</w:t>
+      </w:r>
+    </w:p>
+    <w:tbl>
+      <w:tblPr>
+        <w:tblStyle w:val="TableGrid"/>
+        <w:tblW w:w="0" w:type="auto"/>
+        <w:tblBorders>
+          <w:top w:val="single" w:sz="4" w:space="0" w:color="CBD5E1"/>
+          <w:left w:val="single" w:sz="4" w:space="0" w:color="CBD5E1"/>
+          <w:bottom w:val="single" w:sz="4" w:space="0" w:color="CBD5E1"/>
+          <w:right w:val="single" w:sz="4" w:space="0" w:color="CBD5E1"/>
+          <w:insideH w:val="single" w:sz="4" w:space="0" w:color="CBD5E1"/>
+          <w:insideV w:val="single" w:sz="4" w:space="0" w:color="CBD5E1"/>
+        </w:tblBorders>
+      </w:tblPr>
+      <w:tr>
+        <w:tc>
+          <w:tcPr>
+            <w:shd w:fill="E2E8F0"/>
+          </w:tcPr>
+          <w:p>
+            <w:pPr>
+              <w:pStyle w:val="Normal"/>
+            </w:pPr>
+            <w:r>
+              <w:t xml:space="preserve">Hand</w:t>
+            </w:r>
+          </w:p>
+        </w:tc>
+        <w:tc>
+          <w:tcPr>
+            <w:shd w:fill="E2E8F0"/>
+          </w:tcPr>
+          <w:p>
+            <w:pPr>
+              <w:pStyle w:val="Normal"/>
+            </w:pPr>
+            <w:r>
+              <w:t xml:space="preserve">Matched frames</w:t>
+            </w:r>
+          </w:p>
+        </w:tc>
+        <w:tc>
+          <w:tcPr>
+            <w:shd w:fill="E2E8F0"/>
+          </w:tcPr>
+          <w:p>
+            <w:pPr>
+              <w:pStyle w:val="Normal"/>
+            </w:pPr>
+            <w:r>
+              <w:t xml:space="preserve">Mean error over 21 points</w:t>
+            </w:r>
+          </w:p>
+        </w:tc>
+        <w:tc>
+          <w:tcPr>
+            <w:shd w:fill="E2E8F0"/>
+          </w:tcPr>
+          <w:p>
+            <w:pPr>
+              <w:pStyle w:val="Normal"/>
+            </w:pPr>
+            <w:r>
+              <w:t xml:space="preserve">Mean fingertip error</w:t>
+            </w:r>
+          </w:p>
+        </w:tc>
+        <w:tc>
+          <w:tcPr>
+            <w:shd w:fill="E2E8F0"/>
+          </w:tcPr>
+          <w:p>
+            <w:pPr>
+              <w:pStyle w:val="Normal"/>
+            </w:pPr>
+            <w:r>
+              <w:t xml:space="preserve">Mean max error</w:t>
+            </w:r>
+          </w:p>
+        </w:tc>
+        <w:tc>
+          <w:tcPr>
+            <w:shd w:fill="E2E8F0"/>
+          </w:tcPr>
+          <w:p>
+            <w:pPr>
+              <w:pStyle w:val="Normal"/>
+            </w:pPr>
+            <w:r>
+              <w:t xml:space="preserve">Worst max error</w:t>
+            </w:r>
+          </w:p>
+        </w:tc>
+      </w:tr>
+      <w:tr>
+        <w:tc>
+          <w:tcPr/>
+          <w:p>
+            <w:pPr>
+              <w:pStyle w:val="Normal"/>
+            </w:pPr>
+            <w:r>
+              <w:t xml:space="preserve">Right</w:t>
+            </w:r>
+          </w:p>
+        </w:tc>
+        <w:tc>
+          <w:tcPr/>
+          <w:p>
+            <w:pPr>
+              <w:pStyle w:val="Normal"/>
+            </w:pPr>
+            <w:r>
+              <w:t xml:space="preserve">90</w:t>
+            </w:r>
+          </w:p>
+        </w:tc>
+        <w:tc>
+          <w:tcPr/>
+          <w:p>
+            <w:pPr>
+              <w:pStyle w:val="Normal"/>
+            </w:pPr>
+            <w:r>
+              <w:t xml:space="preserve">0.0270</w:t>
+            </w:r>
+          </w:p>
+        </w:tc>
+        <w:tc>
+          <w:tcPr/>
+          <w:p>
+            <w:pPr>
+              <w:pStyle w:val="Normal"/>
+            </w:pPr>
+            <w:r>
+              <w:t xml:space="preserve">0.0336</w:t>
+            </w:r>
+          </w:p>
+        </w:tc>
+        <w:tc>
+          <w:tcPr/>
+          <w:p>
+            <w:pPr>
+              <w:pStyle w:val="Normal"/>
+            </w:pPr>
+            <w:r>
+              <w:t xml:space="preserve">0.0532</w:t>
+            </w:r>
+          </w:p>
+        </w:tc>
+        <w:tc>
+          <w:tcPr/>
+          <w:p>
+            <w:pPr>
+              <w:pStyle w:val="Normal"/>
+            </w:pPr>
+            <w:r>
+              <w:t xml:space="preserve">0.1593</w:t>
+            </w:r>
+          </w:p>
+        </w:tc>
+      </w:tr>
+      <w:tr>
+        <w:tc>
+          <w:tcPr/>
+          <w:p>
+            <w:pPr>
+              <w:pStyle w:val="Normal"/>
+            </w:pPr>
+            <w:r>
+              <w:t xml:space="preserve">Left</w:t>
+            </w:r>
+          </w:p>
+        </w:tc>
+        <w:tc>
+          <w:tcPr/>
+          <w:p>
+            <w:pPr>
+              <w:pStyle w:val="Normal"/>
+            </w:pPr>
+            <w:r>
+              <w:t xml:space="preserve">83</w:t>
+            </w:r>
+          </w:p>
+        </w:tc>
+        <w:tc>
+          <w:tcPr/>
+          <w:p>
+            <w:pPr>
+              <w:pStyle w:val="Normal"/>
+            </w:pPr>
+            <w:r>
+              <w:t xml:space="preserve">0.0256</w:t>
+            </w:r>
+          </w:p>
+        </w:tc>
+        <w:tc>
+          <w:tcPr/>
+          <w:p>
+            <w:pPr>
+              <w:pStyle w:val="Normal"/>
+            </w:pPr>
+            <w:r>
+              <w:t xml:space="preserve">0.0353</w:t>
+            </w:r>
+          </w:p>
+        </w:tc>
+        <w:tc>
+          <w:tcPr/>
+          <w:p>
+            <w:pPr>
+              <w:pStyle w:val="Normal"/>
+            </w:pPr>
+            <w:r>
+              <w:t xml:space="preserve">0.0457</w:t>
+            </w:r>
+          </w:p>
+        </w:tc>
+        <w:tc>
+          <w:tcPr/>
+          <w:p>
+            <w:pPr>
+              <w:pStyle w:val="Normal"/>
+            </w:pPr>
+            <w:r>
+              <w:t xml:space="preserve">0.0734</w:t>
+            </w:r>
+          </w:p>
+        </w:tc>
+      </w:tr>
+    </w:tbl>
+    <w:p>
+      <w:pPr>
+        <w:pStyle w:val="Normal"/>
+      </w:pPr>
+      <w:r>
+        <w:t xml:space="preserve">An affine correction model was then fit to reduce systematic NPU landmark bias. On the same 90-frame training set, the corrected errors were:</w:t>
+      </w:r>
+    </w:p>
+    <w:tbl>
+      <w:tblPr>
+        <w:tblStyle w:val="TableGrid"/>
+        <w:tblW w:w="0" w:type="auto"/>
+        <w:tblBorders>
+          <w:top w:val="single" w:sz="4" w:space="0" w:color="CBD5E1"/>
+          <w:left w:val="single" w:sz="4" w:space="0" w:color="CBD5E1"/>
+          <w:bottom w:val="single" w:sz="4" w:space="0" w:color="CBD5E1"/>
+          <w:right w:val="single" w:sz="4" w:space="0" w:color="CBD5E1"/>
+          <w:insideH w:val="single" w:sz="4" w:space="0" w:color="CBD5E1"/>
+          <w:insideV w:val="single" w:sz="4" w:space="0" w:color="CBD5E1"/>
+        </w:tblBorders>
+      </w:tblPr>
+      <w:tr>
+        <w:tc>
+          <w:tcPr>
+            <w:shd w:fill="E2E8F0"/>
+          </w:tcPr>
+          <w:p>
+            <w:pPr>
+              <w:pStyle w:val="Normal"/>
+            </w:pPr>
+            <w:r>
+              <w:t xml:space="preserve">Hand</w:t>
+            </w:r>
+          </w:p>
+        </w:tc>
+        <w:tc>
+          <w:tcPr>
+            <w:shd w:fill="E2E8F0"/>
+          </w:tcPr>
+          <w:p>
+            <w:pPr>
+              <w:pStyle w:val="Normal"/>
+            </w:pPr>
+            <w:r>
+              <w:t xml:space="preserve">Matched frames</w:t>
+            </w:r>
+          </w:p>
+        </w:tc>
+        <w:tc>
+          <w:tcPr>
+            <w:shd w:fill="E2E8F0"/>
+          </w:tcPr>
+          <w:p>
+            <w:pPr>
+              <w:pStyle w:val="Normal"/>
+            </w:pPr>
+            <w:r>
+              <w:t xml:space="preserve">Mean error over 21 points</w:t>
+            </w:r>
+          </w:p>
+        </w:tc>
+        <w:tc>
+          <w:tcPr>
+            <w:shd w:fill="E2E8F0"/>
+          </w:tcPr>
+          <w:p>
+            <w:pPr>
+              <w:pStyle w:val="Normal"/>
+            </w:pPr>
+            <w:r>
+              <w:t xml:space="preserve">Mean fingertip error</w:t>
+            </w:r>
+          </w:p>
+        </w:tc>
+        <w:tc>
+          <w:tcPr>
+            <w:shd w:fill="E2E8F0"/>
+          </w:tcPr>
+          <w:p>
+            <w:pPr>
+              <w:pStyle w:val="Normal"/>
+            </w:pPr>
+            <w:r>
+              <w:t xml:space="preserve">Mean max error</w:t>
+            </w:r>
+          </w:p>
+        </w:tc>
+        <w:tc>
+          <w:tcPr>
+            <w:shd w:fill="E2E8F0"/>
+          </w:tcPr>
+          <w:p>
+            <w:pPr>
+              <w:pStyle w:val="Normal"/>
+            </w:pPr>
+            <w:r>
+              <w:t xml:space="preserve">Worst max error</w:t>
+            </w:r>
+          </w:p>
+        </w:tc>
+      </w:tr>
+      <w:tr>
+        <w:tc>
+          <w:tcPr/>
+          <w:p>
+            <w:pPr>
+              <w:pStyle w:val="Normal"/>
+            </w:pPr>
+            <w:r>
+              <w:t xml:space="preserve">Right</w:t>
+            </w:r>
+          </w:p>
+        </w:tc>
+        <w:tc>
+          <w:tcPr/>
+          <w:p>
+            <w:pPr>
+              <w:pStyle w:val="Normal"/>
+            </w:pPr>
+            <w:r>
+              <w:t xml:space="preserve">90</w:t>
+            </w:r>
+          </w:p>
+        </w:tc>
+        <w:tc>
+          <w:tcPr/>
+          <w:p>
+            <w:pPr>
+              <w:pStyle w:val="Normal"/>
+            </w:pPr>
+            <w:r>
+              <w:t xml:space="preserve">0.0102</w:t>
+            </w:r>
+          </w:p>
+        </w:tc>
+        <w:tc>
+          <w:tcPr/>
+          <w:p>
+            <w:pPr>
+              <w:pStyle w:val="Normal"/>
+            </w:pPr>
+            <w:r>
+              <w:t xml:space="preserve">0.0112</w:t>
+            </w:r>
+          </w:p>
+        </w:tc>
+        <w:tc>
+          <w:tcPr/>
+          <w:p>
+            <w:pPr>
+              <w:pStyle w:val="Normal"/>
+            </w:pPr>
+            <w:r>
+              <w:t xml:space="preserve">0.0223</w:t>
+            </w:r>
+          </w:p>
+        </w:tc>
+        <w:tc>
+          <w:tcPr/>
+          <w:p>
+            <w:pPr>
+              <w:pStyle w:val="Normal"/>
+            </w:pPr>
+            <w:r>
+              <w:t xml:space="preserve">0.1701</w:t>
+            </w:r>
+          </w:p>
+        </w:tc>
+      </w:tr>
+      <w:tr>
+        <w:tc>
+          <w:tcPr/>
+          <w:p>
+            <w:pPr>
+              <w:pStyle w:val="Normal"/>
+            </w:pPr>
+            <w:r>
+              <w:t xml:space="preserve">Left</w:t>
+            </w:r>
+          </w:p>
+        </w:tc>
+        <w:tc>
+          <w:tcPr/>
+          <w:p>
+            <w:pPr>
+              <w:pStyle w:val="Normal"/>
+            </w:pPr>
+            <w:r>
+              <w:t xml:space="preserve">83</w:t>
+            </w:r>
+          </w:p>
+        </w:tc>
+        <w:tc>
+          <w:tcPr/>
+          <w:p>
+            <w:pPr>
+              <w:pStyle w:val="Normal"/>
+            </w:pPr>
+            <w:r>
+              <w:t xml:space="preserve">0.0092</w:t>
+            </w:r>
+          </w:p>
+        </w:tc>
+        <w:tc>
+          <w:tcPr/>
+          <w:p>
+            <w:pPr>
+              <w:pStyle w:val="Normal"/>
+            </w:pPr>
+            <w:r>
+              <w:t xml:space="preserve">0.0090</w:t>
+            </w:r>
+          </w:p>
+        </w:tc>
+        <w:tc>
+          <w:tcPr/>
+          <w:p>
+            <w:pPr>
+              <w:pStyle w:val="Normal"/>
+            </w:pPr>
+            <w:r>
+              <w:t xml:space="preserve">0.0193</w:t>
+            </w:r>
+          </w:p>
+        </w:tc>
+        <w:tc>
+          <w:tcPr/>
+          <w:p>
+            <w:pPr>
+              <w:pStyle w:val="Normal"/>
+            </w:pPr>
+            <w:r>
+              <w:t xml:space="preserve">0.0437</w:t>
+            </w:r>
+          </w:p>
+        </w:tc>
+      </w:tr>
+    </w:tbl>
+    <w:p>
+      <w:pPr>
+        <w:pStyle w:val="Normal"/>
+      </w:pPr>
+      <w:r>
+        <w:t xml:space="preserve">The correction reduces average and fingertip error on the training capture, but it should not be reported as a generalized accuracy improvement until it is evaluated on a separate hold-out capture with different lighting, hand size, hand pose, and camera distance.</w:t>
       </w:r>
     </w:p>
     <w:p>
@@ -2601,7 +3961,7 @@
         <w:pStyle w:val="Normal"/>
       </w:pPr>
       <w:r>
-        <w:t xml:space="preserve">The NPU accelerates hand landmark inference, but a full robust pipeline also needs palm detection. Current notes indicate that INT8 palm detection quality was insufficient, forcing palm detection to remain CPU TFLite in the accurate pipeline. Consequently, the most accurate NPU-full backend can be slower than expected because palm detection dominates. This suggests that future work should focus on either improving palm model quantization, replacing the detector, or reducing palm frequency while controlling drift.</w:t>
+        <w:t xml:space="preserve">The NPU accelerates hand landmark inference, but a full robust pipeline also needs palm detection. In the experiments reported above, the NPU palm candidate was fast but unusable because INT8 quantization damaged detection scores, leaving CPU TFLite palm detection in the accurate pipeline. Consequently, the most accurate NPU-full backend can be slower than expected because palm detection dominates. This suggests that future work should focus on either improving palm model quantization, replacing the detector, or reducing palm frequency while controlling drift.</w:t>
       </w:r>
     </w:p>
     <w:p>
@@ -2841,7 +4201,7 @@
         <w:pStyle w:val="Normal"/>
       </w:pPr>
       <w:r>
-        <w:t xml:space="preserve">[1] Project implementation and documentation, air_drum_pad/ repository files: README.md, docs/ARCHITECTURE.md, and docs/EXPERIMENTS.md. [2] MediaPipe Hands / hand landmark model family, used through CPU MediaPipe and TFLite-derived pipeline paths. [3] OpenCV, used for camera capture, drawing, and display. [4] pygame, used for low-latency playback of pre-rendered PCM sound buffers. [5] DeepX DX-RT / DX-COM toolchain, used for .dxnn NPU hand-landmark inference experiments.</w:t>
+        <w:t xml:space="preserve">[1] AI Air-Drum Pad repository artifact, air_drum_pad/ in git@github.com:GW-arch/deepx.git: source code, tests, generated figures, instrument images, and recorded benchmark artifacts used to construct this self-contained report. [2] MediaPipe Hands / hand landmark model family, used through CPU MediaPipe and TFLite-derived pipeline paths. [3] OpenCV, used for camera capture, drawing, and display. [4] pygame, used for low-latency playback of pre-rendered PCM sound buffers. [5] DeepX DX-RT / DX-COM toolchain, used for .dxnn NPU hand-landmark inference experiments.</w:t>
       </w:r>
     </w:p>
     <w:p>

</xml_diff>

<commit_message>
Add PANDA title and report icon
</commit_message>
<xml_diff>
--- a/air_drum_pad/docs/FINAL_REPORT_AI_AIR_DRUM_PAD.docx
+++ b/air_drum_pad/docs/FINAL_REPORT_AI_AIR_DRUM_PAD.docx
@@ -7,231 +7,7 @@
         <w:pStyle w:val="Heading1"/>
       </w:pPr>
       <w:r>
-        <w:t xml:space="preserve">AI Air-Drum Pad: A Vision-Based Contactless Musical Interface with Hand-Landmark Strike Detection</w:t>
-      </w:r>
-    </w:p>
-    <w:p>
-      <w:pPr>
-        <w:pStyle w:val="Normal"/>
-      </w:pPr>
-      <w:r>
-        <w:t xml:space="preserve">Final Report</w:t>
-      </w:r>
-    </w:p>
-    <w:p>
-      <w:pPr>
-        <w:pStyle w:val="Normal"/>
-      </w:pPr>
-      <w:r>
-        <w:t xml:space="preserve">Authors: FILLME</w:t>
-      </w:r>
-    </w:p>
-    <w:p>
-      <w:pPr>
-        <w:pStyle w:val="Normal"/>
-      </w:pPr>
-      <w:r>
-        <w:t xml:space="preserve">Affiliation: FILLME</w:t>
-      </w:r>
-    </w:p>
-    <w:p>
-      <w:pPr>
-        <w:pStyle w:val="Normal"/>
-      </w:pPr>
-      <w:r>
-        <w:t xml:space="preserve">Date: 2026-05-26</w:t>
-      </w:r>
-    </w:p>
-    <w:p>
-      <w:pPr>
-        <w:pStyle w:val="Normal"/>
-      </w:pPr>
-      <w:r>
-        <w:t xml:space="preserve">Repository: air_drum_pad/ in git@github.com:GW-arch/deepx.git</w:t>
-      </w:r>
-    </w:p>
-    <w:p>
-      <w:pPr>
-        <w:pStyle w:val="Normal"/>
-      </w:pPr>
-      <w:r>
-        <w:t xml:space="preserve"/>
-      </w:r>
-    </w:p>
-    <w:p>
-      <w:pPr>
-        <w:pStyle w:val="Heading2"/>
-      </w:pPr>
-      <w:r>
-        <w:t xml:space="preserve">Abstract</w:t>
-      </w:r>
-    </w:p>
-    <w:p>
-      <w:pPr>
-        <w:pStyle w:val="Normal"/>
-      </w:pPr>
-      <w:r>
-        <w:t xml:space="preserve">This report presents AI Air-Drum Pad, a real-time camera-based musical interface that converts hand and finger motions into playable drum and piano events. The system tracks hand landmarks from a USB camera, estimates downward fingertip velocity and finger-joint angular velocity, and triggers audio only when both motion cues indicate an intentional strike. Two musical modes are implemented on the same perception-and-strike-detection core: (1) a drum pad mode, where any fingertip may strike an on-screen rectangular pad, and (2) a piano mode, where notes are mapped to hand and finger identity. The final piano default layout maps the left hand from thumb to pinky as G4, F4, E4, D4, C4 and the right hand as C5, D5, E5, F5, G5. The implementation supports CPU MediaPipe, CPU TFLite baseline, hybrid CPU+NPU hand-landmark inference, and a low-latency NPU dual-halves mode. Evaluation utilities and unit tests validate strike detection, pad-zone parsing, piano-note mapping, ROI transforms, and benchmark helpers. Prototype measurements show that the low-latency NPU dual-halves backend can approach the 60 FPS frame budget, while the more accurate palm-detection pipeline is limited by CPU palm detection. The project demonstrates a practical path toward low-cost, contactless musical instruments on edge AI hardware, with clear remaining work in end-to-end audio-latency measurement, robust hit-accuracy evaluation, and user studies.</w:t>
-      </w:r>
-    </w:p>
-    <w:p>
-      <w:pPr>
-        <w:pStyle w:val="Normal"/>
-      </w:pPr>
-      <w:r>
-        <w:t xml:space="preserve">Keywords: contactless musical interface, hand tracking, gesture recognition, air drums, virtual piano, edge AI, NPU, real-time interaction</w:t>
-      </w:r>
-    </w:p>
-    <w:p>
-      <w:pPr>
-        <w:pStyle w:val="Normal"/>
-      </w:pPr>
-      <w:r>
-        <w:t xml:space="preserve"/>
-      </w:r>
-    </w:p>
-    <w:p>
-      <w:pPr>
-        <w:pStyle w:val="Heading2"/>
-      </w:pPr>
-      <w:r>
-        <w:t xml:space="preserve">1. Introduction</w:t>
-      </w:r>
-    </w:p>
-    <w:p>
-      <w:pPr>
-        <w:pStyle w:val="Normal"/>
-      </w:pPr>
-      <w:r>
-        <w:t xml:space="preserve">Musical performance interfaces traditionally rely on physical contact: a drumstick contacts a drumhead, or a finger depresses a piano key. Contact provides both tactile feedback and a clear sensing event. However, camera-based hand tracking makes it possible to build contactless musical instruments that require no specialized controller beyond a camera and display. Such systems are attractive for prototyping, education, accessibility, public installations, and embedded AI demonstrations.</w:t>
-      </w:r>
-    </w:p>
-    <w:p>
-      <w:pPr>
-        <w:pStyle w:val="Normal"/>
-      </w:pPr>
-      <w:r>
-        <w:t xml:space="preserve">The main challenge is that visually recognizing a musical strike is harder than recognizing a static hand pose. A simple fingertip-position trigger produces false positives when the whole hand moves, while a simple velocity trigger may fire during non-musical gestures. AI Air-Drum Pad addresses this by combining two motion cues:</w:t>
-      </w:r>
-    </w:p>
-    <w:p>
-      <w:pPr>
-        <w:pStyle w:val="ListParagraph"/>
-      </w:pPr>
-      <w:r>
-        <w:t xml:space="preserve">1. Fingertip downward velocity: the fingertip moves rapidly in the image direction associated with a striking motion.</w:t>
-      </w:r>
-    </w:p>
-    <w:p>
-      <w:pPr>
-        <w:pStyle w:val="ListParagraph"/>
-      </w:pPr>
-      <w:r>
-        <w:t xml:space="preserve">2. Finger-joint angular velocity: the finger itself articulates, distinguishing a deliberate finger strike from arm-only translation.</w:t>
-      </w:r>
-    </w:p>
-    <w:p>
-      <w:pPr>
-        <w:pStyle w:val="Normal"/>
-      </w:pPr>
-      <w:r>
-        <w:t xml:space="preserve">This report summarizes the final implemented system, its two musical modes, generated visual assets, software architecture, testing strategy, and prototype performance measurements.</w:t>
-      </w:r>
-    </w:p>
-    <w:p>
-      <w:pPr>
-        <w:pStyle w:val="Heading3"/>
-      </w:pPr>
-      <w:r>
-        <w:t xml:space="preserve">1.1 Contributions</w:t>
-      </w:r>
-    </w:p>
-    <w:p>
-      <w:pPr>
-        <w:pStyle w:val="Normal"/>
-      </w:pPr>
-      <w:r>
-        <w:t xml:space="preserve">The implemented project contributes:</w:t>
-      </w:r>
-    </w:p>
-    <w:p>
-      <w:pPr>
-        <w:pStyle w:val="ListParagraph"/>
-      </w:pPr>
-      <w:r>
-        <w:t xml:space="preserve">• A real-time hand-landmark musical interface supporting both drum pad and piano modes.</w:t>
-      </w:r>
-    </w:p>
-    <w:p>
-      <w:pPr>
-        <w:pStyle w:val="ListParagraph"/>
-      </w:pPr>
-      <w:r>
-        <w:t xml:space="preserve">• A common strike detector using fingertip velocity plus joint angular velocity.</w:t>
-      </w:r>
-    </w:p>
-    <w:p>
-      <w:pPr>
-        <w:pStyle w:val="ListParagraph"/>
-      </w:pPr>
-      <w:r>
-        <w:t xml:space="preserve">• A pad-zone drum interface with configurable rectangular hit regions and visual flash feedback.</w:t>
-      </w:r>
-    </w:p>
-    <w:p>
-      <w:pPr>
-        <w:pStyle w:val="ListParagraph"/>
-      </w:pPr>
-      <w:r>
-        <w:t xml:space="preserve">• A piano interface with a corrected default mapping: left thumb G4, left pinky C4, right hand C5–G5.</w:t>
-      </w:r>
-    </w:p>
-    <w:p>
-      <w:pPr>
-        <w:pStyle w:val="ListParagraph"/>
-      </w:pPr>
-      <w:r>
-        <w:t xml:space="preserve">• Generated interface diagrams for both modes.</w:t>
-      </w:r>
-    </w:p>
-    <w:p>
-      <w:pPr>
-        <w:pStyle w:val="ListParagraph"/>
-      </w:pPr>
-      <w:r>
-        <w:t xml:space="preserve">• Report figures generated by Python for system architecture, strike logic, and backend latency.</w:t>
-      </w:r>
-    </w:p>
-    <w:p>
-      <w:pPr>
-        <w:pStyle w:val="ListParagraph"/>
-      </w:pPr>
-      <w:r>
-        <w:t xml:space="preserve">• A repeatable test and quality-check pipeline covering mapping, detector behavior, pad validation, ROI helpers, and benchmark helpers.</w:t>
-      </w:r>
-    </w:p>
-    <w:p>
-      <w:pPr>
-        <w:pStyle w:val="Normal"/>
-      </w:pPr>
-      <w:r>
-        <w:t xml:space="preserve"/>
-      </w:r>
-    </w:p>
-    <w:p>
-      <w:pPr>
-        <w:pStyle w:val="Heading2"/>
-      </w:pPr>
-      <w:r>
-        <w:t xml:space="preserve">2. System Overview</w:t>
-      </w:r>
-    </w:p>
-    <w:p>
-      <w:pPr>
-        <w:pStyle w:val="Normal"/>
-      </w:pPr>
-      <w:r>
-        <w:t xml:space="preserve">Figure 1 summarizes the runtime pipeline. Frames are captured from a USB camera, processed by one of several hand-tracking backends, converted into per-hand landmark coordinates, passed to the strike detector, mapped to either piano notes or drum pad sounds, and finally played through pre-rendered PCM audio buffers.</w:t>
+        <w:t xml:space="preserve">PANDA: Pose-Aware NPU-Driven Digital Audio Interface for Contactless Musical Performance</w:t>
       </w:r>
     </w:p>
     <w:p>
@@ -241,8 +17,8 @@
       <w:r>
         <w:drawing>
           <wp:inline distT="0" distB="0" distL="0" distR="0">
-            <wp:extent cx="5669280" cy="2506418"/>
-            <wp:docPr id="1" name="system_pipeline.png"/>
+            <wp:extent cx="5669280" cy="1488186"/>
+            <wp:docPr id="1" name="panda_icon.png"/>
             <wp:cNvGraphicFramePr>
               <a:graphicFrameLocks noChangeAspect="1"/>
             </wp:cNvGraphicFramePr>
@@ -250,11 +26,284 @@
               <a:graphicData uri="http://schemas.openxmlformats.org/drawingml/2006/picture">
                 <pic:pic>
                   <pic:nvPicPr>
-                    <pic:cNvPr id="1" name="system_pipeline.png"/>
+                    <pic:cNvPr id="1" name="panda_icon.png"/>
                     <pic:cNvPicPr/>
                   </pic:nvPicPr>
                   <pic:blipFill>
                     <a:blip r:embed="rId1"/>
+                    <a:stretch>
+                      <a:fillRect/>
+                    </a:stretch>
+                  </pic:blipFill>
+                  <pic:spPr>
+                    <a:xfrm>
+                      <a:off x="0" y="0"/>
+                      <a:ext cx="5669280" cy="1488186"/>
+                    </a:xfrm>
+                    <a:prstGeom prst="rect">
+                      <a:avLst/>
+                    </a:prstGeom>
+                  </pic:spPr>
+                </pic:pic>
+              </a:graphicData>
+            </a:graphic>
+          </wp:inline>
+        </w:drawing>
+      </w:r>
+    </w:p>
+    <w:p>
+      <w:pPr>
+        <w:pStyle w:val="Caption"/>
+      </w:pPr>
+      <w:r>
+        <w:t xml:space="preserve">PANDA project icon generated by tools/gen_report_figures.py.</w:t>
+      </w:r>
+    </w:p>
+    <w:p>
+      <w:pPr>
+        <w:pStyle w:val="Normal"/>
+      </w:pPr>
+      <w:r>
+        <w:t xml:space="preserve">Final Report</w:t>
+      </w:r>
+    </w:p>
+    <w:p>
+      <w:pPr>
+        <w:pStyle w:val="Normal"/>
+      </w:pPr>
+      <w:r>
+        <w:t xml:space="preserve">Authors: FILLME</w:t>
+      </w:r>
+    </w:p>
+    <w:p>
+      <w:pPr>
+        <w:pStyle w:val="Normal"/>
+      </w:pPr>
+      <w:r>
+        <w:t xml:space="preserve">Affiliation: FILLME</w:t>
+      </w:r>
+    </w:p>
+    <w:p>
+      <w:pPr>
+        <w:pStyle w:val="Normal"/>
+      </w:pPr>
+      <w:r>
+        <w:t xml:space="preserve">Date: 2026-05-27</w:t>
+      </w:r>
+    </w:p>
+    <w:p>
+      <w:pPr>
+        <w:pStyle w:val="Normal"/>
+      </w:pPr>
+      <w:r>
+        <w:t xml:space="preserve">Repository: air_drum_pad/ in git@github.com:GW-arch/deepx.git</w:t>
+      </w:r>
+    </w:p>
+    <w:p>
+      <w:pPr>
+        <w:pStyle w:val="Normal"/>
+      </w:pPr>
+      <w:r>
+        <w:t xml:space="preserve"/>
+      </w:r>
+    </w:p>
+    <w:p>
+      <w:pPr>
+        <w:pStyle w:val="Heading2"/>
+      </w:pPr>
+      <w:r>
+        <w:t xml:space="preserve">Abstract</w:t>
+      </w:r>
+    </w:p>
+    <w:p>
+      <w:pPr>
+        <w:pStyle w:val="Normal"/>
+      </w:pPr>
+      <w:r>
+        <w:t xml:space="preserve">This report presents PANDA (Pose-Aware NPU-Driven Digital Audio Interface), the final titled version of AI Air-Drum Pad, a real-time camera-based musical interface that converts hand and finger motions into playable drum and piano events. The system tracks hand landmarks from a USB camera, estimates downward fingertip velocity and finger-joint angular velocity, and triggers audio only when both motion cues indicate an intentional strike. Two musical modes are implemented on the same perception-and-strike-detection core: (1) a drum pad mode, where any fingertip may strike an on-screen rectangular pad, and (2) a piano mode, where notes are mapped to hand and finger identity. The final piano default layout maps the left hand from thumb to pinky as G4, F4, E4, D4, C4 and the right hand as C5, D5, E5, F5, G5. The implementation supports CPU MediaPipe, CPU TFLite baseline, hybrid CPU+NPU hand-landmark inference, and a low-latency NPU dual-halves mode. Evaluation utilities and unit tests validate strike detection, pad-zone parsing, piano-note mapping, ROI transforms, and benchmark helpers. Prototype measurements show that the low-latency NPU dual-halves backend can approach the 60 FPS frame budget, while the more accurate palm-detection pipeline is limited by CPU palm detection. The project demonstrates a practical path toward low-cost, contactless musical instruments on edge AI hardware, with clear remaining work in end-to-end audio-latency measurement, robust hit-accuracy evaluation, and user studies.</w:t>
+      </w:r>
+    </w:p>
+    <w:p>
+      <w:pPr>
+        <w:pStyle w:val="Normal"/>
+      </w:pPr>
+      <w:r>
+        <w:t xml:space="preserve">Keywords: PANDA, contactless musical interface, hand tracking, gesture recognition, air drums, virtual piano, edge AI, NPU, real-time interaction</w:t>
+      </w:r>
+    </w:p>
+    <w:p>
+      <w:pPr>
+        <w:pStyle w:val="Normal"/>
+      </w:pPr>
+      <w:r>
+        <w:t xml:space="preserve"/>
+      </w:r>
+    </w:p>
+    <w:p>
+      <w:pPr>
+        <w:pStyle w:val="Heading2"/>
+      </w:pPr>
+      <w:r>
+        <w:t xml:space="preserve">1. Introduction</w:t>
+      </w:r>
+    </w:p>
+    <w:p>
+      <w:pPr>
+        <w:pStyle w:val="Normal"/>
+      </w:pPr>
+      <w:r>
+        <w:t xml:space="preserve">Musical performance interfaces traditionally rely on physical contact: a drumstick contacts a drumhead, or a finger depresses a piano key. Contact provides both tactile feedback and a clear sensing event. However, camera-based hand tracking makes it possible to build contactless musical instruments that require no specialized controller beyond a camera and display. Such systems are attractive for prototyping, education, accessibility, public installations, and embedded AI demonstrations.</w:t>
+      </w:r>
+    </w:p>
+    <w:p>
+      <w:pPr>
+        <w:pStyle w:val="Normal"/>
+      </w:pPr>
+      <w:r>
+        <w:t xml:space="preserve">The main challenge is that visually recognizing a musical strike is harder than recognizing a static hand pose. A simple fingertip-position trigger produces false positives when the whole hand moves, while a simple velocity trigger may fire during non-musical gestures. PANDA addresses this by combining two motion cues:</w:t>
+      </w:r>
+    </w:p>
+    <w:p>
+      <w:pPr>
+        <w:pStyle w:val="ListParagraph"/>
+      </w:pPr>
+      <w:r>
+        <w:t xml:space="preserve">1. Fingertip downward velocity: the fingertip moves rapidly in the image direction associated with a striking motion.</w:t>
+      </w:r>
+    </w:p>
+    <w:p>
+      <w:pPr>
+        <w:pStyle w:val="ListParagraph"/>
+      </w:pPr>
+      <w:r>
+        <w:t xml:space="preserve">2. Finger-joint angular velocity: the finger itself articulates, distinguishing a deliberate finger strike from arm-only translation.</w:t>
+      </w:r>
+    </w:p>
+    <w:p>
+      <w:pPr>
+        <w:pStyle w:val="Normal"/>
+      </w:pPr>
+      <w:r>
+        <w:t xml:space="preserve">This report summarizes the final implemented system, its two musical modes, generated visual assets, software architecture, testing strategy, and prototype performance measurements.</w:t>
+      </w:r>
+    </w:p>
+    <w:p>
+      <w:pPr>
+        <w:pStyle w:val="Heading3"/>
+      </w:pPr>
+      <w:r>
+        <w:t xml:space="preserve">1.1 Contributions</w:t>
+      </w:r>
+    </w:p>
+    <w:p>
+      <w:pPr>
+        <w:pStyle w:val="Normal"/>
+      </w:pPr>
+      <w:r>
+        <w:t xml:space="preserve">The implemented project contributes:</w:t>
+      </w:r>
+    </w:p>
+    <w:p>
+      <w:pPr>
+        <w:pStyle w:val="ListParagraph"/>
+      </w:pPr>
+      <w:r>
+        <w:t xml:space="preserve">• A real-time hand-landmark musical interface supporting both drum pad and piano modes.</w:t>
+      </w:r>
+    </w:p>
+    <w:p>
+      <w:pPr>
+        <w:pStyle w:val="ListParagraph"/>
+      </w:pPr>
+      <w:r>
+        <w:t xml:space="preserve">• A common strike detector using fingertip velocity plus joint angular velocity.</w:t>
+      </w:r>
+    </w:p>
+    <w:p>
+      <w:pPr>
+        <w:pStyle w:val="ListParagraph"/>
+      </w:pPr>
+      <w:r>
+        <w:t xml:space="preserve">• A pad-zone drum interface with configurable rectangular hit regions and visual flash feedback.</w:t>
+      </w:r>
+    </w:p>
+    <w:p>
+      <w:pPr>
+        <w:pStyle w:val="ListParagraph"/>
+      </w:pPr>
+      <w:r>
+        <w:t xml:space="preserve">• A piano interface with a corrected default mapping: left thumb G4, left pinky C4, right hand C5–G5.</w:t>
+      </w:r>
+    </w:p>
+    <w:p>
+      <w:pPr>
+        <w:pStyle w:val="ListParagraph"/>
+      </w:pPr>
+      <w:r>
+        <w:t xml:space="preserve">• Generated interface diagrams for both modes.</w:t>
+      </w:r>
+    </w:p>
+    <w:p>
+      <w:pPr>
+        <w:pStyle w:val="ListParagraph"/>
+      </w:pPr>
+      <w:r>
+        <w:t xml:space="preserve">• Report figures generated by Python for system architecture, strike logic, and backend latency.</w:t>
+      </w:r>
+    </w:p>
+    <w:p>
+      <w:pPr>
+        <w:pStyle w:val="ListParagraph"/>
+      </w:pPr>
+      <w:r>
+        <w:t xml:space="preserve">• A repeatable test and quality-check pipeline covering mapping, detector behavior, pad validation, ROI helpers, and benchmark helpers.</w:t>
+      </w:r>
+    </w:p>
+    <w:p>
+      <w:pPr>
+        <w:pStyle w:val="Normal"/>
+      </w:pPr>
+      <w:r>
+        <w:t xml:space="preserve"/>
+      </w:r>
+    </w:p>
+    <w:p>
+      <w:pPr>
+        <w:pStyle w:val="Heading2"/>
+      </w:pPr>
+      <w:r>
+        <w:t xml:space="preserve">2. System Overview</w:t>
+      </w:r>
+    </w:p>
+    <w:p>
+      <w:pPr>
+        <w:pStyle w:val="Normal"/>
+      </w:pPr>
+      <w:r>
+        <w:t xml:space="preserve">Figure 1 summarizes the runtime pipeline. Frames are captured from a USB camera, processed by one of several hand-tracking backends, converted into per-hand landmark coordinates, passed to the strike detector, mapped to either piano notes or drum pad sounds, and finally played through pre-rendered PCM audio buffers.</w:t>
+      </w:r>
+    </w:p>
+    <w:p>
+      <w:pPr>
+        <w:jc w:val="center"/>
+      </w:pPr>
+      <w:r>
+        <w:drawing>
+          <wp:inline distT="0" distB="0" distL="0" distR="0">
+            <wp:extent cx="5669280" cy="2506418"/>
+            <wp:docPr id="2" name="system_pipeline.png"/>
+            <wp:cNvGraphicFramePr>
+              <a:graphicFrameLocks noChangeAspect="1"/>
+            </wp:cNvGraphicFramePr>
+            <a:graphic>
+              <a:graphicData uri="http://schemas.openxmlformats.org/drawingml/2006/picture">
+                <pic:pic>
+                  <pic:nvPicPr>
+                    <pic:cNvPr id="2" name="system_pipeline.png"/>
+                    <pic:cNvPicPr/>
+                  </pic:nvPicPr>
+                  <pic:blipFill>
+                    <a:blip r:embed="rId2"/>
                     <a:stretch>
                       <a:fillRect/>
                     </a:stretch>
@@ -339,7 +388,7 @@
         <w:drawing>
           <wp:inline distT="0" distB="0" distL="0" distR="0">
             <wp:extent cx="5669280" cy="3587341"/>
-            <wp:docPr id="2" name="drum_default.png"/>
+            <wp:docPr id="3" name="drum_default.png"/>
             <wp:cNvGraphicFramePr>
               <a:graphicFrameLocks noChangeAspect="1"/>
             </wp:cNvGraphicFramePr>
@@ -347,64 +396,7 @@
               <a:graphicData uri="http://schemas.openxmlformats.org/drawingml/2006/picture">
                 <pic:pic>
                   <pic:nvPicPr>
-                    <pic:cNvPr id="2" name="drum_default.png"/>
-                    <pic:cNvPicPr/>
-                  </pic:nvPicPr>
-                  <pic:blipFill>
-                    <a:blip r:embed="rId2"/>
-                    <a:stretch>
-                      <a:fillRect/>
-                    </a:stretch>
-                  </pic:blipFill>
-                  <pic:spPr>
-                    <a:xfrm>
-                      <a:off x="0" y="0"/>
-                      <a:ext cx="5669280" cy="3587341"/>
-                    </a:xfrm>
-                    <a:prstGeom prst="rect">
-                      <a:avLst/>
-                    </a:prstGeom>
-                  </pic:spPr>
-                </pic:pic>
-              </a:graphicData>
-            </a:graphic>
-          </wp:inline>
-        </w:drawing>
-      </w:r>
-    </w:p>
-    <w:p>
-      <w:pPr>
-        <w:pStyle w:val="Caption"/>
-      </w:pPr>
-      <w:r>
-        <w:t xml:space="preserve">Figure 2. Default drum pad layout generated by tools/gen_instrument_diagrams.py.</w:t>
-      </w:r>
-    </w:p>
-    <w:p>
-      <w:pPr>
-        <w:pStyle w:val="Normal"/>
-      </w:pPr>
-      <w:r>
-        <w:t xml:space="preserve">A larger diagram lists all built-in drum sound keys available for custom pad layouts.</w:t>
-      </w:r>
-    </w:p>
-    <w:p>
-      <w:pPr>
-        <w:jc w:val="center"/>
-      </w:pPr>
-      <w:r>
-        <w:drawing>
-          <wp:inline distT="0" distB="0" distL="0" distR="0">
-            <wp:extent cx="5669280" cy="3587341"/>
-            <wp:docPr id="3" name="drum_all_instruments.png"/>
-            <wp:cNvGraphicFramePr>
-              <a:graphicFrameLocks noChangeAspect="1"/>
-            </wp:cNvGraphicFramePr>
-            <a:graphic>
-              <a:graphicData uri="http://schemas.openxmlformats.org/drawingml/2006/picture">
-                <pic:pic>
-                  <pic:nvPicPr>
-                    <pic:cNvPr id="3" name="drum_all_instruments.png"/>
+                    <pic:cNvPr id="3" name="drum_default.png"/>
                     <pic:cNvPicPr/>
                   </pic:nvPicPr>
                   <pic:blipFill>
@@ -434,6 +426,63 @@
         <w:pStyle w:val="Caption"/>
       </w:pPr>
       <w:r>
+        <w:t xml:space="preserve">Figure 2. Default drum pad layout generated by tools/gen_instrument_diagrams.py.</w:t>
+      </w:r>
+    </w:p>
+    <w:p>
+      <w:pPr>
+        <w:pStyle w:val="Normal"/>
+      </w:pPr>
+      <w:r>
+        <w:t xml:space="preserve">A larger diagram lists all built-in drum sound keys available for custom pad layouts.</w:t>
+      </w:r>
+    </w:p>
+    <w:p>
+      <w:pPr>
+        <w:jc w:val="center"/>
+      </w:pPr>
+      <w:r>
+        <w:drawing>
+          <wp:inline distT="0" distB="0" distL="0" distR="0">
+            <wp:extent cx="5669280" cy="3587341"/>
+            <wp:docPr id="4" name="drum_all_instruments.png"/>
+            <wp:cNvGraphicFramePr>
+              <a:graphicFrameLocks noChangeAspect="1"/>
+            </wp:cNvGraphicFramePr>
+            <a:graphic>
+              <a:graphicData uri="http://schemas.openxmlformats.org/drawingml/2006/picture">
+                <pic:pic>
+                  <pic:nvPicPr>
+                    <pic:cNvPr id="4" name="drum_all_instruments.png"/>
+                    <pic:cNvPicPr/>
+                  </pic:nvPicPr>
+                  <pic:blipFill>
+                    <a:blip r:embed="rId4"/>
+                    <a:stretch>
+                      <a:fillRect/>
+                    </a:stretch>
+                  </pic:blipFill>
+                  <pic:spPr>
+                    <a:xfrm>
+                      <a:off x="0" y="0"/>
+                      <a:ext cx="5669280" cy="3587341"/>
+                    </a:xfrm>
+                    <a:prstGeom prst="rect">
+                      <a:avLst/>
+                    </a:prstGeom>
+                  </pic:spPr>
+                </pic:pic>
+              </a:graphicData>
+            </a:graphic>
+          </wp:inline>
+        </w:drawing>
+      </w:r>
+    </w:p>
+    <w:p>
+      <w:pPr>
+        <w:pStyle w:val="Caption"/>
+      </w:pPr>
+      <w:r>
         <w:t xml:space="preserve">Figure 3. Built-in drum sound-key catalog generated by tools/gen_instrument_diagrams.py.</w:t>
       </w:r>
     </w:p>
@@ -699,7 +748,7 @@
         <w:drawing>
           <wp:inline distT="0" distB="0" distL="0" distR="0">
             <wp:extent cx="5669280" cy="4089915"/>
-            <wp:docPr id="4" name="piano_default.png"/>
+            <wp:docPr id="5" name="piano_default.png"/>
             <wp:cNvGraphicFramePr>
               <a:graphicFrameLocks noChangeAspect="1"/>
             </wp:cNvGraphicFramePr>
@@ -707,64 +756,7 @@
               <a:graphicData uri="http://schemas.openxmlformats.org/drawingml/2006/picture">
                 <pic:pic>
                   <pic:nvPicPr>
-                    <pic:cNvPr id="4" name="piano_default.png"/>
-                    <pic:cNvPicPr/>
-                  </pic:nvPicPr>
-                  <pic:blipFill>
-                    <a:blip r:embed="rId4"/>
-                    <a:stretch>
-                      <a:fillRect/>
-                    </a:stretch>
-                  </pic:blipFill>
-                  <pic:spPr>
-                    <a:xfrm>
-                      <a:off x="0" y="0"/>
-                      <a:ext cx="5669280" cy="4089915"/>
-                    </a:xfrm>
-                    <a:prstGeom prst="rect">
-                      <a:avLst/>
-                    </a:prstGeom>
-                  </pic:spPr>
-                </pic:pic>
-              </a:graphicData>
-            </a:graphic>
-          </wp:inline>
-        </w:drawing>
-      </w:r>
-    </w:p>
-    <w:p>
-      <w:pPr>
-        <w:pStyle w:val="Caption"/>
-      </w:pPr>
-      <w:r>
-        <w:t xml:space="preserve">Figure 4. Default piano layout generated by tools/gen_instrument_diagrams.py.</w:t>
-      </w:r>
-    </w:p>
-    <w:p>
-      <w:pPr>
-        <w:pStyle w:val="Normal"/>
-      </w:pPr>
-      <w:r>
-        <w:t xml:space="preserve">A custom JSON piano layout example is also generated using the same default slot order.</w:t>
-      </w:r>
-    </w:p>
-    <w:p>
-      <w:pPr>
-        <w:jc w:val="center"/>
-      </w:pPr>
-      <w:r>
-        <w:drawing>
-          <wp:inline distT="0" distB="0" distL="0" distR="0">
-            <wp:extent cx="5669280" cy="4089915"/>
-            <wp:docPr id="5" name="piano_custom.png"/>
-            <wp:cNvGraphicFramePr>
-              <a:graphicFrameLocks noChangeAspect="1"/>
-            </wp:cNvGraphicFramePr>
-            <a:graphic>
-              <a:graphicData uri="http://schemas.openxmlformats.org/drawingml/2006/picture">
-                <pic:pic>
-                  <pic:nvPicPr>
-                    <pic:cNvPr id="5" name="piano_custom.png"/>
+                    <pic:cNvPr id="5" name="piano_default.png"/>
                     <pic:cNvPicPr/>
                   </pic:nvPicPr>
                   <pic:blipFill>
@@ -794,6 +786,63 @@
         <w:pStyle w:val="Caption"/>
       </w:pPr>
       <w:r>
+        <w:t xml:space="preserve">Figure 4. Default piano layout generated by tools/gen_instrument_diagrams.py.</w:t>
+      </w:r>
+    </w:p>
+    <w:p>
+      <w:pPr>
+        <w:pStyle w:val="Normal"/>
+      </w:pPr>
+      <w:r>
+        <w:t xml:space="preserve">A custom JSON piano layout example is also generated using the same default slot order.</w:t>
+      </w:r>
+    </w:p>
+    <w:p>
+      <w:pPr>
+        <w:jc w:val="center"/>
+      </w:pPr>
+      <w:r>
+        <w:drawing>
+          <wp:inline distT="0" distB="0" distL="0" distR="0">
+            <wp:extent cx="5669280" cy="4089915"/>
+            <wp:docPr id="6" name="piano_custom.png"/>
+            <wp:cNvGraphicFramePr>
+              <a:graphicFrameLocks noChangeAspect="1"/>
+            </wp:cNvGraphicFramePr>
+            <a:graphic>
+              <a:graphicData uri="http://schemas.openxmlformats.org/drawingml/2006/picture">
+                <pic:pic>
+                  <pic:nvPicPr>
+                    <pic:cNvPr id="6" name="piano_custom.png"/>
+                    <pic:cNvPicPr/>
+                  </pic:nvPicPr>
+                  <pic:blipFill>
+                    <a:blip r:embed="rId6"/>
+                    <a:stretch>
+                      <a:fillRect/>
+                    </a:stretch>
+                  </pic:blipFill>
+                  <pic:spPr>
+                    <a:xfrm>
+                      <a:off x="0" y="0"/>
+                      <a:ext cx="5669280" cy="4089915"/>
+                    </a:xfrm>
+                    <a:prstGeom prst="rect">
+                      <a:avLst/>
+                    </a:prstGeom>
+                  </pic:spPr>
+                </pic:pic>
+              </a:graphicData>
+            </a:graphic>
+          </wp:inline>
+        </w:drawing>
+      </w:r>
+    </w:p>
+    <w:p>
+      <w:pPr>
+        <w:pStyle w:val="Caption"/>
+      </w:pPr>
+      <w:r>
         <w:t xml:space="preserve">Figure 5. Piano custom-layout example generated by tools/gen_instrument_diagrams.py.</w:t>
       </w:r>
     </w:p>
@@ -850,7 +899,7 @@
         <w:pStyle w:val="Normal"/>
       </w:pPr>
       <w:r>
-        <w:t xml:space="preserve">AI Air-Drum Pad sits at the intersection of gesture-based musical interfaces, real-time hand tracking, and embedded edge AI. Prior gesture instruments often use depth cameras, wearable sensors, inertial measurement units, or vision-based pose estimation. Compared with wearable sensors, camera-only systems reduce setup cost and improve accessibility, but they must infer intent from noisy visual motion alone.</w:t>
+        <w:t xml:space="preserve">PANDA sits at the intersection of gesture-based musical interfaces, real-time hand tracking, and embedded edge AI. Prior gesture instruments often use depth cameras, wearable sensors, inertial measurement units, or vision-based pose estimation. Compared with wearable sensors, camera-only systems reduce setup cost and improve accessibility, but they must infer intent from noisy visual motion alone.</w:t>
       </w:r>
     </w:p>
     <w:p>
@@ -1095,7 +1144,7 @@
         <w:drawing>
           <wp:inline distT="0" distB="0" distL="0" distR="0">
             <wp:extent cx="5669280" cy="3025644"/>
-            <wp:docPr id="6" name="strike_logic.png"/>
+            <wp:docPr id="7" name="strike_logic.png"/>
             <wp:cNvGraphicFramePr>
               <a:graphicFrameLocks noChangeAspect="1"/>
             </wp:cNvGraphicFramePr>
@@ -1103,11 +1152,11 @@
               <a:graphicData uri="http://schemas.openxmlformats.org/drawingml/2006/picture">
                 <pic:pic>
                   <pic:nvPicPr>
-                    <pic:cNvPr id="6" name="strike_logic.png"/>
+                    <pic:cNvPr id="7" name="strike_logic.png"/>
                     <pic:cNvPicPr/>
                   </pic:nvPicPr>
                   <pic:blipFill>
-                    <a:blip r:embed="rId6"/>
+                    <a:blip r:embed="rId7"/>
                     <a:stretch>
                       <a:fillRect/>
                     </a:stretch>
@@ -2387,7 +2436,7 @@
         <w:drawing>
           <wp:inline distT="0" distB="0" distL="0" distR="0">
             <wp:extent cx="5669280" cy="2508969"/>
-            <wp:docPr id="7" name="backend_latency.png"/>
+            <wp:docPr id="8" name="backend_latency.png"/>
             <wp:cNvGraphicFramePr>
               <a:graphicFrameLocks noChangeAspect="1"/>
             </wp:cNvGraphicFramePr>
@@ -2395,11 +2444,11 @@
               <a:graphicData uri="http://schemas.openxmlformats.org/drawingml/2006/picture">
                 <pic:pic>
                   <pic:nvPicPr>
-                    <pic:cNvPr id="7" name="backend_latency.png"/>
+                    <pic:cNvPr id="8" name="backend_latency.png"/>
                     <pic:cNvPicPr/>
                   </pic:nvPicPr>
                   <pic:blipFill>
-                    <a:blip r:embed="rId7"/>
+                    <a:blip r:embed="rId8"/>
                     <a:stretch>
                       <a:fillRect/>
                     </a:stretch>
@@ -4153,7 +4202,7 @@
         <w:pStyle w:val="Normal"/>
       </w:pPr>
       <w:r>
-        <w:t xml:space="preserve">AI Air-Drum Pad demonstrates a complete camera-based musical interface that converts hand motion into playable drum and piano events. The final implementation includes a pad-based drum interface, a corrected piano note mapping, low-latency audio playback, generated documentation diagrams, and a repeatable validation suite. The project shows that edge AI hand tracking can support expressive contactless musical interaction, but also highlights the importance of robust strike detection, accurate hand localization, and careful latency measurement. With further evaluation and NPU optimization, the system can serve as a strong foundation for embedded AI musical interfaces and real-time gesture-control demonstrations.</w:t>
+        <w:t xml:space="preserve">PANDA demonstrates a complete camera-based musical interface that converts hand motion into playable drum and piano events. The final implementation includes a pad-based drum interface, a corrected piano note mapping, low-latency audio playback, generated documentation diagrams, and a repeatable validation suite. The project shows that edge AI hand tracking can support expressive contactless musical interaction, but also highlights the importance of robust strike detection, accurate hand localization, and careful latency measurement. With further evaluation and NPU optimization, the system can serve as a strong foundation for embedded AI musical interfaces and real-time gesture-control demonstrations.</w:t>
       </w:r>
     </w:p>
     <w:p>
@@ -4201,7 +4250,7 @@
         <w:pStyle w:val="Normal"/>
       </w:pPr>
       <w:r>
-        <w:t xml:space="preserve">[1] AI Air-Drum Pad repository artifact, air_drum_pad/ in git@github.com:GW-arch/deepx.git: source code, tests, generated figures, instrument images, and recorded benchmark artifacts used to construct this self-contained report. [2] MediaPipe Hands / hand landmark model family, used through CPU MediaPipe and TFLite-derived pipeline paths. [3] OpenCV, used for camera capture, drawing, and display. [4] pygame, used for low-latency playback of pre-rendered PCM sound buffers. [5] DeepX DX-RT / DX-COM toolchain, used for .dxnn NPU hand-landmark inference experiments.</w:t>
+        <w:t xml:space="preserve">[1] PANDA / AI Air-Drum Pad repository artifact, air_drum_pad/ in git@github.com:GW-arch/deepx.git: source code, tests, generated figures, instrument images, and recorded benchmark artifacts used to construct this self-contained report. [2] MediaPipe Hands / hand landmark model family, used through CPU MediaPipe and TFLite-derived pipeline paths. [3] OpenCV, used for camera capture, drawing, and display. [4] pygame, used for low-latency playback of pre-rendered PCM sound buffers. [5] DeepX DX-RT / DX-COM toolchain, used for .dxnn NPU hand-landmark inference experiments.</w:t>
       </w:r>
     </w:p>
     <w:p>

</xml_diff>

<commit_message>
Emphasize PANDA acronym expansion
</commit_message>
<xml_diff>
--- a/air_drum_pad/docs/FINAL_REPORT_AI_AIR_DRUM_PAD.docx
+++ b/air_drum_pad/docs/FINAL_REPORT_AI_AIR_DRUM_PAD.docx
@@ -7,7 +7,62 @@
         <w:pStyle w:val="Heading1"/>
       </w:pPr>
       <w:r>
-        <w:t xml:space="preserve">PANDA: Pose-Aware NPU-Driven Digital Audio Interface for Contactless Musical Performance</w:t>
+        <w:t xml:space="preserve">PANDA: </w:t>
+      </w:r>
+      <w:r>
+        <w:rPr>
+          <w:b/>
+          <w:bCs/>
+          <w:u w:val="single"/>
+        </w:rPr>
+        <w:t xml:space="preserve">P</w:t>
+      </w:r>
+      <w:r>
+        <w:t xml:space="preserve">ose-</w:t>
+      </w:r>
+      <w:r>
+        <w:rPr>
+          <w:b/>
+          <w:bCs/>
+          <w:u w:val="single"/>
+        </w:rPr>
+        <w:t xml:space="preserve">A</w:t>
+      </w:r>
+      <w:r>
+        <w:t xml:space="preserve">ware </w:t>
+      </w:r>
+      <w:r>
+        <w:rPr>
+          <w:b/>
+          <w:bCs/>
+          <w:u w:val="single"/>
+        </w:rPr>
+        <w:t xml:space="preserve">N</w:t>
+      </w:r>
+      <w:r>
+        <w:t xml:space="preserve">PU </w:t>
+      </w:r>
+      <w:r>
+        <w:rPr>
+          <w:b/>
+          <w:bCs/>
+          <w:u w:val="single"/>
+        </w:rPr>
+        <w:t xml:space="preserve">D</w:t>
+      </w:r>
+      <w:r>
+        <w:t xml:space="preserve">igital </w:t>
+      </w:r>
+      <w:r>
+        <w:rPr>
+          <w:b/>
+          <w:bCs/>
+          <w:u w:val="single"/>
+        </w:rPr>
+        <w:t xml:space="preserve">A</w:t>
+      </w:r>
+      <w:r>
+        <w:t xml:space="preserve">udio Interface for Contactless Musical Performance</w:t>
       </w:r>
     </w:p>
     <w:p>
@@ -56,14 +111,97 @@
         <w:pStyle w:val="Caption"/>
       </w:pPr>
       <w:r>
-        <w:t xml:space="preserve">PANDA project icon generated by tools/gen_report_figures.py.</w:t>
-      </w:r>
-    </w:p>
-    <w:p>
-      <w:pPr>
-        <w:pStyle w:val="Normal"/>
-      </w:pPr>
-      <w:r>
+        <w:t xml:space="preserve">PANDA project icon generated by </w:t>
+      </w:r>
+      <w:r>
+        <w:rPr>
+          <w:rFonts w:ascii="Courier New" w:hAnsi="Courier New"/>
+        </w:rPr>
+        <w:t xml:space="preserve">tools/gen_report_figures.py</w:t>
+      </w:r>
+      <w:r>
+        <w:t xml:space="preserve">.</w:t>
+      </w:r>
+    </w:p>
+    <w:p>
+      <w:pPr>
+        <w:pStyle w:val="Normal"/>
+      </w:pPr>
+      <w:r>
+        <w:rPr>
+          <w:b/>
+          <w:bCs/>
+        </w:rPr>
+        <w:t xml:space="preserve">Acronym expansion:</w:t>
+      </w:r>
+      <w:r>
+        <w:t xml:space="preserve"> </w:t>
+      </w:r>
+      <w:r>
+        <w:rPr>
+          <w:b/>
+          <w:bCs/>
+          <w:u w:val="single"/>
+        </w:rPr>
+        <w:t xml:space="preserve">P</w:t>
+      </w:r>
+      <w:r>
+        <w:t xml:space="preserve">ose-</w:t>
+      </w:r>
+      <w:r>
+        <w:rPr>
+          <w:b/>
+          <w:bCs/>
+          <w:u w:val="single"/>
+        </w:rPr>
+        <w:t xml:space="preserve">A</w:t>
+      </w:r>
+      <w:r>
+        <w:t xml:space="preserve">ware </w:t>
+      </w:r>
+      <w:r>
+        <w:rPr>
+          <w:b/>
+          <w:bCs/>
+          <w:u w:val="single"/>
+        </w:rPr>
+        <w:t xml:space="preserve">N</w:t>
+      </w:r>
+      <w:r>
+        <w:t xml:space="preserve">PU </w:t>
+      </w:r>
+      <w:r>
+        <w:rPr>
+          <w:b/>
+          <w:bCs/>
+          <w:u w:val="single"/>
+        </w:rPr>
+        <w:t xml:space="preserve">D</w:t>
+      </w:r>
+      <w:r>
+        <w:t xml:space="preserve">igital </w:t>
+      </w:r>
+      <w:r>
+        <w:rPr>
+          <w:b/>
+          <w:bCs/>
+          <w:u w:val="single"/>
+        </w:rPr>
+        <w:t xml:space="preserve">A</w:t>
+      </w:r>
+      <w:r>
+        <w:t xml:space="preserve">udio Interface</w:t>
+      </w:r>
+    </w:p>
+    <w:p>
+      <w:pPr>
+        <w:pStyle w:val="Normal"/>
+      </w:pPr>
+      <w:r>
+        <w:rPr>
+          <w:b/>
+          <w:bCs/>
+        </w:rPr>
         <w:t xml:space="preserve">Final Report</w:t>
       </w:r>
     </w:p>
@@ -72,40 +210,80 @@
         <w:pStyle w:val="Normal"/>
       </w:pPr>
       <w:r>
-        <w:t xml:space="preserve">Authors: FILLME</w:t>
-      </w:r>
-    </w:p>
-    <w:p>
-      <w:pPr>
-        <w:pStyle w:val="Normal"/>
-      </w:pPr>
-      <w:r>
-        <w:t xml:space="preserve">Affiliation: FILLME</w:t>
-      </w:r>
-    </w:p>
-    <w:p>
-      <w:pPr>
-        <w:pStyle w:val="Normal"/>
-      </w:pPr>
-      <w:r>
-        <w:t xml:space="preserve">Date: 2026-05-27</w:t>
-      </w:r>
-    </w:p>
-    <w:p>
-      <w:pPr>
-        <w:pStyle w:val="Normal"/>
-      </w:pPr>
-      <w:r>
-        <w:t xml:space="preserve">Repository: air_drum_pad/ in git@github.com:GW-arch/deepx.git</w:t>
-      </w:r>
-    </w:p>
-    <w:p>
-      <w:pPr>
-        <w:pStyle w:val="Normal"/>
-      </w:pPr>
-      <w:r>
-        <w:t xml:space="preserve"/>
-      </w:r>
+        <w:rPr>
+          <w:b/>
+          <w:bCs/>
+        </w:rPr>
+        <w:t xml:space="preserve">Authors:</w:t>
+      </w:r>
+      <w:r>
+        <w:t xml:space="preserve"> FILLME</w:t>
+      </w:r>
+    </w:p>
+    <w:p>
+      <w:pPr>
+        <w:pStyle w:val="Normal"/>
+      </w:pPr>
+      <w:r>
+        <w:rPr>
+          <w:b/>
+          <w:bCs/>
+        </w:rPr>
+        <w:t xml:space="preserve">Affiliation:</w:t>
+      </w:r>
+      <w:r>
+        <w:t xml:space="preserve"> FILLME</w:t>
+      </w:r>
+    </w:p>
+    <w:p>
+      <w:pPr>
+        <w:pStyle w:val="Normal"/>
+      </w:pPr>
+      <w:r>
+        <w:rPr>
+          <w:b/>
+          <w:bCs/>
+        </w:rPr>
+        <w:t xml:space="preserve">Date:</w:t>
+      </w:r>
+      <w:r>
+        <w:t xml:space="preserve"> 2026-05-27</w:t>
+      </w:r>
+    </w:p>
+    <w:p>
+      <w:pPr>
+        <w:pStyle w:val="Normal"/>
+      </w:pPr>
+      <w:r>
+        <w:rPr>
+          <w:b/>
+          <w:bCs/>
+        </w:rPr>
+        <w:t xml:space="preserve">Repository:</w:t>
+      </w:r>
+      <w:r>
+        <w:t xml:space="preserve"> </w:t>
+      </w:r>
+      <w:r>
+        <w:rPr>
+          <w:rFonts w:ascii="Courier New" w:hAnsi="Courier New"/>
+        </w:rPr>
+        <w:t xml:space="preserve">air_drum_pad/</w:t>
+      </w:r>
+      <w:r>
+        <w:t xml:space="preserve"> in </w:t>
+      </w:r>
+      <w:r>
+        <w:rPr>
+          <w:rFonts w:ascii="Courier New" w:hAnsi="Courier New"/>
+        </w:rPr>
+        <w:t xml:space="preserve">git@github.com:GW-arch/deepx.git</w:t>
+      </w:r>
+    </w:p>
+    <w:p>
+      <w:pPr>
+        <w:pStyle w:val="Normal"/>
+      </w:pPr>
     </w:p>
     <w:p>
       <w:pPr>
@@ -120,24 +298,141 @@
         <w:pStyle w:val="Normal"/>
       </w:pPr>
       <w:r>
-        <w:t xml:space="preserve">This report presents PANDA (Pose-Aware NPU-Driven Digital Audio Interface), the final titled version of AI Air-Drum Pad, a real-time camera-based musical interface that converts hand and finger motions into playable drum and piano events. The system tracks hand landmarks from a USB camera, estimates downward fingertip velocity and finger-joint angular velocity, and triggers audio only when both motion cues indicate an intentional strike. Two musical modes are implemented on the same perception-and-strike-detection core: (1) a drum pad mode, where any fingertip may strike an on-screen rectangular pad, and (2) a piano mode, where notes are mapped to hand and finger identity. The final piano default layout maps the left hand from thumb to pinky as G4, F4, E4, D4, C4 and the right hand as C5, D5, E5, F5, G5. The implementation supports CPU MediaPipe, CPU TFLite baseline, hybrid CPU+NPU hand-landmark inference, and a low-latency NPU dual-halves mode. Evaluation utilities and unit tests validate strike detection, pad-zone parsing, piano-note mapping, ROI transforms, and benchmark helpers. Prototype measurements show that the low-latency NPU dual-halves backend can approach the 60 FPS frame budget, while the more accurate palm-detection pipeline is limited by CPU palm detection. The project demonstrates a practical path toward low-cost, contactless musical instruments on edge AI hardware, with clear remaining work in end-to-end audio-latency measurement, robust hit-accuracy evaluation, and user studies.</w:t>
-      </w:r>
-    </w:p>
-    <w:p>
-      <w:pPr>
-        <w:pStyle w:val="Normal"/>
-      </w:pPr>
-      <w:r>
-        <w:t xml:space="preserve">Keywords: PANDA, contactless musical interface, hand tracking, gesture recognition, air drums, virtual piano, edge AI, NPU, real-time interaction</w:t>
-      </w:r>
-    </w:p>
-    <w:p>
-      <w:pPr>
-        <w:pStyle w:val="Normal"/>
-      </w:pPr>
-      <w:r>
-        <w:t xml:space="preserve"/>
-      </w:r>
+        <w:t xml:space="preserve">This report presents </w:t>
+      </w:r>
+      <w:r>
+        <w:rPr>
+          <w:b/>
+          <w:bCs/>
+        </w:rPr>
+        <w:t xml:space="preserve">PANDA</w:t>
+      </w:r>
+      <w:r>
+        <w:t xml:space="preserve">, short for </w:t>
+      </w:r>
+      <w:r>
+        <w:rPr>
+          <w:b/>
+          <w:bCs/>
+          <w:u w:val="single"/>
+        </w:rPr>
+        <w:t xml:space="preserve">P</w:t>
+      </w:r>
+      <w:r>
+        <w:t xml:space="preserve">ose-</w:t>
+      </w:r>
+      <w:r>
+        <w:rPr>
+          <w:b/>
+          <w:bCs/>
+          <w:u w:val="single"/>
+        </w:rPr>
+        <w:t xml:space="preserve">A</w:t>
+      </w:r>
+      <w:r>
+        <w:t xml:space="preserve">ware </w:t>
+      </w:r>
+      <w:r>
+        <w:rPr>
+          <w:b/>
+          <w:bCs/>
+          <w:u w:val="single"/>
+        </w:rPr>
+        <w:t xml:space="preserve">N</w:t>
+      </w:r>
+      <w:r>
+        <w:t xml:space="preserve">PU </w:t>
+      </w:r>
+      <w:r>
+        <w:rPr>
+          <w:b/>
+          <w:bCs/>
+          <w:u w:val="single"/>
+        </w:rPr>
+        <w:t xml:space="preserve">D</w:t>
+      </w:r>
+      <w:r>
+        <w:t xml:space="preserve">igital </w:t>
+      </w:r>
+      <w:r>
+        <w:rPr>
+          <w:b/>
+          <w:bCs/>
+          <w:u w:val="single"/>
+        </w:rPr>
+        <w:t xml:space="preserve">A</w:t>
+      </w:r>
+      <w:r>
+        <w:t xml:space="preserve">udio Interface, the final titled version of </w:t>
+      </w:r>
+      <w:r>
+        <w:rPr>
+          <w:b/>
+          <w:bCs/>
+        </w:rPr>
+        <w:t xml:space="preserve">AI Air-Drum Pad</w:t>
+      </w:r>
+      <w:r>
+        <w:t xml:space="preserve">, a real-time camera-based musical interface that converts hand and finger motions into playable drum and piano events. The system tracks hand landmarks from a USB camera, estimates downward fingertip velocity and finger-joint angular velocity, and triggers audio only when both motion cues indicate an intentional strike. Two musical modes are implemented on the same perception-and-strike-detection core: (1) a </w:t>
+      </w:r>
+      <w:r>
+        <w:rPr>
+          <w:b/>
+          <w:bCs/>
+        </w:rPr>
+        <w:t xml:space="preserve">drum pad mode</w:t>
+      </w:r>
+      <w:r>
+        <w:t xml:space="preserve">, where any fingertip may strike an on-screen rectangular pad, and (2) a </w:t>
+      </w:r>
+      <w:r>
+        <w:rPr>
+          <w:b/>
+          <w:bCs/>
+        </w:rPr>
+        <w:t xml:space="preserve">piano mode</w:t>
+      </w:r>
+      <w:r>
+        <w:t xml:space="preserve">, where notes are mapped to hand and finger identity. The final piano default layout maps the left hand from thumb to pinky as </w:t>
+      </w:r>
+      <w:r>
+        <w:rPr>
+          <w:rFonts w:ascii="Courier New" w:hAnsi="Courier New"/>
+        </w:rPr>
+        <w:t xml:space="preserve">G4, F4, E4, D4, C4</w:t>
+      </w:r>
+      <w:r>
+        <w:t xml:space="preserve"> and the right hand as </w:t>
+      </w:r>
+      <w:r>
+        <w:rPr>
+          <w:rFonts w:ascii="Courier New" w:hAnsi="Courier New"/>
+        </w:rPr>
+        <w:t xml:space="preserve">C5, D5, E5, F5, G5</w:t>
+      </w:r>
+      <w:r>
+        <w:t xml:space="preserve">. The implementation supports CPU MediaPipe, CPU TFLite baseline, hybrid CPU+NPU hand-landmark inference, and a low-latency NPU dual-halves mode. Evaluation utilities and unit tests validate strike detection, pad-zone parsing, piano-note mapping, ROI transforms, and benchmark helpers. Prototype measurements show that the low-latency NPU dual-halves backend can approach the 60 FPS frame budget, while the more accurate palm-detection pipeline is limited by CPU palm detection. The project demonstrates a practical path toward low-cost, contactless musical instruments on edge AI hardware, with clear remaining work in end-to-end audio-latency measurement, robust hit-accuracy evaluation, and user studies.</w:t>
+      </w:r>
+    </w:p>
+    <w:p>
+      <w:pPr>
+        <w:pStyle w:val="Normal"/>
+      </w:pPr>
+      <w:r>
+        <w:rPr>
+          <w:b/>
+          <w:bCs/>
+        </w:rPr>
+        <w:t xml:space="preserve">Keywords:</w:t>
+      </w:r>
+      <w:r>
+        <w:t xml:space="preserve"> PANDA, contactless musical interface, hand tracking, gesture recognition, air drums, virtual piano, edge AI, NPU, real-time interaction</w:t>
+      </w:r>
+    </w:p>
+    <w:p>
+      <w:pPr>
+        <w:pStyle w:val="Normal"/>
+      </w:pPr>
     </w:p>
     <w:p>
       <w:pPr>
@@ -152,7 +447,17 @@
         <w:pStyle w:val="Normal"/>
       </w:pPr>
       <w:r>
-        <w:t xml:space="preserve">Musical performance interfaces traditionally rely on physical contact: a drumstick contacts a drumhead, or a finger depresses a piano key. Contact provides both tactile feedback and a clear sensing event. However, camera-based hand tracking makes it possible to build contactless musical instruments that require no specialized controller beyond a camera and display. Such systems are attractive for prototyping, education, accessibility, public installations, and embedded AI demonstrations.</w:t>
+        <w:t xml:space="preserve">Musical performance interfaces traditionally rely on physical contact: a drumstick contacts a drumhead, or a finger depresses a piano key. Contact provides both tactile feedback and a clear sensing event. However, camera-based hand tracking makes it possible to build </w:t>
+      </w:r>
+      <w:r>
+        <w:rPr>
+          <w:b/>
+          <w:bCs/>
+        </w:rPr>
+        <w:t xml:space="preserve">contactless musical instruments</w:t>
+      </w:r>
+      <w:r>
+        <w:t xml:space="preserve"> that require no specialized controller beyond a camera and display. Such systems are attractive for prototyping, education, accessibility, public installations, and embedded AI demonstrations.</w:t>
       </w:r>
     </w:p>
     <w:p>
@@ -168,7 +473,17 @@
         <w:pStyle w:val="ListParagraph"/>
       </w:pPr>
       <w:r>
-        <w:t xml:space="preserve">1. Fingertip downward velocity: the fingertip moves rapidly in the image direction associated with a striking motion.</w:t>
+        <w:t xml:space="preserve">1. </w:t>
+      </w:r>
+      <w:r>
+        <w:rPr>
+          <w:b/>
+          <w:bCs/>
+        </w:rPr>
+        <w:t xml:space="preserve">Fingertip downward velocity</w:t>
+      </w:r>
+      <w:r>
+        <w:t xml:space="preserve">: the fingertip moves rapidly in the image direction associated with a striking motion.</w:t>
       </w:r>
     </w:p>
     <w:p>
@@ -176,7 +491,17 @@
         <w:pStyle w:val="ListParagraph"/>
       </w:pPr>
       <w:r>
-        <w:t xml:space="preserve">2. Finger-joint angular velocity: the finger itself articulates, distinguishing a deliberate finger strike from arm-only translation.</w:t>
+        <w:t xml:space="preserve">2. </w:t>
+      </w:r>
+      <w:r>
+        <w:rPr>
+          <w:b/>
+          <w:bCs/>
+        </w:rPr>
+        <w:t xml:space="preserve">Finger-joint angular velocity</w:t>
+      </w:r>
+      <w:r>
+        <w:t xml:space="preserve">: the finger itself articulates, distinguishing a deliberate finger strike from arm-only translation.</w:t>
       </w:r>
     </w:p>
     <w:p>
@@ -208,7 +533,27 @@
         <w:pStyle w:val="ListParagraph"/>
       </w:pPr>
       <w:r>
-        <w:t xml:space="preserve">• A real-time hand-landmark musical interface supporting both drum pad and piano modes.</w:t>
+        <w:t xml:space="preserve">• A real-time hand-landmark musical interface supporting both </w:t>
+      </w:r>
+      <w:r>
+        <w:rPr>
+          <w:b/>
+          <w:bCs/>
+        </w:rPr>
+        <w:t xml:space="preserve">drum pad</w:t>
+      </w:r>
+      <w:r>
+        <w:t xml:space="preserve"> and </w:t>
+      </w:r>
+      <w:r>
+        <w:rPr>
+          <w:b/>
+          <w:bCs/>
+        </w:rPr>
+        <w:t xml:space="preserve">piano</w:t>
+      </w:r>
+      <w:r>
+        <w:t xml:space="preserve"> modes.</w:t>
       </w:r>
     </w:p>
     <w:p>
@@ -232,7 +577,34 @@
         <w:pStyle w:val="ListParagraph"/>
       </w:pPr>
       <w:r>
-        <w:t xml:space="preserve">• A piano interface with a corrected default mapping: left thumb G4, left pinky C4, right hand C5–G5.</w:t>
+        <w:t xml:space="preserve">• A piano interface with a corrected default mapping: left thumb </w:t>
+      </w:r>
+      <w:r>
+        <w:rPr>
+          <w:rFonts w:ascii="Courier New" w:hAnsi="Courier New"/>
+        </w:rPr>
+        <w:t xml:space="preserve">G4</w:t>
+      </w:r>
+      <w:r>
+        <w:t xml:space="preserve">, left pinky </w:t>
+      </w:r>
+      <w:r>
+        <w:rPr>
+          <w:rFonts w:ascii="Courier New" w:hAnsi="Courier New"/>
+        </w:rPr>
+        <w:t xml:space="preserve">C4</w:t>
+      </w:r>
+      <w:r>
+        <w:t xml:space="preserve">, right hand </w:t>
+      </w:r>
+      <w:r>
+        <w:rPr>
+          <w:rFonts w:ascii="Courier New" w:hAnsi="Courier New"/>
+        </w:rPr>
+        <w:t xml:space="preserve">C5–G5</w:t>
+      </w:r>
+      <w:r>
+        <w:t xml:space="preserve">.</w:t>
       </w:r>
     </w:p>
     <w:p>
@@ -263,9 +635,6 @@
       <w:pPr>
         <w:pStyle w:val="Normal"/>
       </w:pPr>
-      <w:r>
-        <w:t xml:space="preserve"/>
-      </w:r>
     </w:p>
     <w:p>
       <w:pPr>
@@ -329,7 +698,16 @@
         <w:pStyle w:val="Caption"/>
       </w:pPr>
       <w:r>
-        <w:t xml:space="preserve">Figure 1. Runtime pipeline generated by tools/gen_report_figures.py.</w:t>
+        <w:t xml:space="preserve">Figure 1. Runtime pipeline generated by </w:t>
+      </w:r>
+      <w:r>
+        <w:rPr>
+          <w:rFonts w:ascii="Courier New" w:hAnsi="Courier New"/>
+        </w:rPr>
+        <w:t xml:space="preserve">tools/gen_report_figures.py</w:t>
+      </w:r>
+      <w:r>
+        <w:t xml:space="preserve">.</w:t>
       </w:r>
     </w:p>
     <w:p>
@@ -345,7 +723,26 @@
         <w:pStyle w:val="ListParagraph"/>
       </w:pPr>
       <w:r>
-        <w:t xml:space="preserve">• Piano mode: hand_id × fingertip_id → note name.</w:t>
+        <w:t xml:space="preserve">• </w:t>
+      </w:r>
+      <w:r>
+        <w:rPr>
+          <w:b/>
+          <w:bCs/>
+        </w:rPr>
+        <w:t xml:space="preserve">Piano mode:</w:t>
+      </w:r>
+      <w:r>
+        <w:t xml:space="preserve"> </w:t>
+      </w:r>
+      <w:r>
+        <w:rPr>
+          <w:rFonts w:ascii="Courier New" w:hAnsi="Courier New"/>
+        </w:rPr>
+        <w:t xml:space="preserve">hand_id × fingertip_id → note name</w:t>
+      </w:r>
+      <w:r>
+        <w:t xml:space="preserve">.</w:t>
       </w:r>
     </w:p>
     <w:p>
@@ -353,7 +750,26 @@
         <w:pStyle w:val="ListParagraph"/>
       </w:pPr>
       <w:r>
-        <w:t xml:space="preserve">• Drum mode: fingertip position inside pad rectangle → drum sound.</w:t>
+        <w:t xml:space="preserve">• </w:t>
+      </w:r>
+      <w:r>
+        <w:rPr>
+          <w:b/>
+          <w:bCs/>
+        </w:rPr>
+        <w:t xml:space="preserve">Drum mode:</w:t>
+      </w:r>
+      <w:r>
+        <w:t xml:space="preserve"> </w:t>
+      </w:r>
+      <w:r>
+        <w:rPr>
+          <w:rFonts w:ascii="Courier New" w:hAnsi="Courier New"/>
+        </w:rPr>
+        <w:t xml:space="preserve">fingertip position inside pad rectangle → drum sound</w:t>
+      </w:r>
+      <w:r>
+        <w:t xml:space="preserve">.</w:t>
       </w:r>
     </w:p>
     <w:p>
@@ -426,7 +842,16 @@
         <w:pStyle w:val="Caption"/>
       </w:pPr>
       <w:r>
-        <w:t xml:space="preserve">Figure 2. Default drum pad layout generated by tools/gen_instrument_diagrams.py.</w:t>
+        <w:t xml:space="preserve">Figure 2. Default drum pad layout generated by </w:t>
+      </w:r>
+      <w:r>
+        <w:rPr>
+          <w:rFonts w:ascii="Courier New" w:hAnsi="Courier New"/>
+        </w:rPr>
+        <w:t xml:space="preserve">tools/gen_instrument_diagrams.py</w:t>
+      </w:r>
+      <w:r>
+        <w:t xml:space="preserve">.</w:t>
       </w:r>
     </w:p>
     <w:p>
@@ -483,7 +908,16 @@
         <w:pStyle w:val="Caption"/>
       </w:pPr>
       <w:r>
-        <w:t xml:space="preserve">Figure 3. Built-in drum sound-key catalog generated by tools/gen_instrument_diagrams.py.</w:t>
+        <w:t xml:space="preserve">Figure 3. Built-in drum sound-key catalog generated by </w:t>
+      </w:r>
+      <w:r>
+        <w:rPr>
+          <w:rFonts w:ascii="Courier New" w:hAnsi="Courier New"/>
+        </w:rPr>
+        <w:t xml:space="preserve">tools/gen_instrument_diagrams.py</w:t>
+      </w:r>
+      <w:r>
+        <w:t xml:space="preserve">.</w:t>
       </w:r>
     </w:p>
     <w:p>
@@ -737,7 +1171,27 @@
         <w:pStyle w:val="Normal"/>
       </w:pPr>
       <w:r>
-        <w:t xml:space="preserve">This preserves the user's intended left-hand orientation: the left thumb is G4 and the left pinky is C4, while the right hand remains ascending from C5 to G5.</w:t>
+        <w:t xml:space="preserve">This preserves the user's intended left-hand orientation: the </w:t>
+      </w:r>
+      <w:r>
+        <w:rPr>
+          <w:b/>
+          <w:bCs/>
+        </w:rPr>
+        <w:t xml:space="preserve">left thumb is G4</w:t>
+      </w:r>
+      <w:r>
+        <w:t xml:space="preserve"> and the </w:t>
+      </w:r>
+      <w:r>
+        <w:rPr>
+          <w:b/>
+          <w:bCs/>
+        </w:rPr>
+        <w:t xml:space="preserve">left pinky is C4</w:t>
+      </w:r>
+      <w:r>
+        <w:t xml:space="preserve">, while the right hand remains ascending from C5 to G5.</w:t>
       </w:r>
     </w:p>
     <w:p>
@@ -786,7 +1240,16 @@
         <w:pStyle w:val="Caption"/>
       </w:pPr>
       <w:r>
-        <w:t xml:space="preserve">Figure 4. Default piano layout generated by tools/gen_instrument_diagrams.py.</w:t>
+        <w:t xml:space="preserve">Figure 4. Default piano layout generated by </w:t>
+      </w:r>
+      <w:r>
+        <w:rPr>
+          <w:rFonts w:ascii="Courier New" w:hAnsi="Courier New"/>
+        </w:rPr>
+        <w:t xml:space="preserve">tools/gen_instrument_diagrams.py</w:t>
+      </w:r>
+      <w:r>
+        <w:t xml:space="preserve">.</w:t>
       </w:r>
     </w:p>
     <w:p>
@@ -843,7 +1306,16 @@
         <w:pStyle w:val="Caption"/>
       </w:pPr>
       <w:r>
-        <w:t xml:space="preserve">Figure 5. Piano custom-layout example generated by tools/gen_instrument_diagrams.py.</w:t>
+        <w:t xml:space="preserve">Figure 5. Piano custom-layout example generated by </w:t>
+      </w:r>
+      <w:r>
+        <w:rPr>
+          <w:rFonts w:ascii="Courier New" w:hAnsi="Courier New"/>
+        </w:rPr>
+        <w:t xml:space="preserve">tools/gen_instrument_diagrams.py</w:t>
+      </w:r>
+      <w:r>
+        <w:t xml:space="preserve">.</w:t>
       </w:r>
     </w:p>
     <w:p>
@@ -882,9 +1354,6 @@
       <w:pPr>
         <w:pStyle w:val="Normal"/>
       </w:pPr>
-      <w:r>
-        <w:t xml:space="preserve"/>
-      </w:r>
     </w:p>
     <w:p>
       <w:pPr>
@@ -922,9 +1391,6 @@
       <w:pPr>
         <w:pStyle w:val="Normal"/>
       </w:pPr>
-      <w:r>
-        <w:t xml:space="preserve"/>
-      </w:r>
     </w:p>
     <w:p>
       <w:pPr>
@@ -1182,7 +1648,16 @@
         <w:pStyle w:val="Caption"/>
       </w:pPr>
       <w:r>
-        <w:t xml:space="preserve">Figure 6. Strike-decision logic generated by tools/gen_report_figures.py.</w:t>
+        <w:t xml:space="preserve">Figure 6. Strike-decision logic generated by </w:t>
+      </w:r>
+      <w:r>
+        <w:rPr>
+          <w:rFonts w:ascii="Courier New" w:hAnsi="Courier New"/>
+        </w:rPr>
+        <w:t xml:space="preserve">tools/gen_report_figures.py</w:t>
+      </w:r>
+      <w:r>
+        <w:t xml:space="preserve">.</w:t>
       </w:r>
     </w:p>
     <w:p>
@@ -1374,7 +1849,34 @@
         <w:pStyle w:val="Normal"/>
       </w:pPr>
       <w:r>
-        <w:t xml:space="preserve">This mapping is stored in both drumkit_audio.py and the default instruments.piano.example.json used by main.py when no custom piano JSON is provided.</w:t>
+        <w:t xml:space="preserve">This mapping is stored in both </w:t>
+      </w:r>
+      <w:r>
+        <w:rPr>
+          <w:rFonts w:ascii="Courier New" w:hAnsi="Courier New"/>
+        </w:rPr>
+        <w:t xml:space="preserve">drumkit_audio.py</w:t>
+      </w:r>
+      <w:r>
+        <w:t xml:space="preserve"> and the default </w:t>
+      </w:r>
+      <w:r>
+        <w:rPr>
+          <w:rFonts w:ascii="Courier New" w:hAnsi="Courier New"/>
+        </w:rPr>
+        <w:t xml:space="preserve">instruments.piano.example.json</w:t>
+      </w:r>
+      <w:r>
+        <w:t xml:space="preserve"> used by </w:t>
+      </w:r>
+      <w:r>
+        <w:rPr>
+          <w:rFonts w:ascii="Courier New" w:hAnsi="Courier New"/>
+        </w:rPr>
+        <w:t xml:space="preserve">main.py</w:t>
+      </w:r>
+      <w:r>
+        <w:t xml:space="preserve"> when no custom piano JSON is provided.</w:t>
       </w:r>
     </w:p>
     <w:p>
@@ -1390,16 +1892,22 @@
         <w:pStyle w:val="Normal"/>
       </w:pPr>
       <w:r>
-        <w:t xml:space="preserve">The system pre-renders synthetic drum and piano sounds into pygame.mixer.Sound objects to avoid synthesizing audio on every strike. Piano tones are approximately 0.5 seconds long. Short drum samples were lengthened so triggered sounds remain audible despite perception and output latency.</w:t>
-      </w:r>
-    </w:p>
-    <w:p>
-      <w:pPr>
-        <w:pStyle w:val="Normal"/>
-      </w:pPr>
-      <w:r>
-        <w:t xml:space="preserve"/>
-      </w:r>
+        <w:t xml:space="preserve">The system pre-renders synthetic drum and piano sounds into </w:t>
+      </w:r>
+      <w:r>
+        <w:rPr>
+          <w:rFonts w:ascii="Courier New" w:hAnsi="Courier New"/>
+        </w:rPr>
+        <w:t xml:space="preserve">pygame.mixer.Sound</w:t>
+      </w:r>
+      <w:r>
+        <w:t xml:space="preserve"> objects to avoid synthesizing audio on every strike. Piano tones are approximately 0.5 seconds long. Short drum samples were lengthened so triggered sounds remain audible despite perception and output latency.</w:t>
+      </w:r>
+    </w:p>
+    <w:p>
+      <w:pPr>
+        <w:pStyle w:val="Normal"/>
+      </w:pPr>
     </w:p>
     <w:p>
       <w:pPr>
@@ -1466,6 +1974,9 @@
               <w:pStyle w:val="Normal"/>
             </w:pPr>
             <w:r>
+              <w:rPr>
+                <w:rFonts w:ascii="Courier New" w:hAnsi="Courier New"/>
+              </w:rPr>
               <w:t xml:space="preserve">main.py</w:t>
             </w:r>
           </w:p>
@@ -1490,6 +2001,9 @@
               <w:pStyle w:val="Normal"/>
             </w:pPr>
             <w:r>
+              <w:rPr>
+                <w:rFonts w:ascii="Courier New" w:hAnsi="Courier New"/>
+              </w:rPr>
               <w:t xml:space="preserve">hand_tracker.py</w:t>
             </w:r>
           </w:p>
@@ -1514,6 +2028,9 @@
               <w:pStyle w:val="Normal"/>
             </w:pPr>
             <w:r>
+              <w:rPr>
+                <w:rFonts w:ascii="Courier New" w:hAnsi="Courier New"/>
+              </w:rPr>
               <w:t xml:space="preserve">strike_detector.py</w:t>
             </w:r>
           </w:p>
@@ -1538,6 +2055,9 @@
               <w:pStyle w:val="Normal"/>
             </w:pPr>
             <w:r>
+              <w:rPr>
+                <w:rFonts w:ascii="Courier New" w:hAnsi="Courier New"/>
+              </w:rPr>
               <w:t xml:space="preserve">drumkit_audio.py</w:t>
             </w:r>
           </w:p>
@@ -1562,6 +2082,9 @@
               <w:pStyle w:val="Normal"/>
             </w:pPr>
             <w:r>
+              <w:rPr>
+                <w:rFonts w:ascii="Courier New" w:hAnsi="Courier New"/>
+              </w:rPr>
               <w:t xml:space="preserve">tools/gen_instrument_diagrams.py</w:t>
             </w:r>
           </w:p>
@@ -1586,6 +2109,9 @@
               <w:pStyle w:val="Normal"/>
             </w:pPr>
             <w:r>
+              <w:rPr>
+                <w:rFonts w:ascii="Courier New" w:hAnsi="Courier New"/>
+              </w:rPr>
               <w:t xml:space="preserve">tools/gen_report_figures.py</w:t>
             </w:r>
           </w:p>
@@ -1610,6 +2136,9 @@
               <w:pStyle w:val="Normal"/>
             </w:pPr>
             <w:r>
+              <w:rPr>
+                <w:rFonts w:ascii="Courier New" w:hAnsi="Courier New"/>
+              </w:rPr>
               <w:t xml:space="preserve">tests/</w:t>
             </w:r>
           </w:p>
@@ -1718,6 +2247,9 @@
               <w:pStyle w:val="Normal"/>
             </w:pPr>
             <w:r>
+              <w:rPr>
+                <w:rFonts w:ascii="Courier New" w:hAnsi="Courier New"/>
+              </w:rPr>
               <w:t xml:space="preserve">cpu</w:t>
             </w:r>
           </w:p>
@@ -1764,6 +2296,9 @@
               <w:pStyle w:val="Normal"/>
             </w:pPr>
             <w:r>
+              <w:rPr>
+                <w:rFonts w:ascii="Courier New" w:hAnsi="Courier New"/>
+              </w:rPr>
               <w:t xml:space="preserve">cpu-baseline</w:t>
             </w:r>
           </w:p>
@@ -1810,6 +2345,9 @@
               <w:pStyle w:val="Normal"/>
             </w:pPr>
             <w:r>
+              <w:rPr>
+                <w:rFonts w:ascii="Courier New" w:hAnsi="Courier New"/>
+              </w:rPr>
               <w:t xml:space="preserve">npu-full</w:t>
             </w:r>
           </w:p>
@@ -1832,7 +2370,13 @@
               <w:pStyle w:val="Normal"/>
             </w:pPr>
             <w:r>
-              <w:t xml:space="preserve">NPU .dxnn</w:t>
+              <w:t xml:space="preserve">NPU </w:t>
+            </w:r>
+            <w:r>
+              <w:rPr>
+                <w:rFonts w:ascii="Courier New" w:hAnsi="Courier New"/>
+              </w:rPr>
+              <w:t xml:space="preserve">.dxnn</w:t>
             </w:r>
           </w:p>
         </w:tc>
@@ -1856,6 +2400,9 @@
               <w:pStyle w:val="Normal"/>
             </w:pPr>
             <w:r>
+              <w:rPr>
+                <w:rFonts w:ascii="Courier New" w:hAnsi="Courier New"/>
+              </w:rPr>
               <w:t xml:space="preserve">npu</w:t>
             </w:r>
           </w:p>
@@ -1878,7 +2425,13 @@
               <w:pStyle w:val="Normal"/>
             </w:pPr>
             <w:r>
-              <w:t xml:space="preserve">NPU .dxnn</w:t>
+              <w:t xml:space="preserve">NPU </w:t>
+            </w:r>
+            <w:r>
+              <w:rPr>
+                <w:rFonts w:ascii="Courier New" w:hAnsi="Courier New"/>
+              </w:rPr>
+              <w:t xml:space="preserve">.dxnn</w:t>
             </w:r>
           </w:p>
         </w:tc>
@@ -1931,9 +2484,6 @@
       <w:pPr>
         <w:pStyle w:val="Normal"/>
       </w:pPr>
-      <w:r>
-        <w:t xml:space="preserve"/>
-      </w:r>
     </w:p>
     <w:p>
       <w:pPr>
@@ -2085,7 +2635,13 @@
               <w:pStyle w:val="Normal"/>
             </w:pPr>
             <w:r>
-              <w:t xml:space="preserve">cpu / MediaPipe</w:t>
+              <w:rPr>
+                <w:rFonts w:ascii="Courier New" w:hAnsi="Courier New"/>
+              </w:rPr>
+              <w:t xml:space="preserve">cpu</w:t>
+            </w:r>
+            <w:r>
+              <w:t xml:space="preserve"> / MediaPipe</w:t>
             </w:r>
           </w:p>
         </w:tc>
@@ -2120,6 +2676,9 @@
               <w:pStyle w:val="Normal"/>
             </w:pPr>
             <w:r>
+              <w:rPr>
+                <w:rFonts w:ascii="Courier New" w:hAnsi="Courier New"/>
+              </w:rPr>
               <w:t xml:space="preserve">cpu-baseline</w:t>
             </w:r>
           </w:p>
@@ -2142,31 +2701,52 @@
               <w:pStyle w:val="Normal"/>
             </w:pPr>
             <w:r>
-              <w:t xml:space="preserve">Uses the same two-stage palm→ROI→hand structure as npu-full, so it isolates whether replacing only hand inference with NPU is beneficial</w:t>
-            </w:r>
-          </w:p>
-        </w:tc>
-      </w:tr>
-      <w:tr>
-        <w:tc>
-          <w:tcPr/>
-          <w:p>
-            <w:pPr>
-              <w:pStyle w:val="Normal"/>
-            </w:pPr>
-            <w:r>
+              <w:t xml:space="preserve">Uses the same two-stage palm→ROI→hand structure as </w:t>
+            </w:r>
+            <w:r>
+              <w:rPr>
+                <w:rFonts w:ascii="Courier New" w:hAnsi="Courier New"/>
+              </w:rPr>
               <w:t xml:space="preserve">npu-full</w:t>
             </w:r>
-          </w:p>
-        </w:tc>
-        <w:tc>
-          <w:tcPr/>
-          <w:p>
-            <w:pPr>
-              <w:pStyle w:val="Normal"/>
-            </w:pPr>
-            <w:r>
-              <w:t xml:space="preserve">Palm TFLite on CPU + hand landmark .dxnn on NPU</w:t>
+            <w:r>
+              <w:t xml:space="preserve">, so it isolates whether replacing only hand inference with NPU is beneficial</w:t>
+            </w:r>
+          </w:p>
+        </w:tc>
+      </w:tr>
+      <w:tr>
+        <w:tc>
+          <w:tcPr/>
+          <w:p>
+            <w:pPr>
+              <w:pStyle w:val="Normal"/>
+            </w:pPr>
+            <w:r>
+              <w:rPr>
+                <w:rFonts w:ascii="Courier New" w:hAnsi="Courier New"/>
+              </w:rPr>
+              <w:t xml:space="preserve">npu-full</w:t>
+            </w:r>
+          </w:p>
+        </w:tc>
+        <w:tc>
+          <w:tcPr/>
+          <w:p>
+            <w:pPr>
+              <w:pStyle w:val="Normal"/>
+            </w:pPr>
+            <w:r>
+              <w:t xml:space="preserve">Palm TFLite on CPU + hand landmark </w:t>
+            </w:r>
+            <w:r>
+              <w:rPr>
+                <w:rFonts w:ascii="Courier New" w:hAnsi="Courier New"/>
+              </w:rPr>
+              <w:t xml:space="preserve">.dxnn</w:t>
+            </w:r>
+            <w:r>
+              <w:t xml:space="preserve"> on NPU</w:t>
             </w:r>
           </w:p>
         </w:tc>
@@ -2190,18 +2770,33 @@
               <w:pStyle w:val="Normal"/>
             </w:pPr>
             <w:r>
-              <w:t xml:space="preserve">npu dual-halves</w:t>
-            </w:r>
-          </w:p>
-        </w:tc>
-        <w:tc>
-          <w:tcPr/>
-          <w:p>
-            <w:pPr>
-              <w:pStyle w:val="Normal"/>
-            </w:pPr>
-            <w:r>
-              <w:t xml:space="preserve">No palm detector; screen split into two approximate hand regions; hand landmark .dxnn on NPU</w:t>
+              <w:rPr>
+                <w:rFonts w:ascii="Courier New" w:hAnsi="Courier New"/>
+              </w:rPr>
+              <w:t xml:space="preserve">npu</w:t>
+            </w:r>
+            <w:r>
+              <w:t xml:space="preserve"> dual-halves</w:t>
+            </w:r>
+          </w:p>
+        </w:tc>
+        <w:tc>
+          <w:tcPr/>
+          <w:p>
+            <w:pPr>
+              <w:pStyle w:val="Normal"/>
+            </w:pPr>
+            <w:r>
+              <w:t xml:space="preserve">No palm detector; screen split into two approximate hand regions; hand landmark </w:t>
+            </w:r>
+            <w:r>
+              <w:rPr>
+                <w:rFonts w:ascii="Courier New" w:hAnsi="Courier New"/>
+              </w:rPr>
+              <w:t xml:space="preserve">.dxnn</w:t>
+            </w:r>
+            <w:r>
+              <w:t xml:space="preserve"> on NPU</w:t>
             </w:r>
           </w:p>
         </w:tc>
@@ -2223,7 +2818,17 @@
         <w:pStyle w:val="Normal"/>
       </w:pPr>
       <w:r>
-        <w:t xml:space="preserve">The main evaluation metric in this report is vision-loop latency: time spent in camera-frame processing, palm/hand inference, ROI handling, and landmark production before the audio trigger logic. This is not a full acoustic end-to-end latency measurement. The target interactive frame budget is 16.7 ms for 60 FPS, while the final acoustic measurement should separately report motion-to-sound latency.</w:t>
+        <w:t xml:space="preserve">The main evaluation metric in this report is </w:t>
+      </w:r>
+      <w:r>
+        <w:rPr>
+          <w:b/>
+          <w:bCs/>
+        </w:rPr>
+        <w:t xml:space="preserve">vision-loop latency</w:t>
+      </w:r>
+      <w:r>
+        <w:t xml:space="preserve">: time spent in camera-frame processing, palm/hand inference, ROI handling, and landmark production before the audio trigger logic. This is not a full acoustic end-to-end latency measurement. The target interactive frame budget is 16.7 ms for 60 FPS, while the final acoustic measurement should separately report motion-to-sound latency.</w:t>
       </w:r>
     </w:p>
     <w:p>
@@ -2331,7 +2936,13 @@
               <w:pStyle w:val="Normal"/>
             </w:pPr>
             <w:r>
-              <w:t xml:space="preserve">DX-RT / dx_engine</w:t>
+              <w:t xml:space="preserve">DX-RT / </w:t>
+            </w:r>
+            <w:r>
+              <w:rPr>
+                <w:rFonts w:ascii="Courier New" w:hAnsi="Courier New"/>
+              </w:rPr>
+              <w:t xml:space="preserve">dx_engine</w:t>
             </w:r>
           </w:p>
         </w:tc>
@@ -2414,7 +3025,13 @@
               <w:pStyle w:val="Normal"/>
             </w:pPr>
             <w:r>
-              <w:t xml:space="preserve">90 captured frames in dataset/frame_*.png</w:t>
+              <w:t xml:space="preserve">90 captured frames in </w:t>
+            </w:r>
+            <w:r>
+              <w:rPr>
+                <w:rFonts w:ascii="Courier New" w:hAnsi="Courier New"/>
+              </w:rPr>
+              <w:t xml:space="preserve">dataset/frame_*.png</w:t>
             </w:r>
           </w:p>
         </w:tc>
@@ -2425,7 +3042,16 @@
         <w:pStyle w:val="Normal"/>
       </w:pPr>
       <w:r>
-        <w:t xml:space="preserve">The palm detector was also tested as an NPU .dxnn candidate. Although the NPU palm model was fast at roughly 12 ms, INT8 quantization damaged the score head: ONNX-to-NPU score correlation was approximately -0.11, making real hand detection unreliable. Therefore, all accurate palm-based configurations use CPU TFLite palm detection, and palm detection remains the main latency bottleneck.</w:t>
+        <w:t xml:space="preserve">The palm detector was also tested as an NPU </w:t>
+      </w:r>
+      <w:r>
+        <w:rPr>
+          <w:rFonts w:ascii="Courier New" w:hAnsi="Courier New"/>
+        </w:rPr>
+        <w:t xml:space="preserve">.dxnn</w:t>
+      </w:r>
+      <w:r>
+        <w:t xml:space="preserve"> candidate. Although the NPU palm model was fast at roughly 12 ms, INT8 quantization damaged the score head: ONNX-to-NPU score correlation was approximately -0.11, making real hand detection unreliable. Therefore, all accurate palm-based configurations use CPU TFLite palm detection, and palm detection remains the main latency bottleneck.</w:t>
       </w:r>
     </w:p>
     <w:p>
@@ -2474,7 +3100,16 @@
         <w:pStyle w:val="Caption"/>
       </w:pPr>
       <w:r>
-        <w:t xml:space="preserve">Figure 7. Backend latency comparison generated by tools/gen_report_figures.py.</w:t>
+        <w:t xml:space="preserve">Figure 7. Backend latency comparison generated by </w:t>
+      </w:r>
+      <w:r>
+        <w:rPr>
+          <w:rFonts w:ascii="Courier New" w:hAnsi="Courier New"/>
+        </w:rPr>
+        <w:t xml:space="preserve">tools/gen_report_figures.py</w:t>
+      </w:r>
+      <w:r>
+        <w:t xml:space="preserve">.</w:t>
       </w:r>
     </w:p>
     <w:p>
@@ -2498,7 +3133,26 @@
         <w:pStyle w:val="ListParagraph"/>
       </w:pPr>
       <w:r>
-        <w:t xml:space="preserve">1. End-to-end audio latency: record the performer's hand and the speaker output simultaneously using a high-speed camera or synchronized audio/video setup. For each strike, identify the video frame where the downward hit begins and the first audio waveform onset at the speaker. Compute Delta t = t_audio - t_video. Use at least 30 strikes per mode and report mean, standard deviation, and P95 latency.</w:t>
+        <w:t xml:space="preserve">1. </w:t>
+      </w:r>
+      <w:r>
+        <w:rPr>
+          <w:b/>
+          <w:bCs/>
+        </w:rPr>
+        <w:t xml:space="preserve">End-to-end audio latency:</w:t>
+      </w:r>
+      <w:r>
+        <w:t xml:space="preserve"> record the performer's hand and the speaker output simultaneously using a high-speed camera or synchronized audio/video setup. For each strike, identify the video frame where the downward hit begins and the first audio waveform onset at the speaker. Compute </w:t>
+      </w:r>
+      <w:r>
+        <w:rPr>
+          <w:rFonts w:ascii="Courier New" w:hAnsi="Courier New"/>
+        </w:rPr>
+        <w:t xml:space="preserve">Delta t = t_audio - t_video</w:t>
+      </w:r>
+      <w:r>
+        <w:t xml:space="preserve">. Use at least 30 strikes per mode and report mean, standard deviation, and P95 latency.</w:t>
       </w:r>
     </w:p>
     <w:p>
@@ -2506,7 +3160,17 @@
         <w:pStyle w:val="ListParagraph"/>
       </w:pPr>
       <w:r>
-        <w:t xml:space="preserve">2. Hit accuracy: run metronome-guided trials in both drum and piano modes. A true positive is an intended strike detected within the allowed time window. A false negative is an intended strike with no valid event. A false positive is an unintended or duplicate event outside the allowed window. Report TP, FP, FN, precision, recall, and qualitative failure cases.</w:t>
+        <w:t xml:space="preserve">2. </w:t>
+      </w:r>
+      <w:r>
+        <w:rPr>
+          <w:b/>
+          <w:bCs/>
+        </w:rPr>
+        <w:t xml:space="preserve">Hit accuracy:</w:t>
+      </w:r>
+      <w:r>
+        <w:t xml:space="preserve"> run metronome-guided trials in both drum and piano modes. A true positive is an intended strike detected within the allowed time window. A false negative is an intended strike with no valid event. A false positive is an unintended or duplicate event outside the allowed window. Report TP, FP, FN, precision, recall, and qualitative failure cases.</w:t>
       </w:r>
     </w:p>
     <w:p>
@@ -2514,7 +3178,107 @@
         <w:pStyle w:val="ListParagraph"/>
       </w:pPr>
       <w:r>
-        <w:t xml:space="preserve">3. Per-run logging: retain the git commit, backend, camera resolution, model paths/checksums, vy_trigger, joint_dps, cooldown, lighting conditions, and raw event log fields such as t, frame_id, infer_ms, hand_id, finger_id, pad/note, and trigger.</w:t>
+        <w:t xml:space="preserve">3. </w:t>
+      </w:r>
+      <w:r>
+        <w:rPr>
+          <w:b/>
+          <w:bCs/>
+        </w:rPr>
+        <w:t xml:space="preserve">Per-run logging:</w:t>
+      </w:r>
+      <w:r>
+        <w:t xml:space="preserve"> retain the git commit, backend, camera resolution, model paths/checksums, </w:t>
+      </w:r>
+      <w:r>
+        <w:rPr>
+          <w:rFonts w:ascii="Courier New" w:hAnsi="Courier New"/>
+        </w:rPr>
+        <w:t xml:space="preserve">vy_trigger</w:t>
+      </w:r>
+      <w:r>
+        <w:t xml:space="preserve">, </w:t>
+      </w:r>
+      <w:r>
+        <w:rPr>
+          <w:rFonts w:ascii="Courier New" w:hAnsi="Courier New"/>
+        </w:rPr>
+        <w:t xml:space="preserve">joint_dps</w:t>
+      </w:r>
+      <w:r>
+        <w:t xml:space="preserve">, </w:t>
+      </w:r>
+      <w:r>
+        <w:rPr>
+          <w:rFonts w:ascii="Courier New" w:hAnsi="Courier New"/>
+        </w:rPr>
+        <w:t xml:space="preserve">cooldown</w:t>
+      </w:r>
+      <w:r>
+        <w:t xml:space="preserve">, lighting conditions, and raw event log fields such as </w:t>
+      </w:r>
+      <w:r>
+        <w:rPr>
+          <w:rFonts w:ascii="Courier New" w:hAnsi="Courier New"/>
+        </w:rPr>
+        <w:t xml:space="preserve">t</w:t>
+      </w:r>
+      <w:r>
+        <w:t xml:space="preserve">, </w:t>
+      </w:r>
+      <w:r>
+        <w:rPr>
+          <w:rFonts w:ascii="Courier New" w:hAnsi="Courier New"/>
+        </w:rPr>
+        <w:t xml:space="preserve">frame_id</w:t>
+      </w:r>
+      <w:r>
+        <w:t xml:space="preserve">, </w:t>
+      </w:r>
+      <w:r>
+        <w:rPr>
+          <w:rFonts w:ascii="Courier New" w:hAnsi="Courier New"/>
+        </w:rPr>
+        <w:t xml:space="preserve">infer_ms</w:t>
+      </w:r>
+      <w:r>
+        <w:t xml:space="preserve">, </w:t>
+      </w:r>
+      <w:r>
+        <w:rPr>
+          <w:rFonts w:ascii="Courier New" w:hAnsi="Courier New"/>
+        </w:rPr>
+        <w:t xml:space="preserve">hand_id</w:t>
+      </w:r>
+      <w:r>
+        <w:t xml:space="preserve">, </w:t>
+      </w:r>
+      <w:r>
+        <w:rPr>
+          <w:rFonts w:ascii="Courier New" w:hAnsi="Courier New"/>
+        </w:rPr>
+        <w:t xml:space="preserve">finger_id</w:t>
+      </w:r>
+      <w:r>
+        <w:t xml:space="preserve">, </w:t>
+      </w:r>
+      <w:r>
+        <w:rPr>
+          <w:rFonts w:ascii="Courier New" w:hAnsi="Courier New"/>
+        </w:rPr>
+        <w:t xml:space="preserve">pad/note</w:t>
+      </w:r>
+      <w:r>
+        <w:t xml:space="preserve">, and </w:t>
+      </w:r>
+      <w:r>
+        <w:rPr>
+          <w:rFonts w:ascii="Courier New" w:hAnsi="Courier New"/>
+        </w:rPr>
+        <w:t xml:space="preserve">trigger</w:t>
+      </w:r>
+      <w:r>
+        <w:t xml:space="preserve">.</w:t>
       </w:r>
     </w:p>
     <w:p>
@@ -2545,9 +3309,6 @@
       <w:pPr>
         <w:pStyle w:val="Normal"/>
       </w:pPr>
-      <w:r>
-        <w:t xml:space="preserve"/>
-      </w:r>
     </w:p>
     <w:p>
       <w:pPr>
@@ -2769,7 +3530,13 @@
               <w:pStyle w:val="Normal"/>
             </w:pPr>
             <w:r>
-              <w:t xml:space="preserve">Skipped intentionally with RUN_BENCH_SMOKE=0</w:t>
+              <w:t xml:space="preserve">Skipped intentionally with </w:t>
+            </w:r>
+            <w:r>
+              <w:rPr>
+                <w:rFonts w:ascii="Courier New" w:hAnsi="Courier New"/>
+              </w:rPr>
+              <w:t xml:space="preserve">RUN_BENCH_SMOKE=0</w:t>
             </w:r>
           </w:p>
         </w:tc>
@@ -2796,7 +3563,43 @@
         <w:pStyle w:val="Normal"/>
       </w:pPr>
       <w:r>
-        <w:t xml:space="preserve">The table below reports the high-level latency comparison for the four evaluated runtime configurations. The cpu row is a practical reference path. The cpu-baseline and npu-full rows form the controlled CPU-vs-NPU comparison because they share the same palm→ROI→hand pipeline and differ only in hand landmark inference. The npu dual-halves row is not an accuracy-equivalent baseline; it is a low-latency approximation that removes palm detection to estimate the best-case live-demo path.</w:t>
+        <w:t xml:space="preserve">The table below reports the high-level latency comparison for the four evaluated runtime configurations. The </w:t>
+      </w:r>
+      <w:r>
+        <w:rPr>
+          <w:rFonts w:ascii="Courier New" w:hAnsi="Courier New"/>
+        </w:rPr>
+        <w:t xml:space="preserve">cpu</w:t>
+      </w:r>
+      <w:r>
+        <w:t xml:space="preserve"> row is a practical reference path. The </w:t>
+      </w:r>
+      <w:r>
+        <w:rPr>
+          <w:rFonts w:ascii="Courier New" w:hAnsi="Courier New"/>
+        </w:rPr>
+        <w:t xml:space="preserve">cpu-baseline</w:t>
+      </w:r>
+      <w:r>
+        <w:t xml:space="preserve"> and </w:t>
+      </w:r>
+      <w:r>
+        <w:rPr>
+          <w:rFonts w:ascii="Courier New" w:hAnsi="Courier New"/>
+        </w:rPr>
+        <w:t xml:space="preserve">npu-full</w:t>
+      </w:r>
+      <w:r>
+        <w:t xml:space="preserve"> rows form the controlled CPU-vs-NPU comparison because they share the same palm→ROI→hand pipeline and differ only in hand landmark inference. The </w:t>
+      </w:r>
+      <w:r>
+        <w:rPr>
+          <w:rFonts w:ascii="Courier New" w:hAnsi="Courier New"/>
+        </w:rPr>
+        <w:t xml:space="preserve">npu</w:t>
+      </w:r>
+      <w:r>
+        <w:t xml:space="preserve"> dual-halves row is not an accuracy-equivalent baseline; it is a low-latency approximation that removes palm detection to estimate the best-case live-demo path.</w:t>
       </w:r>
     </w:p>
     <w:tbl>
@@ -2887,7 +3690,13 @@
               <w:pStyle w:val="Normal"/>
             </w:pPr>
             <w:r>
-              <w:t xml:space="preserve">cpu (MediaPipe)</w:t>
+              <w:rPr>
+                <w:rFonts w:ascii="Courier New" w:hAnsi="Courier New"/>
+              </w:rPr>
+              <w:t xml:space="preserve">cpu</w:t>
+            </w:r>
+            <w:r>
+              <w:t xml:space="preserve"> (MediaPipe)</w:t>
             </w:r>
           </w:p>
         </w:tc>
@@ -2944,7 +3753,13 @@
               <w:pStyle w:val="Normal"/>
             </w:pPr>
             <w:r>
-              <w:t xml:space="preserve">cpu-baseline (TFLite)</w:t>
+              <w:rPr>
+                <w:rFonts w:ascii="Courier New" w:hAnsi="Courier New"/>
+              </w:rPr>
+              <w:t xml:space="preserve">cpu-baseline</w:t>
+            </w:r>
+            <w:r>
+              <w:t xml:space="preserve"> (TFLite)</w:t>
             </w:r>
           </w:p>
         </w:tc>
@@ -2988,20 +3803,35 @@
               <w:pStyle w:val="Normal"/>
             </w:pPr>
             <w:r>
-              <w:t xml:space="preserve">Same two-stage structure as npu-full; isolates the hand-landmark accelerator comparison</w:t>
-            </w:r>
-          </w:p>
-        </w:tc>
-      </w:tr>
-      <w:tr>
-        <w:tc>
-          <w:tcPr/>
-          <w:p>
-            <w:pPr>
-              <w:pStyle w:val="Normal"/>
-            </w:pPr>
-            <w:r>
-              <w:t xml:space="preserve">npu-full (TFLite + NPU)</w:t>
+              <w:t xml:space="preserve">Same two-stage structure as </w:t>
+            </w:r>
+            <w:r>
+              <w:rPr>
+                <w:rFonts w:ascii="Courier New" w:hAnsi="Courier New"/>
+              </w:rPr>
+              <w:t xml:space="preserve">npu-full</w:t>
+            </w:r>
+            <w:r>
+              <w:t xml:space="preserve">; isolates the hand-landmark accelerator comparison</w:t>
+            </w:r>
+          </w:p>
+        </w:tc>
+      </w:tr>
+      <w:tr>
+        <w:tc>
+          <w:tcPr/>
+          <w:p>
+            <w:pPr>
+              <w:pStyle w:val="Normal"/>
+            </w:pPr>
+            <w:r>
+              <w:rPr>
+                <w:rFonts w:ascii="Courier New" w:hAnsi="Courier New"/>
+              </w:rPr>
+              <w:t xml:space="preserve">npu-full</w:t>
+            </w:r>
+            <w:r>
+              <w:t xml:space="preserve"> (TFLite + NPU)</w:t>
             </w:r>
           </w:p>
         </w:tc>
@@ -3058,7 +3888,13 @@
               <w:pStyle w:val="Normal"/>
             </w:pPr>
             <w:r>
-              <w:t xml:space="preserve">npu dual-halves</w:t>
+              <w:rPr>
+                <w:rFonts w:ascii="Courier New" w:hAnsi="Courier New"/>
+              </w:rPr>
+              <w:t xml:space="preserve">npu</w:t>
+            </w:r>
+            <w:r>
+              <w:t xml:space="preserve"> dual-halves</w:t>
             </w:r>
           </w:p>
         </w:tc>
@@ -3129,7 +3965,25 @@
         <w:pStyle w:val="Normal"/>
       </w:pPr>
       <w:r>
-        <w:t xml:space="preserve">A 90-frame offline benchmark was run to compare the two structurally matched pipelines, cpu-baseline and npu-full, using the same captured input frames. This benchmark removes live camera variability and focuses on per-frame processing latency and landmark agreement.</w:t>
+        <w:t xml:space="preserve">A 90-frame offline benchmark was run to compare the two structurally matched pipelines, </w:t>
+      </w:r>
+      <w:r>
+        <w:rPr>
+          <w:rFonts w:ascii="Courier New" w:hAnsi="Courier New"/>
+        </w:rPr>
+        <w:t xml:space="preserve">cpu-baseline</w:t>
+      </w:r>
+      <w:r>
+        <w:t xml:space="preserve"> and </w:t>
+      </w:r>
+      <w:r>
+        <w:rPr>
+          <w:rFonts w:ascii="Courier New" w:hAnsi="Courier New"/>
+        </w:rPr>
+        <w:t xml:space="preserve">npu-full</w:t>
+      </w:r>
+      <w:r>
+        <w:t xml:space="preserve">, using the same captured input frames. This benchmark removes live camera variability and focuses on per-frame processing latency and landmark agreement.</w:t>
       </w:r>
     </w:p>
     <w:tbl>
@@ -3220,7 +4074,13 @@
               <w:pStyle w:val="Normal"/>
             </w:pPr>
             <w:r>
-              <w:t xml:space="preserve">cpu-baseline, palm every frame</w:t>
+              <w:rPr>
+                <w:rFonts w:ascii="Courier New" w:hAnsi="Courier New"/>
+              </w:rPr>
+              <w:t xml:space="preserve">cpu-baseline</w:t>
+            </w:r>
+            <w:r>
+              <w:t xml:space="preserve">, palm every frame</w:t>
             </w:r>
           </w:p>
         </w:tc>
@@ -3277,7 +4137,13 @@
               <w:pStyle w:val="Normal"/>
             </w:pPr>
             <w:r>
-              <w:t xml:space="preserve">npu-full, palm every frame</w:t>
+              <w:rPr>
+                <w:rFonts w:ascii="Courier New" w:hAnsi="Courier New"/>
+              </w:rPr>
+              <w:t xml:space="preserve">npu-full</w:t>
+            </w:r>
+            <w:r>
+              <w:t xml:space="preserve">, palm every frame</w:t>
             </w:r>
           </w:p>
         </w:tc>
@@ -3334,7 +4200,22 @@
               <w:pStyle w:val="Normal"/>
             </w:pPr>
             <w:r>
-              <w:t xml:space="preserve">npu-full, --palm-redetect-every 5 (20-frame smoke)</w:t>
+              <w:rPr>
+                <w:rFonts w:ascii="Courier New" w:hAnsi="Courier New"/>
+              </w:rPr>
+              <w:t xml:space="preserve">npu-full</w:t>
+            </w:r>
+            <w:r>
+              <w:t xml:space="preserve">, </w:t>
+            </w:r>
+            <w:r>
+              <w:rPr>
+                <w:rFonts w:ascii="Courier New" w:hAnsi="Courier New"/>
+              </w:rPr>
+              <w:t xml:space="preserve">--palm-redetect-every 5</w:t>
+            </w:r>
+            <w:r>
+              <w:t xml:space="preserve"> (20-frame smoke)</w:t>
             </w:r>
           </w:p>
         </w:tc>
@@ -3391,7 +4272,22 @@
               <w:pStyle w:val="Normal"/>
             </w:pPr>
             <w:r>
-              <w:t xml:space="preserve">npu-full, --async-palm smoke</w:t>
+              <w:rPr>
+                <w:rFonts w:ascii="Courier New" w:hAnsi="Courier New"/>
+              </w:rPr>
+              <w:t xml:space="preserve">npu-full</w:t>
+            </w:r>
+            <w:r>
+              <w:t xml:space="preserve">, </w:t>
+            </w:r>
+            <w:r>
+              <w:rPr>
+                <w:rFonts w:ascii="Courier New" w:hAnsi="Courier New"/>
+              </w:rPr>
+              <w:t xml:space="preserve">--async-palm</w:t>
+            </w:r>
+            <w:r>
+              <w:t xml:space="preserve"> smoke</w:t>
             </w:r>
           </w:p>
         </w:tc>
@@ -3446,15 +4342,42 @@
         <w:pStyle w:val="Normal"/>
       </w:pPr>
       <w:r>
-        <w:t xml:space="preserve">The matched cpu-baseline vs. npu-full comparison shows that the NPU substantially reduces hand-landmark time in the TFLite-style pipeline (44.80 ms to 9.13 ms in the recorded 90-frame run). However, palm detection remains about 40 ms, so the accurate pipeline still exceeds the 60 FPS target unless palm frequency is reduced or palm detection is accelerated.</w:t>
-      </w:r>
-    </w:p>
-    <w:p>
-      <w:pPr>
-        <w:pStyle w:val="Normal"/>
-      </w:pPr>
-      <w:r>
-        <w:t xml:space="preserve">Landmark accuracy was estimated by comparing npu-full landmarks against the CPU-baseline reference in normalized image coordinates.</w:t>
+        <w:t xml:space="preserve">The matched </w:t>
+      </w:r>
+      <w:r>
+        <w:rPr>
+          <w:rFonts w:ascii="Courier New" w:hAnsi="Courier New"/>
+        </w:rPr>
+        <w:t xml:space="preserve">cpu-baseline</w:t>
+      </w:r>
+      <w:r>
+        <w:t xml:space="preserve"> vs. </w:t>
+      </w:r>
+      <w:r>
+        <w:rPr>
+          <w:rFonts w:ascii="Courier New" w:hAnsi="Courier New"/>
+        </w:rPr>
+        <w:t xml:space="preserve">npu-full</w:t>
+      </w:r>
+      <w:r>
+        <w:t xml:space="preserve"> comparison shows that the NPU substantially reduces hand-landmark time in the TFLite-style pipeline (44.80 ms to 9.13 ms in the recorded 90-frame run). However, palm detection remains about 40 ms, so the accurate pipeline still exceeds the 60 FPS target unless palm frequency is reduced or palm detection is accelerated.</w:t>
+      </w:r>
+    </w:p>
+    <w:p>
+      <w:pPr>
+        <w:pStyle w:val="Normal"/>
+      </w:pPr>
+      <w:r>
+        <w:t xml:space="preserve">Landmark accuracy was estimated by comparing </w:t>
+      </w:r>
+      <w:r>
+        <w:rPr>
+          <w:rFonts w:ascii="Courier New" w:hAnsi="Courier New"/>
+        </w:rPr>
+        <w:t xml:space="preserve">npu-full</w:t>
+      </w:r>
+      <w:r>
+        <w:t xml:space="preserve"> landmarks against the CPU-baseline reference in normalized image coordinates.</w:t>
       </w:r>
     </w:p>
     <w:tbl>
@@ -3937,9 +4860,6 @@
       <w:pPr>
         <w:pStyle w:val="Normal"/>
       </w:pPr>
-      <w:r>
-        <w:t xml:space="preserve"/>
-      </w:r>
     </w:p>
     <w:p>
       <w:pPr>
@@ -3994,7 +4914,43 @@
         <w:pStyle w:val="Normal"/>
       </w:pPr>
       <w:r>
-        <w:t xml:space="preserve">The final piano mapping follows the user-specified convention: left-hand thumb is highest among left-hand notes (G4) and left-hand pinky is lowest (C4), while the right hand ascends from C5 to G5. This mapping matches common left-hand physical intuition when the left hand is viewed in a camera-facing diagram.</w:t>
+        <w:t xml:space="preserve">The final piano mapping follows the user-specified convention: left-hand thumb is highest among left-hand notes (</w:t>
+      </w:r>
+      <w:r>
+        <w:rPr>
+          <w:rFonts w:ascii="Courier New" w:hAnsi="Courier New"/>
+        </w:rPr>
+        <w:t xml:space="preserve">G4</w:t>
+      </w:r>
+      <w:r>
+        <w:t xml:space="preserve">) and left-hand pinky is lowest (</w:t>
+      </w:r>
+      <w:r>
+        <w:rPr>
+          <w:rFonts w:ascii="Courier New" w:hAnsi="Courier New"/>
+        </w:rPr>
+        <w:t xml:space="preserve">C4</w:t>
+      </w:r>
+      <w:r>
+        <w:t xml:space="preserve">), while the right hand ascends from </w:t>
+      </w:r>
+      <w:r>
+        <w:rPr>
+          <w:rFonts w:ascii="Courier New" w:hAnsi="Courier New"/>
+        </w:rPr>
+        <w:t xml:space="preserve">C5</w:t>
+      </w:r>
+      <w:r>
+        <w:t xml:space="preserve"> to </w:t>
+      </w:r>
+      <w:r>
+        <w:rPr>
+          <w:rFonts w:ascii="Courier New" w:hAnsi="Courier New"/>
+        </w:rPr>
+        <w:t xml:space="preserve">G5</w:t>
+      </w:r>
+      <w:r>
+        <w:t xml:space="preserve">. This mapping matches common left-hand physical intuition when the left hand is viewed in a camera-facing diagram.</w:t>
       </w:r>
     </w:p>
     <w:p>
@@ -4017,9 +4973,6 @@
       <w:pPr>
         <w:pStyle w:val="Normal"/>
       </w:pPr>
-      <w:r>
-        <w:t xml:space="preserve"/>
-      </w:r>
     </w:p>
     <w:p>
       <w:pPr>
@@ -4042,7 +4995,17 @@
         <w:pStyle w:val="ListParagraph"/>
       </w:pPr>
       <w:r>
-        <w:t xml:space="preserve">• No complete final E2E audio-latency measurement is included; a manual high-speed-camera or synchronized audio/video experiment is required.</w:t>
+        <w:t xml:space="preserve">• </w:t>
+      </w:r>
+      <w:r>
+        <w:rPr>
+          <w:b/>
+          <w:bCs/>
+        </w:rPr>
+        <w:t xml:space="preserve">No complete final E2E audio-latency measurement</w:t>
+      </w:r>
+      <w:r>
+        <w:t xml:space="preserve"> is included; a manual high-speed-camera or synchronized audio/video experiment is required.</w:t>
       </w:r>
     </w:p>
     <w:p>
@@ -4050,7 +5013,17 @@
         <w:pStyle w:val="ListParagraph"/>
       </w:pPr>
       <w:r>
-        <w:t xml:space="preserve">• No formal user study has been conducted.</w:t>
+        <w:t xml:space="preserve">• </w:t>
+      </w:r>
+      <w:r>
+        <w:rPr>
+          <w:b/>
+          <w:bCs/>
+        </w:rPr>
+        <w:t xml:space="preserve">No formal user study</w:t>
+      </w:r>
+      <w:r>
+        <w:t xml:space="preserve"> has been conducted.</w:t>
       </w:r>
     </w:p>
     <w:p>
@@ -4058,7 +5031,17 @@
         <w:pStyle w:val="ListParagraph"/>
       </w:pPr>
       <w:r>
-        <w:t xml:space="preserve">• No final hit-accuracy table is available for tempo-controlled trials.</w:t>
+        <w:t xml:space="preserve">• </w:t>
+      </w:r>
+      <w:r>
+        <w:rPr>
+          <w:b/>
+          <w:bCs/>
+        </w:rPr>
+        <w:t xml:space="preserve">No final hit-accuracy table</w:t>
+      </w:r>
+      <w:r>
+        <w:t xml:space="preserve"> is available for tempo-controlled trials.</w:t>
       </w:r>
     </w:p>
     <w:p>
@@ -4066,7 +5049,17 @@
         <w:pStyle w:val="ListParagraph"/>
       </w:pPr>
       <w:r>
-        <w:t xml:space="preserve">• Depth ambiguity remains because the system uses a single RGB camera.</w:t>
+        <w:t xml:space="preserve">• </w:t>
+      </w:r>
+      <w:r>
+        <w:rPr>
+          <w:b/>
+          <w:bCs/>
+        </w:rPr>
+        <w:t xml:space="preserve">Depth ambiguity</w:t>
+      </w:r>
+      <w:r>
+        <w:t xml:space="preserve"> remains because the system uses a single RGB camera.</w:t>
       </w:r>
     </w:p>
     <w:p>
@@ -4074,7 +5067,17 @@
         <w:pStyle w:val="ListParagraph"/>
       </w:pPr>
       <w:r>
-        <w:t xml:space="preserve">• Lighting and background sensitivity may affect landmark stability.</w:t>
+        <w:t xml:space="preserve">• </w:t>
+      </w:r>
+      <w:r>
+        <w:rPr>
+          <w:b/>
+          <w:bCs/>
+        </w:rPr>
+        <w:t xml:space="preserve">Lighting and background sensitivity</w:t>
+      </w:r>
+      <w:r>
+        <w:t xml:space="preserve"> may affect landmark stability.</w:t>
       </w:r>
     </w:p>
     <w:p>
@@ -4082,7 +5085,17 @@
         <w:pStyle w:val="ListParagraph"/>
       </w:pPr>
       <w:r>
-        <w:t xml:space="preserve">• NPU-full accuracy and latency remain limited by CPU palm detection.</w:t>
+        <w:t xml:space="preserve">• </w:t>
+      </w:r>
+      <w:r>
+        <w:rPr>
+          <w:b/>
+          <w:bCs/>
+        </w:rPr>
+        <w:t xml:space="preserve">NPU-full accuracy and latency</w:t>
+      </w:r>
+      <w:r>
+        <w:t xml:space="preserve"> remain limited by CPU palm detection.</w:t>
       </w:r>
     </w:p>
     <w:p>
@@ -4090,16 +5103,23 @@
         <w:pStyle w:val="ListParagraph"/>
       </w:pPr>
       <w:r>
-        <w:t xml:space="preserve">• Tactile feedback is absent, so timing may feel different from physical instruments.</w:t>
-      </w:r>
-    </w:p>
-    <w:p>
-      <w:pPr>
-        <w:pStyle w:val="Normal"/>
-      </w:pPr>
-      <w:r>
-        <w:t xml:space="preserve"/>
-      </w:r>
+        <w:t xml:space="preserve">• </w:t>
+      </w:r>
+      <w:r>
+        <w:rPr>
+          <w:b/>
+          <w:bCs/>
+        </w:rPr>
+        <w:t xml:space="preserve">Tactile feedback is absent</w:t>
+      </w:r>
+      <w:r>
+        <w:t xml:space="preserve">, so timing may feel different from physical instruments.</w:t>
+      </w:r>
+    </w:p>
+    <w:p>
+      <w:pPr>
+        <w:pStyle w:val="Normal"/>
+      </w:pPr>
     </w:p>
     <w:p>
       <w:pPr>
@@ -4185,9 +5205,6 @@
       <w:pPr>
         <w:pStyle w:val="Normal"/>
       </w:pPr>
-      <w:r>
-        <w:t xml:space="preserve"/>
-      </w:r>
     </w:p>
     <w:p>
       <w:pPr>
@@ -4209,9 +5226,6 @@
       <w:pPr>
         <w:pStyle w:val="Normal"/>
       </w:pPr>
-      <w:r>
-        <w:t xml:space="preserve"/>
-      </w:r>
     </w:p>
     <w:p>
       <w:pPr>
@@ -4233,9 +5247,6 @@
       <w:pPr>
         <w:pStyle w:val="Normal"/>
       </w:pPr>
-      <w:r>
-        <w:t xml:space="preserve"/>
-      </w:r>
     </w:p>
     <w:p>
       <w:pPr>
@@ -4250,16 +5261,40 @@
         <w:pStyle w:val="Normal"/>
       </w:pPr>
       <w:r>
-        <w:t xml:space="preserve">[1] PANDA / AI Air-Drum Pad repository artifact, air_drum_pad/ in git@github.com:GW-arch/deepx.git: source code, tests, generated figures, instrument images, and recorded benchmark artifacts used to construct this self-contained report. [2] MediaPipe Hands / hand landmark model family, used through CPU MediaPipe and TFLite-derived pipeline paths. [3] OpenCV, used for camera capture, drawing, and display. [4] pygame, used for low-latency playback of pre-rendered PCM sound buffers. [5] DeepX DX-RT / DX-COM toolchain, used for .dxnn NPU hand-landmark inference experiments.</w:t>
-      </w:r>
-    </w:p>
-    <w:p>
-      <w:pPr>
-        <w:pStyle w:val="Normal"/>
-      </w:pPr>
-      <w:r>
-        <w:t xml:space="preserve"/>
-      </w:r>
+        <w:t xml:space="preserve">[1] PANDA / AI Air-Drum Pad repository artifact, </w:t>
+      </w:r>
+      <w:r>
+        <w:rPr>
+          <w:rFonts w:ascii="Courier New" w:hAnsi="Courier New"/>
+        </w:rPr>
+        <w:t xml:space="preserve">air_drum_pad/</w:t>
+      </w:r>
+      <w:r>
+        <w:t xml:space="preserve"> in </w:t>
+      </w:r>
+      <w:r>
+        <w:rPr>
+          <w:rFonts w:ascii="Courier New" w:hAnsi="Courier New"/>
+        </w:rPr>
+        <w:t xml:space="preserve">git@github.com:GW-arch/deepx.git</w:t>
+      </w:r>
+      <w:r>
+        <w:t xml:space="preserve">: source code, tests, generated figures, instrument images, and recorded benchmark artifacts used to construct this self-contained report. [2] MediaPipe Hands / hand landmark model family, used through CPU MediaPipe and TFLite-derived pipeline paths. [3] OpenCV, used for camera capture, drawing, and display. [4] pygame, used for low-latency playback of pre-rendered PCM sound buffers. [5] DeepX DX-RT / DX-COM toolchain, used for </w:t>
+      </w:r>
+      <w:r>
+        <w:rPr>
+          <w:rFonts w:ascii="Courier New" w:hAnsi="Courier New"/>
+        </w:rPr>
+        <w:t xml:space="preserve">.dxnn</w:t>
+      </w:r>
+      <w:r>
+        <w:t xml:space="preserve"> NPU hand-landmark inference experiments.</w:t>
+      </w:r>
+    </w:p>
+    <w:p>
+      <w:pPr>
+        <w:pStyle w:val="Normal"/>
+      </w:pPr>
     </w:p>
     <w:p>
       <w:pPr>
@@ -4401,9 +5436,6 @@
       <w:pPr>
         <w:pStyle w:val="Normal"/>
       </w:pPr>
-      <w:r>
-        <w:t xml:space="preserve"/>
-      </w:r>
     </w:p>
     <w:p>
       <w:pPr>
@@ -4462,6 +5494,9 @@
               <w:pStyle w:val="Normal"/>
             </w:pPr>
             <w:r>
+              <w:rPr>
+                <w:rFonts w:ascii="Courier New" w:hAnsi="Courier New"/>
+              </w:rPr>
               <w:t xml:space="preserve">main.py</w:t>
             </w:r>
           </w:p>
@@ -4486,6 +5521,9 @@
               <w:pStyle w:val="Normal"/>
             </w:pPr>
             <w:r>
+              <w:rPr>
+                <w:rFonts w:ascii="Courier New" w:hAnsi="Courier New"/>
+              </w:rPr>
               <w:t xml:space="preserve">strike_detector.py</w:t>
             </w:r>
           </w:p>
@@ -4510,6 +5548,9 @@
               <w:pStyle w:val="Normal"/>
             </w:pPr>
             <w:r>
+              <w:rPr>
+                <w:rFonts w:ascii="Courier New" w:hAnsi="Courier New"/>
+              </w:rPr>
               <w:t xml:space="preserve">drumkit_audio.py</w:t>
             </w:r>
           </w:p>
@@ -4534,6 +5575,9 @@
               <w:pStyle w:val="Normal"/>
             </w:pPr>
             <w:r>
+              <w:rPr>
+                <w:rFonts w:ascii="Courier New" w:hAnsi="Courier New"/>
+              </w:rPr>
               <w:t xml:space="preserve">pads.example.json</w:t>
             </w:r>
           </w:p>
@@ -4558,6 +5602,9 @@
               <w:pStyle w:val="Normal"/>
             </w:pPr>
             <w:r>
+              <w:rPr>
+                <w:rFonts w:ascii="Courier New" w:hAnsi="Courier New"/>
+              </w:rPr>
               <w:t xml:space="preserve">instruments.piano.example.json</w:t>
             </w:r>
           </w:p>
@@ -4582,6 +5629,9 @@
               <w:pStyle w:val="Normal"/>
             </w:pPr>
             <w:r>
+              <w:rPr>
+                <w:rFonts w:ascii="Courier New" w:hAnsi="Courier New"/>
+              </w:rPr>
               <w:t xml:space="preserve">tools/gen_instrument_diagrams.py</w:t>
             </w:r>
           </w:p>
@@ -4606,6 +5656,9 @@
               <w:pStyle w:val="Normal"/>
             </w:pPr>
             <w:r>
+              <w:rPr>
+                <w:rFonts w:ascii="Courier New" w:hAnsi="Courier New"/>
+              </w:rPr>
               <w:t xml:space="preserve">tools/gen_report_figures.py</w:t>
             </w:r>
           </w:p>
@@ -4630,6 +5683,9 @@
               <w:pStyle w:val="Normal"/>
             </w:pPr>
             <w:r>
+              <w:rPr>
+                <w:rFonts w:ascii="Courier New" w:hAnsi="Courier New"/>
+              </w:rPr>
               <w:t xml:space="preserve">docs/figures/</w:t>
             </w:r>
           </w:p>
@@ -4654,6 +5710,9 @@
               <w:pStyle w:val="Normal"/>
             </w:pPr>
             <w:r>
+              <w:rPr>
+                <w:rFonts w:ascii="Courier New" w:hAnsi="Courier New"/>
+              </w:rPr>
               <w:t xml:space="preserve">instruments/</w:t>
             </w:r>
           </w:p>

</xml_diff>

<commit_message>
Mark report source artifacts private
</commit_message>
<xml_diff>
--- a/air_drum_pad/docs/FINAL_REPORT_AI_AIR_DRUM_PAD.docx
+++ b/air_drum_pad/docs/FINAL_REPORT_AI_AIR_DRUM_PAD.docx
@@ -111,16 +111,7 @@
         <w:pStyle w:val="Caption"/>
       </w:pPr>
       <w:r>
-        <w:t xml:space="preserve">PANDA project icon generated by </w:t>
-      </w:r>
-      <w:r>
-        <w:rPr>
-          <w:rFonts w:ascii="Courier New" w:hAnsi="Courier New"/>
-        </w:rPr>
-        <w:t xml:space="preserve">tools/gen_report_figures.py</w:t>
-      </w:r>
-      <w:r>
-        <w:t xml:space="preserve">.</w:t>
+        <w:t xml:space="preserve">PANDA project icon.</w:t>
       </w:r>
     </w:p>
     <w:p>
@@ -259,25 +250,10 @@
           <w:b/>
           <w:bCs/>
         </w:rPr>
-        <w:t xml:space="preserve">Repository:</w:t>
-      </w:r>
-      <w:r>
-        <w:t xml:space="preserve"> </w:t>
-      </w:r>
-      <w:r>
-        <w:rPr>
-          <w:rFonts w:ascii="Courier New" w:hAnsi="Courier New"/>
-        </w:rPr>
-        <w:t xml:space="preserve">air_drum_pad/</w:t>
-      </w:r>
-      <w:r>
-        <w:t xml:space="preserve"> in </w:t>
-      </w:r>
-      <w:r>
-        <w:rPr>
-          <w:rFonts w:ascii="Courier New" w:hAnsi="Courier New"/>
-        </w:rPr>
-        <w:t xml:space="preserve">git@github.com:GW-arch/deepx.git</w:t>
+        <w:t xml:space="preserve">Source availability:</w:t>
+      </w:r>
+      <w:r>
+        <w:t xml:space="preserve"> Private implementation artifact; the GitHub repository and source code are not publicly released.</w:t>
       </w:r>
     </w:p>
     <w:p>
@@ -620,7 +596,7 @@
         <w:pStyle w:val="ListParagraph"/>
       </w:pPr>
       <w:r>
-        <w:t xml:space="preserve">• Report figures generated by Python for system architecture, strike logic, and backend latency.</w:t>
+        <w:t xml:space="preserve">• Report figures generated programmatically for system architecture, strike logic, and backend latency.</w:t>
       </w:r>
     </w:p>
     <w:p>
@@ -628,7 +604,7 @@
         <w:pStyle w:val="ListParagraph"/>
       </w:pPr>
       <w:r>
-        <w:t xml:space="preserve">• A repeatable test and quality-check pipeline covering mapping, detector behavior, pad validation, ROI helpers, and benchmark helpers.</w:t>
+        <w:t xml:space="preserve">• A repeatable private validation pipeline covering mapping, detector behavior, pad validation, ROI helpers, and benchmark helpers.</w:t>
       </w:r>
     </w:p>
     <w:p>
@@ -698,16 +674,7 @@
         <w:pStyle w:val="Caption"/>
       </w:pPr>
       <w:r>
-        <w:t xml:space="preserve">Figure 1. Runtime pipeline generated by </w:t>
-      </w:r>
-      <w:r>
-        <w:rPr>
-          <w:rFonts w:ascii="Courier New" w:hAnsi="Courier New"/>
-        </w:rPr>
-        <w:t xml:space="preserve">tools/gen_report_figures.py</w:t>
-      </w:r>
-      <w:r>
-        <w:t xml:space="preserve">.</w:t>
+        <w:t xml:space="preserve">Figure 1. Runtime pipeline diagram generated programmatically for this report.</w:t>
       </w:r>
     </w:p>
     <w:p>
@@ -842,16 +809,7 @@
         <w:pStyle w:val="Caption"/>
       </w:pPr>
       <w:r>
-        <w:t xml:space="preserve">Figure 2. Default drum pad layout generated by </w:t>
-      </w:r>
-      <w:r>
-        <w:rPr>
-          <w:rFonts w:ascii="Courier New" w:hAnsi="Courier New"/>
-        </w:rPr>
-        <w:t xml:space="preserve">tools/gen_instrument_diagrams.py</w:t>
-      </w:r>
-      <w:r>
-        <w:t xml:space="preserve">.</w:t>
+        <w:t xml:space="preserve">Figure 2. Default drum pad layout generated programmatically for this report.</w:t>
       </w:r>
     </w:p>
     <w:p>
@@ -908,16 +866,7 @@
         <w:pStyle w:val="Caption"/>
       </w:pPr>
       <w:r>
-        <w:t xml:space="preserve">Figure 3. Built-in drum sound-key catalog generated by </w:t>
-      </w:r>
-      <w:r>
-        <w:rPr>
-          <w:rFonts w:ascii="Courier New" w:hAnsi="Courier New"/>
-        </w:rPr>
-        <w:t xml:space="preserve">tools/gen_instrument_diagrams.py</w:t>
-      </w:r>
-      <w:r>
-        <w:t xml:space="preserve">.</w:t>
+        <w:t xml:space="preserve">Figure 3. Built-in drum sound-key catalog generated programmatically for this report.</w:t>
       </w:r>
     </w:p>
     <w:p>
@@ -1240,16 +1189,7 @@
         <w:pStyle w:val="Caption"/>
       </w:pPr>
       <w:r>
-        <w:t xml:space="preserve">Figure 4. Default piano layout generated by </w:t>
-      </w:r>
-      <w:r>
-        <w:rPr>
-          <w:rFonts w:ascii="Courier New" w:hAnsi="Courier New"/>
-        </w:rPr>
-        <w:t xml:space="preserve">tools/gen_instrument_diagrams.py</w:t>
-      </w:r>
-      <w:r>
-        <w:t xml:space="preserve">.</w:t>
+        <w:t xml:space="preserve">Figure 4. Default piano layout generated programmatically for this report.</w:t>
       </w:r>
     </w:p>
     <w:p>
@@ -1306,16 +1246,7 @@
         <w:pStyle w:val="Caption"/>
       </w:pPr>
       <w:r>
-        <w:t xml:space="preserve">Figure 5. Piano custom-layout example generated by </w:t>
-      </w:r>
-      <w:r>
-        <w:rPr>
-          <w:rFonts w:ascii="Courier New" w:hAnsi="Courier New"/>
-        </w:rPr>
-        <w:t xml:space="preserve">tools/gen_instrument_diagrams.py</w:t>
-      </w:r>
-      <w:r>
-        <w:t xml:space="preserve">.</w:t>
+        <w:t xml:space="preserve">Figure 5. Piano custom-layout example generated programmatically for this report.</w:t>
       </w:r>
     </w:p>
     <w:p>
@@ -1648,72 +1579,237 @@
         <w:pStyle w:val="Caption"/>
       </w:pPr>
       <w:r>
-        <w:t xml:space="preserve">Figure 6. Strike-decision logic generated by </w:t>
+        <w:t xml:space="preserve">Figure 6. Strike-decision logic diagram generated programmatically for this report.</w:t>
+      </w:r>
+    </w:p>
+    <w:p>
+      <w:pPr>
+        <w:pStyle w:val="Normal"/>
+      </w:pPr>
+      <w:r>
+        <w:t xml:space="preserve">Let \(y_t\) be the fingertip's normalized vertical image coordinate at time \(t\). The downward fingertip velocity is approximated by</w:t>
+      </w:r>
+    </w:p>
+    <w:p>
+      <w:pPr>
+        <w:pStyle w:val="Normal"/>
+      </w:pPr>
+      <w:r>
+        <w:t xml:space="preserve">\[ v_y = \frac{y_t - y_{t-1}}{t - t_{t-1}}. \]</w:t>
+      </w:r>
+    </w:p>
+    <w:p>
+      <w:pPr>
+        <w:pStyle w:val="Normal"/>
+      </w:pPr>
+      <w:r>
+        <w:t xml:space="preserve">Because image coordinates increase downward, positive \(v_y\) indicates downward motion. Let \(\theta_t\) be the angle at the selected finger joint. Joint angular speed is approximated by</w:t>
+      </w:r>
+    </w:p>
+    <w:p>
+      <w:pPr>
+        <w:pStyle w:val="Normal"/>
+      </w:pPr>
+      <w:r>
+        <w:t xml:space="preserve">\[ \omega = \left|\frac{\theta_t - \theta_{t-1}}{t - t_{t-1}}\right|. \]</w:t>
+      </w:r>
+    </w:p>
+    <w:p>
+      <w:pPr>
+        <w:pStyle w:val="Normal"/>
+      </w:pPr>
+      <w:r>
+        <w:t xml:space="preserve">A strike candidate satisfies</w:t>
+      </w:r>
+    </w:p>
+    <w:p>
+      <w:pPr>
+        <w:pStyle w:val="Normal"/>
+      </w:pPr>
+      <w:r>
+        <w:t xml:space="preserve">\[ v_y \ge \tau_v \quad \land \quad \omega \ge \tau_\omega. \]</w:t>
+      </w:r>
+    </w:p>
+    <w:p>
+      <w:pPr>
+        <w:pStyle w:val="Normal"/>
+      </w:pPr>
+      <w:r>
+        <w:t xml:space="preserve">The detector then applies confidence filtering, minimum displacement filtering, and cooldown logic. The middle finger has a lower internal threshold scale because its visual angular change is often smaller than the other fingers in camera coordinates.</w:t>
+      </w:r>
+    </w:p>
+    <w:p>
+      <w:pPr>
+        <w:pStyle w:val="Heading3"/>
+      </w:pPr>
+      <w:r>
+        <w:t xml:space="preserve">4.3 Drum Pad Mapping</w:t>
+      </w:r>
+    </w:p>
+    <w:p>
+      <w:pPr>
+        <w:pStyle w:val="Normal"/>
+      </w:pPr>
+      <w:r>
+        <w:t xml:space="preserve">Each drum pad is a normalized rectangle</w:t>
+      </w:r>
+    </w:p>
+    <w:p>
+      <w:pPr>
+        <w:pStyle w:val="Normal"/>
+      </w:pPr>
+      <w:r>
+        <w:t xml:space="preserve">\[ (x_1, y_1, x_2, y_2), \quad 0 \le x_1 &lt; x_2 \le 1, \quad 0 \le y_1 &lt; y_2 \le 1. \]</w:t>
+      </w:r>
+    </w:p>
+    <w:p>
+      <w:pPr>
+        <w:pStyle w:val="Normal"/>
+      </w:pPr>
+      <w:r>
+        <w:t xml:space="preserve">If a fingertip strike occurs and the fingertip coordinate lies inside a pad, the detector returns that pad's sound key. Cooldown is tracked by pad label, allowing different pads to be played in rapid sequence.</w:t>
+      </w:r>
+    </w:p>
+    <w:p>
+      <w:pPr>
+        <w:pStyle w:val="Normal"/>
+      </w:pPr>
+      <w:r>
+        <w:t xml:space="preserve">Custom drum layouts are loaded from JSON:</w:t>
+      </w:r>
+    </w:p>
+    <w:p>
+      <w:pPr>
+        <w:pStyle w:val="Code"/>
+      </w:pPr>
+      <w:r>
+        <w:t xml:space="preserve">{</w:t>
+      </w:r>
+    </w:p>
+    <w:p>
+      <w:pPr>
+        <w:pStyle w:val="Code"/>
+      </w:pPr>
+      <w:r>
+        <w:t xml:space="preserve">  "pads": [</w:t>
+      </w:r>
+    </w:p>
+    <w:p>
+      <w:pPr>
+        <w:pStyle w:val="Code"/>
+      </w:pPr>
+      <w:r>
+        <w:t xml:space="preserve">    {"label": "kick", "sound": "kick", "x1": 0.05, "y1": 0.35, "x2": 0.29, "y2": 0.59, "color": [80, 80, 180]}</w:t>
+      </w:r>
+    </w:p>
+    <w:p>
+      <w:pPr>
+        <w:pStyle w:val="Code"/>
+      </w:pPr>
+      <w:r>
+        <w:t xml:space="preserve">  ]</w:t>
+      </w:r>
+    </w:p>
+    <w:p>
+      <w:pPr>
+        <w:pStyle w:val="Code"/>
+      </w:pPr>
+      <w:r>
+        <w:t xml:space="preserve">}</w:t>
+      </w:r>
+    </w:p>
+    <w:p>
+      <w:pPr>
+        <w:pStyle w:val="Heading3"/>
+      </w:pPr>
+      <w:r>
+        <w:t xml:space="preserve">4.4 Piano Mapping</w:t>
+      </w:r>
+    </w:p>
+    <w:p>
+      <w:pPr>
+        <w:pStyle w:val="Normal"/>
+      </w:pPr>
+      <w:r>
+        <w:t xml:space="preserve">Piano mapping uses a 10-slot tuple ordered as:</w:t>
+      </w:r>
+    </w:p>
+    <w:p>
+      <w:pPr>
+        <w:pStyle w:val="Code"/>
+      </w:pPr>
+      <w:r>
+        <w:t xml:space="preserve">[Hand 0 thumb, index, middle, ring, pinky,</w:t>
+      </w:r>
+    </w:p>
+    <w:p>
+      <w:pPr>
+        <w:pStyle w:val="Code"/>
+      </w:pPr>
+      <w:r>
+        <w:t xml:space="preserve"> Hand 1 thumb, index, middle, ring, pinky]</w:t>
+      </w:r>
+    </w:p>
+    <w:p>
+      <w:pPr>
+        <w:pStyle w:val="Normal"/>
+      </w:pPr>
+      <w:r>
+        <w:t xml:space="preserve">The final default tuple is:</w:t>
+      </w:r>
+    </w:p>
+    <w:p>
+      <w:pPr>
+        <w:pStyle w:val="Code"/>
+      </w:pPr>
+      <w:r>
+        <w:t xml:space="preserve">("G4", "F4", "E4", "D4", "C4", "C5", "D5", "E5", "F5", "G5")</w:t>
+      </w:r>
+    </w:p>
+    <w:p>
+      <w:pPr>
+        <w:pStyle w:val="Normal"/>
+      </w:pPr>
+      <w:r>
+        <w:t xml:space="preserve">This mapping is implemented as the default runtime note configuration and is also mirrored in the private example configuration used for custom piano layouts.</w:t>
+      </w:r>
+    </w:p>
+    <w:p>
+      <w:pPr>
+        <w:pStyle w:val="Heading3"/>
+      </w:pPr>
+      <w:r>
+        <w:t xml:space="preserve">4.5 Audio Generation</w:t>
+      </w:r>
+    </w:p>
+    <w:p>
+      <w:pPr>
+        <w:pStyle w:val="Normal"/>
+      </w:pPr>
+      <w:r>
+        <w:t xml:space="preserve">The system pre-renders synthetic drum and piano sounds into </w:t>
       </w:r>
       <w:r>
         <w:rPr>
           <w:rFonts w:ascii="Courier New" w:hAnsi="Courier New"/>
         </w:rPr>
-        <w:t xml:space="preserve">tools/gen_report_figures.py</w:t>
-      </w:r>
-      <w:r>
-        <w:t xml:space="preserve">.</w:t>
-      </w:r>
-    </w:p>
-    <w:p>
-      <w:pPr>
-        <w:pStyle w:val="Normal"/>
-      </w:pPr>
-      <w:r>
-        <w:t xml:space="preserve">Let \(y_t\) be the fingertip's normalized vertical image coordinate at time \(t\). The downward fingertip velocity is approximated by</w:t>
-      </w:r>
-    </w:p>
-    <w:p>
-      <w:pPr>
-        <w:pStyle w:val="Normal"/>
-      </w:pPr>
-      <w:r>
-        <w:t xml:space="preserve">\[ v_y = \frac{y_t - y_{t-1}}{t - t_{t-1}}. \]</w:t>
-      </w:r>
-    </w:p>
-    <w:p>
-      <w:pPr>
-        <w:pStyle w:val="Normal"/>
-      </w:pPr>
-      <w:r>
-        <w:t xml:space="preserve">Because image coordinates increase downward, positive \(v_y\) indicates downward motion. Let \(\theta_t\) be the angle at the selected finger joint. Joint angular speed is approximated by</w:t>
-      </w:r>
-    </w:p>
-    <w:p>
-      <w:pPr>
-        <w:pStyle w:val="Normal"/>
-      </w:pPr>
-      <w:r>
-        <w:t xml:space="preserve">\[ \omega = \left|\frac{\theta_t - \theta_{t-1}}{t - t_{t-1}}\right|. \]</w:t>
-      </w:r>
-    </w:p>
-    <w:p>
-      <w:pPr>
-        <w:pStyle w:val="Normal"/>
-      </w:pPr>
-      <w:r>
-        <w:t xml:space="preserve">A strike candidate satisfies</w:t>
-      </w:r>
-    </w:p>
-    <w:p>
-      <w:pPr>
-        <w:pStyle w:val="Normal"/>
-      </w:pPr>
-      <w:r>
-        <w:t xml:space="preserve">\[ v_y \ge \tau_v \quad \land \quad \omega \ge \tau_\omega. \]</w:t>
-      </w:r>
-    </w:p>
-    <w:p>
-      <w:pPr>
-        <w:pStyle w:val="Normal"/>
-      </w:pPr>
-      <w:r>
-        <w:t xml:space="preserve">The detector then applies confidence filtering, minimum displacement filtering, and cooldown logic. The middle finger has a lower internal threshold scale because its visual angular change is often smaller than the other fingers in camera coordinates.</w:t>
+        <w:t xml:space="preserve">pygame.mixer.Sound</w:t>
+      </w:r>
+      <w:r>
+        <w:t xml:space="preserve"> objects to avoid synthesizing audio on every strike. Piano tones are approximately 0.5 seconds long. Short drum samples were lengthened so triggered sounds remain audible despite perception and output latency.</w:t>
+      </w:r>
+    </w:p>
+    <w:p>
+      <w:pPr>
+        <w:pStyle w:val="Normal"/>
+      </w:pPr>
+    </w:p>
+    <w:p>
+      <w:pPr>
+        <w:pStyle w:val="Heading2"/>
+      </w:pPr>
+      <w:r>
+        <w:t xml:space="preserve">5. Implementation</w:t>
       </w:r>
     </w:p>
     <w:p>
@@ -1721,208 +1817,15 @@
         <w:pStyle w:val="Heading3"/>
       </w:pPr>
       <w:r>
-        <w:t xml:space="preserve">4.3 Drum Pad Mapping</w:t>
-      </w:r>
-    </w:p>
-    <w:p>
-      <w:pPr>
-        <w:pStyle w:val="Normal"/>
-      </w:pPr>
-      <w:r>
-        <w:t xml:space="preserve">Each drum pad is a normalized rectangle</w:t>
-      </w:r>
-    </w:p>
-    <w:p>
-      <w:pPr>
-        <w:pStyle w:val="Normal"/>
-      </w:pPr>
-      <w:r>
-        <w:t xml:space="preserve">\[ (x_1, y_1, x_2, y_2), \quad 0 \le x_1 &lt; x_2 \le 1, \quad 0 \le y_1 &lt; y_2 \le 1. \]</w:t>
-      </w:r>
-    </w:p>
-    <w:p>
-      <w:pPr>
-        <w:pStyle w:val="Normal"/>
-      </w:pPr>
-      <w:r>
-        <w:t xml:space="preserve">If a fingertip strike occurs and the fingertip coordinate lies inside a pad, the detector returns that pad's sound key. Cooldown is tracked by pad label, allowing different pads to be played in rapid sequence.</w:t>
-      </w:r>
-    </w:p>
-    <w:p>
-      <w:pPr>
-        <w:pStyle w:val="Normal"/>
-      </w:pPr>
-      <w:r>
-        <w:t xml:space="preserve">Custom drum layouts are loaded from JSON:</w:t>
-      </w:r>
-    </w:p>
-    <w:p>
-      <w:pPr>
-        <w:pStyle w:val="Code"/>
-      </w:pPr>
-      <w:r>
-        <w:t xml:space="preserve">{</w:t>
-      </w:r>
-    </w:p>
-    <w:p>
-      <w:pPr>
-        <w:pStyle w:val="Code"/>
-      </w:pPr>
-      <w:r>
-        <w:t xml:space="preserve">  "pads": [</w:t>
-      </w:r>
-    </w:p>
-    <w:p>
-      <w:pPr>
-        <w:pStyle w:val="Code"/>
-      </w:pPr>
-      <w:r>
-        <w:t xml:space="preserve">    {"label": "kick", "sound": "kick", "x1": 0.05, "y1": 0.35, "x2": 0.29, "y2": 0.59, "color": [80, 80, 180]}</w:t>
-      </w:r>
-    </w:p>
-    <w:p>
-      <w:pPr>
-        <w:pStyle w:val="Code"/>
-      </w:pPr>
-      <w:r>
-        <w:t xml:space="preserve">  ]</w:t>
-      </w:r>
-    </w:p>
-    <w:p>
-      <w:pPr>
-        <w:pStyle w:val="Code"/>
-      </w:pPr>
-      <w:r>
-        <w:t xml:space="preserve">}</w:t>
-      </w:r>
-    </w:p>
-    <w:p>
-      <w:pPr>
-        <w:pStyle w:val="Heading3"/>
-      </w:pPr>
-      <w:r>
-        <w:t xml:space="preserve">4.4 Piano Mapping</w:t>
-      </w:r>
-    </w:p>
-    <w:p>
-      <w:pPr>
-        <w:pStyle w:val="Normal"/>
-      </w:pPr>
-      <w:r>
-        <w:t xml:space="preserve">Piano mapping uses a 10-slot tuple ordered as:</w:t>
-      </w:r>
-    </w:p>
-    <w:p>
-      <w:pPr>
-        <w:pStyle w:val="Code"/>
-      </w:pPr>
-      <w:r>
-        <w:t xml:space="preserve">[Hand 0 thumb, index, middle, ring, pinky,</w:t>
-      </w:r>
-    </w:p>
-    <w:p>
-      <w:pPr>
-        <w:pStyle w:val="Code"/>
-      </w:pPr>
-      <w:r>
-        <w:t xml:space="preserve"> Hand 1 thumb, index, middle, ring, pinky]</w:t>
-      </w:r>
-    </w:p>
-    <w:p>
-      <w:pPr>
-        <w:pStyle w:val="Normal"/>
-      </w:pPr>
-      <w:r>
-        <w:t xml:space="preserve">The final default tuple is:</w:t>
-      </w:r>
-    </w:p>
-    <w:p>
-      <w:pPr>
-        <w:pStyle w:val="Code"/>
-      </w:pPr>
-      <w:r>
-        <w:t xml:space="preserve">("G4", "F4", "E4", "D4", "C4", "C5", "D5", "E5", "F5", "G5")</w:t>
-      </w:r>
-    </w:p>
-    <w:p>
-      <w:pPr>
-        <w:pStyle w:val="Normal"/>
-      </w:pPr>
-      <w:r>
-        <w:t xml:space="preserve">This mapping is stored in both </w:t>
-      </w:r>
-      <w:r>
-        <w:rPr>
-          <w:rFonts w:ascii="Courier New" w:hAnsi="Courier New"/>
-        </w:rPr>
-        <w:t xml:space="preserve">drumkit_audio.py</w:t>
-      </w:r>
-      <w:r>
-        <w:t xml:space="preserve"> and the default </w:t>
-      </w:r>
-      <w:r>
-        <w:rPr>
-          <w:rFonts w:ascii="Courier New" w:hAnsi="Courier New"/>
-        </w:rPr>
-        <w:t xml:space="preserve">instruments.piano.example.json</w:t>
-      </w:r>
-      <w:r>
-        <w:t xml:space="preserve"> used by </w:t>
-      </w:r>
-      <w:r>
-        <w:rPr>
-          <w:rFonts w:ascii="Courier New" w:hAnsi="Courier New"/>
-        </w:rPr>
-        <w:t xml:space="preserve">main.py</w:t>
-      </w:r>
-      <w:r>
-        <w:t xml:space="preserve"> when no custom piano JSON is provided.</w:t>
-      </w:r>
-    </w:p>
-    <w:p>
-      <w:pPr>
-        <w:pStyle w:val="Heading3"/>
-      </w:pPr>
-      <w:r>
-        <w:t xml:space="preserve">4.5 Audio Generation</w:t>
-      </w:r>
-    </w:p>
-    <w:p>
-      <w:pPr>
-        <w:pStyle w:val="Normal"/>
-      </w:pPr>
-      <w:r>
-        <w:t xml:space="preserve">The system pre-renders synthetic drum and piano sounds into </w:t>
-      </w:r>
-      <w:r>
-        <w:rPr>
-          <w:rFonts w:ascii="Courier New" w:hAnsi="Courier New"/>
-        </w:rPr>
-        <w:t xml:space="preserve">pygame.mixer.Sound</w:t>
-      </w:r>
-      <w:r>
-        <w:t xml:space="preserve"> objects to avoid synthesizing audio on every strike. Piano tones are approximately 0.5 seconds long. Short drum samples were lengthened so triggered sounds remain audible despite perception and output latency.</w:t>
-      </w:r>
-    </w:p>
-    <w:p>
-      <w:pPr>
-        <w:pStyle w:val="Normal"/>
-      </w:pPr>
-    </w:p>
-    <w:p>
-      <w:pPr>
-        <w:pStyle w:val="Heading2"/>
-      </w:pPr>
-      <w:r>
-        <w:t xml:space="preserve">5. Implementation</w:t>
-      </w:r>
-    </w:p>
-    <w:p>
-      <w:pPr>
-        <w:pStyle w:val="Heading3"/>
-      </w:pPr>
-      <w:r>
-        <w:t xml:space="preserve">5.1 Main Runtime Files</w:t>
+        <w:t xml:space="preserve">5.1 Private Implementation Modules</w:t>
+      </w:r>
+    </w:p>
+    <w:p>
+      <w:pPr>
+        <w:pStyle w:val="Normal"/>
+      </w:pPr>
+      <w:r>
+        <w:t xml:space="preserve">The source repository is not publicly released. For reproducibility of the academic description, the implementation is summarized by functional module rather than by public source path.</w:t>
       </w:r>
     </w:p>
     <w:tbl>
@@ -1948,7 +1851,7 @@
               <w:pStyle w:val="Normal"/>
             </w:pPr>
             <w:r>
-              <w:t xml:space="preserve">File</w:t>
+              <w:t xml:space="preserve">Private module</w:t>
             </w:r>
           </w:p>
         </w:tc>
@@ -1974,10 +1877,7 @@
               <w:pStyle w:val="Normal"/>
             </w:pPr>
             <w:r>
-              <w:rPr>
-                <w:rFonts w:ascii="Courier New" w:hAnsi="Courier New"/>
-              </w:rPr>
-              <w:t xml:space="preserve">main.py</w:t>
+              <w:t xml:space="preserve">Runtime controller</w:t>
             </w:r>
           </w:p>
         </w:tc>
@@ -2001,10 +1901,7 @@
               <w:pStyle w:val="Normal"/>
             </w:pPr>
             <w:r>
-              <w:rPr>
-                <w:rFonts w:ascii="Courier New" w:hAnsi="Courier New"/>
-              </w:rPr>
-              <w:t xml:space="preserve">hand_tracker.py</w:t>
+              <w:t xml:space="preserve">Hand-tracking layer</w:t>
             </w:r>
           </w:p>
         </w:tc>
@@ -2028,37 +1925,31 @@
               <w:pStyle w:val="Normal"/>
             </w:pPr>
             <w:r>
-              <w:rPr>
-                <w:rFonts w:ascii="Courier New" w:hAnsi="Courier New"/>
-              </w:rPr>
-              <w:t xml:space="preserve">strike_detector.py</w:t>
-            </w:r>
-          </w:p>
-        </w:tc>
-        <w:tc>
-          <w:tcPr/>
-          <w:p>
-            <w:pPr>
-              <w:pStyle w:val="Normal"/>
-            </w:pPr>
-            <w:r>
-              <w:t xml:space="preserve">Finger strike detector, pad strike detector, pad JSON validation</w:t>
-            </w:r>
-          </w:p>
-        </w:tc>
-      </w:tr>
-      <w:tr>
-        <w:tc>
-          <w:tcPr/>
-          <w:p>
-            <w:pPr>
-              <w:pStyle w:val="Normal"/>
-            </w:pPr>
-            <w:r>
-              <w:rPr>
-                <w:rFonts w:ascii="Courier New" w:hAnsi="Courier New"/>
-              </w:rPr>
-              <w:t xml:space="preserve">drumkit_audio.py</w:t>
+              <w:t xml:space="preserve">Strike-detection layer</w:t>
+            </w:r>
+          </w:p>
+        </w:tc>
+        <w:tc>
+          <w:tcPr/>
+          <w:p>
+            <w:pPr>
+              <w:pStyle w:val="Normal"/>
+            </w:pPr>
+            <w:r>
+              <w:t xml:space="preserve">Finger strike detector, pad strike detector, pad layout validation</w:t>
+            </w:r>
+          </w:p>
+        </w:tc>
+      </w:tr>
+      <w:tr>
+        <w:tc>
+          <w:tcPr/>
+          <w:p>
+            <w:pPr>
+              <w:pStyle w:val="Normal"/>
+            </w:pPr>
+            <w:r>
+              <w:t xml:space="preserve">Audio layer</w:t>
             </w:r>
           </w:p>
         </w:tc>
@@ -2082,64 +1973,31 @@
               <w:pStyle w:val="Normal"/>
             </w:pPr>
             <w:r>
-              <w:rPr>
-                <w:rFonts w:ascii="Courier New" w:hAnsi="Courier New"/>
-              </w:rPr>
-              <w:t xml:space="preserve">tools/gen_instrument_diagrams.py</w:t>
-            </w:r>
-          </w:p>
-        </w:tc>
-        <w:tc>
-          <w:tcPr/>
-          <w:p>
-            <w:pPr>
-              <w:pStyle w:val="Normal"/>
-            </w:pPr>
-            <w:r>
-              <w:t xml:space="preserve">Generates drum and piano mapping images</w:t>
-            </w:r>
-          </w:p>
-        </w:tc>
-      </w:tr>
-      <w:tr>
-        <w:tc>
-          <w:tcPr/>
-          <w:p>
-            <w:pPr>
-              <w:pStyle w:val="Normal"/>
-            </w:pPr>
-            <w:r>
-              <w:rPr>
-                <w:rFonts w:ascii="Courier New" w:hAnsi="Courier New"/>
-              </w:rPr>
-              <w:t xml:space="preserve">tools/gen_report_figures.py</w:t>
-            </w:r>
-          </w:p>
-        </w:tc>
-        <w:tc>
-          <w:tcPr/>
-          <w:p>
-            <w:pPr>
-              <w:pStyle w:val="Normal"/>
-            </w:pPr>
-            <w:r>
-              <w:t xml:space="preserve">Generates this report's architecture and result figures</w:t>
-            </w:r>
-          </w:p>
-        </w:tc>
-      </w:tr>
-      <w:tr>
-        <w:tc>
-          <w:tcPr/>
-          <w:p>
-            <w:pPr>
-              <w:pStyle w:val="Normal"/>
-            </w:pPr>
-            <w:r>
-              <w:rPr>
-                <w:rFonts w:ascii="Courier New" w:hAnsi="Courier New"/>
-              </w:rPr>
-              <w:t xml:space="preserve">tests/</w:t>
+              <w:t xml:space="preserve">Figure-generation utilities</w:t>
+            </w:r>
+          </w:p>
+        </w:tc>
+        <w:tc>
+          <w:tcPr/>
+          <w:p>
+            <w:pPr>
+              <w:pStyle w:val="Normal"/>
+            </w:pPr>
+            <w:r>
+              <w:t xml:space="preserve">Drum/piano mapping images and report diagrams</w:t>
+            </w:r>
+          </w:p>
+        </w:tc>
+      </w:tr>
+      <w:tr>
+        <w:tc>
+          <w:tcPr/>
+          <w:p>
+            <w:pPr>
+              <w:pStyle w:val="Normal"/>
+            </w:pPr>
+            <w:r>
+              <w:t xml:space="preserve">Validation suite</w:t>
             </w:r>
           </w:p>
         </w:tc>
@@ -2477,7 +2335,7 @@
         <w:pStyle w:val="Normal"/>
       </w:pPr>
       <w:r>
-        <w:t xml:space="preserve">The generated diagrams are used both as documentation and as sidebar assets, keeping the report, README, and runtime UI consistent.</w:t>
+        <w:t xml:space="preserve">The generated diagrams are used both as report figures and as sidebar assets, keeping the report and runtime UI consistent without requiring public source-code distribution.</w:t>
       </w:r>
     </w:p>
     <w:p>
@@ -3100,16 +2958,7 @@
         <w:pStyle w:val="Caption"/>
       </w:pPr>
       <w:r>
-        <w:t xml:space="preserve">Figure 7. Backend latency comparison generated by </w:t>
-      </w:r>
-      <w:r>
-        <w:rPr>
-          <w:rFonts w:ascii="Courier New" w:hAnsi="Courier New"/>
-        </w:rPr>
-        <w:t xml:space="preserve">tools/gen_report_figures.py</w:t>
-      </w:r>
-      <w:r>
-        <w:t xml:space="preserve">.</w:t>
+        <w:t xml:space="preserve">Figure 7. Backend latency comparison generated programmatically for this report.</w:t>
       </w:r>
     </w:p>
     <w:p>
@@ -5261,30 +5110,12 @@
         <w:pStyle w:val="Normal"/>
       </w:pPr>
       <w:r>
-        <w:t xml:space="preserve">[1] PANDA / AI Air-Drum Pad repository artifact, </w:t>
+        <w:t xml:space="preserve">[1] PANDA / AI Air-Drum Pad private project artifact: implementation, validation outputs, generated figures, instrument images, and recorded benchmark artifacts retained privately by the project authors and summarized in this self-contained report. [2] MediaPipe Hands / hand landmark model family, used through CPU MediaPipe and TFLite-derived pipeline paths. [3] OpenCV, used for camera capture, drawing, and display. [4] pygame, used for low-latency playback of pre-rendered PCM sound buffers. [5] DeepX DX-RT / DX-COM toolchain, used for </w:t>
       </w:r>
       <w:r>
         <w:rPr>
           <w:rFonts w:ascii="Courier New" w:hAnsi="Courier New"/>
         </w:rPr>
-        <w:t xml:space="preserve">air_drum_pad/</w:t>
-      </w:r>
-      <w:r>
-        <w:t xml:space="preserve"> in </w:t>
-      </w:r>
-      <w:r>
-        <w:rPr>
-          <w:rFonts w:ascii="Courier New" w:hAnsi="Courier New"/>
-        </w:rPr>
-        <w:t xml:space="preserve">git@github.com:GW-arch/deepx.git</w:t>
-      </w:r>
-      <w:r>
-        <w:t xml:space="preserve">: source code, tests, generated figures, instrument images, and recorded benchmark artifacts used to construct this self-contained report. [2] MediaPipe Hands / hand landmark model family, used through CPU MediaPipe and TFLite-derived pipeline paths. [3] OpenCV, used for camera capture, drawing, and display. [4] pygame, used for low-latency playback of pre-rendered PCM sound buffers. [5] DeepX DX-RT / DX-COM toolchain, used for </w:t>
-      </w:r>
-      <w:r>
-        <w:rPr>
-          <w:rFonts w:ascii="Courier New" w:hAnsi="Courier New"/>
-        </w:rPr>
         <w:t xml:space="preserve">.dxnn</w:t>
       </w:r>
       <w:r>
@@ -5301,135 +5132,71 @@
         <w:pStyle w:val="Heading2"/>
       </w:pPr>
       <w:r>
-        <w:t xml:space="preserve">Appendix A. Reproduction Commands</w:t>
-      </w:r>
-    </w:p>
-    <w:p>
-      <w:pPr>
-        <w:pStyle w:val="Normal"/>
-      </w:pPr>
-      <w:r>
-        <w:t xml:space="preserve">Generate interface diagrams:</w:t>
-      </w:r>
-    </w:p>
-    <w:p>
-      <w:pPr>
-        <w:pStyle w:val="Code"/>
-      </w:pPr>
-      <w:r>
-        <w:t xml:space="preserve">cd air_drum_pad</w:t>
-      </w:r>
-    </w:p>
-    <w:p>
-      <w:pPr>
-        <w:pStyle w:val="Code"/>
-      </w:pPr>
-      <w:r>
-        <w:t xml:space="preserve">python3 tools/gen_instrument_diagrams.py</w:t>
-      </w:r>
-    </w:p>
-    <w:p>
-      <w:pPr>
-        <w:pStyle w:val="Normal"/>
-      </w:pPr>
-      <w:r>
-        <w:t xml:space="preserve">Generate report figures:</w:t>
-      </w:r>
-    </w:p>
-    <w:p>
-      <w:pPr>
-        <w:pStyle w:val="Code"/>
-      </w:pPr>
-      <w:r>
-        <w:t xml:space="preserve">cd air_drum_pad</w:t>
-      </w:r>
-    </w:p>
-    <w:p>
-      <w:pPr>
-        <w:pStyle w:val="Code"/>
-      </w:pPr>
-      <w:r>
-        <w:t xml:space="preserve">python3 tools/gen_report_figures.py</w:t>
-      </w:r>
-    </w:p>
-    <w:p>
-      <w:pPr>
-        <w:pStyle w:val="Normal"/>
-      </w:pPr>
-      <w:r>
-        <w:t xml:space="preserve">Run quality checks:</w:t>
-      </w:r>
-    </w:p>
-    <w:p>
-      <w:pPr>
-        <w:pStyle w:val="Code"/>
-      </w:pPr>
-      <w:r>
-        <w:t xml:space="preserve">cd air_drum_pad</w:t>
-      </w:r>
-    </w:p>
-    <w:p>
-      <w:pPr>
-        <w:pStyle w:val="Code"/>
-      </w:pPr>
-      <w:r>
-        <w:t xml:space="preserve">RUN_BENCH_SMOKE=0 ./scripts/check_quality.sh</w:t>
-      </w:r>
-    </w:p>
-    <w:p>
-      <w:pPr>
-        <w:pStyle w:val="Normal"/>
-      </w:pPr>
-      <w:r>
-        <w:t xml:space="preserve">Run default modes:</w:t>
-      </w:r>
-    </w:p>
-    <w:p>
-      <w:pPr>
-        <w:pStyle w:val="Code"/>
-      </w:pPr>
-      <w:r>
-        <w:t xml:space="preserve">cd air_drum_pad</w:t>
-      </w:r>
-    </w:p>
-    <w:p>
-      <w:pPr>
-        <w:pStyle w:val="Code"/>
-      </w:pPr>
-      <w:r>
-        <w:t xml:space="preserve">python3 main.py --camera 0</w:t>
-      </w:r>
-    </w:p>
-    <w:p>
-      <w:pPr>
-        <w:pStyle w:val="Code"/>
-      </w:pPr>
-      <w:r>
-        <w:t xml:space="preserve">python3 main.py --piano --camera 0</w:t>
-      </w:r>
-    </w:p>
-    <w:p>
-      <w:pPr>
-        <w:pStyle w:val="Normal"/>
-      </w:pPr>
-      <w:r>
-        <w:t xml:space="preserve">Run custom drum pads:</w:t>
-      </w:r>
-    </w:p>
-    <w:p>
-      <w:pPr>
-        <w:pStyle w:val="Code"/>
-      </w:pPr>
-      <w:r>
-        <w:t xml:space="preserve">cd air_drum_pad</w:t>
-      </w:r>
-    </w:p>
-    <w:p>
-      <w:pPr>
-        <w:pStyle w:val="Code"/>
-      </w:pPr>
-      <w:r>
-        <w:t xml:space="preserve">python3 main.py --camera 0 --drum-pads pads.example.json</w:t>
+        <w:t xml:space="preserve">Appendix A. Artifact Availability and Private Validation Workflow</w:t>
+      </w:r>
+    </w:p>
+    <w:p>
+      <w:pPr>
+        <w:pStyle w:val="Normal"/>
+      </w:pPr>
+      <w:r>
+        <w:t xml:space="preserve">The GitHub repository and source code are not publicly released. The report is therefore written as a self-contained technical description: all system design, mode mappings, strike-detection equations, backend definitions, benchmark settings, and measured values needed for review are included in the main text.</w:t>
+      </w:r>
+    </w:p>
+    <w:p>
+      <w:pPr>
+        <w:pStyle w:val="Normal"/>
+      </w:pPr>
+      <w:r>
+        <w:t xml:space="preserve">The private implementation was validated using the following internal workflow:</w:t>
+      </w:r>
+    </w:p>
+    <w:p>
+      <w:pPr>
+        <w:pStyle w:val="ListParagraph"/>
+      </w:pPr>
+      <w:r>
+        <w:t xml:space="preserve">1. Regenerate the interface diagrams and report figures from the private artifact.</w:t>
+      </w:r>
+    </w:p>
+    <w:p>
+      <w:pPr>
+        <w:pStyle w:val="ListParagraph"/>
+      </w:pPr>
+      <w:r>
+        <w:t xml:space="preserve">2. Export the English and Korean reports to Markdown, DOCX, and PDF.</w:t>
+      </w:r>
+    </w:p>
+    <w:p>
+      <w:pPr>
+        <w:pStyle w:val="ListParagraph"/>
+      </w:pPr>
+      <w:r>
+        <w:t xml:space="preserve">3. Run Python syntax checks, unit tests, and palm-decode tests.</w:t>
+      </w:r>
+    </w:p>
+    <w:p>
+      <w:pPr>
+        <w:pStyle w:val="ListParagraph"/>
+      </w:pPr>
+      <w:r>
+        <w:t xml:space="preserve">4. Verify DOCX package integrity and PDF generation.</w:t>
+      </w:r>
+    </w:p>
+    <w:p>
+      <w:pPr>
+        <w:pStyle w:val="ListParagraph"/>
+      </w:pPr>
+      <w:r>
+        <w:t xml:space="preserve">5. Record the exact private build revision used for submission.</w:t>
+      </w:r>
+    </w:p>
+    <w:p>
+      <w:pPr>
+        <w:pStyle w:val="Normal"/>
+      </w:pPr>
+      <w:r>
+        <w:t xml:space="preserve">No public GitHub URL, source archive, or source-code listing is required for reading this report. If an evaluator requires code access, it should be provided separately through the course's private submission channel.</w:t>
       </w:r>
     </w:p>
     <w:p>
@@ -5442,7 +5209,7 @@
         <w:pStyle w:val="Heading2"/>
       </w:pPr>
       <w:r>
-        <w:t xml:space="preserve">Appendix B. Important Source Paths</w:t>
+        <w:t xml:space="preserve">Appendix B. Private Artifact Summary</w:t>
       </w:r>
     </w:p>
     <w:tbl>
@@ -5468,7 +5235,7 @@
               <w:pStyle w:val="Normal"/>
             </w:pPr>
             <w:r>
-              <w:t xml:space="preserve">Path</w:t>
+              <w:t xml:space="preserve">Artifact category</w:t>
             </w:r>
           </w:p>
         </w:tc>
@@ -5494,237 +5261,138 @@
               <w:pStyle w:val="Normal"/>
             </w:pPr>
             <w:r>
-              <w:rPr>
-                <w:rFonts w:ascii="Courier New" w:hAnsi="Courier New"/>
-              </w:rPr>
-              <w:t xml:space="preserve">main.py</w:t>
-            </w:r>
-          </w:p>
-        </w:tc>
-        <w:tc>
-          <w:tcPr/>
-          <w:p>
-            <w:pPr>
-              <w:pStyle w:val="Normal"/>
-            </w:pPr>
-            <w:r>
-              <w:t xml:space="preserve">Main runtime application</w:t>
-            </w:r>
-          </w:p>
-        </w:tc>
-      </w:tr>
-      <w:tr>
-        <w:tc>
-          <w:tcPr/>
-          <w:p>
-            <w:pPr>
-              <w:pStyle w:val="Normal"/>
-            </w:pPr>
-            <w:r>
-              <w:rPr>
-                <w:rFonts w:ascii="Courier New" w:hAnsi="Courier New"/>
-              </w:rPr>
-              <w:t xml:space="preserve">strike_detector.py</w:t>
-            </w:r>
-          </w:p>
-        </w:tc>
-        <w:tc>
-          <w:tcPr/>
-          <w:p>
-            <w:pPr>
-              <w:pStyle w:val="Normal"/>
-            </w:pPr>
-            <w:r>
-              <w:t xml:space="preserve">Strike and pad detectors</w:t>
-            </w:r>
-          </w:p>
-        </w:tc>
-      </w:tr>
-      <w:tr>
-        <w:tc>
-          <w:tcPr/>
-          <w:p>
-            <w:pPr>
-              <w:pStyle w:val="Normal"/>
-            </w:pPr>
-            <w:r>
-              <w:rPr>
-                <w:rFonts w:ascii="Courier New" w:hAnsi="Courier New"/>
-              </w:rPr>
-              <w:t xml:space="preserve">drumkit_audio.py</w:t>
-            </w:r>
-          </w:p>
-        </w:tc>
-        <w:tc>
-          <w:tcPr/>
-          <w:p>
-            <w:pPr>
-              <w:pStyle w:val="Normal"/>
-            </w:pPr>
-            <w:r>
-              <w:t xml:space="preserve">Audio and piano note definitions</w:t>
-            </w:r>
-          </w:p>
-        </w:tc>
-      </w:tr>
-      <w:tr>
-        <w:tc>
-          <w:tcPr/>
-          <w:p>
-            <w:pPr>
-              <w:pStyle w:val="Normal"/>
-            </w:pPr>
-            <w:r>
-              <w:rPr>
-                <w:rFonts w:ascii="Courier New" w:hAnsi="Courier New"/>
-              </w:rPr>
-              <w:t xml:space="preserve">pads.example.json</w:t>
-            </w:r>
-          </w:p>
-        </w:tc>
-        <w:tc>
-          <w:tcPr/>
-          <w:p>
-            <w:pPr>
-              <w:pStyle w:val="Normal"/>
-            </w:pPr>
-            <w:r>
-              <w:t xml:space="preserve">Custom drum pad layout example</w:t>
-            </w:r>
-          </w:p>
-        </w:tc>
-      </w:tr>
-      <w:tr>
-        <w:tc>
-          <w:tcPr/>
-          <w:p>
-            <w:pPr>
-              <w:pStyle w:val="Normal"/>
-            </w:pPr>
-            <w:r>
-              <w:rPr>
-                <w:rFonts w:ascii="Courier New" w:hAnsi="Courier New"/>
-              </w:rPr>
-              <w:t xml:space="preserve">instruments.piano.example.json</w:t>
-            </w:r>
-          </w:p>
-        </w:tc>
-        <w:tc>
-          <w:tcPr/>
-          <w:p>
-            <w:pPr>
-              <w:pStyle w:val="Normal"/>
-            </w:pPr>
-            <w:r>
-              <w:t xml:space="preserve">Default/custom piano note example</w:t>
-            </w:r>
-          </w:p>
-        </w:tc>
-      </w:tr>
-      <w:tr>
-        <w:tc>
-          <w:tcPr/>
-          <w:p>
-            <w:pPr>
-              <w:pStyle w:val="Normal"/>
-            </w:pPr>
-            <w:r>
-              <w:rPr>
-                <w:rFonts w:ascii="Courier New" w:hAnsi="Courier New"/>
-              </w:rPr>
-              <w:t xml:space="preserve">tools/gen_instrument_diagrams.py</w:t>
-            </w:r>
-          </w:p>
-        </w:tc>
-        <w:tc>
-          <w:tcPr/>
-          <w:p>
-            <w:pPr>
-              <w:pStyle w:val="Normal"/>
-            </w:pPr>
-            <w:r>
-              <w:t xml:space="preserve">Generates mode diagrams</w:t>
-            </w:r>
-          </w:p>
-        </w:tc>
-      </w:tr>
-      <w:tr>
-        <w:tc>
-          <w:tcPr/>
-          <w:p>
-            <w:pPr>
-              <w:pStyle w:val="Normal"/>
-            </w:pPr>
-            <w:r>
-              <w:rPr>
-                <w:rFonts w:ascii="Courier New" w:hAnsi="Courier New"/>
-              </w:rPr>
-              <w:t xml:space="preserve">tools/gen_report_figures.py</w:t>
-            </w:r>
-          </w:p>
-        </w:tc>
-        <w:tc>
-          <w:tcPr/>
-          <w:p>
-            <w:pPr>
-              <w:pStyle w:val="Normal"/>
-            </w:pPr>
-            <w:r>
-              <w:t xml:space="preserve">Generates report figures</w:t>
-            </w:r>
-          </w:p>
-        </w:tc>
-      </w:tr>
-      <w:tr>
-        <w:tc>
-          <w:tcPr/>
-          <w:p>
-            <w:pPr>
-              <w:pStyle w:val="Normal"/>
-            </w:pPr>
-            <w:r>
-              <w:rPr>
-                <w:rFonts w:ascii="Courier New" w:hAnsi="Courier New"/>
-              </w:rPr>
-              <w:t xml:space="preserve">docs/figures/</w:t>
-            </w:r>
-          </w:p>
-        </w:tc>
-        <w:tc>
-          <w:tcPr/>
-          <w:p>
-            <w:pPr>
-              <w:pStyle w:val="Normal"/>
-            </w:pPr>
-            <w:r>
-              <w:t xml:space="preserve">Report-only generated figures</w:t>
-            </w:r>
-          </w:p>
-        </w:tc>
-      </w:tr>
-      <w:tr>
-        <w:tc>
-          <w:tcPr/>
-          <w:p>
-            <w:pPr>
-              <w:pStyle w:val="Normal"/>
-            </w:pPr>
-            <w:r>
-              <w:rPr>
-                <w:rFonts w:ascii="Courier New" w:hAnsi="Courier New"/>
-              </w:rPr>
-              <w:t xml:space="preserve">instruments/</w:t>
-            </w:r>
-          </w:p>
-        </w:tc>
-        <w:tc>
-          <w:tcPr/>
-          <w:p>
-            <w:pPr>
-              <w:pStyle w:val="Normal"/>
-            </w:pPr>
-            <w:r>
-              <w:t xml:space="preserve">Runtime/documentation mapping images</w:t>
+              <w:t xml:space="preserve">Runtime application</w:t>
+            </w:r>
+          </w:p>
+        </w:tc>
+        <w:tc>
+          <w:tcPr/>
+          <w:p>
+            <w:pPr>
+              <w:pStyle w:val="Normal"/>
+            </w:pPr>
+            <w:r>
+              <w:t xml:space="preserve">Private camera-to-audio application for drum and piano modes</w:t>
+            </w:r>
+          </w:p>
+        </w:tc>
+      </w:tr>
+      <w:tr>
+        <w:tc>
+          <w:tcPr/>
+          <w:p>
+            <w:pPr>
+              <w:pStyle w:val="Normal"/>
+            </w:pPr>
+            <w:r>
+              <w:t xml:space="preserve">Tracking backends</w:t>
+            </w:r>
+          </w:p>
+        </w:tc>
+        <w:tc>
+          <w:tcPr/>
+          <w:p>
+            <w:pPr>
+              <w:pStyle w:val="Normal"/>
+            </w:pPr>
+            <w:r>
+              <w:t xml:space="preserve">CPU MediaPipe, CPU TFLite baseline, hybrid CPU+NPU, and NPU dual-halves paths</w:t>
+            </w:r>
+          </w:p>
+        </w:tc>
+      </w:tr>
+      <w:tr>
+        <w:tc>
+          <w:tcPr/>
+          <w:p>
+            <w:pPr>
+              <w:pStyle w:val="Normal"/>
+            </w:pPr>
+            <w:r>
+              <w:t xml:space="preserve">Strike-detection logic</w:t>
+            </w:r>
+          </w:p>
+        </w:tc>
+        <w:tc>
+          <w:tcPr/>
+          <w:p>
+            <w:pPr>
+              <w:pStyle w:val="Normal"/>
+            </w:pPr>
+            <w:r>
+              <w:t xml:space="preserve">Fingertip velocity, joint angular velocity, confidence filtering, and cooldown handling</w:t>
+            </w:r>
+          </w:p>
+        </w:tc>
+      </w:tr>
+      <w:tr>
+        <w:tc>
+          <w:tcPr/>
+          <w:p>
+            <w:pPr>
+              <w:pStyle w:val="Normal"/>
+            </w:pPr>
+            <w:r>
+              <w:t xml:space="preserve">Configuration examples</w:t>
+            </w:r>
+          </w:p>
+        </w:tc>
+        <w:tc>
+          <w:tcPr/>
+          <w:p>
+            <w:pPr>
+              <w:pStyle w:val="Normal"/>
+            </w:pPr>
+            <w:r>
+              <w:t xml:space="preserve">Private drum-pad and piano-note layout examples used to generate the figures</w:t>
+            </w:r>
+          </w:p>
+        </w:tc>
+      </w:tr>
+      <w:tr>
+        <w:tc>
+          <w:tcPr/>
+          <w:p>
+            <w:pPr>
+              <w:pStyle w:val="Normal"/>
+            </w:pPr>
+            <w:r>
+              <w:t xml:space="preserve">Generated figures</w:t>
+            </w:r>
+          </w:p>
+        </w:tc>
+        <w:tc>
+          <w:tcPr/>
+          <w:p>
+            <w:pPr>
+              <w:pStyle w:val="Normal"/>
+            </w:pPr>
+            <w:r>
+              <w:t xml:space="preserve">Report diagrams, instrument layout images, and the PANDA icon included in this report</w:t>
+            </w:r>
+          </w:p>
+        </w:tc>
+      </w:tr>
+      <w:tr>
+        <w:tc>
+          <w:tcPr/>
+          <w:p>
+            <w:pPr>
+              <w:pStyle w:val="Normal"/>
+            </w:pPr>
+            <w:r>
+              <w:t xml:space="preserve">Validation outputs</w:t>
+            </w:r>
+          </w:p>
+        </w:tc>
+        <w:tc>
+          <w:tcPr/>
+          <w:p>
+            <w:pPr>
+              <w:pStyle w:val="Normal"/>
+            </w:pPr>
+            <w:r>
+              <w:t xml:space="preserve">Syntax checks, unit tests, palm-decode tests, DOCX integrity checks, and PDF export checks</w:t>
             </w:r>
           </w:p>
         </w:tc>

</xml_diff>

<commit_message>
Widen PANDA report icon card
</commit_message>
<xml_diff>
--- a/air_drum_pad/docs/FINAL_REPORT_AI_AIR_DRUM_PAD.docx
+++ b/air_drum_pad/docs/FINAL_REPORT_AI_AIR_DRUM_PAD.docx
@@ -72,7 +72,7 @@
       <w:r>
         <w:drawing>
           <wp:inline distT="0" distB="0" distL="0" distR="0">
-            <wp:extent cx="5669280" cy="1488186"/>
+            <wp:extent cx="5669280" cy="1287079"/>
             <wp:docPr id="1" name="panda_icon.png"/>
             <wp:cNvGraphicFramePr>
               <a:graphicFrameLocks noChangeAspect="1"/>
@@ -93,7 +93,7 @@
                   <pic:spPr>
                     <a:xfrm>
                       <a:off x="0" y="0"/>
-                      <a:ext cx="5669280" cy="1488186"/>
+                      <a:ext cx="5669280" cy="1287079"/>
                     </a:xfrm>
                     <a:prstGeom prst="rect">
                       <a:avLst/>

</xml_diff>

<commit_message>
Finalize English-only private report
</commit_message>
<xml_diff>
--- a/air_drum_pad/docs/FINAL_REPORT_AI_AIR_DRUM_PAD.docx
+++ b/air_drum_pad/docs/FINAL_REPORT_AI_AIR_DRUM_PAD.docx
@@ -250,10 +250,10 @@
           <w:b/>
           <w:bCs/>
         </w:rPr>
-        <w:t xml:space="preserve">Source availability:</w:t>
-      </w:r>
-      <w:r>
-        <w:t xml:space="preserve"> Private implementation artifact; the GitHub repository and source code are not publicly released.</w:t>
+        <w:t xml:space="preserve">Code availability:</w:t>
+      </w:r>
+      <w:r>
+        <w:t xml:space="preserve"> Not publicly released.</w:t>
       </w:r>
     </w:p>
     <w:p>
@@ -339,109 +339,117 @@
         <w:t xml:space="preserve">A</w:t>
       </w:r>
       <w:r>
-        <w:t xml:space="preserve">udio Interface, the final titled version of </w:t>
+        <w:t xml:space="preserve">udio Interface, a real-time camera-based musical interface that converts hand and finger motions into playable drum and piano events. The system tracks hand landmarks from a USB camera, estimates downward fingertip velocity and finger-joint angular velocity, and triggers audio only when both motion cues indicate an intentional strike. Two musical modes are implemented on the same perception-and-strike-detection core: (1) a </w:t>
       </w:r>
       <w:r>
         <w:rPr>
           <w:b/>
           <w:bCs/>
         </w:rPr>
-        <w:t xml:space="preserve">AI Air-Drum Pad</w:t>
-      </w:r>
-      <w:r>
-        <w:t xml:space="preserve">, a real-time camera-based musical interface that converts hand and finger motions into playable drum and piano events. The system tracks hand landmarks from a USB camera, estimates downward fingertip velocity and finger-joint angular velocity, and triggers audio only when both motion cues indicate an intentional strike. Two musical modes are implemented on the same perception-and-strike-detection core: (1) a </w:t>
+        <w:t xml:space="preserve">drum pad mode</w:t>
+      </w:r>
+      <w:r>
+        <w:t xml:space="preserve">, where any fingertip may strike an on-screen rectangular pad, and (2) a </w:t>
       </w:r>
       <w:r>
         <w:rPr>
           <w:b/>
           <w:bCs/>
         </w:rPr>
-        <w:t xml:space="preserve">drum pad mode</w:t>
-      </w:r>
-      <w:r>
-        <w:t xml:space="preserve">, where any fingertip may strike an on-screen rectangular pad, and (2) a </w:t>
-      </w:r>
+        <w:t xml:space="preserve">piano mode</w:t>
+      </w:r>
+      <w:r>
+        <w:t xml:space="preserve">, where notes are mapped to hand and finger identity. The final piano default layout maps the left hand from thumb to pinky as </w:t>
+      </w:r>
+      <w:r>
+        <w:rPr>
+          <w:rFonts w:ascii="Courier New" w:hAnsi="Courier New"/>
+        </w:rPr>
+        <w:t xml:space="preserve">G4, F4, E4, D4, C4</w:t>
+      </w:r>
+      <w:r>
+        <w:t xml:space="preserve"> and the right hand as </w:t>
+      </w:r>
+      <w:r>
+        <w:rPr>
+          <w:rFonts w:ascii="Courier New" w:hAnsi="Courier New"/>
+        </w:rPr>
+        <w:t xml:space="preserve">C5, D5, E5, F5, G5</w:t>
+      </w:r>
+      <w:r>
+        <w:t xml:space="preserve">. The implementation supports CPU MediaPipe, CPU TFLite baseline, hybrid CPU+NPU hand-landmark inference, and a low-latency NPU dual-halves mode. Evaluation utilities and unit tests validate strike detection, pad-zone parsing, piano-note mapping, ROI transforms, and benchmark helpers. Prototype measurements show that the low-latency NPU dual-halves backend can approach the 60 FPS frame budget, while the more accurate palm-detection pipeline is limited by CPU palm detection. The project demonstrates a practical path toward low-cost, contactless musical instruments on edge AI hardware, with clear remaining work in end-to-end audio-latency measurement, robust hit-accuracy evaluation, and user studies.</w:t>
+      </w:r>
+    </w:p>
+    <w:p>
+      <w:pPr>
+        <w:pStyle w:val="Normal"/>
+      </w:pPr>
       <w:r>
         <w:rPr>
           <w:b/>
           <w:bCs/>
         </w:rPr>
-        <w:t xml:space="preserve">piano mode</w:t>
-      </w:r>
-      <w:r>
-        <w:t xml:space="preserve">, where notes are mapped to hand and finger identity. The final piano default layout maps the left hand from thumb to pinky as </w:t>
-      </w:r>
-      <w:r>
-        <w:rPr>
-          <w:rFonts w:ascii="Courier New" w:hAnsi="Courier New"/>
-        </w:rPr>
-        <w:t xml:space="preserve">G4, F4, E4, D4, C4</w:t>
-      </w:r>
-      <w:r>
-        <w:t xml:space="preserve"> and the right hand as </w:t>
-      </w:r>
-      <w:r>
-        <w:rPr>
-          <w:rFonts w:ascii="Courier New" w:hAnsi="Courier New"/>
-        </w:rPr>
-        <w:t xml:space="preserve">C5, D5, E5, F5, G5</w:t>
-      </w:r>
-      <w:r>
-        <w:t xml:space="preserve">. The implementation supports CPU MediaPipe, CPU TFLite baseline, hybrid CPU+NPU hand-landmark inference, and a low-latency NPU dual-halves mode. Evaluation utilities and unit tests validate strike detection, pad-zone parsing, piano-note mapping, ROI transforms, and benchmark helpers. Prototype measurements show that the low-latency NPU dual-halves backend can approach the 60 FPS frame budget, while the more accurate palm-detection pipeline is limited by CPU palm detection. The project demonstrates a practical path toward low-cost, contactless musical instruments on edge AI hardware, with clear remaining work in end-to-end audio-latency measurement, robust hit-accuracy evaluation, and user studies.</w:t>
-      </w:r>
-    </w:p>
-    <w:p>
-      <w:pPr>
-        <w:pStyle w:val="Normal"/>
-      </w:pPr>
+        <w:t xml:space="preserve">Keywords:</w:t>
+      </w:r>
+      <w:r>
+        <w:t xml:space="preserve"> PANDA, contactless musical interface, hand tracking, gesture recognition, air drums, virtual piano, edge AI, NPU, real-time interaction</w:t>
+      </w:r>
+    </w:p>
+    <w:p>
+      <w:pPr>
+        <w:pStyle w:val="Normal"/>
+      </w:pPr>
+    </w:p>
+    <w:p>
+      <w:pPr>
+        <w:pStyle w:val="Heading2"/>
+      </w:pPr>
+      <w:r>
+        <w:t xml:space="preserve">1. Introduction</w:t>
+      </w:r>
+    </w:p>
+    <w:p>
+      <w:pPr>
+        <w:pStyle w:val="Normal"/>
+      </w:pPr>
+      <w:r>
+        <w:t xml:space="preserve">Musical performance interfaces traditionally rely on physical contact: a drumstick contacts a drumhead, or a finger depresses a piano key. Contact provides both tactile feedback and a clear sensing event. However, camera-based hand tracking makes it possible to build </w:t>
+      </w:r>
       <w:r>
         <w:rPr>
           <w:b/>
           <w:bCs/>
         </w:rPr>
-        <w:t xml:space="preserve">Keywords:</w:t>
-      </w:r>
-      <w:r>
-        <w:t xml:space="preserve"> PANDA, contactless musical interface, hand tracking, gesture recognition, air drums, virtual piano, edge AI, NPU, real-time interaction</w:t>
-      </w:r>
-    </w:p>
-    <w:p>
-      <w:pPr>
-        <w:pStyle w:val="Normal"/>
-      </w:pPr>
-    </w:p>
-    <w:p>
-      <w:pPr>
-        <w:pStyle w:val="Heading2"/>
-      </w:pPr>
-      <w:r>
-        <w:t xml:space="preserve">1. Introduction</w:t>
-      </w:r>
-    </w:p>
-    <w:p>
-      <w:pPr>
-        <w:pStyle w:val="Normal"/>
-      </w:pPr>
-      <w:r>
-        <w:t xml:space="preserve">Musical performance interfaces traditionally rely on physical contact: a drumstick contacts a drumhead, or a finger depresses a piano key. Contact provides both tactile feedback and a clear sensing event. However, camera-based hand tracking makes it possible to build </w:t>
+        <w:t xml:space="preserve">contactless musical instruments</w:t>
+      </w:r>
+      <w:r>
+        <w:t xml:space="preserve"> that require no specialized controller beyond a camera and display. Such systems are attractive for prototyping, education, accessibility, public installations, and embedded AI demonstrations.</w:t>
+      </w:r>
+    </w:p>
+    <w:p>
+      <w:pPr>
+        <w:pStyle w:val="Normal"/>
+      </w:pPr>
+      <w:r>
+        <w:t xml:space="preserve">The main challenge is that visually recognizing a musical strike is harder than recognizing a static hand pose. A simple fingertip-position trigger produces false positives when the whole hand moves, while a simple velocity trigger may fire during non-musical gestures. PANDA addresses this by combining two motion cues:</w:t>
+      </w:r>
+    </w:p>
+    <w:p>
+      <w:pPr>
+        <w:pStyle w:val="ListParagraph"/>
+      </w:pPr>
+      <w:r>
+        <w:t xml:space="preserve">1. </w:t>
       </w:r>
       <w:r>
         <w:rPr>
           <w:b/>
           <w:bCs/>
         </w:rPr>
-        <w:t xml:space="preserve">contactless musical instruments</w:t>
-      </w:r>
-      <w:r>
-        <w:t xml:space="preserve"> that require no specialized controller beyond a camera and display. Such systems are attractive for prototyping, education, accessibility, public installations, and embedded AI demonstrations.</w:t>
-      </w:r>
-    </w:p>
-    <w:p>
-      <w:pPr>
-        <w:pStyle w:val="Normal"/>
-      </w:pPr>
-      <w:r>
-        <w:t xml:space="preserve">The main challenge is that visually recognizing a musical strike is harder than recognizing a static hand pose. A simple fingertip-position trigger produces false positives when the whole hand moves, while a simple velocity trigger may fire during non-musical gestures. PANDA addresses this by combining two motion cues:</w:t>
+        <w:t xml:space="preserve">Fingertip downward velocity</w:t>
+      </w:r>
+      <w:r>
+        <w:t xml:space="preserve">: the fingertip moves rapidly in the image direction associated with a striking motion.</w:t>
       </w:r>
     </w:p>
     <w:p>
@@ -449,17 +457,41 @@
         <w:pStyle w:val="ListParagraph"/>
       </w:pPr>
       <w:r>
-        <w:t xml:space="preserve">1. </w:t>
+        <w:t xml:space="preserve">2. </w:t>
       </w:r>
       <w:r>
         <w:rPr>
           <w:b/>
           <w:bCs/>
         </w:rPr>
-        <w:t xml:space="preserve">Fingertip downward velocity</w:t>
-      </w:r>
-      <w:r>
-        <w:t xml:space="preserve">: the fingertip moves rapidly in the image direction associated with a striking motion.</w:t>
+        <w:t xml:space="preserve">Finger-joint angular velocity</w:t>
+      </w:r>
+      <w:r>
+        <w:t xml:space="preserve">: the finger itself articulates, distinguishing a deliberate finger strike from arm-only translation.</w:t>
+      </w:r>
+    </w:p>
+    <w:p>
+      <w:pPr>
+        <w:pStyle w:val="Normal"/>
+      </w:pPr>
+      <w:r>
+        <w:t xml:space="preserve">This report summarizes the final implemented system, its two musical modes, generated visual assets, software architecture, testing strategy, and prototype performance measurements.</w:t>
+      </w:r>
+    </w:p>
+    <w:p>
+      <w:pPr>
+        <w:pStyle w:val="Heading3"/>
+      </w:pPr>
+      <w:r>
+        <w:t xml:space="preserve">1.1 Contributions</w:t>
+      </w:r>
+    </w:p>
+    <w:p>
+      <w:pPr>
+        <w:pStyle w:val="Normal"/>
+      </w:pPr>
+      <w:r>
+        <w:t xml:space="preserve">The implemented project contributes:</w:t>
       </w:r>
     </w:p>
     <w:p>
@@ -467,65 +499,23 @@
         <w:pStyle w:val="ListParagraph"/>
       </w:pPr>
       <w:r>
-        <w:t xml:space="preserve">2. </w:t>
+        <w:t xml:space="preserve">• A real-time hand-landmark musical interface supporting both </w:t>
       </w:r>
       <w:r>
         <w:rPr>
           <w:b/>
           <w:bCs/>
         </w:rPr>
-        <w:t xml:space="preserve">Finger-joint angular velocity</w:t>
-      </w:r>
-      <w:r>
-        <w:t xml:space="preserve">: the finger itself articulates, distinguishing a deliberate finger strike from arm-only translation.</w:t>
-      </w:r>
-    </w:p>
-    <w:p>
-      <w:pPr>
-        <w:pStyle w:val="Normal"/>
-      </w:pPr>
-      <w:r>
-        <w:t xml:space="preserve">This report summarizes the final implemented system, its two musical modes, generated visual assets, software architecture, testing strategy, and prototype performance measurements.</w:t>
-      </w:r>
-    </w:p>
-    <w:p>
-      <w:pPr>
-        <w:pStyle w:val="Heading3"/>
-      </w:pPr>
-      <w:r>
-        <w:t xml:space="preserve">1.1 Contributions</w:t>
-      </w:r>
-    </w:p>
-    <w:p>
-      <w:pPr>
-        <w:pStyle w:val="Normal"/>
-      </w:pPr>
-      <w:r>
-        <w:t xml:space="preserve">The implemented project contributes:</w:t>
-      </w:r>
-    </w:p>
-    <w:p>
-      <w:pPr>
-        <w:pStyle w:val="ListParagraph"/>
-      </w:pPr>
-      <w:r>
-        <w:t xml:space="preserve">• A real-time hand-landmark musical interface supporting both </w:t>
+        <w:t xml:space="preserve">drum pad</w:t>
+      </w:r>
+      <w:r>
+        <w:t xml:space="preserve"> and </w:t>
       </w:r>
       <w:r>
         <w:rPr>
           <w:b/>
           <w:bCs/>
         </w:rPr>
-        <w:t xml:space="preserve">drum pad</w:t>
-      </w:r>
-      <w:r>
-        <w:t xml:space="preserve"> and </w:t>
-      </w:r>
-      <w:r>
-        <w:rPr>
-          <w:b/>
-          <w:bCs/>
-        </w:rPr>
         <w:t xml:space="preserve">piano</w:t>
       </w:r>
       <w:r>
@@ -604,7 +594,7 @@
         <w:pStyle w:val="ListParagraph"/>
       </w:pPr>
       <w:r>
-        <w:t xml:space="preserve">• A repeatable private validation pipeline covering mapping, detector behavior, pad validation, ROI helpers, and benchmark helpers.</w:t>
+        <w:t xml:space="preserve">• A repeatable validation pipeline covering mapping, detector behavior, pad validation, ROI helpers, and benchmark helpers.</w:t>
       </w:r>
     </w:p>
     <w:p>
@@ -1771,7 +1761,7 @@
         <w:pStyle w:val="Normal"/>
       </w:pPr>
       <w:r>
-        <w:t xml:space="preserve">This mapping is implemented as the default runtime note configuration and is also mirrored in the private example configuration used for custom piano layouts.</w:t>
+        <w:t xml:space="preserve">This mapping is implemented as the default runtime note configuration and is mirrored in the custom piano-layout configuration used to generate the example figure.</w:t>
       </w:r>
     </w:p>
     <w:p>
@@ -1817,15 +1807,15 @@
         <w:pStyle w:val="Heading3"/>
       </w:pPr>
       <w:r>
-        <w:t xml:space="preserve">5.1 Private Implementation Modules</w:t>
-      </w:r>
-    </w:p>
-    <w:p>
-      <w:pPr>
-        <w:pStyle w:val="Normal"/>
-      </w:pPr>
-      <w:r>
-        <w:t xml:space="preserve">The source repository is not publicly released. For reproducibility of the academic description, the implementation is summarized by functional module rather than by public source path.</w:t>
+        <w:t xml:space="preserve">5.1 Runtime Backends</w:t>
+      </w:r>
+    </w:p>
+    <w:p>
+      <w:pPr>
+        <w:pStyle w:val="Normal"/>
+      </w:pPr>
+      <w:r>
+        <w:t xml:space="preserve">The application supports four major backend configurations.</w:t>
       </w:r>
     </w:p>
     <w:tbl>
@@ -1851,208 +1841,6 @@
               <w:pStyle w:val="Normal"/>
             </w:pPr>
             <w:r>
-              <w:t xml:space="preserve">Private module</w:t>
-            </w:r>
-          </w:p>
-        </w:tc>
-        <w:tc>
-          <w:tcPr>
-            <w:shd w:fill="E2E8F0"/>
-          </w:tcPr>
-          <w:p>
-            <w:pPr>
-              <w:pStyle w:val="Normal"/>
-            </w:pPr>
-            <w:r>
-              <w:t xml:space="preserve">Role</w:t>
-            </w:r>
-          </w:p>
-        </w:tc>
-      </w:tr>
-      <w:tr>
-        <w:tc>
-          <w:tcPr/>
-          <w:p>
-            <w:pPr>
-              <w:pStyle w:val="Normal"/>
-            </w:pPr>
-            <w:r>
-              <w:t xml:space="preserve">Runtime controller</w:t>
-            </w:r>
-          </w:p>
-        </w:tc>
-        <w:tc>
-          <w:tcPr/>
-          <w:p>
-            <w:pPr>
-              <w:pStyle w:val="Normal"/>
-            </w:pPr>
-            <w:r>
-              <w:t xml:space="preserve">Camera loop, backend selection, mode selection, drawing, sidebar UI, sound triggering</w:t>
-            </w:r>
-          </w:p>
-        </w:tc>
-      </w:tr>
-      <w:tr>
-        <w:tc>
-          <w:tcPr/>
-          <w:p>
-            <w:pPr>
-              <w:pStyle w:val="Normal"/>
-            </w:pPr>
-            <w:r>
-              <w:t xml:space="preserve">Hand-tracking layer</w:t>
-            </w:r>
-          </w:p>
-        </w:tc>
-        <w:tc>
-          <w:tcPr/>
-          <w:p>
-            <w:pPr>
-              <w:pStyle w:val="Normal"/>
-            </w:pPr>
-            <w:r>
-              <w:t xml:space="preserve">CPU MediaPipe, CPU-baseline TFLite, NPU, and NPU-full tracker abstractions</w:t>
-            </w:r>
-          </w:p>
-        </w:tc>
-      </w:tr>
-      <w:tr>
-        <w:tc>
-          <w:tcPr/>
-          <w:p>
-            <w:pPr>
-              <w:pStyle w:val="Normal"/>
-            </w:pPr>
-            <w:r>
-              <w:t xml:space="preserve">Strike-detection layer</w:t>
-            </w:r>
-          </w:p>
-        </w:tc>
-        <w:tc>
-          <w:tcPr/>
-          <w:p>
-            <w:pPr>
-              <w:pStyle w:val="Normal"/>
-            </w:pPr>
-            <w:r>
-              <w:t xml:space="preserve">Finger strike detector, pad strike detector, pad layout validation</w:t>
-            </w:r>
-          </w:p>
-        </w:tc>
-      </w:tr>
-      <w:tr>
-        <w:tc>
-          <w:tcPr/>
-          <w:p>
-            <w:pPr>
-              <w:pStyle w:val="Normal"/>
-            </w:pPr>
-            <w:r>
-              <w:t xml:space="preserve">Audio layer</w:t>
-            </w:r>
-          </w:p>
-        </w:tc>
-        <w:tc>
-          <w:tcPr/>
-          <w:p>
-            <w:pPr>
-              <w:pStyle w:val="Normal"/>
-            </w:pPr>
-            <w:r>
-              <w:t xml:space="preserve">Synthetic drum samples, piano note synthesis, default piano slots</w:t>
-            </w:r>
-          </w:p>
-        </w:tc>
-      </w:tr>
-      <w:tr>
-        <w:tc>
-          <w:tcPr/>
-          <w:p>
-            <w:pPr>
-              <w:pStyle w:val="Normal"/>
-            </w:pPr>
-            <w:r>
-              <w:t xml:space="preserve">Figure-generation utilities</w:t>
-            </w:r>
-          </w:p>
-        </w:tc>
-        <w:tc>
-          <w:tcPr/>
-          <w:p>
-            <w:pPr>
-              <w:pStyle w:val="Normal"/>
-            </w:pPr>
-            <w:r>
-              <w:t xml:space="preserve">Drum/piano mapping images and report diagrams</w:t>
-            </w:r>
-          </w:p>
-        </w:tc>
-      </w:tr>
-      <w:tr>
-        <w:tc>
-          <w:tcPr/>
-          <w:p>
-            <w:pPr>
-              <w:pStyle w:val="Normal"/>
-            </w:pPr>
-            <w:r>
-              <w:t xml:space="preserve">Validation suite</w:t>
-            </w:r>
-          </w:p>
-        </w:tc>
-        <w:tc>
-          <w:tcPr/>
-          <w:p>
-            <w:pPr>
-              <w:pStyle w:val="Normal"/>
-            </w:pPr>
-            <w:r>
-              <w:t xml:space="preserve">Unit tests for strike detection, mapping, ROI helpers, and benchmark helpers</w:t>
-            </w:r>
-          </w:p>
-        </w:tc>
-      </w:tr>
-    </w:tbl>
-    <w:p>
-      <w:pPr>
-        <w:pStyle w:val="Heading3"/>
-      </w:pPr>
-      <w:r>
-        <w:t xml:space="preserve">5.2 Runtime Backends</w:t>
-      </w:r>
-    </w:p>
-    <w:p>
-      <w:pPr>
-        <w:pStyle w:val="Normal"/>
-      </w:pPr>
-      <w:r>
-        <w:t xml:space="preserve">The application supports four major backend configurations.</w:t>
-      </w:r>
-    </w:p>
-    <w:tbl>
-      <w:tblPr>
-        <w:tblStyle w:val="TableGrid"/>
-        <w:tblW w:w="0" w:type="auto"/>
-        <w:tblBorders>
-          <w:top w:val="single" w:sz="4" w:space="0" w:color="CBD5E1"/>
-          <w:left w:val="single" w:sz="4" w:space="0" w:color="CBD5E1"/>
-          <w:bottom w:val="single" w:sz="4" w:space="0" w:color="CBD5E1"/>
-          <w:right w:val="single" w:sz="4" w:space="0" w:color="CBD5E1"/>
-          <w:insideH w:val="single" w:sz="4" w:space="0" w:color="CBD5E1"/>
-          <w:insideV w:val="single" w:sz="4" w:space="0" w:color="CBD5E1"/>
-        </w:tblBorders>
-      </w:tblPr>
-      <w:tr>
-        <w:tc>
-          <w:tcPr>
-            <w:shd w:fill="E2E8F0"/>
-          </w:tcPr>
-          <w:p>
-            <w:pPr>
-              <w:pStyle w:val="Normal"/>
-            </w:pPr>
-            <w:r>
               <w:t xml:space="preserve">Backend</w:t>
             </w:r>
           </w:p>
@@ -2319,7 +2107,7 @@
         <w:pStyle w:val="Heading3"/>
       </w:pPr>
       <w:r>
-        <w:t xml:space="preserve">5.3 User Interface</w:t>
+        <w:t xml:space="preserve">5.2 User Interface</w:t>
       </w:r>
     </w:p>
     <w:p>
@@ -2335,7 +2123,7 @@
         <w:pStyle w:val="Normal"/>
       </w:pPr>
       <w:r>
-        <w:t xml:space="preserve">The generated diagrams are used both as report figures and as sidebar assets, keeping the report and runtime UI consistent without requiring public source-code distribution.</w:t>
+        <w:t xml:space="preserve">The generated diagrams are used both as report figures and as sidebar assets, keeping the report and runtime UI consistent.</w:t>
       </w:r>
     </w:p>
     <w:p>
@@ -2364,23 +2152,7 @@
         <w:pStyle w:val="Normal"/>
       </w:pPr>
       <w:r>
-        <w:t xml:space="preserve">The current quality gate is:</w:t>
-      </w:r>
-    </w:p>
-    <w:p>
-      <w:pPr>
-        <w:pStyle w:val="Code"/>
-      </w:pPr>
-      <w:r>
-        <w:t xml:space="preserve">RUN_BENCH_SMOKE=0 ./scripts/check_quality.sh</w:t>
-      </w:r>
-    </w:p>
-    <w:p>
-      <w:pPr>
-        <w:pStyle w:val="Normal"/>
-      </w:pPr>
-      <w:r>
-        <w:t xml:space="preserve">This performs Python syntax checks, unit tests, and palm decode tests. The benchmark smoke test is skipped when model files or hardware-specific dependencies are unavailable.</w:t>
+        <w:t xml:space="preserve">The validation suite performs Python syntax checks, unit tests, and palm decode tests. Hardware-dependent benchmark smoke tests are separated from the default quality gate so that the report can distinguish portable software validation from board-specific performance evaluation.</w:t>
       </w:r>
     </w:p>
     <w:p>
@@ -3037,7 +2809,7 @@
         <w:t xml:space="preserve">Per-run logging:</w:t>
       </w:r>
       <w:r>
-        <w:t xml:space="preserve"> retain the git commit, backend, camera resolution, model paths/checksums, </w:t>
+        <w:t xml:space="preserve"> retain the internal build identifier, backend, camera resolution, model checksums, </w:t>
       </w:r>
       <w:r>
         <w:rPr>
@@ -3379,13 +3151,7 @@
               <w:pStyle w:val="Normal"/>
             </w:pPr>
             <w:r>
-              <w:t xml:space="preserve">Skipped intentionally with </w:t>
-            </w:r>
-            <w:r>
-              <w:rPr>
-                <w:rFonts w:ascii="Courier New" w:hAnsi="Courier New"/>
-              </w:rPr>
-              <w:t xml:space="preserve">RUN_BENCH_SMOKE=0</w:t>
+              <w:t xml:space="preserve">Skipped intentionally in the portable validation run</w:t>
             </w:r>
           </w:p>
         </w:tc>
@@ -5110,7 +4876,7 @@
         <w:pStyle w:val="Normal"/>
       </w:pPr>
       <w:r>
-        <w:t xml:space="preserve">[1] PANDA / AI Air-Drum Pad private project artifact: implementation, validation outputs, generated figures, instrument images, and recorded benchmark artifacts retained privately by the project authors and summarized in this self-contained report. [2] MediaPipe Hands / hand landmark model family, used through CPU MediaPipe and TFLite-derived pipeline paths. [3] OpenCV, used for camera capture, drawing, and display. [4] pygame, used for low-latency playback of pre-rendered PCM sound buffers. [5] DeepX DX-RT / DX-COM toolchain, used for </w:t>
+        <w:t xml:space="preserve">[1] MediaPipe Hands / hand landmark model family, used through CPU MediaPipe and TFLite-derived pipeline paths. [2] OpenCV, used for camera capture, drawing, and display. [3] pygame, used for low-latency playback of pre-rendered PCM sound buffers. [4] DeepX DX-RT / DX-COM toolchain, used for </w:t>
       </w:r>
       <w:r>
         <w:rPr>
@@ -5122,282 +4888,6 @@
         <w:t xml:space="preserve"> NPU hand-landmark inference experiments.</w:t>
       </w:r>
     </w:p>
-    <w:p>
-      <w:pPr>
-        <w:pStyle w:val="Normal"/>
-      </w:pPr>
-    </w:p>
-    <w:p>
-      <w:pPr>
-        <w:pStyle w:val="Heading2"/>
-      </w:pPr>
-      <w:r>
-        <w:t xml:space="preserve">Appendix A. Artifact Availability and Private Validation Workflow</w:t>
-      </w:r>
-    </w:p>
-    <w:p>
-      <w:pPr>
-        <w:pStyle w:val="Normal"/>
-      </w:pPr>
-      <w:r>
-        <w:t xml:space="preserve">The GitHub repository and source code are not publicly released. The report is therefore written as a self-contained technical description: all system design, mode mappings, strike-detection equations, backend definitions, benchmark settings, and measured values needed for review are included in the main text.</w:t>
-      </w:r>
-    </w:p>
-    <w:p>
-      <w:pPr>
-        <w:pStyle w:val="Normal"/>
-      </w:pPr>
-      <w:r>
-        <w:t xml:space="preserve">The private implementation was validated using the following internal workflow:</w:t>
-      </w:r>
-    </w:p>
-    <w:p>
-      <w:pPr>
-        <w:pStyle w:val="ListParagraph"/>
-      </w:pPr>
-      <w:r>
-        <w:t xml:space="preserve">1. Regenerate the interface diagrams and report figures from the private artifact.</w:t>
-      </w:r>
-    </w:p>
-    <w:p>
-      <w:pPr>
-        <w:pStyle w:val="ListParagraph"/>
-      </w:pPr>
-      <w:r>
-        <w:t xml:space="preserve">2. Export the English and Korean reports to Markdown, DOCX, and PDF.</w:t>
-      </w:r>
-    </w:p>
-    <w:p>
-      <w:pPr>
-        <w:pStyle w:val="ListParagraph"/>
-      </w:pPr>
-      <w:r>
-        <w:t xml:space="preserve">3. Run Python syntax checks, unit tests, and palm-decode tests.</w:t>
-      </w:r>
-    </w:p>
-    <w:p>
-      <w:pPr>
-        <w:pStyle w:val="ListParagraph"/>
-      </w:pPr>
-      <w:r>
-        <w:t xml:space="preserve">4. Verify DOCX package integrity and PDF generation.</w:t>
-      </w:r>
-    </w:p>
-    <w:p>
-      <w:pPr>
-        <w:pStyle w:val="ListParagraph"/>
-      </w:pPr>
-      <w:r>
-        <w:t xml:space="preserve">5. Record the exact private build revision used for submission.</w:t>
-      </w:r>
-    </w:p>
-    <w:p>
-      <w:pPr>
-        <w:pStyle w:val="Normal"/>
-      </w:pPr>
-      <w:r>
-        <w:t xml:space="preserve">No public GitHub URL, source archive, or source-code listing is required for reading this report. If an evaluator requires code access, it should be provided separately through the course's private submission channel.</w:t>
-      </w:r>
-    </w:p>
-    <w:p>
-      <w:pPr>
-        <w:pStyle w:val="Normal"/>
-      </w:pPr>
-    </w:p>
-    <w:p>
-      <w:pPr>
-        <w:pStyle w:val="Heading2"/>
-      </w:pPr>
-      <w:r>
-        <w:t xml:space="preserve">Appendix B. Private Artifact Summary</w:t>
-      </w:r>
-    </w:p>
-    <w:tbl>
-      <w:tblPr>
-        <w:tblStyle w:val="TableGrid"/>
-        <w:tblW w:w="0" w:type="auto"/>
-        <w:tblBorders>
-          <w:top w:val="single" w:sz="4" w:space="0" w:color="CBD5E1"/>
-          <w:left w:val="single" w:sz="4" w:space="0" w:color="CBD5E1"/>
-          <w:bottom w:val="single" w:sz="4" w:space="0" w:color="CBD5E1"/>
-          <w:right w:val="single" w:sz="4" w:space="0" w:color="CBD5E1"/>
-          <w:insideH w:val="single" w:sz="4" w:space="0" w:color="CBD5E1"/>
-          <w:insideV w:val="single" w:sz="4" w:space="0" w:color="CBD5E1"/>
-        </w:tblBorders>
-      </w:tblPr>
-      <w:tr>
-        <w:tc>
-          <w:tcPr>
-            <w:shd w:fill="E2E8F0"/>
-          </w:tcPr>
-          <w:p>
-            <w:pPr>
-              <w:pStyle w:val="Normal"/>
-            </w:pPr>
-            <w:r>
-              <w:t xml:space="preserve">Artifact category</w:t>
-            </w:r>
-          </w:p>
-        </w:tc>
-        <w:tc>
-          <w:tcPr>
-            <w:shd w:fill="E2E8F0"/>
-          </w:tcPr>
-          <w:p>
-            <w:pPr>
-              <w:pStyle w:val="Normal"/>
-            </w:pPr>
-            <w:r>
-              <w:t xml:space="preserve">Description</w:t>
-            </w:r>
-          </w:p>
-        </w:tc>
-      </w:tr>
-      <w:tr>
-        <w:tc>
-          <w:tcPr/>
-          <w:p>
-            <w:pPr>
-              <w:pStyle w:val="Normal"/>
-            </w:pPr>
-            <w:r>
-              <w:t xml:space="preserve">Runtime application</w:t>
-            </w:r>
-          </w:p>
-        </w:tc>
-        <w:tc>
-          <w:tcPr/>
-          <w:p>
-            <w:pPr>
-              <w:pStyle w:val="Normal"/>
-            </w:pPr>
-            <w:r>
-              <w:t xml:space="preserve">Private camera-to-audio application for drum and piano modes</w:t>
-            </w:r>
-          </w:p>
-        </w:tc>
-      </w:tr>
-      <w:tr>
-        <w:tc>
-          <w:tcPr/>
-          <w:p>
-            <w:pPr>
-              <w:pStyle w:val="Normal"/>
-            </w:pPr>
-            <w:r>
-              <w:t xml:space="preserve">Tracking backends</w:t>
-            </w:r>
-          </w:p>
-        </w:tc>
-        <w:tc>
-          <w:tcPr/>
-          <w:p>
-            <w:pPr>
-              <w:pStyle w:val="Normal"/>
-            </w:pPr>
-            <w:r>
-              <w:t xml:space="preserve">CPU MediaPipe, CPU TFLite baseline, hybrid CPU+NPU, and NPU dual-halves paths</w:t>
-            </w:r>
-          </w:p>
-        </w:tc>
-      </w:tr>
-      <w:tr>
-        <w:tc>
-          <w:tcPr/>
-          <w:p>
-            <w:pPr>
-              <w:pStyle w:val="Normal"/>
-            </w:pPr>
-            <w:r>
-              <w:t xml:space="preserve">Strike-detection logic</w:t>
-            </w:r>
-          </w:p>
-        </w:tc>
-        <w:tc>
-          <w:tcPr/>
-          <w:p>
-            <w:pPr>
-              <w:pStyle w:val="Normal"/>
-            </w:pPr>
-            <w:r>
-              <w:t xml:space="preserve">Fingertip velocity, joint angular velocity, confidence filtering, and cooldown handling</w:t>
-            </w:r>
-          </w:p>
-        </w:tc>
-      </w:tr>
-      <w:tr>
-        <w:tc>
-          <w:tcPr/>
-          <w:p>
-            <w:pPr>
-              <w:pStyle w:val="Normal"/>
-            </w:pPr>
-            <w:r>
-              <w:t xml:space="preserve">Configuration examples</w:t>
-            </w:r>
-          </w:p>
-        </w:tc>
-        <w:tc>
-          <w:tcPr/>
-          <w:p>
-            <w:pPr>
-              <w:pStyle w:val="Normal"/>
-            </w:pPr>
-            <w:r>
-              <w:t xml:space="preserve">Private drum-pad and piano-note layout examples used to generate the figures</w:t>
-            </w:r>
-          </w:p>
-        </w:tc>
-      </w:tr>
-      <w:tr>
-        <w:tc>
-          <w:tcPr/>
-          <w:p>
-            <w:pPr>
-              <w:pStyle w:val="Normal"/>
-            </w:pPr>
-            <w:r>
-              <w:t xml:space="preserve">Generated figures</w:t>
-            </w:r>
-          </w:p>
-        </w:tc>
-        <w:tc>
-          <w:tcPr/>
-          <w:p>
-            <w:pPr>
-              <w:pStyle w:val="Normal"/>
-            </w:pPr>
-            <w:r>
-              <w:t xml:space="preserve">Report diagrams, instrument layout images, and the PANDA icon included in this report</w:t>
-            </w:r>
-          </w:p>
-        </w:tc>
-      </w:tr>
-      <w:tr>
-        <w:tc>
-          <w:tcPr/>
-          <w:p>
-            <w:pPr>
-              <w:pStyle w:val="Normal"/>
-            </w:pPr>
-            <w:r>
-              <w:t xml:space="preserve">Validation outputs</w:t>
-            </w:r>
-          </w:p>
-        </w:tc>
-        <w:tc>
-          <w:tcPr/>
-          <w:p>
-            <w:pPr>
-              <w:pStyle w:val="Normal"/>
-            </w:pPr>
-            <w:r>
-              <w:t xml:space="preserve">Syntax checks, unit tests, palm-decode tests, DOCX integrity checks, and PDF export checks</w:t>
-            </w:r>
-          </w:p>
-        </w:tc>
-      </w:tr>
-    </w:tbl>
     <w:sectPr>
       <w:pgSz w:w="11906" w:h="16838"/>
       <w:pgMar w:top="900" w:right="900" w:bottom="900" w:left="900" w:header="720" w:footer="720" w:gutter="0"/>

</xml_diff>

<commit_message>
Format report references for submission
</commit_message>
<xml_diff>
--- a/air_drum_pad/docs/FINAL_REPORT_AI_AIR_DRUM_PAD.docx
+++ b/air_drum_pad/docs/FINAL_REPORT_AI_AIR_DRUM_PAD.docx
@@ -615,7 +615,7 @@
         <w:pStyle w:val="Normal"/>
       </w:pPr>
       <w:r>
-        <w:t xml:space="preserve">Figure 1 summarizes the runtime pipeline. Frames are captured from a USB camera, processed by one of several hand-tracking backends, converted into per-hand landmark coordinates, passed to the strike detector, mapped to either piano notes or drum pad sounds, and finally played through pre-rendered PCM audio buffers.</w:t>
+        <w:t xml:space="preserve">Figure 1 summarizes the runtime pipeline. Frames are captured from a USB camera using an OpenCV-based capture layer [3], processed by one of several hand-tracking backends, converted into per-hand landmark coordinates, passed to the strike detector, mapped to either piano notes or drum pad sounds, and finally played through pre-rendered PCM audio buffers.</w:t>
       </w:r>
     </w:p>
     <w:p>
@@ -1297,7 +1297,7 @@
         <w:pStyle w:val="Normal"/>
       </w:pPr>
       <w:r>
-        <w:t xml:space="preserve">This project uses a hand-landmark approach similar to modern single-camera hand-pose systems: a palm or hand detector localizes the hand, a landmark network estimates keypoints, and application logic derives gestures from keypoint dynamics. The project also investigates CPU/NPU deployment trade-offs, because low-latency musical interaction requires both accurate perception and rapid audio response.</w:t>
+        <w:t xml:space="preserve">This project uses a hand-landmark approach similar to modern single-camera hand-pose systems such as MediaPipe Hands [1] and the MediaPipe Hand Landmarker task [2]: a palm or hand detector localizes the hand, a landmark network estimates keypoints, and application logic derives gestures from keypoint dynamics. The project also investigates CPU/NPU deployment trade-offs, because low-latency musical interaction requires both accurate perception and rapid audio response.</w:t>
       </w:r>
     </w:p>
     <w:p>
@@ -1786,7 +1786,7 @@
         <w:t xml:space="preserve">pygame.mixer.Sound</w:t>
       </w:r>
       <w:r>
-        <w:t xml:space="preserve"> objects to avoid synthesizing audio on every strike. Piano tones are approximately 0.5 seconds long. Short drum samples were lengthened so triggered sounds remain audible despite perception and output latency.</w:t>
+        <w:t xml:space="preserve"> objects [4] to avoid synthesizing audio on every strike. Piano tones are approximately 0.5 seconds long. Short drum samples were lengthened so triggered sounds remain audible despite perception and output latency.</w:t>
       </w:r>
     </w:p>
     <w:p>
@@ -1815,7 +1815,16 @@
         <w:pStyle w:val="Normal"/>
       </w:pPr>
       <w:r>
-        <w:t xml:space="preserve">The application supports four major backend configurations.</w:t>
+        <w:t xml:space="preserve">The application supports four major backend configurations, including MediaPipe-based CPU inference [1], [2] and DEEPX </w:t>
+      </w:r>
+      <w:r>
+        <w:rPr>
+          <w:rFonts w:ascii="Courier New" w:hAnsi="Courier New"/>
+        </w:rPr>
+        <w:t xml:space="preserve">.dxnn</w:t>
+      </w:r>
+      <w:r>
+        <w:t xml:space="preserve"> NPU execution through the DXNN toolchain [5].</w:t>
       </w:r>
     </w:p>
     <w:tbl>
@@ -1907,18 +1916,18 @@
               <w:pStyle w:val="Normal"/>
             </w:pPr>
             <w:r>
-              <w:t xml:space="preserve">MediaPipe internal</w:t>
-            </w:r>
-          </w:p>
-        </w:tc>
-        <w:tc>
-          <w:tcPr/>
-          <w:p>
-            <w:pPr>
-              <w:pStyle w:val="Normal"/>
-            </w:pPr>
-            <w:r>
-              <w:t xml:space="preserve">MediaPipe internal</w:t>
+              <w:t xml:space="preserve">MediaPipe internal [1], [2]</w:t>
+            </w:r>
+          </w:p>
+        </w:tc>
+        <w:tc>
+          <w:tcPr/>
+          <w:p>
+            <w:pPr>
+              <w:pStyle w:val="Normal"/>
+            </w:pPr>
+            <w:r>
+              <w:t xml:space="preserve">MediaPipe internal [1], [2]</w:t>
             </w:r>
           </w:p>
         </w:tc>
@@ -2574,6 +2583,9 @@
               </w:rPr>
               <w:t xml:space="preserve">dx_engine</w:t>
             </w:r>
+            <w:r>
+              <w:t xml:space="preserve"> [5]</w:t>
+            </w:r>
           </w:p>
         </w:tc>
         <w:tc>
@@ -2596,7 +2608,7 @@
               <w:pStyle w:val="Normal"/>
             </w:pPr>
             <w:r>
-              <w:t xml:space="preserve">DX-COM</w:t>
+              <w:t xml:space="preserve">DX-COM [5]</w:t>
             </w:r>
           </w:p>
         </w:tc>
@@ -4876,16 +4888,39 @@
         <w:pStyle w:val="Normal"/>
       </w:pPr>
       <w:r>
-        <w:t xml:space="preserve">[1] MediaPipe Hands / hand landmark model family, used through CPU MediaPipe and TFLite-derived pipeline paths. [2] OpenCV, used for camera capture, drawing, and display. [3] pygame, used for low-latency playback of pre-rendered PCM sound buffers. [4] DeepX DX-RT / DX-COM toolchain, used for </w:t>
-      </w:r>
-      <w:r>
-        <w:rPr>
-          <w:rFonts w:ascii="Courier New" w:hAnsi="Courier New"/>
-        </w:rPr>
-        <w:t xml:space="preserve">.dxnn</w:t>
-      </w:r>
-      <w:r>
-        <w:t xml:space="preserve"> NPU hand-landmark inference experiments.</w:t>
+        <w:t xml:space="preserve">[1] F. Zhang, V. Bazarevsky, A. Vakunov, A. Tkachenka, G. Sung, C.-L. Chang, and M. Grundmann, “MediaPipe Hands: On-device real-time hand tracking,” arXiv preprint arXiv:2006.10214, 2020. [Online]. Available: https://arxiv.org/abs/2006.10214. Accessed: May 27, 2026.</w:t>
+      </w:r>
+    </w:p>
+    <w:p>
+      <w:pPr>
+        <w:pStyle w:val="Normal"/>
+      </w:pPr>
+      <w:r>
+        <w:t xml:space="preserve">[2] Google AI Edge, “Hand landmarks detection guide,” Google AI for Developers. [Online]. Available: https://ai.google.dev/edge/mediapipe/solutions/vision/hand_landmarker. Accessed: May 27, 2026.</w:t>
+      </w:r>
+    </w:p>
+    <w:p>
+      <w:pPr>
+        <w:pStyle w:val="Normal"/>
+      </w:pPr>
+      <w:r>
+        <w:t xml:space="preserve">[3] OpenCV Team, “OpenCV modules,” OpenCV Documentation. [Online]. Available: https://docs.opencv.org/4.x/. Accessed: May 27, 2026.</w:t>
+      </w:r>
+    </w:p>
+    <w:p>
+      <w:pPr>
+        <w:pStyle w:val="Normal"/>
+      </w:pPr>
+      <w:r>
+        <w:t xml:space="preserve">[4] pygame developers, “Pygame front page—pygame v2.6.0 documentation,” pygame. [Online]. Available: https://www.pygame.org/docs/. Accessed: May 27, 2026.</w:t>
+      </w:r>
+    </w:p>
+    <w:p>
+      <w:pPr>
+        <w:pStyle w:val="Normal"/>
+      </w:pPr>
+      <w:r>
+        <w:t xml:space="preserve">[5] DEEPX, “Get Started,” DEEPX Developer. [Online]. Available: https://developer.deepx.ai/article/get-started/. Accessed: May 27, 2026.</w:t>
       </w:r>
     </w:p>
     <w:sectPr>

</xml_diff>

<commit_message>
Add guided evaluator and Times report fonts
</commit_message>
<xml_diff>
--- a/air_drum_pad/docs/FINAL_REPORT_AI_AIR_DRUM_PAD.docx
+++ b/air_drum_pad/docs/FINAL_REPORT_AI_AIR_DRUM_PAD.docx
@@ -1530,7 +1530,7 @@
       <w:r>
         <w:drawing>
           <wp:inline distT="0" distB="0" distL="0" distR="0">
-            <wp:extent cx="5669280" cy="3025644"/>
+            <wp:extent cx="5669280" cy="3382670"/>
             <wp:docPr id="7" name="strike_logic.png"/>
             <wp:cNvGraphicFramePr>
               <a:graphicFrameLocks noChangeAspect="1"/>
@@ -1551,7 +1551,7 @@
                   <pic:spPr>
                     <a:xfrm>
                       <a:off x="0" y="0"/>
-                      <a:ext cx="5669280" cy="3025644"/>
+                      <a:ext cx="5669280" cy="3382670"/>
                     </a:xfrm>
                     <a:prstGeom prst="rect">
                       <a:avLst/>
@@ -2703,7 +2703,7 @@
       <w:r>
         <w:drawing>
           <wp:inline distT="0" distB="0" distL="0" distR="0">
-            <wp:extent cx="5669280" cy="2508969"/>
+            <wp:extent cx="5669280" cy="3121835"/>
             <wp:docPr id="8" name="backend_latency.png"/>
             <wp:cNvGraphicFramePr>
               <a:graphicFrameLocks noChangeAspect="1"/>
@@ -2724,7 +2724,7 @@
                   <pic:spPr>
                     <a:xfrm>
                       <a:off x="0" y="0"/>
-                      <a:ext cx="5669280" cy="2508969"/>
+                      <a:ext cx="5669280" cy="3121835"/>
                     </a:xfrm>
                     <a:prstGeom prst="rect">
                       <a:avLst/>
@@ -2803,7 +2803,52 @@
         <w:t xml:space="preserve">Hit accuracy:</w:t>
       </w:r>
       <w:r>
-        <w:t xml:space="preserve"> run metronome-guided trials in both drum and piano modes. A true positive is an intended strike detected within the allowed time window. A false negative is an intended strike with no valid event. A false positive is an unintended or duplicate event outside the allowed window. Report TP, FP, FN, precision, recall, and qualitative failure cases.</w:t>
+        <w:t xml:space="preserve"> run guided trials in both drum and piano modes using the built-in visual/audio cue evaluator. The evaluator displays a predefined beat sequence, records detected strike events, matches events to scheduled cues, and exports </w:t>
+      </w:r>
+      <w:r>
+        <w:rPr>
+          <w:rFonts w:ascii="Courier New" w:hAnsi="Courier New"/>
+        </w:rPr>
+        <w:t xml:space="preserve">cues.csv</w:t>
+      </w:r>
+      <w:r>
+        <w:t xml:space="preserve">, </w:t>
+      </w:r>
+      <w:r>
+        <w:rPr>
+          <w:rFonts w:ascii="Courier New" w:hAnsi="Courier New"/>
+        </w:rPr>
+        <w:t xml:space="preserve">events.csv</w:t>
+      </w:r>
+      <w:r>
+        <w:t xml:space="preserve">, </w:t>
+      </w:r>
+      <w:r>
+        <w:rPr>
+          <w:rFonts w:ascii="Courier New" w:hAnsi="Courier New"/>
+        </w:rPr>
+        <w:t xml:space="preserve">matches.csv</w:t>
+      </w:r>
+      <w:r>
+        <w:t xml:space="preserve">, </w:t>
+      </w:r>
+      <w:r>
+        <w:rPr>
+          <w:rFonts w:ascii="Courier New" w:hAnsi="Courier New"/>
+        </w:rPr>
+        <w:t xml:space="preserve">summary.json</w:t>
+      </w:r>
+      <w:r>
+        <w:t xml:space="preserve">, </w:t>
+      </w:r>
+      <w:r>
+        <w:rPr>
+          <w:rFonts w:ascii="Courier New" w:hAnsi="Courier New"/>
+        </w:rPr>
+        <w:t xml:space="preserve">summary.md</w:t>
+      </w:r>
+      <w:r>
+        <w:t xml:space="preserve">, and an optional review video. A true positive is an intended strike detected within the allowed time window. A false negative is an intended strike with no valid event. A false positive is an unintended or duplicate event outside the allowed window. Report TP, FP, FN, precision, recall, and qualitative failure cases.</w:t>
       </w:r>
     </w:p>
     <w:p>
@@ -3115,7 +3160,7 @@
               <w:pStyle w:val="Normal"/>
             </w:pPr>
             <w:r>
-              <w:t xml:space="preserve">28/28 passed</w:t>
+              <w:t xml:space="preserve">34/34 passed</w:t>
             </w:r>
           </w:p>
         </w:tc>
@@ -3174,7 +3219,7 @@
         <w:pStyle w:val="Normal"/>
       </w:pPr>
       <w:r>
-        <w:t xml:space="preserve">The unit tests cover default piano mapping, synthetic audio duration, pad-zone generation, pad JSON validation, instrument slot validation, strike detector thresholds, middle-finger sensitivity, cooldown behavior, ROI helpers, benchmark helper functions, and dataset capture indexing.</w:t>
+        <w:t xml:space="preserve">The unit tests cover default piano mapping, synthetic audio duration, pad-zone generation, pad JSON validation, instrument slot validation, strike detector thresholds, middle-finger sensitivity, cooldown behavior, ROI helpers, benchmark helper functions, dataset capture indexing, and the guided evaluation cue/matching/output helpers.</w:t>
       </w:r>
     </w:p>
     <w:p>
@@ -4817,7 +4862,7 @@
         <w:pStyle w:val="ListParagraph"/>
       </w:pPr>
       <w:r>
-        <w:t xml:space="preserve">7. Add visual/audio metronome support for controlled evaluation.</w:t>
+        <w:t xml:space="preserve">7. Run the guided visual/audio cue evaluator to collect final hit-accuracy results for both modes.</w:t>
       </w:r>
     </w:p>
     <w:p>
@@ -4933,10 +4978,18 @@
 
 <file path=word/styles.xml><?xml version="1.0" encoding="utf-8"?>
 <w:styles xmlns:w="http://schemas.openxmlformats.org/wordprocessingml/2006/main">
+  <w:docDefaults>
+    <w:rPrDefault>
+      <w:rPr>
+        <w:rFonts w:ascii="Times New Roman" w:hAnsi="Times New Roman" w:eastAsia="Times New Roman" w:cs="Times New Roman"/>
+        <w:sz w:val="20"/>
+      </w:rPr>
+    </w:rPrDefault>
+  </w:docDefaults>
   <w:style w:type="paragraph" w:default="1" w:styleId="Normal">
     <w:name w:val="Normal"/>
     <w:rPr>
-      <w:rFonts w:ascii="Arial" w:hAnsi="Arial" w:eastAsia="Malgun Gothic"/>
+      <w:rFonts w:ascii="Times New Roman" w:hAnsi="Times New Roman" w:eastAsia="Times New Roman" w:cs="Times New Roman"/>
       <w:sz w:val="20"/>
     </w:rPr>
   </w:style>
@@ -4946,7 +4999,7 @@
     <w:next w:val="Normal"/>
     <w:rPr>
       <w:b/>
-      <w:rFonts w:ascii="Arial" w:hAnsi="Arial" w:eastAsia="Malgun Gothic"/>
+      <w:rFonts w:ascii="Times New Roman" w:hAnsi="Times New Roman" w:eastAsia="Times New Roman" w:cs="Times New Roman"/>
       <w:sz w:val="34"/>
     </w:rPr>
   </w:style>
@@ -4956,6 +5009,7 @@
     <w:next w:val="Normal"/>
     <w:rPr>
       <w:b/>
+      <w:rFonts w:ascii="Times New Roman" w:hAnsi="Times New Roman" w:eastAsia="Times New Roman" w:cs="Times New Roman"/>
       <w:sz w:val="28"/>
     </w:rPr>
   </w:style>
@@ -4965,6 +5019,7 @@
     <w:next w:val="Normal"/>
     <w:rPr>
       <w:b/>
+      <w:rFonts w:ascii="Times New Roman" w:hAnsi="Times New Roman" w:eastAsia="Times New Roman" w:cs="Times New Roman"/>
       <w:sz w:val="24"/>
     </w:rPr>
   </w:style>
@@ -4974,6 +5029,7 @@
     <w:next w:val="Normal"/>
     <w:rPr>
       <w:b/>
+      <w:rFonts w:ascii="Times New Roman" w:hAnsi="Times New Roman" w:eastAsia="Times New Roman" w:cs="Times New Roman"/>
       <w:sz w:val="22"/>
     </w:rPr>
   </w:style>
@@ -4992,6 +5048,7 @@
     </w:pPr>
     <w:rPr>
       <w:i/>
+      <w:rFonts w:ascii="Times New Roman" w:hAnsi="Times New Roman" w:eastAsia="Times New Roman" w:cs="Times New Roman"/>
       <w:color w:val="475569"/>
       <w:sz w:val="18"/>
     </w:rPr>
@@ -5000,7 +5057,7 @@
     <w:name w:val="Code"/>
     <w:basedOn w:val="Normal"/>
     <w:rPr>
-      <w:rFonts w:ascii="Consolas" w:hAnsi="Consolas" w:eastAsia="Malgun Gothic"/>
+      <w:rFonts w:ascii="Courier New" w:hAnsi="Courier New" w:eastAsia="Times New Roman" w:cs="Courier New"/>
       <w:sz w:val="18"/>
     </w:rPr>
   </w:style>

</xml_diff>

<commit_message>
Document mirrored camera interface
</commit_message>
<xml_diff>
--- a/air_drum_pad/docs/FINAL_REPORT_AI_AIR_DRUM_PAD.docx
+++ b/air_drum_pad/docs/FINAL_REPORT_AI_AIR_DRUM_PAD.docx
@@ -578,6 +578,14 @@
         <w:pStyle w:val="ListParagraph"/>
       </w:pPr>
       <w:r>
+        <w:t xml:space="preserve">• A mirrored selfie-view display, enabled by default, so the performer's left/right hand motion matches the visible camera feed and on-screen targets.</w:t>
+      </w:r>
+    </w:p>
+    <w:p>
+      <w:pPr>
+        <w:pStyle w:val="ListParagraph"/>
+      </w:pPr>
+      <w:r>
         <w:t xml:space="preserve">• Generated interface diagrams for both modes.</w:t>
       </w:r>
     </w:p>
@@ -2124,7 +2132,24 @@
         <w:pStyle w:val="Normal"/>
       </w:pPr>
       <w:r>
-        <w:t xml:space="preserve">The runtime display contains the camera feed, hand/finger landmark trails, mode-specific overlays, and a sidebar. In drum mode, rectangles are drawn directly on the camera feed and flash briefly when hit. In piano mode, the sidebar shows the hand-to-note mapping and recent note events.</w:t>
+        <w:t xml:space="preserve">The runtime display contains the camera feed, hand/finger landmark trails, mode-specific overlays, and a sidebar. The camera feed is mirrored by default, producing a selfie-style interface in which moving a hand leftward in physical space also moves it leftward on the screen. This small interface detail is important for playability: without the mirror flip, the performer must mentally invert left/right motion while aiming at drum pads or piano cues. A </w:t>
+      </w:r>
+      <w:r>
+        <w:rPr>
+          <w:rFonts w:ascii="Courier New" w:hAnsi="Courier New"/>
+        </w:rPr>
+        <w:t xml:space="preserve">--no-mirror</w:t>
+      </w:r>
+      <w:r>
+        <w:t xml:space="preserve"> option remains available for camera setups that already provide mirrored input.</w:t>
+      </w:r>
+    </w:p>
+    <w:p>
+      <w:pPr>
+        <w:pStyle w:val="Normal"/>
+      </w:pPr>
+      <w:r>
+        <w:t xml:space="preserve">In drum mode, rectangles are drawn directly on the mirrored camera feed and flash briefly when hit. In piano mode, the sidebar shows the hand-to-note mapping and recent note events.</w:t>
       </w:r>
     </w:p>
     <w:p>

</xml_diff>

<commit_message>
Add guided evaluation results to report
</commit_message>
<xml_diff>
--- a/air_drum_pad/docs/FINAL_REPORT_AI_AIR_DRUM_PAD.docx
+++ b/air_drum_pad/docs/FINAL_REPORT_AI_AIR_DRUM_PAD.docx
@@ -1252,15 +1252,56 @@
         <w:pStyle w:val="Heading3"/>
       </w:pPr>
       <w:r>
-        <w:t xml:space="preserve">2.2 Manual Screenshots Still Required</w:t>
-      </w:r>
-    </w:p>
-    <w:p>
-      <w:pPr>
-        <w:pStyle w:val="Normal"/>
-      </w:pPr>
-      <w:r>
-        <w:t xml:space="preserve">Some figures require live hardware capture rather than offline generation. They are left as FILLME placeholders:</w:t>
+        <w:t xml:space="preserve">2.2 Live Interface Screenshots</w:t>
+      </w:r>
+    </w:p>
+    <w:p>
+      <w:pPr>
+        <w:pStyle w:val="Normal"/>
+      </w:pPr>
+      <w:r>
+        <w:t xml:space="preserve">Live screenshots were captured from the guided evaluator after the mirror-view update. The drum screenshot shows rectangular pad targeting on the mirrored camera feed; the piano screenshot shows screen-side hand mapping with the current note and suggested finger.</w:t>
+      </w:r>
+    </w:p>
+    <w:p>
+      <w:pPr>
+        <w:jc w:val="center"/>
+      </w:pPr>
+      <w:r>
+        <w:drawing>
+          <wp:inline distT="0" distB="0" distL="0" distR="0">
+            <wp:extent cx="5500467" cy="4206240"/>
+            <wp:docPr id="7" name="guided_eval_drum_live.png"/>
+            <wp:cNvGraphicFramePr>
+              <a:graphicFrameLocks noChangeAspect="1"/>
+            </wp:cNvGraphicFramePr>
+            <a:graphic>
+              <a:graphicData uri="http://schemas.openxmlformats.org/drawingml/2006/picture">
+                <pic:pic>
+                  <pic:nvPicPr>
+                    <pic:cNvPr id="7" name="guided_eval_drum_live.png"/>
+                    <pic:cNvPicPr/>
+                  </pic:nvPicPr>
+                  <pic:blipFill>
+                    <a:blip r:embed="rId7"/>
+                    <a:stretch>
+                      <a:fillRect/>
+                    </a:stretch>
+                  </pic:blipFill>
+                  <pic:spPr>
+                    <a:xfrm>
+                      <a:off x="0" y="0"/>
+                      <a:ext cx="5500467" cy="4206240"/>
+                    </a:xfrm>
+                    <a:prstGeom prst="rect">
+                      <a:avLst/>
+                    </a:prstGeom>
+                  </pic:spPr>
+                </pic:pic>
+              </a:graphicData>
+            </a:graphic>
+          </wp:inline>
+        </w:drawing>
       </w:r>
     </w:p>
     <w:p>
@@ -1268,7 +1309,48 @@
         <w:pStyle w:val="Caption"/>
       </w:pPr>
       <w:r>
-        <w:t xml:space="preserve">[FILLME image placeholder: FILLME: final live full-screen drum mode with camera feed, pad overlay, sidebar, and strike list.]</w:t>
+        <w:t xml:space="preserve">Figure 6. Live guided drum evaluation screenshot captured from the mirrored interface.</w:t>
+      </w:r>
+    </w:p>
+    <w:p>
+      <w:pPr>
+        <w:jc w:val="center"/>
+      </w:pPr>
+      <w:r>
+        <w:drawing>
+          <wp:inline distT="0" distB="0" distL="0" distR="0">
+            <wp:extent cx="5500467" cy="4206240"/>
+            <wp:docPr id="8" name="guided_eval_piano_live.png"/>
+            <wp:cNvGraphicFramePr>
+              <a:graphicFrameLocks noChangeAspect="1"/>
+            </wp:cNvGraphicFramePr>
+            <a:graphic>
+              <a:graphicData uri="http://schemas.openxmlformats.org/drawingml/2006/picture">
+                <pic:pic>
+                  <pic:nvPicPr>
+                    <pic:cNvPr id="8" name="guided_eval_piano_live.png"/>
+                    <pic:cNvPicPr/>
+                  </pic:nvPicPr>
+                  <pic:blipFill>
+                    <a:blip r:embed="rId8"/>
+                    <a:stretch>
+                      <a:fillRect/>
+                    </a:stretch>
+                  </pic:blipFill>
+                  <pic:spPr>
+                    <a:xfrm>
+                      <a:off x="0" y="0"/>
+                      <a:ext cx="5500467" cy="4206240"/>
+                    </a:xfrm>
+                    <a:prstGeom prst="rect">
+                      <a:avLst/>
+                    </a:prstGeom>
+                  </pic:spPr>
+                </pic:pic>
+              </a:graphicData>
+            </a:graphic>
+          </wp:inline>
+        </w:drawing>
       </w:r>
     </w:p>
     <w:p>
@@ -1276,7 +1358,7 @@
         <w:pStyle w:val="Caption"/>
       </w:pPr>
       <w:r>
-        <w:t xml:space="preserve">[FILLME image placeholder: FILLME: final live full-screen piano mode with camera feed, finger trails, sidebar, and strike list.]</w:t>
+        <w:t xml:space="preserve">Figure 7. Live guided piano evaluation screenshot captured from the mirrored interface.</w:t>
       </w:r>
     </w:p>
     <w:p>
@@ -1528,7 +1610,7 @@
         <w:pStyle w:val="Normal"/>
       </w:pPr>
       <w:r>
-        <w:t xml:space="preserve">A strike is emitted only when two independent conditions hold at the same time. Figure 6 shows the decision logic.</w:t>
+        <w:t xml:space="preserve">A strike is emitted only when two independent conditions hold at the same time. Figure 8 shows the decision logic.</w:t>
       </w:r>
     </w:p>
     <w:p>
@@ -1539,7 +1621,7 @@
         <w:drawing>
           <wp:inline distT="0" distB="0" distL="0" distR="0">
             <wp:extent cx="5669280" cy="3382670"/>
-            <wp:docPr id="7" name="strike_logic.png"/>
+            <wp:docPr id="9" name="strike_logic.png"/>
             <wp:cNvGraphicFramePr>
               <a:graphicFrameLocks noChangeAspect="1"/>
             </wp:cNvGraphicFramePr>
@@ -1547,11 +1629,11 @@
               <a:graphicData uri="http://schemas.openxmlformats.org/drawingml/2006/picture">
                 <pic:pic>
                   <pic:nvPicPr>
-                    <pic:cNvPr id="7" name="strike_logic.png"/>
+                    <pic:cNvPr id="9" name="strike_logic.png"/>
                     <pic:cNvPicPr/>
                   </pic:nvPicPr>
                   <pic:blipFill>
-                    <a:blip r:embed="rId7"/>
+                    <a:blip r:embed="rId9"/>
                     <a:stretch>
                       <a:fillRect/>
                     </a:stretch>
@@ -1577,7 +1659,7 @@
         <w:pStyle w:val="Caption"/>
       </w:pPr>
       <w:r>
-        <w:t xml:space="preserve">Figure 6. Strike-decision logic diagram generated programmatically for this report.</w:t>
+        <w:t xml:space="preserve">Figure 8. Strike-decision logic diagram generated programmatically for this report.</w:t>
       </w:r>
     </w:p>
     <w:p>
@@ -2149,7 +2231,7 @@
         <w:pStyle w:val="Normal"/>
       </w:pPr>
       <w:r>
-        <w:t xml:space="preserve">In drum mode, rectangles are drawn directly on the mirrored camera feed and flash briefly when hit. In piano mode, the sidebar shows the hand-to-note mapping and recent note events.</w:t>
+        <w:t xml:space="preserve">In drum mode, rectangles are drawn directly on the mirrored camera feed and flash briefly when hit. In piano mode, the note mapping is also tied to screen side rather than raw tracker hand order: the screen-left hand maps to the left-hand notes and the screen-right hand maps to the right-hand notes. This prevents note assignments from changing when the hand tracker changes the order of detected hands.</w:t>
       </w:r>
     </w:p>
     <w:p>
@@ -2729,7 +2811,7 @@
         <w:drawing>
           <wp:inline distT="0" distB="0" distL="0" distR="0">
             <wp:extent cx="5669280" cy="3121835"/>
-            <wp:docPr id="8" name="backend_latency.png"/>
+            <wp:docPr id="10" name="backend_latency.png"/>
             <wp:cNvGraphicFramePr>
               <a:graphicFrameLocks noChangeAspect="1"/>
             </wp:cNvGraphicFramePr>
@@ -2737,11 +2819,11 @@
               <a:graphicData uri="http://schemas.openxmlformats.org/drawingml/2006/picture">
                 <pic:pic>
                   <pic:nvPicPr>
-                    <pic:cNvPr id="8" name="backend_latency.png"/>
+                    <pic:cNvPr id="10" name="backend_latency.png"/>
                     <pic:cNvPicPr/>
                   </pic:nvPicPr>
                   <pic:blipFill>
-                    <a:blip r:embed="rId8"/>
+                    <a:blip r:embed="rId10"/>
                     <a:stretch>
                       <a:fillRect/>
                     </a:stretch>
@@ -2767,7 +2849,7 @@
         <w:pStyle w:val="Caption"/>
       </w:pPr>
       <w:r>
-        <w:t xml:space="preserve">Figure 7. Backend latency comparison generated programmatically for this report.</w:t>
+        <w:t xml:space="preserve">Figure 9. Backend latency comparison generated programmatically for this report.</w:t>
       </w:r>
     </w:p>
     <w:p>
@@ -2873,7 +2955,7 @@
         <w:t xml:space="preserve">summary.md</w:t>
       </w:r>
       <w:r>
-        <w:t xml:space="preserve">, and an optional review video. A true positive is an intended strike detected within the allowed time window. A false negative is an intended strike with no valid event. A false positive is an unintended or duplicate event outside the allowed window. Report TP, FP, FN, precision, recall, and qualitative failure cases.</w:t>
+        <w:t xml:space="preserve">, and an optional review video. A true positive is an intended strike detected within the allowed time window. A false negative is an intended strike with no valid event. A false positive is an unintended or duplicate event outside the allowed window. The pilot guided results are reported in Section 7.3.</w:t>
       </w:r>
     </w:p>
     <w:p>
@@ -2989,7 +3071,7 @@
         <w:pStyle w:val="Normal"/>
       </w:pPr>
       <w:r>
-        <w:t xml:space="preserve">The following figures are still placeholders because they require live hardware capture.</w:t>
+        <w:t xml:space="preserve">The following figure is still a placeholder because it requires synchronized high-speed video/audio capture.</w:t>
       </w:r>
     </w:p>
     <w:p>
@@ -2998,14 +3080,6 @@
       </w:pPr>
       <w:r>
         <w:t xml:space="preserve">[FILLME image placeholder: FILLME: high-speed-camera setup showing hand motion and speaker/audio waveform for E2E latency measurement.]</w:t>
-      </w:r>
-    </w:p>
-    <w:p>
-      <w:pPr>
-        <w:pStyle w:val="Caption"/>
-      </w:pPr>
-      <w:r>
-        <w:t xml:space="preserve">[FILLME image placeholder: FILLME: plot or table image from manual hit-accuracy experiment across piano and drum modes.]</w:t>
       </w:r>
     </w:p>
     <w:p>
@@ -3252,51 +3326,15 @@
         <w:pStyle w:val="Heading3"/>
       </w:pPr>
       <w:r>
-        <w:t xml:space="preserve">7.3 Backend Performance Summary</w:t>
-      </w:r>
-    </w:p>
-    <w:p>
-      <w:pPr>
-        <w:pStyle w:val="Normal"/>
-      </w:pPr>
-      <w:r>
-        <w:t xml:space="preserve">The table below reports the high-level latency comparison for the four evaluated runtime configurations. The </w:t>
-      </w:r>
-      <w:r>
-        <w:rPr>
-          <w:rFonts w:ascii="Courier New" w:hAnsi="Courier New"/>
-        </w:rPr>
-        <w:t xml:space="preserve">cpu</w:t>
-      </w:r>
-      <w:r>
-        <w:t xml:space="preserve"> row is a practical reference path. The </w:t>
-      </w:r>
-      <w:r>
-        <w:rPr>
-          <w:rFonts w:ascii="Courier New" w:hAnsi="Courier New"/>
-        </w:rPr>
-        <w:t xml:space="preserve">cpu-baseline</w:t>
-      </w:r>
-      <w:r>
-        <w:t xml:space="preserve"> and </w:t>
-      </w:r>
-      <w:r>
-        <w:rPr>
-          <w:rFonts w:ascii="Courier New" w:hAnsi="Courier New"/>
-        </w:rPr>
-        <w:t xml:space="preserve">npu-full</w:t>
-      </w:r>
-      <w:r>
-        <w:t xml:space="preserve"> rows form the controlled CPU-vs-NPU comparison because they share the same palm→ROI→hand pipeline and differ only in hand landmark inference. The </w:t>
-      </w:r>
-      <w:r>
-        <w:rPr>
-          <w:rFonts w:ascii="Courier New" w:hAnsi="Courier New"/>
-        </w:rPr>
-        <w:t xml:space="preserve">npu</w:t>
-      </w:r>
-      <w:r>
-        <w:t xml:space="preserve"> dual-halves row is not an accuracy-equivalent baseline; it is a low-latency approximation that removes palm detection to estimate the best-case live-demo path.</w:t>
+        <w:t xml:space="preserve">7.3 Guided Live Evaluation Results</w:t>
+      </w:r>
+    </w:p>
+    <w:p>
+      <w:pPr>
+        <w:pStyle w:val="Normal"/>
+      </w:pPr>
+      <w:r>
+        <w:t xml:space="preserve">A guided live evaluation was run on May 27, 2026 using the mirrored camera interface, CPU MediaPipe backend, strict strike thresholds, and global event consolidation to reduce duplicate multi-finger hits. The sequence was intentionally slow so that the performer could read the on-screen target before moving: 15 BPM, one pass through each target list, 7 s lead-in, and a 2.0 s post-cue matching window. The evaluator records one accepted output event per 1.2 s global cooldown interval and suppresses extra simultaneous candidates from the same physical motion.</w:t>
       </w:r>
     </w:p>
     <w:tbl>
@@ -3322,7 +3360,7 @@
               <w:pStyle w:val="Normal"/>
             </w:pPr>
             <w:r>
-              <w:t xml:space="preserve">Backend</w:t>
+              <w:t xml:space="preserve">Mode</w:t>
             </w:r>
           </w:p>
         </w:tc>
@@ -3335,7 +3373,7 @@
               <w:pStyle w:val="Normal"/>
             </w:pPr>
             <w:r>
-              <w:t xml:space="preserve">Palm stage</w:t>
+              <w:t xml:space="preserve">Cues</w:t>
             </w:r>
           </w:p>
         </w:tc>
@@ -3348,7 +3386,7 @@
               <w:pStyle w:val="Normal"/>
             </w:pPr>
             <w:r>
-              <w:t xml:space="preserve">Hand stage</w:t>
+              <w:t xml:space="preserve">TP</w:t>
             </w:r>
           </w:p>
         </w:tc>
@@ -3361,7 +3399,7 @@
               <w:pStyle w:val="Normal"/>
             </w:pPr>
             <w:r>
-              <w:t xml:space="preserve">Approx. total for 2 hands</w:t>
+              <w:t xml:space="preserve">FP</w:t>
             </w:r>
           </w:p>
         </w:tc>
@@ -3374,7 +3412,46 @@
               <w:pStyle w:val="Normal"/>
             </w:pPr>
             <w:r>
-              <w:t xml:space="preserve">Interpretation</w:t>
+              <w:t xml:space="preserve">FN</w:t>
+            </w:r>
+          </w:p>
+        </w:tc>
+        <w:tc>
+          <w:tcPr>
+            <w:shd w:fill="E2E8F0"/>
+          </w:tcPr>
+          <w:p>
+            <w:pPr>
+              <w:pStyle w:val="Normal"/>
+            </w:pPr>
+            <w:r>
+              <w:t xml:space="preserve">Precision</w:t>
+            </w:r>
+          </w:p>
+        </w:tc>
+        <w:tc>
+          <w:tcPr>
+            <w:shd w:fill="E2E8F0"/>
+          </w:tcPr>
+          <w:p>
+            <w:pPr>
+              <w:pStyle w:val="Normal"/>
+            </w:pPr>
+            <w:r>
+              <w:t xml:space="preserve">Recall / target accuracy</w:t>
+            </w:r>
+          </w:p>
+        </w:tc>
+        <w:tc>
+          <w:tcPr>
+            <w:shd w:fill="E2E8F0"/>
+          </w:tcPr>
+          <w:p>
+            <w:pPr>
+              <w:pStyle w:val="Normal"/>
+            </w:pPr>
+            <w:r>
+              <w:t xml:space="preserve">Mean cue-to-detection latency</w:t>
             </w:r>
           </w:p>
         </w:tc>
@@ -3387,57 +3464,84 @@
               <w:pStyle w:val="Normal"/>
             </w:pPr>
             <w:r>
-              <w:rPr>
-                <w:rFonts w:ascii="Courier New" w:hAnsi="Courier New"/>
-              </w:rPr>
-              <w:t xml:space="preserve">cpu</w:t>
-            </w:r>
-            <w:r>
-              <w:t xml:space="preserve"> (MediaPipe)</w:t>
-            </w:r>
-          </w:p>
-        </w:tc>
-        <w:tc>
-          <w:tcPr/>
-          <w:p>
-            <w:pPr>
-              <w:pStyle w:val="Normal"/>
-            </w:pPr>
-            <w:r>
-              <w:t xml:space="preserve">~15 ms</w:t>
-            </w:r>
-          </w:p>
-        </w:tc>
-        <w:tc>
-          <w:tcPr/>
-          <w:p>
-            <w:pPr>
-              <w:pStyle w:val="Normal"/>
-            </w:pPr>
-            <w:r>
-              <w:t xml:space="preserve">~10 ms</w:t>
-            </w:r>
-          </w:p>
-        </w:tc>
-        <w:tc>
-          <w:tcPr/>
-          <w:p>
-            <w:pPr>
-              <w:pStyle w:val="Normal"/>
-            </w:pPr>
-            <w:r>
-              <w:t xml:space="preserve">~35 ms</w:t>
-            </w:r>
-          </w:p>
-        </w:tc>
-        <w:tc>
-          <w:tcPr/>
-          <w:p>
-            <w:pPr>
-              <w:pStyle w:val="Normal"/>
-            </w:pPr>
-            <w:r>
-              <w:t xml:space="preserve">Simple CPU-only functional baseline; no extra model files required</w:t>
+              <w:t xml:space="preserve">Drum pads</w:t>
+            </w:r>
+          </w:p>
+        </w:tc>
+        <w:tc>
+          <w:tcPr/>
+          <w:p>
+            <w:pPr>
+              <w:pStyle w:val="Normal"/>
+            </w:pPr>
+            <w:r>
+              <w:t xml:space="preserve">8</w:t>
+            </w:r>
+          </w:p>
+        </w:tc>
+        <w:tc>
+          <w:tcPr/>
+          <w:p>
+            <w:pPr>
+              <w:pStyle w:val="Normal"/>
+            </w:pPr>
+            <w:r>
+              <w:t xml:space="preserve">7</w:t>
+            </w:r>
+          </w:p>
+        </w:tc>
+        <w:tc>
+          <w:tcPr/>
+          <w:p>
+            <w:pPr>
+              <w:pStyle w:val="Normal"/>
+            </w:pPr>
+            <w:r>
+              <w:t xml:space="preserve">9</w:t>
+            </w:r>
+          </w:p>
+        </w:tc>
+        <w:tc>
+          <w:tcPr/>
+          <w:p>
+            <w:pPr>
+              <w:pStyle w:val="Normal"/>
+            </w:pPr>
+            <w:r>
+              <w:t xml:space="preserve">1</w:t>
+            </w:r>
+          </w:p>
+        </w:tc>
+        <w:tc>
+          <w:tcPr/>
+          <w:p>
+            <w:pPr>
+              <w:pStyle w:val="Normal"/>
+            </w:pPr>
+            <w:r>
+              <w:t xml:space="preserve">43.8%</w:t>
+            </w:r>
+          </w:p>
+        </w:tc>
+        <w:tc>
+          <w:tcPr/>
+          <w:p>
+            <w:pPr>
+              <w:pStyle w:val="Normal"/>
+            </w:pPr>
+            <w:r>
+              <w:t xml:space="preserve">87.5%</w:t>
+            </w:r>
+          </w:p>
+        </w:tc>
+        <w:tc>
+          <w:tcPr/>
+          <w:p>
+            <w:pPr>
+              <w:pStyle w:val="Normal"/>
+            </w:pPr>
+            <w:r>
+              <w:t xml:space="preserve">660 ms</w:t>
             </w:r>
           </w:p>
         </w:tc>
@@ -3450,192 +3554,84 @@
               <w:pStyle w:val="Normal"/>
             </w:pPr>
             <w:r>
-              <w:rPr>
-                <w:rFonts w:ascii="Courier New" w:hAnsi="Courier New"/>
-              </w:rPr>
-              <w:t xml:space="preserve">cpu-baseline</w:t>
-            </w:r>
-            <w:r>
-              <w:t xml:space="preserve"> (TFLite)</w:t>
-            </w:r>
-          </w:p>
-        </w:tc>
-        <w:tc>
-          <w:tcPr/>
-          <w:p>
-            <w:pPr>
-              <w:pStyle w:val="Normal"/>
-            </w:pPr>
-            <w:r>
-              <w:t xml:space="preserve">~95 ms</w:t>
-            </w:r>
-          </w:p>
-        </w:tc>
-        <w:tc>
-          <w:tcPr/>
-          <w:p>
-            <w:pPr>
-              <w:pStyle w:val="Normal"/>
-            </w:pPr>
-            <w:r>
-              <w:t xml:space="preserve">~5 ms</w:t>
-            </w:r>
-          </w:p>
-        </w:tc>
-        <w:tc>
-          <w:tcPr/>
-          <w:p>
-            <w:pPr>
-              <w:pStyle w:val="Normal"/>
-            </w:pPr>
-            <w:r>
-              <w:t xml:space="preserve">~105 ms</w:t>
-            </w:r>
-          </w:p>
-        </w:tc>
-        <w:tc>
-          <w:tcPr/>
-          <w:p>
-            <w:pPr>
-              <w:pStyle w:val="Normal"/>
-            </w:pPr>
-            <w:r>
-              <w:t xml:space="preserve">Same two-stage structure as </w:t>
-            </w:r>
-            <w:r>
-              <w:rPr>
-                <w:rFonts w:ascii="Courier New" w:hAnsi="Courier New"/>
-              </w:rPr>
-              <w:t xml:space="preserve">npu-full</w:t>
-            </w:r>
-            <w:r>
-              <w:t xml:space="preserve">; isolates the hand-landmark accelerator comparison</w:t>
-            </w:r>
-          </w:p>
-        </w:tc>
-      </w:tr>
-      <w:tr>
-        <w:tc>
-          <w:tcPr/>
-          <w:p>
-            <w:pPr>
-              <w:pStyle w:val="Normal"/>
-            </w:pPr>
-            <w:r>
-              <w:rPr>
-                <w:rFonts w:ascii="Courier New" w:hAnsi="Courier New"/>
-              </w:rPr>
-              <w:t xml:space="preserve">npu-full</w:t>
-            </w:r>
-            <w:r>
-              <w:t xml:space="preserve"> (TFLite + NPU)</w:t>
-            </w:r>
-          </w:p>
-        </w:tc>
-        <w:tc>
-          <w:tcPr/>
-          <w:p>
-            <w:pPr>
-              <w:pStyle w:val="Normal"/>
-            </w:pPr>
-            <w:r>
-              <w:t xml:space="preserve">~95 ms</w:t>
-            </w:r>
-          </w:p>
-        </w:tc>
-        <w:tc>
-          <w:tcPr/>
-          <w:p>
-            <w:pPr>
-              <w:pStyle w:val="Normal"/>
-            </w:pPr>
-            <w:r>
-              <w:t xml:space="preserve">~8 ms</w:t>
-            </w:r>
-          </w:p>
-        </w:tc>
-        <w:tc>
-          <w:tcPr/>
-          <w:p>
-            <w:pPr>
-              <w:pStyle w:val="Normal"/>
-            </w:pPr>
-            <w:r>
-              <w:t xml:space="preserve">~111 ms</w:t>
-            </w:r>
-          </w:p>
-        </w:tc>
-        <w:tc>
-          <w:tcPr/>
-          <w:p>
-            <w:pPr>
-              <w:pStyle w:val="Normal"/>
-            </w:pPr>
-            <w:r>
-              <w:t xml:space="preserve">Accurate hybrid path, but CPU palm detection dominates total time</w:t>
-            </w:r>
-          </w:p>
-        </w:tc>
-      </w:tr>
-      <w:tr>
-        <w:tc>
-          <w:tcPr/>
-          <w:p>
-            <w:pPr>
-              <w:pStyle w:val="Normal"/>
-            </w:pPr>
-            <w:r>
-              <w:rPr>
-                <w:rFonts w:ascii="Courier New" w:hAnsi="Courier New"/>
-              </w:rPr>
-              <w:t xml:space="preserve">npu</w:t>
-            </w:r>
-            <w:r>
-              <w:t xml:space="preserve"> dual-halves</w:t>
-            </w:r>
-          </w:p>
-        </w:tc>
-        <w:tc>
-          <w:tcPr/>
-          <w:p>
-            <w:pPr>
-              <w:pStyle w:val="Normal"/>
-            </w:pPr>
-            <w:r>
-              <w:t xml:space="preserve">0 ms</w:t>
-            </w:r>
-          </w:p>
-        </w:tc>
-        <w:tc>
-          <w:tcPr/>
-          <w:p>
-            <w:pPr>
-              <w:pStyle w:val="Normal"/>
-            </w:pPr>
-            <w:r>
-              <w:t xml:space="preserve">~8 ms × 2</w:t>
-            </w:r>
-          </w:p>
-        </w:tc>
-        <w:tc>
-          <w:tcPr/>
-          <w:p>
-            <w:pPr>
-              <w:pStyle w:val="Normal"/>
-            </w:pPr>
-            <w:r>
-              <w:t xml:space="preserve">~16 ms</w:t>
-            </w:r>
-          </w:p>
-        </w:tc>
-        <w:tc>
-          <w:tcPr/>
-          <w:p>
-            <w:pPr>
-              <w:pStyle w:val="Normal"/>
-            </w:pPr>
-            <w:r>
-              <w:t xml:space="preserve">Fastest path and close to 60 FPS budget, but it approximates hand location without palm detection</w:t>
+              <w:t xml:space="preserve">Piano</w:t>
+            </w:r>
+          </w:p>
+        </w:tc>
+        <w:tc>
+          <w:tcPr/>
+          <w:p>
+            <w:pPr>
+              <w:pStyle w:val="Normal"/>
+            </w:pPr>
+            <w:r>
+              <w:t xml:space="preserve">10</w:t>
+            </w:r>
+          </w:p>
+        </w:tc>
+        <w:tc>
+          <w:tcPr/>
+          <w:p>
+            <w:pPr>
+              <w:pStyle w:val="Normal"/>
+            </w:pPr>
+            <w:r>
+              <w:t xml:space="preserve">2</w:t>
+            </w:r>
+          </w:p>
+        </w:tc>
+        <w:tc>
+          <w:tcPr/>
+          <w:p>
+            <w:pPr>
+              <w:pStyle w:val="Normal"/>
+            </w:pPr>
+            <w:r>
+              <w:t xml:space="preserve">13</w:t>
+            </w:r>
+          </w:p>
+        </w:tc>
+        <w:tc>
+          <w:tcPr/>
+          <w:p>
+            <w:pPr>
+              <w:pStyle w:val="Normal"/>
+            </w:pPr>
+            <w:r>
+              <w:t xml:space="preserve">8</w:t>
+            </w:r>
+          </w:p>
+        </w:tc>
+        <w:tc>
+          <w:tcPr/>
+          <w:p>
+            <w:pPr>
+              <w:pStyle w:val="Normal"/>
+            </w:pPr>
+            <w:r>
+              <w:t xml:space="preserve">13.3%</w:t>
+            </w:r>
+          </w:p>
+        </w:tc>
+        <w:tc>
+          <w:tcPr/>
+          <w:p>
+            <w:pPr>
+              <w:pStyle w:val="Normal"/>
+            </w:pPr>
+            <w:r>
+              <w:t xml:space="preserve">20.0%</w:t>
+            </w:r>
+          </w:p>
+        </w:tc>
+        <w:tc>
+          <w:tcPr/>
+          <w:p>
+            <w:pPr>
+              <w:pStyle w:val="Normal"/>
+            </w:pPr>
+            <w:r>
+              <w:t xml:space="preserve">1034 ms</w:t>
             </w:r>
           </w:p>
         </w:tc>
@@ -3643,10 +3639,59 @@
     </w:tbl>
     <w:p>
       <w:pPr>
-        <w:pStyle w:val="Normal"/>
-      </w:pPr>
-      <w:r>
-        <w:t xml:space="preserve">The result has two important implications. First, moving only the hand landmark model to NPU is insufficient when CPU palm detection still dominates the accurate pipeline. Second, the low-latency dual-halves path is valuable for demonstrations, but it should not be treated as accuracy-equivalent to the palm-based configurations because it assumes stable hand placement.</w:t>
+        <w:jc w:val="center"/>
+      </w:pPr>
+      <w:r>
+        <w:drawing>
+          <wp:inline distT="0" distB="0" distL="0" distR="0">
+            <wp:extent cx="5669280" cy="1820756"/>
+            <wp:docPr id="11" name="guided_eval_results.png"/>
+            <wp:cNvGraphicFramePr>
+              <a:graphicFrameLocks noChangeAspect="1"/>
+            </wp:cNvGraphicFramePr>
+            <a:graphic>
+              <a:graphicData uri="http://schemas.openxmlformats.org/drawingml/2006/picture">
+                <pic:pic>
+                  <pic:nvPicPr>
+                    <pic:cNvPr id="11" name="guided_eval_results.png"/>
+                    <pic:cNvPicPr/>
+                  </pic:nvPicPr>
+                  <pic:blipFill>
+                    <a:blip r:embed="rId11"/>
+                    <a:stretch>
+                      <a:fillRect/>
+                    </a:stretch>
+                  </pic:blipFill>
+                  <pic:spPr>
+                    <a:xfrm>
+                      <a:off x="0" y="0"/>
+                      <a:ext cx="5669280" cy="1820756"/>
+                    </a:xfrm>
+                    <a:prstGeom prst="rect">
+                      <a:avLst/>
+                    </a:prstGeom>
+                  </pic:spPr>
+                </pic:pic>
+              </a:graphicData>
+            </a:graphic>
+          </wp:inline>
+        </w:drawing>
+      </w:r>
+    </w:p>
+    <w:p>
+      <w:pPr>
+        <w:pStyle w:val="Caption"/>
+      </w:pPr>
+      <w:r>
+        <w:t xml:space="preserve">Figure 10. Guided evaluation plot generated from the slow mirrored drum and piano runs.</w:t>
+      </w:r>
+    </w:p>
+    <w:p>
+      <w:pPr>
+        <w:pStyle w:val="Normal"/>
+      </w:pPr>
+      <w:r>
+        <w:t xml:space="preserve">The drum-pad interface performed substantially better than the piano interface in this pilot run. This is expected because drum mode only requires the fingertip strike to land inside a visible rectangle, while piano mode requires both accurate finger identity and stable screen-side hand mapping. The piano result therefore highlights a remaining usability issue rather than a failure of palm detection: the system is detecting fingertip strikes, but many detected notes do not match the prompted note. The cue-to-detection latency values include human reaction time and should not be interpreted as acoustic motion-to-speaker latency.</w:t>
       </w:r>
     </w:p>
     <w:p>
@@ -3654,20 +3699,29 @@
         <w:pStyle w:val="Heading3"/>
       </w:pPr>
       <w:r>
-        <w:t xml:space="preserve">7.4 Offline Dataset Benchmark Summary</w:t>
-      </w:r>
-    </w:p>
-    <w:p>
-      <w:pPr>
-        <w:pStyle w:val="Normal"/>
-      </w:pPr>
-      <w:r>
-        <w:t xml:space="preserve">A 90-frame offline benchmark was run to compare the two structurally matched pipelines, </w:t>
+        <w:t xml:space="preserve">7.4 Backend Performance Summary</w:t>
+      </w:r>
+    </w:p>
+    <w:p>
+      <w:pPr>
+        <w:pStyle w:val="Normal"/>
+      </w:pPr>
+      <w:r>
+        <w:t xml:space="preserve">The table below reports the high-level latency comparison for the four evaluated runtime configurations. The </w:t>
       </w:r>
       <w:r>
         <w:rPr>
           <w:rFonts w:ascii="Courier New" w:hAnsi="Courier New"/>
         </w:rPr>
+        <w:t xml:space="preserve">cpu</w:t>
+      </w:r>
+      <w:r>
+        <w:t xml:space="preserve"> row is a practical reference path. The </w:t>
+      </w:r>
+      <w:r>
+        <w:rPr>
+          <w:rFonts w:ascii="Courier New" w:hAnsi="Courier New"/>
+        </w:rPr>
         <w:t xml:space="preserve">cpu-baseline</w:t>
       </w:r>
       <w:r>
@@ -3680,7 +3734,16 @@
         <w:t xml:space="preserve">npu-full</w:t>
       </w:r>
       <w:r>
-        <w:t xml:space="preserve">, using the same captured input frames. This benchmark removes live camera variability and focuses on per-frame processing latency and landmark agreement.</w:t>
+        <w:t xml:space="preserve"> rows form the controlled CPU-vs-NPU comparison because they share the same palm→ROI→hand pipeline and differ only in hand landmark inference. The </w:t>
+      </w:r>
+      <w:r>
+        <w:rPr>
+          <w:rFonts w:ascii="Courier New" w:hAnsi="Courier New"/>
+        </w:rPr>
+        <w:t xml:space="preserve">npu</w:t>
+      </w:r>
+      <w:r>
+        <w:t xml:space="preserve"> dual-halves row is not an accuracy-equivalent baseline; it is a low-latency approximation that removes palm detection to estimate the best-case live-demo path.</w:t>
       </w:r>
     </w:p>
     <w:tbl>
@@ -3706,7 +3769,7 @@
               <w:pStyle w:val="Normal"/>
             </w:pPr>
             <w:r>
-              <w:t xml:space="preserve">Configuration</w:t>
+              <w:t xml:space="preserve">Backend</w:t>
             </w:r>
           </w:p>
         </w:tc>
@@ -3719,7 +3782,7 @@
               <w:pStyle w:val="Normal"/>
             </w:pPr>
             <w:r>
-              <w:t xml:space="preserve">Mean latency</w:t>
+              <w:t xml:space="preserve">Palm stage</w:t>
             </w:r>
           </w:p>
         </w:tc>
@@ -3732,7 +3795,7 @@
               <w:pStyle w:val="Normal"/>
             </w:pPr>
             <w:r>
-              <w:t xml:space="preserve">P95 latency</w:t>
+              <w:t xml:space="preserve">Hand stage</w:t>
             </w:r>
           </w:p>
         </w:tc>
@@ -3745,7 +3808,7 @@
               <w:pStyle w:val="Normal"/>
             </w:pPr>
             <w:r>
-              <w:t xml:space="preserve">Component profile</w:t>
+              <w:t xml:space="preserve">Approx. total for 2 hands</w:t>
             </w:r>
           </w:p>
         </w:tc>
@@ -3759,6 +3822,69 @@
             </w:pPr>
             <w:r>
               <w:t xml:space="preserve">Interpretation</w:t>
+            </w:r>
+          </w:p>
+        </w:tc>
+      </w:tr>
+      <w:tr>
+        <w:tc>
+          <w:tcPr/>
+          <w:p>
+            <w:pPr>
+              <w:pStyle w:val="Normal"/>
+            </w:pPr>
+            <w:r>
+              <w:rPr>
+                <w:rFonts w:ascii="Courier New" w:hAnsi="Courier New"/>
+              </w:rPr>
+              <w:t xml:space="preserve">cpu</w:t>
+            </w:r>
+            <w:r>
+              <w:t xml:space="preserve"> (MediaPipe)</w:t>
+            </w:r>
+          </w:p>
+        </w:tc>
+        <w:tc>
+          <w:tcPr/>
+          <w:p>
+            <w:pPr>
+              <w:pStyle w:val="Normal"/>
+            </w:pPr>
+            <w:r>
+              <w:t xml:space="preserve">~15 ms</w:t>
+            </w:r>
+          </w:p>
+        </w:tc>
+        <w:tc>
+          <w:tcPr/>
+          <w:p>
+            <w:pPr>
+              <w:pStyle w:val="Normal"/>
+            </w:pPr>
+            <w:r>
+              <w:t xml:space="preserve">~10 ms</w:t>
+            </w:r>
+          </w:p>
+        </w:tc>
+        <w:tc>
+          <w:tcPr/>
+          <w:p>
+            <w:pPr>
+              <w:pStyle w:val="Normal"/>
+            </w:pPr>
+            <w:r>
+              <w:t xml:space="preserve">~35 ms</w:t>
+            </w:r>
+          </w:p>
+        </w:tc>
+        <w:tc>
+          <w:tcPr/>
+          <w:p>
+            <w:pPr>
+              <w:pStyle w:val="Normal"/>
+            </w:pPr>
+            <w:r>
+              <w:t xml:space="preserve">Simple CPU-only functional baseline; no extra model files required</w:t>
             </w:r>
           </w:p>
         </w:tc>
@@ -3777,62 +3903,52 @@
               <w:t xml:space="preserve">cpu-baseline</w:t>
             </w:r>
             <w:r>
-              <w:t xml:space="preserve">, palm every frame</w:t>
-            </w:r>
-          </w:p>
-        </w:tc>
-        <w:tc>
-          <w:tcPr/>
-          <w:p>
-            <w:pPr>
-              <w:pStyle w:val="Normal"/>
-            </w:pPr>
-            <w:r>
-              <w:t xml:space="preserve">84.40 ms</w:t>
-            </w:r>
-          </w:p>
-        </w:tc>
-        <w:tc>
-          <w:tcPr/>
-          <w:p>
-            <w:pPr>
-              <w:pStyle w:val="Normal"/>
-            </w:pPr>
-            <w:r>
-              <w:t xml:space="preserve">86.78 ms</w:t>
-            </w:r>
-          </w:p>
-        </w:tc>
-        <w:tc>
-          <w:tcPr/>
-          <w:p>
-            <w:pPr>
-              <w:pStyle w:val="Normal"/>
-            </w:pPr>
-            <w:r>
-              <w:t xml:space="preserve">palm 39.26 ms + hand 44.80 ms</w:t>
-            </w:r>
-          </w:p>
-        </w:tc>
-        <w:tc>
-          <w:tcPr/>
-          <w:p>
-            <w:pPr>
-              <w:pStyle w:val="Normal"/>
-            </w:pPr>
-            <w:r>
-              <w:t xml:space="preserve">CPU TFLite reference for the two-stage pipeline</w:t>
-            </w:r>
-          </w:p>
-        </w:tc>
-      </w:tr>
-      <w:tr>
-        <w:tc>
-          <w:tcPr/>
-          <w:p>
-            <w:pPr>
-              <w:pStyle w:val="Normal"/>
-            </w:pPr>
+              <w:t xml:space="preserve"> (TFLite)</w:t>
+            </w:r>
+          </w:p>
+        </w:tc>
+        <w:tc>
+          <w:tcPr/>
+          <w:p>
+            <w:pPr>
+              <w:pStyle w:val="Normal"/>
+            </w:pPr>
+            <w:r>
+              <w:t xml:space="preserve">~95 ms</w:t>
+            </w:r>
+          </w:p>
+        </w:tc>
+        <w:tc>
+          <w:tcPr/>
+          <w:p>
+            <w:pPr>
+              <w:pStyle w:val="Normal"/>
+            </w:pPr>
+            <w:r>
+              <w:t xml:space="preserve">~5 ms</w:t>
+            </w:r>
+          </w:p>
+        </w:tc>
+        <w:tc>
+          <w:tcPr/>
+          <w:p>
+            <w:pPr>
+              <w:pStyle w:val="Normal"/>
+            </w:pPr>
+            <w:r>
+              <w:t xml:space="preserve">~105 ms</w:t>
+            </w:r>
+          </w:p>
+        </w:tc>
+        <w:tc>
+          <w:tcPr/>
+          <w:p>
+            <w:pPr>
+              <w:pStyle w:val="Normal"/>
+            </w:pPr>
+            <w:r>
+              <w:t xml:space="preserve">Same two-stage structure as </w:t>
+            </w:r>
             <w:r>
               <w:rPr>
                 <w:rFonts w:ascii="Courier New" w:hAnsi="Courier New"/>
@@ -3840,51 +3956,7 @@
               <w:t xml:space="preserve">npu-full</w:t>
             </w:r>
             <w:r>
-              <w:t xml:space="preserve">, palm every frame</w:t>
-            </w:r>
-          </w:p>
-        </w:tc>
-        <w:tc>
-          <w:tcPr/>
-          <w:p>
-            <w:pPr>
-              <w:pStyle w:val="Normal"/>
-            </w:pPr>
-            <w:r>
-              <w:t xml:space="preserve">50.32 ms</w:t>
-            </w:r>
-          </w:p>
-        </w:tc>
-        <w:tc>
-          <w:tcPr/>
-          <w:p>
-            <w:pPr>
-              <w:pStyle w:val="Normal"/>
-            </w:pPr>
-            <w:r>
-              <w:t xml:space="preserve">54.52 ms</w:t>
-            </w:r>
-          </w:p>
-        </w:tc>
-        <w:tc>
-          <w:tcPr/>
-          <w:p>
-            <w:pPr>
-              <w:pStyle w:val="Normal"/>
-            </w:pPr>
-            <w:r>
-              <w:t xml:space="preserve">palm 40.93 ms + hand 9.13 ms</w:t>
-            </w:r>
-          </w:p>
-        </w:tc>
-        <w:tc>
-          <w:tcPr/>
-          <w:p>
-            <w:pPr>
-              <w:pStyle w:val="Normal"/>
-            </w:pPr>
-            <w:r>
-              <w:t xml:space="preserve">Same palm/ROI path, but hand inference is moved to NPU</w:t>
+              <w:t xml:space="preserve">; isolates the hand-landmark accelerator comparison</w:t>
             </w:r>
           </w:p>
         </w:tc>
@@ -3903,132 +3975,114 @@
               <w:t xml:space="preserve">npu-full</w:t>
             </w:r>
             <w:r>
-              <w:t xml:space="preserve">, </w:t>
-            </w:r>
+              <w:t xml:space="preserve"> (TFLite + NPU)</w:t>
+            </w:r>
+          </w:p>
+        </w:tc>
+        <w:tc>
+          <w:tcPr/>
+          <w:p>
+            <w:pPr>
+              <w:pStyle w:val="Normal"/>
+            </w:pPr>
+            <w:r>
+              <w:t xml:space="preserve">~95 ms</w:t>
+            </w:r>
+          </w:p>
+        </w:tc>
+        <w:tc>
+          <w:tcPr/>
+          <w:p>
+            <w:pPr>
+              <w:pStyle w:val="Normal"/>
+            </w:pPr>
+            <w:r>
+              <w:t xml:space="preserve">~8 ms</w:t>
+            </w:r>
+          </w:p>
+        </w:tc>
+        <w:tc>
+          <w:tcPr/>
+          <w:p>
+            <w:pPr>
+              <w:pStyle w:val="Normal"/>
+            </w:pPr>
+            <w:r>
+              <w:t xml:space="preserve">~111 ms</w:t>
+            </w:r>
+          </w:p>
+        </w:tc>
+        <w:tc>
+          <w:tcPr/>
+          <w:p>
+            <w:pPr>
+              <w:pStyle w:val="Normal"/>
+            </w:pPr>
+            <w:r>
+              <w:t xml:space="preserve">Accurate hybrid path, but CPU palm detection dominates total time</w:t>
+            </w:r>
+          </w:p>
+        </w:tc>
+      </w:tr>
+      <w:tr>
+        <w:tc>
+          <w:tcPr/>
+          <w:p>
+            <w:pPr>
+              <w:pStyle w:val="Normal"/>
+            </w:pPr>
             <w:r>
               <w:rPr>
                 <w:rFonts w:ascii="Courier New" w:hAnsi="Courier New"/>
               </w:rPr>
-              <w:t xml:space="preserve">--palm-redetect-every 5</w:t>
-            </w:r>
-            <w:r>
-              <w:t xml:space="preserve"> (20-frame smoke)</w:t>
-            </w:r>
-          </w:p>
-        </w:tc>
-        <w:tc>
-          <w:tcPr/>
-          <w:p>
-            <w:pPr>
-              <w:pStyle w:val="Normal"/>
-            </w:pPr>
-            <w:r>
-              <w:t xml:space="preserve">15.29 ms</w:t>
-            </w:r>
-          </w:p>
-        </w:tc>
-        <w:tc>
-          <w:tcPr/>
-          <w:p>
-            <w:pPr>
-              <w:pStyle w:val="Normal"/>
-            </w:pPr>
-            <w:r>
-              <w:t xml:space="preserve">50.96 ms</w:t>
-            </w:r>
-          </w:p>
-        </w:tc>
-        <w:tc>
-          <w:tcPr/>
-          <w:p>
-            <w:pPr>
-              <w:pStyle w:val="Normal"/>
-            </w:pPr>
-            <w:r>
-              <w:t xml:space="preserve">palm frames 3/20, tracking frames 17/20</w:t>
-            </w:r>
-          </w:p>
-        </w:tc>
-        <w:tc>
-          <w:tcPr/>
-          <w:p>
-            <w:pPr>
-              <w:pStyle w:val="Normal"/>
-            </w:pPr>
-            <w:r>
-              <w:t xml:space="preserve">Shows latency potential of palm skipping, but drift and hit accuracy must be verified</w:t>
-            </w:r>
-          </w:p>
-        </w:tc>
-      </w:tr>
-      <w:tr>
-        <w:tc>
-          <w:tcPr/>
-          <w:p>
-            <w:pPr>
-              <w:pStyle w:val="Normal"/>
-            </w:pPr>
-            <w:r>
-              <w:rPr>
-                <w:rFonts w:ascii="Courier New" w:hAnsi="Courier New"/>
-              </w:rPr>
-              <w:t xml:space="preserve">npu-full</w:t>
-            </w:r>
-            <w:r>
-              <w:t xml:space="preserve">, </w:t>
-            </w:r>
-            <w:r>
-              <w:rPr>
-                <w:rFonts w:ascii="Courier New" w:hAnsi="Courier New"/>
-              </w:rPr>
-              <w:t xml:space="preserve">--async-palm</w:t>
-            </w:r>
-            <w:r>
-              <w:t xml:space="preserve"> smoke</w:t>
-            </w:r>
-          </w:p>
-        </w:tc>
-        <w:tc>
-          <w:tcPr/>
-          <w:p>
-            <w:pPr>
-              <w:pStyle w:val="Normal"/>
-            </w:pPr>
-            <w:r>
-              <w:t xml:space="preserve">10–20 ms range</w:t>
-            </w:r>
-          </w:p>
-        </w:tc>
-        <w:tc>
-          <w:tcPr/>
-          <w:p>
-            <w:pPr>
-              <w:pStyle w:val="Normal"/>
-            </w:pPr>
-            <w:r>
-              <w:t xml:space="preserve">input-pacing dependent</w:t>
-            </w:r>
-          </w:p>
-        </w:tc>
-        <w:tc>
-          <w:tcPr/>
-          <w:p>
-            <w:pPr>
-              <w:pStyle w:val="Normal"/>
-            </w:pPr>
-            <w:r>
-              <w:t xml:space="preserve">tracking with asynchronous palm refresh</w:t>
-            </w:r>
-          </w:p>
-        </w:tc>
-        <w:tc>
-          <w:tcPr/>
-          <w:p>
-            <w:pPr>
-              <w:pStyle w:val="Normal"/>
-            </w:pPr>
-            <w:r>
-              <w:t xml:space="preserve">Experimental path; live stability still needs validation</w:t>
+              <w:t xml:space="preserve">npu</w:t>
+            </w:r>
+            <w:r>
+              <w:t xml:space="preserve"> dual-halves</w:t>
+            </w:r>
+          </w:p>
+        </w:tc>
+        <w:tc>
+          <w:tcPr/>
+          <w:p>
+            <w:pPr>
+              <w:pStyle w:val="Normal"/>
+            </w:pPr>
+            <w:r>
+              <w:t xml:space="preserve">0 ms</w:t>
+            </w:r>
+          </w:p>
+        </w:tc>
+        <w:tc>
+          <w:tcPr/>
+          <w:p>
+            <w:pPr>
+              <w:pStyle w:val="Normal"/>
+            </w:pPr>
+            <w:r>
+              <w:t xml:space="preserve">~8 ms × 2</w:t>
+            </w:r>
+          </w:p>
+        </w:tc>
+        <w:tc>
+          <w:tcPr/>
+          <w:p>
+            <w:pPr>
+              <w:pStyle w:val="Normal"/>
+            </w:pPr>
+            <w:r>
+              <w:t xml:space="preserve">~16 ms</w:t>
+            </w:r>
+          </w:p>
+        </w:tc>
+        <w:tc>
+          <w:tcPr/>
+          <w:p>
+            <w:pPr>
+              <w:pStyle w:val="Normal"/>
+            </w:pPr>
+            <w:r>
+              <w:t xml:space="preserve">Fastest path and close to 60 FPS budget, but it approximates hand location without palm detection</w:t>
             </w:r>
           </w:p>
         </w:tc>
@@ -4039,7 +4093,23 @@
         <w:pStyle w:val="Normal"/>
       </w:pPr>
       <w:r>
-        <w:t xml:space="preserve">The matched </w:t>
+        <w:t xml:space="preserve">The result has two important implications. First, moving only the hand landmark model to NPU is insufficient when CPU palm detection still dominates the accurate pipeline. Second, the low-latency dual-halves path is valuable for demonstrations, but it should not be treated as accuracy-equivalent to the palm-based configurations because it assumes stable hand placement.</w:t>
+      </w:r>
+    </w:p>
+    <w:p>
+      <w:pPr>
+        <w:pStyle w:val="Heading3"/>
+      </w:pPr>
+      <w:r>
+        <w:t xml:space="preserve">7.5 Offline Dataset Benchmark Summary</w:t>
+      </w:r>
+    </w:p>
+    <w:p>
+      <w:pPr>
+        <w:pStyle w:val="Normal"/>
+      </w:pPr>
+      <w:r>
+        <w:t xml:space="preserve">A 90-frame offline benchmark was run to compare the two structurally matched pipelines, </w:t>
       </w:r>
       <w:r>
         <w:rPr>
@@ -4048,7 +4118,7 @@
         <w:t xml:space="preserve">cpu-baseline</w:t>
       </w:r>
       <w:r>
-        <w:t xml:space="preserve"> vs. </w:t>
+        <w:t xml:space="preserve"> and </w:t>
       </w:r>
       <w:r>
         <w:rPr>
@@ -4057,24 +4127,7 @@
         <w:t xml:space="preserve">npu-full</w:t>
       </w:r>
       <w:r>
-        <w:t xml:space="preserve"> comparison shows that the NPU substantially reduces hand-landmark time in the TFLite-style pipeline (44.80 ms to 9.13 ms in the recorded 90-frame run). However, palm detection remains about 40 ms, so the accurate pipeline still exceeds the 60 FPS target unless palm frequency is reduced or palm detection is accelerated.</w:t>
-      </w:r>
-    </w:p>
-    <w:p>
-      <w:pPr>
-        <w:pStyle w:val="Normal"/>
-      </w:pPr>
-      <w:r>
-        <w:t xml:space="preserve">Landmark accuracy was estimated by comparing </w:t>
-      </w:r>
-      <w:r>
-        <w:rPr>
-          <w:rFonts w:ascii="Courier New" w:hAnsi="Courier New"/>
-        </w:rPr>
-        <w:t xml:space="preserve">npu-full</w:t>
-      </w:r>
-      <w:r>
-        <w:t xml:space="preserve"> landmarks against the CPU-baseline reference in normalized image coordinates.</w:t>
+        <w:t xml:space="preserve">, using the same captured input frames. This benchmark removes live camera variability and focuses on per-frame processing latency and landmark agreement.</w:t>
       </w:r>
     </w:p>
     <w:tbl>
@@ -4100,7 +4153,7 @@
               <w:pStyle w:val="Normal"/>
             </w:pPr>
             <w:r>
-              <w:t xml:space="preserve">Hand</w:t>
+              <w:t xml:space="preserve">Configuration</w:t>
             </w:r>
           </w:p>
         </w:tc>
@@ -4113,7 +4166,7 @@
               <w:pStyle w:val="Normal"/>
             </w:pPr>
             <w:r>
-              <w:t xml:space="preserve">Matched frames</w:t>
+              <w:t xml:space="preserve">Mean latency</w:t>
             </w:r>
           </w:p>
         </w:tc>
@@ -4126,7 +4179,7 @@
               <w:pStyle w:val="Normal"/>
             </w:pPr>
             <w:r>
-              <w:t xml:space="preserve">Mean error over 21 points</w:t>
+              <w:t xml:space="preserve">P95 latency</w:t>
             </w:r>
           </w:p>
         </w:tc>
@@ -4139,7 +4192,7 @@
               <w:pStyle w:val="Normal"/>
             </w:pPr>
             <w:r>
-              <w:t xml:space="preserve">Mean fingertip error</w:t>
+              <w:t xml:space="preserve">Component profile</w:t>
             </w:r>
           </w:p>
         </w:tc>
@@ -4152,20 +4205,7 @@
               <w:pStyle w:val="Normal"/>
             </w:pPr>
             <w:r>
-              <w:t xml:space="preserve">Mean max error</w:t>
-            </w:r>
-          </w:p>
-        </w:tc>
-        <w:tc>
-          <w:tcPr>
-            <w:shd w:fill="E2E8F0"/>
-          </w:tcPr>
-          <w:p>
-            <w:pPr>
-              <w:pStyle w:val="Normal"/>
-            </w:pPr>
-            <w:r>
-              <w:t xml:space="preserve">Worst max error</w:t>
+              <w:t xml:space="preserve">Interpretation</w:t>
             </w:r>
           </w:p>
         </w:tc>
@@ -4178,62 +4218,57 @@
               <w:pStyle w:val="Normal"/>
             </w:pPr>
             <w:r>
-              <w:t xml:space="preserve">Right</w:t>
-            </w:r>
-          </w:p>
-        </w:tc>
-        <w:tc>
-          <w:tcPr/>
-          <w:p>
-            <w:pPr>
-              <w:pStyle w:val="Normal"/>
-            </w:pPr>
-            <w:r>
-              <w:t xml:space="preserve">90</w:t>
-            </w:r>
-          </w:p>
-        </w:tc>
-        <w:tc>
-          <w:tcPr/>
-          <w:p>
-            <w:pPr>
-              <w:pStyle w:val="Normal"/>
-            </w:pPr>
-            <w:r>
-              <w:t xml:space="preserve">0.0270</w:t>
-            </w:r>
-          </w:p>
-        </w:tc>
-        <w:tc>
-          <w:tcPr/>
-          <w:p>
-            <w:pPr>
-              <w:pStyle w:val="Normal"/>
-            </w:pPr>
-            <w:r>
-              <w:t xml:space="preserve">0.0336</w:t>
-            </w:r>
-          </w:p>
-        </w:tc>
-        <w:tc>
-          <w:tcPr/>
-          <w:p>
-            <w:pPr>
-              <w:pStyle w:val="Normal"/>
-            </w:pPr>
-            <w:r>
-              <w:t xml:space="preserve">0.0532</w:t>
-            </w:r>
-          </w:p>
-        </w:tc>
-        <w:tc>
-          <w:tcPr/>
-          <w:p>
-            <w:pPr>
-              <w:pStyle w:val="Normal"/>
-            </w:pPr>
-            <w:r>
-              <w:t xml:space="preserve">0.1593</w:t>
+              <w:rPr>
+                <w:rFonts w:ascii="Courier New" w:hAnsi="Courier New"/>
+              </w:rPr>
+              <w:t xml:space="preserve">cpu-baseline</w:t>
+            </w:r>
+            <w:r>
+              <w:t xml:space="preserve">, palm every frame</w:t>
+            </w:r>
+          </w:p>
+        </w:tc>
+        <w:tc>
+          <w:tcPr/>
+          <w:p>
+            <w:pPr>
+              <w:pStyle w:val="Normal"/>
+            </w:pPr>
+            <w:r>
+              <w:t xml:space="preserve">84.40 ms</w:t>
+            </w:r>
+          </w:p>
+        </w:tc>
+        <w:tc>
+          <w:tcPr/>
+          <w:p>
+            <w:pPr>
+              <w:pStyle w:val="Normal"/>
+            </w:pPr>
+            <w:r>
+              <w:t xml:space="preserve">86.78 ms</w:t>
+            </w:r>
+          </w:p>
+        </w:tc>
+        <w:tc>
+          <w:tcPr/>
+          <w:p>
+            <w:pPr>
+              <w:pStyle w:val="Normal"/>
+            </w:pPr>
+            <w:r>
+              <w:t xml:space="preserve">palm 39.26 ms + hand 44.80 ms</w:t>
+            </w:r>
+          </w:p>
+        </w:tc>
+        <w:tc>
+          <w:tcPr/>
+          <w:p>
+            <w:pPr>
+              <w:pStyle w:val="Normal"/>
+            </w:pPr>
+            <w:r>
+              <w:t xml:space="preserve">CPU TFLite reference for the two-stage pipeline</w:t>
             </w:r>
           </w:p>
         </w:tc>
@@ -4246,62 +4281,201 @@
               <w:pStyle w:val="Normal"/>
             </w:pPr>
             <w:r>
-              <w:t xml:space="preserve">Left</w:t>
-            </w:r>
-          </w:p>
-        </w:tc>
-        <w:tc>
-          <w:tcPr/>
-          <w:p>
-            <w:pPr>
-              <w:pStyle w:val="Normal"/>
-            </w:pPr>
-            <w:r>
-              <w:t xml:space="preserve">83</w:t>
-            </w:r>
-          </w:p>
-        </w:tc>
-        <w:tc>
-          <w:tcPr/>
-          <w:p>
-            <w:pPr>
-              <w:pStyle w:val="Normal"/>
-            </w:pPr>
-            <w:r>
-              <w:t xml:space="preserve">0.0256</w:t>
-            </w:r>
-          </w:p>
-        </w:tc>
-        <w:tc>
-          <w:tcPr/>
-          <w:p>
-            <w:pPr>
-              <w:pStyle w:val="Normal"/>
-            </w:pPr>
-            <w:r>
-              <w:t xml:space="preserve">0.0353</w:t>
-            </w:r>
-          </w:p>
-        </w:tc>
-        <w:tc>
-          <w:tcPr/>
-          <w:p>
-            <w:pPr>
-              <w:pStyle w:val="Normal"/>
-            </w:pPr>
-            <w:r>
-              <w:t xml:space="preserve">0.0457</w:t>
-            </w:r>
-          </w:p>
-        </w:tc>
-        <w:tc>
-          <w:tcPr/>
-          <w:p>
-            <w:pPr>
-              <w:pStyle w:val="Normal"/>
-            </w:pPr>
-            <w:r>
-              <w:t xml:space="preserve">0.0734</w:t>
+              <w:rPr>
+                <w:rFonts w:ascii="Courier New" w:hAnsi="Courier New"/>
+              </w:rPr>
+              <w:t xml:space="preserve">npu-full</w:t>
+            </w:r>
+            <w:r>
+              <w:t xml:space="preserve">, palm every frame</w:t>
+            </w:r>
+          </w:p>
+        </w:tc>
+        <w:tc>
+          <w:tcPr/>
+          <w:p>
+            <w:pPr>
+              <w:pStyle w:val="Normal"/>
+            </w:pPr>
+            <w:r>
+              <w:t xml:space="preserve">50.32 ms</w:t>
+            </w:r>
+          </w:p>
+        </w:tc>
+        <w:tc>
+          <w:tcPr/>
+          <w:p>
+            <w:pPr>
+              <w:pStyle w:val="Normal"/>
+            </w:pPr>
+            <w:r>
+              <w:t xml:space="preserve">54.52 ms</w:t>
+            </w:r>
+          </w:p>
+        </w:tc>
+        <w:tc>
+          <w:tcPr/>
+          <w:p>
+            <w:pPr>
+              <w:pStyle w:val="Normal"/>
+            </w:pPr>
+            <w:r>
+              <w:t xml:space="preserve">palm 40.93 ms + hand 9.13 ms</w:t>
+            </w:r>
+          </w:p>
+        </w:tc>
+        <w:tc>
+          <w:tcPr/>
+          <w:p>
+            <w:pPr>
+              <w:pStyle w:val="Normal"/>
+            </w:pPr>
+            <w:r>
+              <w:t xml:space="preserve">Same palm/ROI path, but hand inference is moved to NPU</w:t>
+            </w:r>
+          </w:p>
+        </w:tc>
+      </w:tr>
+      <w:tr>
+        <w:tc>
+          <w:tcPr/>
+          <w:p>
+            <w:pPr>
+              <w:pStyle w:val="Normal"/>
+            </w:pPr>
+            <w:r>
+              <w:rPr>
+                <w:rFonts w:ascii="Courier New" w:hAnsi="Courier New"/>
+              </w:rPr>
+              <w:t xml:space="preserve">npu-full</w:t>
+            </w:r>
+            <w:r>
+              <w:t xml:space="preserve">, </w:t>
+            </w:r>
+            <w:r>
+              <w:rPr>
+                <w:rFonts w:ascii="Courier New" w:hAnsi="Courier New"/>
+              </w:rPr>
+              <w:t xml:space="preserve">--palm-redetect-every 5</w:t>
+            </w:r>
+            <w:r>
+              <w:t xml:space="preserve"> (20-frame smoke)</w:t>
+            </w:r>
+          </w:p>
+        </w:tc>
+        <w:tc>
+          <w:tcPr/>
+          <w:p>
+            <w:pPr>
+              <w:pStyle w:val="Normal"/>
+            </w:pPr>
+            <w:r>
+              <w:t xml:space="preserve">15.29 ms</w:t>
+            </w:r>
+          </w:p>
+        </w:tc>
+        <w:tc>
+          <w:tcPr/>
+          <w:p>
+            <w:pPr>
+              <w:pStyle w:val="Normal"/>
+            </w:pPr>
+            <w:r>
+              <w:t xml:space="preserve">50.96 ms</w:t>
+            </w:r>
+          </w:p>
+        </w:tc>
+        <w:tc>
+          <w:tcPr/>
+          <w:p>
+            <w:pPr>
+              <w:pStyle w:val="Normal"/>
+            </w:pPr>
+            <w:r>
+              <w:t xml:space="preserve">palm frames 3/20, tracking frames 17/20</w:t>
+            </w:r>
+          </w:p>
+        </w:tc>
+        <w:tc>
+          <w:tcPr/>
+          <w:p>
+            <w:pPr>
+              <w:pStyle w:val="Normal"/>
+            </w:pPr>
+            <w:r>
+              <w:t xml:space="preserve">Shows latency potential of palm skipping, but drift and hit accuracy must be verified</w:t>
+            </w:r>
+          </w:p>
+        </w:tc>
+      </w:tr>
+      <w:tr>
+        <w:tc>
+          <w:tcPr/>
+          <w:p>
+            <w:pPr>
+              <w:pStyle w:val="Normal"/>
+            </w:pPr>
+            <w:r>
+              <w:rPr>
+                <w:rFonts w:ascii="Courier New" w:hAnsi="Courier New"/>
+              </w:rPr>
+              <w:t xml:space="preserve">npu-full</w:t>
+            </w:r>
+            <w:r>
+              <w:t xml:space="preserve">, </w:t>
+            </w:r>
+            <w:r>
+              <w:rPr>
+                <w:rFonts w:ascii="Courier New" w:hAnsi="Courier New"/>
+              </w:rPr>
+              <w:t xml:space="preserve">--async-palm</w:t>
+            </w:r>
+            <w:r>
+              <w:t xml:space="preserve"> smoke</w:t>
+            </w:r>
+          </w:p>
+        </w:tc>
+        <w:tc>
+          <w:tcPr/>
+          <w:p>
+            <w:pPr>
+              <w:pStyle w:val="Normal"/>
+            </w:pPr>
+            <w:r>
+              <w:t xml:space="preserve">10–20 ms range</w:t>
+            </w:r>
+          </w:p>
+        </w:tc>
+        <w:tc>
+          <w:tcPr/>
+          <w:p>
+            <w:pPr>
+              <w:pStyle w:val="Normal"/>
+            </w:pPr>
+            <w:r>
+              <w:t xml:space="preserve">input-pacing dependent</w:t>
+            </w:r>
+          </w:p>
+        </w:tc>
+        <w:tc>
+          <w:tcPr/>
+          <w:p>
+            <w:pPr>
+              <w:pStyle w:val="Normal"/>
+            </w:pPr>
+            <w:r>
+              <w:t xml:space="preserve">tracking with asynchronous palm refresh</w:t>
+            </w:r>
+          </w:p>
+        </w:tc>
+        <w:tc>
+          <w:tcPr/>
+          <w:p>
+            <w:pPr>
+              <w:pStyle w:val="Normal"/>
+            </w:pPr>
+            <w:r>
+              <w:t xml:space="preserve">Experimental path; live stability still needs validation</w:t>
             </w:r>
           </w:p>
         </w:tc>
@@ -4312,7 +4486,42 @@
         <w:pStyle w:val="Normal"/>
       </w:pPr>
       <w:r>
-        <w:t xml:space="preserve">An affine correction model was then fit to reduce systematic NPU landmark bias. On the same 90-frame training set, the corrected errors were:</w:t>
+        <w:t xml:space="preserve">The matched </w:t>
+      </w:r>
+      <w:r>
+        <w:rPr>
+          <w:rFonts w:ascii="Courier New" w:hAnsi="Courier New"/>
+        </w:rPr>
+        <w:t xml:space="preserve">cpu-baseline</w:t>
+      </w:r>
+      <w:r>
+        <w:t xml:space="preserve"> vs. </w:t>
+      </w:r>
+      <w:r>
+        <w:rPr>
+          <w:rFonts w:ascii="Courier New" w:hAnsi="Courier New"/>
+        </w:rPr>
+        <w:t xml:space="preserve">npu-full</w:t>
+      </w:r>
+      <w:r>
+        <w:t xml:space="preserve"> comparison shows that the NPU substantially reduces hand-landmark time in the TFLite-style pipeline (44.80 ms to 9.13 ms in the recorded 90-frame run). However, palm detection remains about 40 ms, so the accurate pipeline still exceeds the 60 FPS target unless palm frequency is reduced or palm detection is accelerated.</w:t>
+      </w:r>
+    </w:p>
+    <w:p>
+      <w:pPr>
+        <w:pStyle w:val="Normal"/>
+      </w:pPr>
+      <w:r>
+        <w:t xml:space="preserve">Landmark accuracy was estimated by comparing </w:t>
+      </w:r>
+      <w:r>
+        <w:rPr>
+          <w:rFonts w:ascii="Courier New" w:hAnsi="Courier New"/>
+        </w:rPr>
+        <w:t xml:space="preserve">npu-full</w:t>
+      </w:r>
+      <w:r>
+        <w:t xml:space="preserve"> landmarks against the CPU-baseline reference in normalized image coordinates.</w:t>
       </w:r>
     </w:p>
     <w:tbl>
@@ -4438,40 +4647,40 @@
               <w:pStyle w:val="Normal"/>
             </w:pPr>
             <w:r>
-              <w:t xml:space="preserve">0.0102</w:t>
-            </w:r>
-          </w:p>
-        </w:tc>
-        <w:tc>
-          <w:tcPr/>
-          <w:p>
-            <w:pPr>
-              <w:pStyle w:val="Normal"/>
-            </w:pPr>
-            <w:r>
-              <w:t xml:space="preserve">0.0112</w:t>
-            </w:r>
-          </w:p>
-        </w:tc>
-        <w:tc>
-          <w:tcPr/>
-          <w:p>
-            <w:pPr>
-              <w:pStyle w:val="Normal"/>
-            </w:pPr>
-            <w:r>
-              <w:t xml:space="preserve">0.0223</w:t>
-            </w:r>
-          </w:p>
-        </w:tc>
-        <w:tc>
-          <w:tcPr/>
-          <w:p>
-            <w:pPr>
-              <w:pStyle w:val="Normal"/>
-            </w:pPr>
-            <w:r>
-              <w:t xml:space="preserve">0.1701</w:t>
+              <w:t xml:space="preserve">0.0270</w:t>
+            </w:r>
+          </w:p>
+        </w:tc>
+        <w:tc>
+          <w:tcPr/>
+          <w:p>
+            <w:pPr>
+              <w:pStyle w:val="Normal"/>
+            </w:pPr>
+            <w:r>
+              <w:t xml:space="preserve">0.0336</w:t>
+            </w:r>
+          </w:p>
+        </w:tc>
+        <w:tc>
+          <w:tcPr/>
+          <w:p>
+            <w:pPr>
+              <w:pStyle w:val="Normal"/>
+            </w:pPr>
+            <w:r>
+              <w:t xml:space="preserve">0.0532</w:t>
+            </w:r>
+          </w:p>
+        </w:tc>
+        <w:tc>
+          <w:tcPr/>
+          <w:p>
+            <w:pPr>
+              <w:pStyle w:val="Normal"/>
+            </w:pPr>
+            <w:r>
+              <w:t xml:space="preserve">0.1593</w:t>
             </w:r>
           </w:p>
         </w:tc>
@@ -4506,40 +4715,40 @@
               <w:pStyle w:val="Normal"/>
             </w:pPr>
             <w:r>
-              <w:t xml:space="preserve">0.0092</w:t>
-            </w:r>
-          </w:p>
-        </w:tc>
-        <w:tc>
-          <w:tcPr/>
-          <w:p>
-            <w:pPr>
-              <w:pStyle w:val="Normal"/>
-            </w:pPr>
-            <w:r>
-              <w:t xml:space="preserve">0.0090</w:t>
-            </w:r>
-          </w:p>
-        </w:tc>
-        <w:tc>
-          <w:tcPr/>
-          <w:p>
-            <w:pPr>
-              <w:pStyle w:val="Normal"/>
-            </w:pPr>
-            <w:r>
-              <w:t xml:space="preserve">0.0193</w:t>
-            </w:r>
-          </w:p>
-        </w:tc>
-        <w:tc>
-          <w:tcPr/>
-          <w:p>
-            <w:pPr>
-              <w:pStyle w:val="Normal"/>
-            </w:pPr>
-            <w:r>
-              <w:t xml:space="preserve">0.0437</w:t>
+              <w:t xml:space="preserve">0.0256</w:t>
+            </w:r>
+          </w:p>
+        </w:tc>
+        <w:tc>
+          <w:tcPr/>
+          <w:p>
+            <w:pPr>
+              <w:pStyle w:val="Normal"/>
+            </w:pPr>
+            <w:r>
+              <w:t xml:space="preserve">0.0353</w:t>
+            </w:r>
+          </w:p>
+        </w:tc>
+        <w:tc>
+          <w:tcPr/>
+          <w:p>
+            <w:pPr>
+              <w:pStyle w:val="Normal"/>
+            </w:pPr>
+            <w:r>
+              <w:t xml:space="preserve">0.0457</w:t>
+            </w:r>
+          </w:p>
+        </w:tc>
+        <w:tc>
+          <w:tcPr/>
+          <w:p>
+            <w:pPr>
+              <w:pStyle w:val="Normal"/>
+            </w:pPr>
+            <w:r>
+              <w:t xml:space="preserve">0.0734</w:t>
             </w:r>
           </w:p>
         </w:tc>
@@ -4550,6 +4759,244 @@
         <w:pStyle w:val="Normal"/>
       </w:pPr>
       <w:r>
+        <w:t xml:space="preserve">An affine correction model was then fit to reduce systematic NPU landmark bias. On the same 90-frame training set, the corrected errors were:</w:t>
+      </w:r>
+    </w:p>
+    <w:tbl>
+      <w:tblPr>
+        <w:tblStyle w:val="TableGrid"/>
+        <w:tblW w:w="0" w:type="auto"/>
+        <w:tblBorders>
+          <w:top w:val="single" w:sz="4" w:space="0" w:color="CBD5E1"/>
+          <w:left w:val="single" w:sz="4" w:space="0" w:color="CBD5E1"/>
+          <w:bottom w:val="single" w:sz="4" w:space="0" w:color="CBD5E1"/>
+          <w:right w:val="single" w:sz="4" w:space="0" w:color="CBD5E1"/>
+          <w:insideH w:val="single" w:sz="4" w:space="0" w:color="CBD5E1"/>
+          <w:insideV w:val="single" w:sz="4" w:space="0" w:color="CBD5E1"/>
+        </w:tblBorders>
+      </w:tblPr>
+      <w:tr>
+        <w:tc>
+          <w:tcPr>
+            <w:shd w:fill="E2E8F0"/>
+          </w:tcPr>
+          <w:p>
+            <w:pPr>
+              <w:pStyle w:val="Normal"/>
+            </w:pPr>
+            <w:r>
+              <w:t xml:space="preserve">Hand</w:t>
+            </w:r>
+          </w:p>
+        </w:tc>
+        <w:tc>
+          <w:tcPr>
+            <w:shd w:fill="E2E8F0"/>
+          </w:tcPr>
+          <w:p>
+            <w:pPr>
+              <w:pStyle w:val="Normal"/>
+            </w:pPr>
+            <w:r>
+              <w:t xml:space="preserve">Matched frames</w:t>
+            </w:r>
+          </w:p>
+        </w:tc>
+        <w:tc>
+          <w:tcPr>
+            <w:shd w:fill="E2E8F0"/>
+          </w:tcPr>
+          <w:p>
+            <w:pPr>
+              <w:pStyle w:val="Normal"/>
+            </w:pPr>
+            <w:r>
+              <w:t xml:space="preserve">Mean error over 21 points</w:t>
+            </w:r>
+          </w:p>
+        </w:tc>
+        <w:tc>
+          <w:tcPr>
+            <w:shd w:fill="E2E8F0"/>
+          </w:tcPr>
+          <w:p>
+            <w:pPr>
+              <w:pStyle w:val="Normal"/>
+            </w:pPr>
+            <w:r>
+              <w:t xml:space="preserve">Mean fingertip error</w:t>
+            </w:r>
+          </w:p>
+        </w:tc>
+        <w:tc>
+          <w:tcPr>
+            <w:shd w:fill="E2E8F0"/>
+          </w:tcPr>
+          <w:p>
+            <w:pPr>
+              <w:pStyle w:val="Normal"/>
+            </w:pPr>
+            <w:r>
+              <w:t xml:space="preserve">Mean max error</w:t>
+            </w:r>
+          </w:p>
+        </w:tc>
+        <w:tc>
+          <w:tcPr>
+            <w:shd w:fill="E2E8F0"/>
+          </w:tcPr>
+          <w:p>
+            <w:pPr>
+              <w:pStyle w:val="Normal"/>
+            </w:pPr>
+            <w:r>
+              <w:t xml:space="preserve">Worst max error</w:t>
+            </w:r>
+          </w:p>
+        </w:tc>
+      </w:tr>
+      <w:tr>
+        <w:tc>
+          <w:tcPr/>
+          <w:p>
+            <w:pPr>
+              <w:pStyle w:val="Normal"/>
+            </w:pPr>
+            <w:r>
+              <w:t xml:space="preserve">Right</w:t>
+            </w:r>
+          </w:p>
+        </w:tc>
+        <w:tc>
+          <w:tcPr/>
+          <w:p>
+            <w:pPr>
+              <w:pStyle w:val="Normal"/>
+            </w:pPr>
+            <w:r>
+              <w:t xml:space="preserve">90</w:t>
+            </w:r>
+          </w:p>
+        </w:tc>
+        <w:tc>
+          <w:tcPr/>
+          <w:p>
+            <w:pPr>
+              <w:pStyle w:val="Normal"/>
+            </w:pPr>
+            <w:r>
+              <w:t xml:space="preserve">0.0102</w:t>
+            </w:r>
+          </w:p>
+        </w:tc>
+        <w:tc>
+          <w:tcPr/>
+          <w:p>
+            <w:pPr>
+              <w:pStyle w:val="Normal"/>
+            </w:pPr>
+            <w:r>
+              <w:t xml:space="preserve">0.0112</w:t>
+            </w:r>
+          </w:p>
+        </w:tc>
+        <w:tc>
+          <w:tcPr/>
+          <w:p>
+            <w:pPr>
+              <w:pStyle w:val="Normal"/>
+            </w:pPr>
+            <w:r>
+              <w:t xml:space="preserve">0.0223</w:t>
+            </w:r>
+          </w:p>
+        </w:tc>
+        <w:tc>
+          <w:tcPr/>
+          <w:p>
+            <w:pPr>
+              <w:pStyle w:val="Normal"/>
+            </w:pPr>
+            <w:r>
+              <w:t xml:space="preserve">0.1701</w:t>
+            </w:r>
+          </w:p>
+        </w:tc>
+      </w:tr>
+      <w:tr>
+        <w:tc>
+          <w:tcPr/>
+          <w:p>
+            <w:pPr>
+              <w:pStyle w:val="Normal"/>
+            </w:pPr>
+            <w:r>
+              <w:t xml:space="preserve">Left</w:t>
+            </w:r>
+          </w:p>
+        </w:tc>
+        <w:tc>
+          <w:tcPr/>
+          <w:p>
+            <w:pPr>
+              <w:pStyle w:val="Normal"/>
+            </w:pPr>
+            <w:r>
+              <w:t xml:space="preserve">83</w:t>
+            </w:r>
+          </w:p>
+        </w:tc>
+        <w:tc>
+          <w:tcPr/>
+          <w:p>
+            <w:pPr>
+              <w:pStyle w:val="Normal"/>
+            </w:pPr>
+            <w:r>
+              <w:t xml:space="preserve">0.0092</w:t>
+            </w:r>
+          </w:p>
+        </w:tc>
+        <w:tc>
+          <w:tcPr/>
+          <w:p>
+            <w:pPr>
+              <w:pStyle w:val="Normal"/>
+            </w:pPr>
+            <w:r>
+              <w:t xml:space="preserve">0.0090</w:t>
+            </w:r>
+          </w:p>
+        </w:tc>
+        <w:tc>
+          <w:tcPr/>
+          <w:p>
+            <w:pPr>
+              <w:pStyle w:val="Normal"/>
+            </w:pPr>
+            <w:r>
+              <w:t xml:space="preserve">0.0193</w:t>
+            </w:r>
+          </w:p>
+        </w:tc>
+        <w:tc>
+          <w:tcPr/>
+          <w:p>
+            <w:pPr>
+              <w:pStyle w:val="Normal"/>
+            </w:pPr>
+            <w:r>
+              <w:t xml:space="preserve">0.0437</w:t>
+            </w:r>
+          </w:p>
+        </w:tc>
+      </w:tr>
+    </w:tbl>
+    <w:p>
+      <w:pPr>
+        <w:pStyle w:val="Normal"/>
+      </w:pPr>
+      <w:r>
         <w:t xml:space="preserve">The correction reduces average and fingertip error on the training capture, but it should not be reported as a generalized accuracy improvement until it is evaluated on a separate hold-out capture with different lighting, hand size, hand pose, and camera distance.</w:t>
       </w:r>
     </w:p>
@@ -4735,10 +5182,10 @@
           <w:b/>
           <w:bCs/>
         </w:rPr>
-        <w:t xml:space="preserve">No final hit-accuracy table</w:t>
-      </w:r>
-      <w:r>
-        <w:t xml:space="preserve"> is available for tempo-controlled trials.</w:t>
+        <w:t xml:space="preserve">Guided hit-accuracy results are preliminary</w:t>
+      </w:r>
+      <w:r>
+        <w:t xml:space="preserve">: the pilot run has one performer and one slow tempo, and piano accuracy remains low without further calibration.</w:t>
       </w:r>
     </w:p>
     <w:p>
@@ -4839,7 +5286,7 @@
         <w:pStyle w:val="ListParagraph"/>
       </w:pPr>
       <w:r>
-        <w:t xml:space="preserve">1. Capture final live screenshots for the FILLME figures.</w:t>
+        <w:t xml:space="preserve">1. Measure E2E audio latency using a high-speed camera and synchronized audio waveform.</w:t>
       </w:r>
     </w:p>
     <w:p>
@@ -4847,7 +5294,7 @@
         <w:pStyle w:val="ListParagraph"/>
       </w:pPr>
       <w:r>
-        <w:t xml:space="preserve">2. Measure E2E audio latency using a high-speed camera and synchronized audio waveform.</w:t>
+        <w:t xml:space="preserve">2. Run guided hit-accuracy trials for both modes at multiple tempos.</w:t>
       </w:r>
     </w:p>
     <w:p>
@@ -4855,7 +5302,7 @@
         <w:pStyle w:val="ListParagraph"/>
       </w:pPr>
       <w:r>
-        <w:t xml:space="preserve">3. Run hit-accuracy trials for both modes at multiple tempos.</w:t>
+        <w:t xml:space="preserve">3. Improve piano-specific calibration for finger identity, screen-side hand mapping, and per-user strike thresholds.</w:t>
       </w:r>
     </w:p>
     <w:p>
@@ -4887,7 +5334,7 @@
         <w:pStyle w:val="ListParagraph"/>
       </w:pPr>
       <w:r>
-        <w:t xml:space="preserve">7. Run the guided visual/audio cue evaluator to collect final hit-accuracy results for both modes.</w:t>
+        <w:t xml:space="preserve">7. Expand the guided evaluation to more participants and longer randomized cue sequences.</w:t>
       </w:r>
     </w:p>
     <w:p>

</xml_diff>

<commit_message>
Use runtime screenshots in report interface section
</commit_message>
<xml_diff>
--- a/air_drum_pad/docs/FINAL_REPORT_AI_AIR_DRUM_PAD.docx
+++ b/air_drum_pad/docs/FINAL_REPORT_AI_AIR_DRUM_PAD.docx
@@ -1260,7 +1260,7 @@
         <w:pStyle w:val="Normal"/>
       </w:pPr>
       <w:r>
-        <w:t xml:space="preserve">Live screenshots were captured from the guided evaluator after the mirror-view update. The drum screenshot shows rectangular pad targeting on the mirrored camera feed; the piano screenshot shows screen-side hand mapping with the current note and suggested finger.</w:t>
+        <w:t xml:space="preserve">Live screenshots were captured from the normal, non-guided runtime after the mirror-view update. The drum screenshot shows the pad-based performance interface with a mirrored camera feed, fingertip landmarks, and the mapping sidebar. The piano screenshot shows the live hand-to-note interface with recent strike events listed in the sidebar.</w:t>
       </w:r>
     </w:p>
     <w:p>
@@ -1270,8 +1270,8 @@
       <w:r>
         <w:drawing>
           <wp:inline distT="0" distB="0" distL="0" distR="0">
-            <wp:extent cx="5500467" cy="4206240"/>
-            <wp:docPr id="7" name="guided_eval_drum_live.png"/>
+            <wp:extent cx="5669280" cy="3187395"/>
+            <wp:docPr id="7" name="live_drum_interface.png"/>
             <wp:cNvGraphicFramePr>
               <a:graphicFrameLocks noChangeAspect="1"/>
             </wp:cNvGraphicFramePr>
@@ -1279,7 +1279,7 @@
               <a:graphicData uri="http://schemas.openxmlformats.org/drawingml/2006/picture">
                 <pic:pic>
                   <pic:nvPicPr>
-                    <pic:cNvPr id="7" name="guided_eval_drum_live.png"/>
+                    <pic:cNvPr id="7" name="live_drum_interface.png"/>
                     <pic:cNvPicPr/>
                   </pic:nvPicPr>
                   <pic:blipFill>
@@ -1291,7 +1291,7 @@
                   <pic:spPr>
                     <a:xfrm>
                       <a:off x="0" y="0"/>
-                      <a:ext cx="5500467" cy="4206240"/>
+                      <a:ext cx="5669280" cy="3187395"/>
                     </a:xfrm>
                     <a:prstGeom prst="rect">
                       <a:avLst/>
@@ -1309,7 +1309,7 @@
         <w:pStyle w:val="Caption"/>
       </w:pPr>
       <w:r>
-        <w:t xml:space="preserve">Figure 6. Live guided drum evaluation screenshot captured from the mirrored interface.</w:t>
+        <w:t xml:space="preserve">Figure 6. Non-guided drum-pad runtime screenshot captured from the mirrored interface.</w:t>
       </w:r>
     </w:p>
     <w:p>
@@ -1319,8 +1319,8 @@
       <w:r>
         <w:drawing>
           <wp:inline distT="0" distB="0" distL="0" distR="0">
-            <wp:extent cx="5500467" cy="4206240"/>
-            <wp:docPr id="8" name="guided_eval_piano_live.png"/>
+            <wp:extent cx="5669280" cy="3187395"/>
+            <wp:docPr id="8" name="live_piano_interface.png"/>
             <wp:cNvGraphicFramePr>
               <a:graphicFrameLocks noChangeAspect="1"/>
             </wp:cNvGraphicFramePr>
@@ -1328,7 +1328,7 @@
               <a:graphicData uri="http://schemas.openxmlformats.org/drawingml/2006/picture">
                 <pic:pic>
                   <pic:nvPicPr>
-                    <pic:cNvPr id="8" name="guided_eval_piano_live.png"/>
+                    <pic:cNvPr id="8" name="live_piano_interface.png"/>
                     <pic:cNvPicPr/>
                   </pic:nvPicPr>
                   <pic:blipFill>
@@ -1340,7 +1340,7 @@
                   <pic:spPr>
                     <a:xfrm>
                       <a:off x="0" y="0"/>
-                      <a:ext cx="5500467" cy="4206240"/>
+                      <a:ext cx="5669280" cy="3187395"/>
                     </a:xfrm>
                     <a:prstGeom prst="rect">
                       <a:avLst/>
@@ -1358,7 +1358,7 @@
         <w:pStyle w:val="Caption"/>
       </w:pPr>
       <w:r>
-        <w:t xml:space="preserve">Figure 7. Live guided piano evaluation screenshot captured from the mirrored interface.</w:t>
+        <w:t xml:space="preserve">Figure 7. Non-guided piano runtime screenshot captured from the mirrored interface.</w:t>
       </w:r>
     </w:p>
     <w:p>
@@ -3337,6 +3337,112 @@
         <w:t xml:space="preserve">A guided live evaluation was run on May 27, 2026 using the mirrored camera interface, CPU MediaPipe backend, strict strike thresholds, and global event consolidation to reduce duplicate multi-finger hits. The sequence was intentionally slow so that the performer could read the on-screen target before moving: 15 BPM, one pass through each target list, 7 s lead-in, and a 2.0 s post-cue matching window. The evaluator records one accepted output event per 1.2 s global cooldown interval and suppresses extra simultaneous candidates from the same physical motion.</w:t>
       </w:r>
     </w:p>
+    <w:p>
+      <w:pPr>
+        <w:pStyle w:val="Normal"/>
+      </w:pPr>
+      <w:r>
+        <w:t xml:space="preserve">Figures 10 and 11 show the guided evaluator UI used for this measurement. Unlike the normal runtime screenshots in Section 2.2, these screens include the current cue, readiness countdown, cue index, target hint, and the accepted matching window.</w:t>
+      </w:r>
+    </w:p>
+    <w:p>
+      <w:pPr>
+        <w:jc w:val="center"/>
+      </w:pPr>
+      <w:r>
+        <w:drawing>
+          <wp:inline distT="0" distB="0" distL="0" distR="0">
+            <wp:extent cx="5500467" cy="4206240"/>
+            <wp:docPr id="11" name="guided_eval_drum_live.png"/>
+            <wp:cNvGraphicFramePr>
+              <a:graphicFrameLocks noChangeAspect="1"/>
+            </wp:cNvGraphicFramePr>
+            <a:graphic>
+              <a:graphicData uri="http://schemas.openxmlformats.org/drawingml/2006/picture">
+                <pic:pic>
+                  <pic:nvPicPr>
+                    <pic:cNvPr id="11" name="guided_eval_drum_live.png"/>
+                    <pic:cNvPicPr/>
+                  </pic:nvPicPr>
+                  <pic:blipFill>
+                    <a:blip r:embed="rId11"/>
+                    <a:stretch>
+                      <a:fillRect/>
+                    </a:stretch>
+                  </pic:blipFill>
+                  <pic:spPr>
+                    <a:xfrm>
+                      <a:off x="0" y="0"/>
+                      <a:ext cx="5500467" cy="4206240"/>
+                    </a:xfrm>
+                    <a:prstGeom prst="rect">
+                      <a:avLst/>
+                    </a:prstGeom>
+                  </pic:spPr>
+                </pic:pic>
+              </a:graphicData>
+            </a:graphic>
+          </wp:inline>
+        </w:drawing>
+      </w:r>
+    </w:p>
+    <w:p>
+      <w:pPr>
+        <w:pStyle w:val="Caption"/>
+      </w:pPr>
+      <w:r>
+        <w:t xml:space="preserve">Figure 10. Guided drum evaluation screenshot showing the current pad cue and mirrored pad overlay.</w:t>
+      </w:r>
+    </w:p>
+    <w:p>
+      <w:pPr>
+        <w:jc w:val="center"/>
+      </w:pPr>
+      <w:r>
+        <w:drawing>
+          <wp:inline distT="0" distB="0" distL="0" distR="0">
+            <wp:extent cx="5500467" cy="4206240"/>
+            <wp:docPr id="12" name="guided_eval_piano_live.png"/>
+            <wp:cNvGraphicFramePr>
+              <a:graphicFrameLocks noChangeAspect="1"/>
+            </wp:cNvGraphicFramePr>
+            <a:graphic>
+              <a:graphicData uri="http://schemas.openxmlformats.org/drawingml/2006/picture">
+                <pic:pic>
+                  <pic:nvPicPr>
+                    <pic:cNvPr id="12" name="guided_eval_piano_live.png"/>
+                    <pic:cNvPicPr/>
+                  </pic:nvPicPr>
+                  <pic:blipFill>
+                    <a:blip r:embed="rId12"/>
+                    <a:stretch>
+                      <a:fillRect/>
+                    </a:stretch>
+                  </pic:blipFill>
+                  <pic:spPr>
+                    <a:xfrm>
+                      <a:off x="0" y="0"/>
+                      <a:ext cx="5500467" cy="4206240"/>
+                    </a:xfrm>
+                    <a:prstGeom prst="rect">
+                      <a:avLst/>
+                    </a:prstGeom>
+                  </pic:spPr>
+                </pic:pic>
+              </a:graphicData>
+            </a:graphic>
+          </wp:inline>
+        </w:drawing>
+      </w:r>
+    </w:p>
+    <w:p>
+      <w:pPr>
+        <w:pStyle w:val="Caption"/>
+      </w:pPr>
+      <w:r>
+        <w:t xml:space="preserve">Figure 11. Guided piano evaluation screenshot showing the current note cue and suggested finger.</w:t>
+      </w:r>
+    </w:p>
     <w:tbl>
       <w:tblPr>
         <w:tblStyle w:val="TableGrid"/>
@@ -3645,7 +3751,7 @@
         <w:drawing>
           <wp:inline distT="0" distB="0" distL="0" distR="0">
             <wp:extent cx="5669280" cy="1820756"/>
-            <wp:docPr id="11" name="guided_eval_results.png"/>
+            <wp:docPr id="13" name="guided_eval_results.png"/>
             <wp:cNvGraphicFramePr>
               <a:graphicFrameLocks noChangeAspect="1"/>
             </wp:cNvGraphicFramePr>
@@ -3653,11 +3759,11 @@
               <a:graphicData uri="http://schemas.openxmlformats.org/drawingml/2006/picture">
                 <pic:pic>
                   <pic:nvPicPr>
-                    <pic:cNvPr id="11" name="guided_eval_results.png"/>
+                    <pic:cNvPr id="13" name="guided_eval_results.png"/>
                     <pic:cNvPicPr/>
                   </pic:nvPicPr>
                   <pic:blipFill>
-                    <a:blip r:embed="rId11"/>
+                    <a:blip r:embed="rId13"/>
                     <a:stretch>
                       <a:fillRect/>
                     </a:stretch>
@@ -3683,7 +3789,7 @@
         <w:pStyle w:val="Caption"/>
       </w:pPr>
       <w:r>
-        <w:t xml:space="preserve">Figure 10. Guided evaluation plot generated from the slow mirrored drum and piano runs.</w:t>
+        <w:t xml:space="preserve">Figure 12. Guided evaluation plot generated from the slow mirrored drum and piano runs.</w:t>
       </w:r>
     </w:p>
     <w:p>

</xml_diff>

<commit_message>
Finalize PANDA guided eval report
</commit_message>
<xml_diff>
--- a/air_drum_pad/docs/FINAL_REPORT_AI_AIR_DRUM_PAD.docx
+++ b/air_drum_pad/docs/FINAL_REPORT_AI_AIR_DRUM_PAD.docx
@@ -15,10 +15,10 @@
           <w:bCs/>
           <w:u w:val="single"/>
         </w:rPr>
-        <w:t xml:space="preserve">P</w:t>
-      </w:r>
-      <w:r>
-        <w:t xml:space="preserve">ose-</w:t>
+        <w:t xml:space="preserve">Pose-A</w:t>
+      </w:r>
+      <w:r>
+        <w:t xml:space="preserve">ware </w:t>
       </w:r>
       <w:r>
         <w:rPr>
@@ -26,21 +26,10 @@
           <w:bCs/>
           <w:u w:val="single"/>
         </w:rPr>
-        <w:t xml:space="preserve">A</w:t>
-      </w:r>
-      <w:r>
-        <w:t xml:space="preserve">ware </w:t>
-      </w:r>
-      <w:r>
-        <w:rPr>
-          <w:b/>
-          <w:bCs/>
-          <w:u w:val="single"/>
-        </w:rPr>
         <w:t xml:space="preserve">N</w:t>
       </w:r>
       <w:r>
-        <w:t xml:space="preserve">PU </w:t>
+        <w:t xml:space="preserve">PU-Driven </w:t>
       </w:r>
       <w:r>
         <w:rPr>
@@ -134,10 +123,10 @@
           <w:bCs/>
           <w:u w:val="single"/>
         </w:rPr>
-        <w:t xml:space="preserve">P</w:t>
-      </w:r>
-      <w:r>
-        <w:t xml:space="preserve">ose-</w:t>
+        <w:t xml:space="preserve">Pose-A</w:t>
+      </w:r>
+      <w:r>
+        <w:t xml:space="preserve">ware </w:t>
       </w:r>
       <w:r>
         <w:rPr>
@@ -145,10 +134,10 @@
           <w:bCs/>
           <w:u w:val="single"/>
         </w:rPr>
-        <w:t xml:space="preserve">A</w:t>
-      </w:r>
-      <w:r>
-        <w:t xml:space="preserve">ware </w:t>
+        <w:t xml:space="preserve">N</w:t>
+      </w:r>
+      <w:r>
+        <w:t xml:space="preserve">PU-Driven </w:t>
       </w:r>
       <w:r>
         <w:rPr>
@@ -156,10 +145,10 @@
           <w:bCs/>
           <w:u w:val="single"/>
         </w:rPr>
-        <w:t xml:space="preserve">N</w:t>
-      </w:r>
-      <w:r>
-        <w:t xml:space="preserve">PU </w:t>
+        <w:t xml:space="preserve">D</w:t>
+      </w:r>
+      <w:r>
+        <w:t xml:space="preserve">igital </w:t>
       </w:r>
       <w:r>
         <w:rPr>
@@ -167,10 +156,113 @@
           <w:bCs/>
           <w:u w:val="single"/>
         </w:rPr>
-        <w:t xml:space="preserve">D</w:t>
-      </w:r>
-      <w:r>
-        <w:t xml:space="preserve">igital </w:t>
+        <w:t xml:space="preserve">A</w:t>
+      </w:r>
+      <w:r>
+        <w:t xml:space="preserve">udio Interface</w:t>
+      </w:r>
+    </w:p>
+    <w:p>
+      <w:pPr>
+        <w:pStyle w:val="Normal"/>
+      </w:pPr>
+      <w:r>
+        <w:rPr>
+          <w:b/>
+          <w:bCs/>
+        </w:rPr>
+        <w:t xml:space="preserve">Final Report</w:t>
+      </w:r>
+    </w:p>
+    <w:p>
+      <w:pPr>
+        <w:pStyle w:val="Normal"/>
+      </w:pPr>
+      <w:r>
+        <w:rPr>
+          <w:b/>
+          <w:bCs/>
+        </w:rPr>
+        <w:t xml:space="preserve">Authors:</w:t>
+      </w:r>
+      <w:r>
+        <w:t xml:space="preserve"> FILLME</w:t>
+      </w:r>
+    </w:p>
+    <w:p>
+      <w:pPr>
+        <w:pStyle w:val="Normal"/>
+      </w:pPr>
+      <w:r>
+        <w:rPr>
+          <w:b/>
+          <w:bCs/>
+        </w:rPr>
+        <w:t xml:space="preserve">Affiliation:</w:t>
+      </w:r>
+      <w:r>
+        <w:t xml:space="preserve"> FILLME</w:t>
+      </w:r>
+    </w:p>
+    <w:p>
+      <w:pPr>
+        <w:pStyle w:val="Normal"/>
+      </w:pPr>
+      <w:r>
+        <w:rPr>
+          <w:b/>
+          <w:bCs/>
+        </w:rPr>
+        <w:t xml:space="preserve">Date:</w:t>
+      </w:r>
+      <w:r>
+        <w:t xml:space="preserve"> 2026-05-27</w:t>
+      </w:r>
+    </w:p>
+    <w:p>
+      <w:pPr>
+        <w:pStyle w:val="Normal"/>
+      </w:pPr>
+      <w:r>
+        <w:rPr>
+          <w:b/>
+          <w:bCs/>
+        </w:rPr>
+        <w:t xml:space="preserve">Code availability:</w:t>
+      </w:r>
+      <w:r>
+        <w:t xml:space="preserve"> Not publicly released.</w:t>
+      </w:r>
+    </w:p>
+    <w:p>
+      <w:pPr>
+        <w:pStyle w:val="Normal"/>
+      </w:pPr>
+    </w:p>
+    <w:p>
+      <w:pPr>
+        <w:pStyle w:val="Heading2"/>
+      </w:pPr>
+      <w:r>
+        <w:t xml:space="preserve">Abstract</w:t>
+      </w:r>
+    </w:p>
+    <w:p>
+      <w:pPr>
+        <w:pStyle w:val="Normal"/>
+      </w:pPr>
+      <w:r>
+        <w:t xml:space="preserve">This report presents </w:t>
+      </w:r>
+      <w:r>
+        <w:rPr>
+          <w:b/>
+          <w:bCs/>
+        </w:rPr>
+        <w:t xml:space="preserve">PANDA</w:t>
+      </w:r>
+      <w:r>
+        <w:t xml:space="preserve">, short for </w:t>
       </w:r>
       <w:r>
         <w:rPr>
@@ -178,113 +270,10 @@
           <w:bCs/>
           <w:u w:val="single"/>
         </w:rPr>
-        <w:t xml:space="preserve">A</w:t>
-      </w:r>
-      <w:r>
-        <w:t xml:space="preserve">udio Interface</w:t>
-      </w:r>
-    </w:p>
-    <w:p>
-      <w:pPr>
-        <w:pStyle w:val="Normal"/>
-      </w:pPr>
-      <w:r>
-        <w:rPr>
-          <w:b/>
-          <w:bCs/>
-        </w:rPr>
-        <w:t xml:space="preserve">Final Report</w:t>
-      </w:r>
-    </w:p>
-    <w:p>
-      <w:pPr>
-        <w:pStyle w:val="Normal"/>
-      </w:pPr>
-      <w:r>
-        <w:rPr>
-          <w:b/>
-          <w:bCs/>
-        </w:rPr>
-        <w:t xml:space="preserve">Authors:</w:t>
-      </w:r>
-      <w:r>
-        <w:t xml:space="preserve"> FILLME</w:t>
-      </w:r>
-    </w:p>
-    <w:p>
-      <w:pPr>
-        <w:pStyle w:val="Normal"/>
-      </w:pPr>
-      <w:r>
-        <w:rPr>
-          <w:b/>
-          <w:bCs/>
-        </w:rPr>
-        <w:t xml:space="preserve">Affiliation:</w:t>
-      </w:r>
-      <w:r>
-        <w:t xml:space="preserve"> FILLME</w:t>
-      </w:r>
-    </w:p>
-    <w:p>
-      <w:pPr>
-        <w:pStyle w:val="Normal"/>
-      </w:pPr>
-      <w:r>
-        <w:rPr>
-          <w:b/>
-          <w:bCs/>
-        </w:rPr>
-        <w:t xml:space="preserve">Date:</w:t>
-      </w:r>
-      <w:r>
-        <w:t xml:space="preserve"> 2026-05-27</w:t>
-      </w:r>
-    </w:p>
-    <w:p>
-      <w:pPr>
-        <w:pStyle w:val="Normal"/>
-      </w:pPr>
-      <w:r>
-        <w:rPr>
-          <w:b/>
-          <w:bCs/>
-        </w:rPr>
-        <w:t xml:space="preserve">Code availability:</w:t>
-      </w:r>
-      <w:r>
-        <w:t xml:space="preserve"> Not publicly released.</w:t>
-      </w:r>
-    </w:p>
-    <w:p>
-      <w:pPr>
-        <w:pStyle w:val="Normal"/>
-      </w:pPr>
-    </w:p>
-    <w:p>
-      <w:pPr>
-        <w:pStyle w:val="Heading2"/>
-      </w:pPr>
-      <w:r>
-        <w:t xml:space="preserve">Abstract</w:t>
-      </w:r>
-    </w:p>
-    <w:p>
-      <w:pPr>
-        <w:pStyle w:val="Normal"/>
-      </w:pPr>
-      <w:r>
-        <w:t xml:space="preserve">This report presents </w:t>
-      </w:r>
-      <w:r>
-        <w:rPr>
-          <w:b/>
-          <w:bCs/>
-        </w:rPr>
-        <w:t xml:space="preserve">PANDA</w:t>
-      </w:r>
-      <w:r>
-        <w:t xml:space="preserve">, short for </w:t>
+        <w:t xml:space="preserve">Pose-A</w:t>
+      </w:r>
+      <w:r>
+        <w:t xml:space="preserve">ware </w:t>
       </w:r>
       <w:r>
         <w:rPr>
@@ -292,32 +281,10 @@
           <w:bCs/>
           <w:u w:val="single"/>
         </w:rPr>
-        <w:t xml:space="preserve">P</w:t>
-      </w:r>
-      <w:r>
-        <w:t xml:space="preserve">ose-</w:t>
-      </w:r>
-      <w:r>
-        <w:rPr>
-          <w:b/>
-          <w:bCs/>
-          <w:u w:val="single"/>
-        </w:rPr>
-        <w:t xml:space="preserve">A</w:t>
-      </w:r>
-      <w:r>
-        <w:t xml:space="preserve">ware </w:t>
-      </w:r>
-      <w:r>
-        <w:rPr>
-          <w:b/>
-          <w:bCs/>
-          <w:u w:val="single"/>
-        </w:rPr>
         <w:t xml:space="preserve">N</w:t>
       </w:r>
       <w:r>
-        <w:t xml:space="preserve">PU </w:t>
+        <w:t xml:space="preserve">PU-Driven </w:t>
       </w:r>
       <w:r>
         <w:rPr>
@@ -1260,7 +1227,16 @@
         <w:pStyle w:val="Normal"/>
       </w:pPr>
       <w:r>
-        <w:t xml:space="preserve">Live screenshots were captured from the normal, non-guided runtime after the mirror-view update. The drum screenshot shows the pad-based performance interface with a mirrored camera feed, fingertip landmarks, and the mapping sidebar. The piano screenshot shows the live hand-to-note interface with recent strike events listed in the sidebar.</w:t>
+        <w:t xml:space="preserve">Live screenshots were captured from the normal, non-guided runtime after the mirror-view update. The non-guided interface uses the same full-camera overlay style as the guided evaluator, but removes cue-specific guidance such as countdowns and "ready" prompts. The drum screenshot uses the CPU+NPU </w:t>
+      </w:r>
+      <w:r>
+        <w:rPr>
+          <w:rFonts w:ascii="Courier New" w:hAnsi="Courier New"/>
+        </w:rPr>
+        <w:t xml:space="preserve">npu-full</w:t>
+      </w:r>
+      <w:r>
+        <w:t xml:space="preserve"> backend and shows the pad-based performance interface with a mirrored camera feed, fingertip landmarks, and recent strike feedback. The piano screenshot shows the live hand-to-note interface with recent strike feedback overlaid on the camera view.</w:t>
       </w:r>
     </w:p>
     <w:p>
@@ -1270,7 +1246,7 @@
       <w:r>
         <w:drawing>
           <wp:inline distT="0" distB="0" distL="0" distR="0">
-            <wp:extent cx="5669280" cy="3187395"/>
+            <wp:extent cx="5669280" cy="3188970"/>
             <wp:docPr id="7" name="live_drum_interface.png"/>
             <wp:cNvGraphicFramePr>
               <a:graphicFrameLocks noChangeAspect="1"/>
@@ -1291,7 +1267,7 @@
                   <pic:spPr>
                     <a:xfrm>
                       <a:off x="0" y="0"/>
-                      <a:ext cx="5669280" cy="3187395"/>
+                      <a:ext cx="5669280" cy="3188970"/>
                     </a:xfrm>
                     <a:prstGeom prst="rect">
                       <a:avLst/>
@@ -1309,7 +1285,7 @@
         <w:pStyle w:val="Caption"/>
       </w:pPr>
       <w:r>
-        <w:t xml:space="preserve">Figure 6. Non-guided drum-pad runtime screenshot captured from the mirrored interface.</w:t>
+        <w:t xml:space="preserve">Figure 6. Non-guided drum-pad runtime screenshot captured from the mirrored CPU+NPU interface.</w:t>
       </w:r>
     </w:p>
     <w:p>
@@ -1319,7 +1295,7 @@
       <w:r>
         <w:drawing>
           <wp:inline distT="0" distB="0" distL="0" distR="0">
-            <wp:extent cx="5669280" cy="3187395"/>
+            <wp:extent cx="5669280" cy="3188970"/>
             <wp:docPr id="8" name="live_piano_interface.png"/>
             <wp:cNvGraphicFramePr>
               <a:graphicFrameLocks noChangeAspect="1"/>
@@ -1340,7 +1316,7 @@
                   <pic:spPr>
                     <a:xfrm>
                       <a:off x="0" y="0"/>
-                      <a:ext cx="5669280" cy="3187395"/>
+                      <a:ext cx="5669280" cy="3188970"/>
                     </a:xfrm>
                     <a:prstGeom prst="rect">
                       <a:avLst/>
@@ -2214,7 +2190,7 @@
         <w:pStyle w:val="Normal"/>
       </w:pPr>
       <w:r>
-        <w:t xml:space="preserve">The runtime display contains the camera feed, hand/finger landmark trails, mode-specific overlays, and a sidebar. The camera feed is mirrored by default, producing a selfie-style interface in which moving a hand leftward in physical space also moves it leftward on the screen. This small interface detail is important for playability: without the mirror flip, the performer must mentally invert left/right motion while aiming at drum pads or piano cues. A </w:t>
+        <w:t xml:space="preserve">The runtime display contains the camera feed, hand/finger landmark trails, and mode-specific overlays. The camera feed is mirrored by default, producing a selfie-style interface in which moving a hand leftward in physical space also moves it leftward on the screen. This small interface detail is important for playability: without the mirror flip, the performer must mentally invert left/right motion while aiming at drum pads or piano cues. A </w:t>
       </w:r>
       <w:r>
         <w:rPr>
@@ -2231,15 +2207,23 @@
         <w:pStyle w:val="Normal"/>
       </w:pPr>
       <w:r>
-        <w:t xml:space="preserve">In drum mode, rectangles are drawn directly on the mirrored camera feed and flash briefly when hit. In piano mode, the note mapping is also tied to screen side rather than raw tracker hand order: the screen-left hand maps to the left-hand notes and the screen-right hand maps to the right-hand notes. This prevents note assignments from changing when the hand tracker changes the order of detected hands.</w:t>
-      </w:r>
-    </w:p>
-    <w:p>
-      <w:pPr>
-        <w:pStyle w:val="Normal"/>
-      </w:pPr>
-      <w:r>
-        <w:t xml:space="preserve">The generated diagrams are used both as report figures and as sidebar assets, keeping the report and runtime UI consistent.</w:t>
+        <w:t xml:space="preserve">In drum mode, rectangles are drawn directly on the mirrored camera feed and flash briefly when hit. In piano mode, the note mapping is tied to a mirror-aware physical left/right estimate rather than raw tracker hand order or raw MediaPipe handedness. This keeps the user-specified left-hand and right-hand note ranges stable even when the camera feed is flipped for the performer and even when the hand tracker changes the order of detected hands.</w:t>
+      </w:r>
+    </w:p>
+    <w:p>
+      <w:pPr>
+        <w:pStyle w:val="Normal"/>
+      </w:pPr>
+      <w:r>
+        <w:t xml:space="preserve">The piano interface also applies a mirror-aware finger-order correction for note mapping. During guided right-hand trials, the mirrored landmark model could treat the physical right hand as if it were the opposite hand, causing the physical pinky to map to the thumb note. The implemented correction swaps thumb with pinky and index with ring for mirrored piano mapping while leaving the raw landmarks unchanged for strike detection.</w:t>
+      </w:r>
+    </w:p>
+    <w:p>
+      <w:pPr>
+        <w:pStyle w:val="Normal"/>
+      </w:pPr>
+      <w:r>
+        <w:t xml:space="preserve">The generated diagrams are used as report figures and as reference assets for documenting the available mappings.</w:t>
       </w:r>
     </w:p>
     <w:p>
@@ -3079,7 +3063,7 @@
         <w:pStyle w:val="Caption"/>
       </w:pPr>
       <w:r>
-        <w:t xml:space="preserve">[FILLME image placeholder: FILLME: high-speed-camera setup showing hand motion and speaker/audio waveform for E2E latency measurement.]</w:t>
+        <w:t xml:space="preserve">[FILLME image placeholder: Figure 10. FILLME: high-speed-camera setup showing hand motion and speaker/audio waveform for E2E latency measurement.]</w:t>
       </w:r>
     </w:p>
     <w:p>
@@ -3156,7 +3140,7 @@
         <w:pStyle w:val="ListParagraph"/>
       </w:pPr>
       <w:r>
-        <w:t xml:space="preserve">• Shows generated mapping diagrams in documentation and runtime sidebar.</w:t>
+        <w:t xml:space="preserve">• Shows generated mapping diagrams in documentation and runtime overlays.</w:t>
       </w:r>
     </w:p>
     <w:p>
@@ -3259,7 +3243,7 @@
               <w:pStyle w:val="Normal"/>
             </w:pPr>
             <w:r>
-              <w:t xml:space="preserve">34/34 passed</w:t>
+              <w:t xml:space="preserve">38/38 passed</w:t>
             </w:r>
           </w:p>
         </w:tc>
@@ -3334,15 +3318,41 @@
         <w:pStyle w:val="Normal"/>
       </w:pPr>
       <w:r>
-        <w:t xml:space="preserve">A guided live evaluation was run on May 27, 2026 using the mirrored camera interface, CPU MediaPipe backend, strict strike thresholds, and global event consolidation to reduce duplicate multi-finger hits. The sequence was intentionally slow so that the performer could read the on-screen target before moving: 15 BPM, one pass through each target list, 7 s lead-in, and a 2.0 s post-cue matching window. The evaluator records one accepted output event per 1.2 s global cooldown interval and suppresses extra simultaneous candidates from the same physical motion.</w:t>
-      </w:r>
-    </w:p>
-    <w:p>
-      <w:pPr>
-        <w:pStyle w:val="Normal"/>
-      </w:pPr>
-      <w:r>
-        <w:t xml:space="preserve">Figures 10 and 11 show the guided evaluator UI used for this measurement. Unlike the normal runtime screenshots in Section 2.2, these screens include the current cue, readiness countdown, cue index, target hint, and the accepted matching window.</w:t>
+        <w:t xml:space="preserve">A guided live evaluation was run on May 27, 2026 using the mirrored camera interface and the final </w:t>
+      </w:r>
+      <w:r>
+        <w:rPr>
+          <w:rFonts w:ascii="Courier New" w:hAnsi="Courier New"/>
+        </w:rPr>
+        <w:t xml:space="preserve">npu-full</w:t>
+      </w:r>
+      <w:r>
+        <w:t xml:space="preserve"> architecture: CPU palm detection with NPU hand-landmark inference. To reduce the effect of reading and reaction time, the evaluator used a block-repetition protocol. Each target block had a 5 s initial lead-in, a 6 s ready interval before the target, six repeated strikes at 50 BPM, and the first two strikes of each block were excluded from scoring as warm-up beats. Matching used a -0.20 s / +0.80 s cue window and a 0.35 s global event cooldown to reduce duplicate multi-finger detections.</w:t>
+      </w:r>
+    </w:p>
+    <w:p>
+      <w:pPr>
+        <w:pStyle w:val="Normal"/>
+      </w:pPr>
+      <w:r>
+        <w:t xml:space="preserve">An initial two-hand piano guided run remained nearly unusable, with only 7.5% recall / target accuracy. Therefore, the final piano guided evaluation used a one-hand right-hand protocol covering only </w:t>
+      </w:r>
+      <w:r>
+        <w:rPr>
+          <w:rFonts w:ascii="Courier New" w:hAnsi="Courier New"/>
+        </w:rPr>
+        <w:t xml:space="preserve">C5–G5</w:t>
+      </w:r>
+      <w:r>
+        <w:t xml:space="preserve">, with the tracker limited to one hand and mirror-aware finger-order correction enabled. This change directly targets the observed failure mode where the physical right hand was interpreted with left-hand-like finger order, making the physical pinky behave like the thumb note.</w:t>
+      </w:r>
+    </w:p>
+    <w:p>
+      <w:pPr>
+        <w:pStyle w:val="Normal"/>
+      </w:pPr>
+      <w:r>
+        <w:t xml:space="preserve">Figures 11 and 12 show the guided evaluator UI used for this measurement. Unlike the normal runtime screenshots in Section 2.2, these screens include the current cue, readiness countdown, cue index, target hint, and the accepted matching window.</w:t>
       </w:r>
     </w:p>
     <w:p>
@@ -3352,7 +3362,7 @@
       <w:r>
         <w:drawing>
           <wp:inline distT="0" distB="0" distL="0" distR="0">
-            <wp:extent cx="5500467" cy="4206240"/>
+            <wp:extent cx="5608320" cy="4206240"/>
             <wp:docPr id="11" name="guided_eval_drum_live.png"/>
             <wp:cNvGraphicFramePr>
               <a:graphicFrameLocks noChangeAspect="1"/>
@@ -3373,7 +3383,7 @@
                   <pic:spPr>
                     <a:xfrm>
                       <a:off x="0" y="0"/>
-                      <a:ext cx="5500467" cy="4206240"/>
+                      <a:ext cx="5608320" cy="4206240"/>
                     </a:xfrm>
                     <a:prstGeom prst="rect">
                       <a:avLst/>
@@ -3391,7 +3401,7 @@
         <w:pStyle w:val="Caption"/>
       </w:pPr>
       <w:r>
-        <w:t xml:space="preserve">Figure 10. Guided drum evaluation screenshot showing the current pad cue and mirrored pad overlay.</w:t>
+        <w:t xml:space="preserve">Figure 11. Guided drum evaluation screenshot showing the current pad cue and mirrored pad overlay.</w:t>
       </w:r>
     </w:p>
     <w:p>
@@ -3401,7 +3411,7 @@
       <w:r>
         <w:drawing>
           <wp:inline distT="0" distB="0" distL="0" distR="0">
-            <wp:extent cx="5500467" cy="4206240"/>
+            <wp:extent cx="5608320" cy="4206240"/>
             <wp:docPr id="12" name="guided_eval_piano_live.png"/>
             <wp:cNvGraphicFramePr>
               <a:graphicFrameLocks noChangeAspect="1"/>
@@ -3422,7 +3432,7 @@
                   <pic:spPr>
                     <a:xfrm>
                       <a:off x="0" y="0"/>
-                      <a:ext cx="5500467" cy="4206240"/>
+                      <a:ext cx="5608320" cy="4206240"/>
                     </a:xfrm>
                     <a:prstGeom prst="rect">
                       <a:avLst/>
@@ -3440,7 +3450,7 @@
         <w:pStyle w:val="Caption"/>
       </w:pPr>
       <w:r>
-        <w:t xml:space="preserve">Figure 11. Guided piano evaluation screenshot showing the current note cue and suggested finger.</w:t>
+        <w:t xml:space="preserve">Figure 12. Guided piano evaluation screenshot showing the current note cue and suggested finger.</w:t>
       </w:r>
     </w:p>
     <w:tbl>
@@ -3479,7 +3489,7 @@
               <w:pStyle w:val="Normal"/>
             </w:pPr>
             <w:r>
-              <w:t xml:space="preserve">Cues</w:t>
+              <w:t xml:space="preserve">Scored cues</w:t>
             </w:r>
           </w:p>
         </w:tc>
@@ -3581,73 +3591,73 @@
               <w:pStyle w:val="Normal"/>
             </w:pPr>
             <w:r>
-              <w:t xml:space="preserve">8</w:t>
-            </w:r>
-          </w:p>
-        </w:tc>
-        <w:tc>
-          <w:tcPr/>
-          <w:p>
-            <w:pPr>
-              <w:pStyle w:val="Normal"/>
-            </w:pPr>
-            <w:r>
-              <w:t xml:space="preserve">7</w:t>
-            </w:r>
-          </w:p>
-        </w:tc>
-        <w:tc>
-          <w:tcPr/>
-          <w:p>
-            <w:pPr>
-              <w:pStyle w:val="Normal"/>
-            </w:pPr>
-            <w:r>
-              <w:t xml:space="preserve">9</w:t>
-            </w:r>
-          </w:p>
-        </w:tc>
-        <w:tc>
-          <w:tcPr/>
-          <w:p>
-            <w:pPr>
-              <w:pStyle w:val="Normal"/>
-            </w:pPr>
-            <w:r>
-              <w:t xml:space="preserve">1</w:t>
-            </w:r>
-          </w:p>
-        </w:tc>
-        <w:tc>
-          <w:tcPr/>
-          <w:p>
-            <w:pPr>
-              <w:pStyle w:val="Normal"/>
-            </w:pPr>
-            <w:r>
-              <w:t xml:space="preserve">43.8%</w:t>
-            </w:r>
-          </w:p>
-        </w:tc>
-        <w:tc>
-          <w:tcPr/>
-          <w:p>
-            <w:pPr>
-              <w:pStyle w:val="Normal"/>
-            </w:pPr>
-            <w:r>
-              <w:t xml:space="preserve">87.5%</w:t>
-            </w:r>
-          </w:p>
-        </w:tc>
-        <w:tc>
-          <w:tcPr/>
-          <w:p>
-            <w:pPr>
-              <w:pStyle w:val="Normal"/>
-            </w:pPr>
-            <w:r>
-              <w:t xml:space="preserve">660 ms</w:t>
+              <w:t xml:space="preserve">32</w:t>
+            </w:r>
+          </w:p>
+        </w:tc>
+        <w:tc>
+          <w:tcPr/>
+          <w:p>
+            <w:pPr>
+              <w:pStyle w:val="Normal"/>
+            </w:pPr>
+            <w:r>
+              <w:t xml:space="preserve">11</w:t>
+            </w:r>
+          </w:p>
+        </w:tc>
+        <w:tc>
+          <w:tcPr/>
+          <w:p>
+            <w:pPr>
+              <w:pStyle w:val="Normal"/>
+            </w:pPr>
+            <w:r>
+              <w:t xml:space="preserve">106</w:t>
+            </w:r>
+          </w:p>
+        </w:tc>
+        <w:tc>
+          <w:tcPr/>
+          <w:p>
+            <w:pPr>
+              <w:pStyle w:val="Normal"/>
+            </w:pPr>
+            <w:r>
+              <w:t xml:space="preserve">21</w:t>
+            </w:r>
+          </w:p>
+        </w:tc>
+        <w:tc>
+          <w:tcPr/>
+          <w:p>
+            <w:pPr>
+              <w:pStyle w:val="Normal"/>
+            </w:pPr>
+            <w:r>
+              <w:t xml:space="preserve">9.4%</w:t>
+            </w:r>
+          </w:p>
+        </w:tc>
+        <w:tc>
+          <w:tcPr/>
+          <w:p>
+            <w:pPr>
+              <w:pStyle w:val="Normal"/>
+            </w:pPr>
+            <w:r>
+              <w:t xml:space="preserve">34.4%</w:t>
+            </w:r>
+          </w:p>
+        </w:tc>
+        <w:tc>
+          <w:tcPr/>
+          <w:p>
+            <w:pPr>
+              <w:pStyle w:val="Normal"/>
+            </w:pPr>
+            <w:r>
+              <w:t xml:space="preserve">333 ms</w:t>
             </w:r>
           </w:p>
         </w:tc>
@@ -3660,84 +3670,174 @@
               <w:pStyle w:val="Normal"/>
             </w:pPr>
             <w:r>
-              <w:t xml:space="preserve">Piano</w:t>
-            </w:r>
-          </w:p>
-        </w:tc>
-        <w:tc>
-          <w:tcPr/>
-          <w:p>
-            <w:pPr>
-              <w:pStyle w:val="Normal"/>
-            </w:pPr>
-            <w:r>
-              <w:t xml:space="preserve">10</w:t>
-            </w:r>
-          </w:p>
-        </w:tc>
-        <w:tc>
-          <w:tcPr/>
-          <w:p>
-            <w:pPr>
-              <w:pStyle w:val="Normal"/>
-            </w:pPr>
-            <w:r>
-              <w:t xml:space="preserve">2</w:t>
-            </w:r>
-          </w:p>
-        </w:tc>
-        <w:tc>
-          <w:tcPr/>
-          <w:p>
-            <w:pPr>
-              <w:pStyle w:val="Normal"/>
-            </w:pPr>
-            <w:r>
-              <w:t xml:space="preserve">13</w:t>
-            </w:r>
-          </w:p>
-        </w:tc>
-        <w:tc>
-          <w:tcPr/>
-          <w:p>
-            <w:pPr>
-              <w:pStyle w:val="Normal"/>
-            </w:pPr>
-            <w:r>
-              <w:t xml:space="preserve">8</w:t>
-            </w:r>
-          </w:p>
-        </w:tc>
-        <w:tc>
-          <w:tcPr/>
-          <w:p>
-            <w:pPr>
-              <w:pStyle w:val="Normal"/>
-            </w:pPr>
-            <w:r>
-              <w:t xml:space="preserve">13.3%</w:t>
-            </w:r>
-          </w:p>
-        </w:tc>
-        <w:tc>
-          <w:tcPr/>
-          <w:p>
-            <w:pPr>
-              <w:pStyle w:val="Normal"/>
-            </w:pPr>
-            <w:r>
-              <w:t xml:space="preserve">20.0%</w:t>
-            </w:r>
-          </w:p>
-        </w:tc>
-        <w:tc>
-          <w:tcPr/>
-          <w:p>
-            <w:pPr>
-              <w:pStyle w:val="Normal"/>
-            </w:pPr>
-            <w:r>
-              <w:t xml:space="preserve">1034 ms</w:t>
+              <w:t xml:space="preserve">Piano, two hands (diagnostic)</w:t>
+            </w:r>
+          </w:p>
+        </w:tc>
+        <w:tc>
+          <w:tcPr/>
+          <w:p>
+            <w:pPr>
+              <w:pStyle w:val="Normal"/>
+            </w:pPr>
+            <w:r>
+              <w:t xml:space="preserve">40</w:t>
+            </w:r>
+          </w:p>
+        </w:tc>
+        <w:tc>
+          <w:tcPr/>
+          <w:p>
+            <w:pPr>
+              <w:pStyle w:val="Normal"/>
+            </w:pPr>
+            <w:r>
+              <w:t xml:space="preserve">3</w:t>
+            </w:r>
+          </w:p>
+        </w:tc>
+        <w:tc>
+          <w:tcPr/>
+          <w:p>
+            <w:pPr>
+              <w:pStyle w:val="Normal"/>
+            </w:pPr>
+            <w:r>
+              <w:t xml:space="preserve">79</w:t>
+            </w:r>
+          </w:p>
+        </w:tc>
+        <w:tc>
+          <w:tcPr/>
+          <w:p>
+            <w:pPr>
+              <w:pStyle w:val="Normal"/>
+            </w:pPr>
+            <w:r>
+              <w:t xml:space="preserve">37</w:t>
+            </w:r>
+          </w:p>
+        </w:tc>
+        <w:tc>
+          <w:tcPr/>
+          <w:p>
+            <w:pPr>
+              <w:pStyle w:val="Normal"/>
+            </w:pPr>
+            <w:r>
+              <w:t xml:space="preserve">3.7%</w:t>
+            </w:r>
+          </w:p>
+        </w:tc>
+        <w:tc>
+          <w:tcPr/>
+          <w:p>
+            <w:pPr>
+              <w:pStyle w:val="Normal"/>
+            </w:pPr>
+            <w:r>
+              <w:t xml:space="preserve">7.5%</w:t>
+            </w:r>
+          </w:p>
+        </w:tc>
+        <w:tc>
+          <w:tcPr/>
+          <w:p>
+            <w:pPr>
+              <w:pStyle w:val="Normal"/>
+            </w:pPr>
+            <w:r>
+              <w:t xml:space="preserve">291 ms</w:t>
+            </w:r>
+          </w:p>
+        </w:tc>
+      </w:tr>
+      <w:tr>
+        <w:tc>
+          <w:tcPr/>
+          <w:p>
+            <w:pPr>
+              <w:pStyle w:val="Normal"/>
+            </w:pPr>
+            <w:r>
+              <w:t xml:space="preserve">Piano, right hand only</w:t>
+            </w:r>
+          </w:p>
+        </w:tc>
+        <w:tc>
+          <w:tcPr/>
+          <w:p>
+            <w:pPr>
+              <w:pStyle w:val="Normal"/>
+            </w:pPr>
+            <w:r>
+              <w:t xml:space="preserve">20</w:t>
+            </w:r>
+          </w:p>
+        </w:tc>
+        <w:tc>
+          <w:tcPr/>
+          <w:p>
+            <w:pPr>
+              <w:pStyle w:val="Normal"/>
+            </w:pPr>
+            <w:r>
+              <w:t xml:space="preserve">3</w:t>
+            </w:r>
+          </w:p>
+        </w:tc>
+        <w:tc>
+          <w:tcPr/>
+          <w:p>
+            <w:pPr>
+              <w:pStyle w:val="Normal"/>
+            </w:pPr>
+            <w:r>
+              <w:t xml:space="preserve">32</w:t>
+            </w:r>
+          </w:p>
+        </w:tc>
+        <w:tc>
+          <w:tcPr/>
+          <w:p>
+            <w:pPr>
+              <w:pStyle w:val="Normal"/>
+            </w:pPr>
+            <w:r>
+              <w:t xml:space="preserve">17</w:t>
+            </w:r>
+          </w:p>
+        </w:tc>
+        <w:tc>
+          <w:tcPr/>
+          <w:p>
+            <w:pPr>
+              <w:pStyle w:val="Normal"/>
+            </w:pPr>
+            <w:r>
+              <w:t xml:space="preserve">8.6%</w:t>
+            </w:r>
+          </w:p>
+        </w:tc>
+        <w:tc>
+          <w:tcPr/>
+          <w:p>
+            <w:pPr>
+              <w:pStyle w:val="Normal"/>
+            </w:pPr>
+            <w:r>
+              <w:t xml:space="preserve">15.0%</w:t>
+            </w:r>
+          </w:p>
+        </w:tc>
+        <w:tc>
+          <w:tcPr/>
+          <w:p>
+            <w:pPr>
+              <w:pStyle w:val="Normal"/>
+            </w:pPr>
+            <w:r>
+              <w:t xml:space="preserve">304 ms</w:t>
             </w:r>
           </w:p>
         </w:tc>
@@ -3789,15 +3889,24 @@
         <w:pStyle w:val="Caption"/>
       </w:pPr>
       <w:r>
-        <w:t xml:space="preserve">Figure 12. Guided evaluation plot generated from the slow mirrored drum and piano runs.</w:t>
-      </w:r>
-    </w:p>
-    <w:p>
-      <w:pPr>
-        <w:pStyle w:val="Normal"/>
-      </w:pPr>
-      <w:r>
-        <w:t xml:space="preserve">The drum-pad interface performed substantially better than the piano interface in this pilot run. This is expected because drum mode only requires the fingertip strike to land inside a visible rectangle, while piano mode requires both accurate finger identity and stable screen-side hand mapping. The piano result therefore highlights a remaining usability issue rather than a failure of palm detection: the system is detecting fingertip strikes, but many detected notes do not match the prompted note. The cue-to-detection latency values include human reaction time and should not be interpreted as acoustic motion-to-speaker latency.</w:t>
+        <w:t xml:space="preserve">Figure 13. Guided evaluation plot generated from the mirrored </w:t>
+      </w:r>
+      <w:r>
+        <w:rPr>
+          <w:rFonts w:ascii="Courier New" w:hAnsi="Courier New"/>
+        </w:rPr>
+        <w:t xml:space="preserve">npu-full</w:t>
+      </w:r>
+      <w:r>
+        <w:t xml:space="preserve"> block-repetition drum, two-hand piano, and one-hand piano runs.</w:t>
+      </w:r>
+    </w:p>
+    <w:p>
+      <w:pPr>
+        <w:pStyle w:val="Normal"/>
+      </w:pPr>
+      <w:r>
+        <w:t xml:space="preserve">The drum-pad interface performed better than the piano interface because drum mode only requires the fingertip strike to land inside a visible rectangle, while piano mode requires stable hand side and finger identity. The two-hand piano diagnostic run confirms this difficulty: many strikes were detected, but most did not match the prompted note. Restricting piano evaluation to one right hand improved target accuracy from 7.5% to 15.0%, but the absolute value remains low and indicates that finger identity, mirrored-hand interpretation, and duplicate-strike suppression need more work. The cue-to-detection latency values include human reaction time and should not be interpreted as acoustic motion-to-speaker latency.</w:t>
       </w:r>
     </w:p>
     <w:p>

</xml_diff>

<commit_message>
Fix PANDA acronym expansion
</commit_message>
<xml_diff>
--- a/air_drum_pad/docs/FINAL_REPORT_AI_AIR_DRUM_PAD.docx
+++ b/air_drum_pad/docs/FINAL_REPORT_AI_AIR_DRUM_PAD.docx
@@ -15,7 +15,18 @@
           <w:bCs/>
           <w:u w:val="single"/>
         </w:rPr>
-        <w:t xml:space="preserve">Pose-A</w:t>
+        <w:t xml:space="preserve">P</w:t>
+      </w:r>
+      <w:r>
+        <w:t xml:space="preserve">ose-</w:t>
+      </w:r>
+      <w:r>
+        <w:rPr>
+          <w:b/>
+          <w:bCs/>
+          <w:u w:val="single"/>
+        </w:rPr>
+        <w:t xml:space="preserve">A</w:t>
       </w:r>
       <w:r>
         <w:t xml:space="preserve">ware </w:t>
@@ -123,10 +134,10 @@
           <w:bCs/>
           <w:u w:val="single"/>
         </w:rPr>
-        <w:t xml:space="preserve">Pose-A</w:t>
-      </w:r>
-      <w:r>
-        <w:t xml:space="preserve">ware </w:t>
+        <w:t xml:space="preserve">P</w:t>
+      </w:r>
+      <w:r>
+        <w:t xml:space="preserve">ose-</w:t>
       </w:r>
       <w:r>
         <w:rPr>
@@ -134,10 +145,10 @@
           <w:bCs/>
           <w:u w:val="single"/>
         </w:rPr>
-        <w:t xml:space="preserve">N</w:t>
-      </w:r>
-      <w:r>
-        <w:t xml:space="preserve">PU-Driven </w:t>
+        <w:t xml:space="preserve">A</w:t>
+      </w:r>
+      <w:r>
+        <w:t xml:space="preserve">ware </w:t>
       </w:r>
       <w:r>
         <w:rPr>
@@ -145,10 +156,10 @@
           <w:bCs/>
           <w:u w:val="single"/>
         </w:rPr>
-        <w:t xml:space="preserve">D</w:t>
-      </w:r>
-      <w:r>
-        <w:t xml:space="preserve">igital </w:t>
+        <w:t xml:space="preserve">N</w:t>
+      </w:r>
+      <w:r>
+        <w:t xml:space="preserve">PU-Driven </w:t>
       </w:r>
       <w:r>
         <w:rPr>
@@ -156,113 +167,10 @@
           <w:bCs/>
           <w:u w:val="single"/>
         </w:rPr>
-        <w:t xml:space="preserve">A</w:t>
-      </w:r>
-      <w:r>
-        <w:t xml:space="preserve">udio Interface</w:t>
-      </w:r>
-    </w:p>
-    <w:p>
-      <w:pPr>
-        <w:pStyle w:val="Normal"/>
-      </w:pPr>
-      <w:r>
-        <w:rPr>
-          <w:b/>
-          <w:bCs/>
-        </w:rPr>
-        <w:t xml:space="preserve">Final Report</w:t>
-      </w:r>
-    </w:p>
-    <w:p>
-      <w:pPr>
-        <w:pStyle w:val="Normal"/>
-      </w:pPr>
-      <w:r>
-        <w:rPr>
-          <w:b/>
-          <w:bCs/>
-        </w:rPr>
-        <w:t xml:space="preserve">Authors:</w:t>
-      </w:r>
-      <w:r>
-        <w:t xml:space="preserve"> FILLME</w:t>
-      </w:r>
-    </w:p>
-    <w:p>
-      <w:pPr>
-        <w:pStyle w:val="Normal"/>
-      </w:pPr>
-      <w:r>
-        <w:rPr>
-          <w:b/>
-          <w:bCs/>
-        </w:rPr>
-        <w:t xml:space="preserve">Affiliation:</w:t>
-      </w:r>
-      <w:r>
-        <w:t xml:space="preserve"> FILLME</w:t>
-      </w:r>
-    </w:p>
-    <w:p>
-      <w:pPr>
-        <w:pStyle w:val="Normal"/>
-      </w:pPr>
-      <w:r>
-        <w:rPr>
-          <w:b/>
-          <w:bCs/>
-        </w:rPr>
-        <w:t xml:space="preserve">Date:</w:t>
-      </w:r>
-      <w:r>
-        <w:t xml:space="preserve"> 2026-05-27</w:t>
-      </w:r>
-    </w:p>
-    <w:p>
-      <w:pPr>
-        <w:pStyle w:val="Normal"/>
-      </w:pPr>
-      <w:r>
-        <w:rPr>
-          <w:b/>
-          <w:bCs/>
-        </w:rPr>
-        <w:t xml:space="preserve">Code availability:</w:t>
-      </w:r>
-      <w:r>
-        <w:t xml:space="preserve"> Not publicly released.</w:t>
-      </w:r>
-    </w:p>
-    <w:p>
-      <w:pPr>
-        <w:pStyle w:val="Normal"/>
-      </w:pPr>
-    </w:p>
-    <w:p>
-      <w:pPr>
-        <w:pStyle w:val="Heading2"/>
-      </w:pPr>
-      <w:r>
-        <w:t xml:space="preserve">Abstract</w:t>
-      </w:r>
-    </w:p>
-    <w:p>
-      <w:pPr>
-        <w:pStyle w:val="Normal"/>
-      </w:pPr>
-      <w:r>
-        <w:t xml:space="preserve">This report presents </w:t>
-      </w:r>
-      <w:r>
-        <w:rPr>
-          <w:b/>
-          <w:bCs/>
-        </w:rPr>
-        <w:t xml:space="preserve">PANDA</w:t>
-      </w:r>
-      <w:r>
-        <w:t xml:space="preserve">, short for </w:t>
+        <w:t xml:space="preserve">D</w:t>
+      </w:r>
+      <w:r>
+        <w:t xml:space="preserve">igital </w:t>
       </w:r>
       <w:r>
         <w:rPr>
@@ -270,7 +178,132 @@
           <w:bCs/>
           <w:u w:val="single"/>
         </w:rPr>
-        <w:t xml:space="preserve">Pose-A</w:t>
+        <w:t xml:space="preserve">A</w:t>
+      </w:r>
+      <w:r>
+        <w:t xml:space="preserve">udio Interface</w:t>
+      </w:r>
+    </w:p>
+    <w:p>
+      <w:pPr>
+        <w:pStyle w:val="Normal"/>
+      </w:pPr>
+      <w:r>
+        <w:rPr>
+          <w:b/>
+          <w:bCs/>
+        </w:rPr>
+        <w:t xml:space="preserve">Final Report</w:t>
+      </w:r>
+    </w:p>
+    <w:p>
+      <w:pPr>
+        <w:pStyle w:val="Normal"/>
+      </w:pPr>
+      <w:r>
+        <w:rPr>
+          <w:b/>
+          <w:bCs/>
+        </w:rPr>
+        <w:t xml:space="preserve">Authors:</w:t>
+      </w:r>
+      <w:r>
+        <w:t xml:space="preserve"> FILLME</w:t>
+      </w:r>
+    </w:p>
+    <w:p>
+      <w:pPr>
+        <w:pStyle w:val="Normal"/>
+      </w:pPr>
+      <w:r>
+        <w:rPr>
+          <w:b/>
+          <w:bCs/>
+        </w:rPr>
+        <w:t xml:space="preserve">Affiliation:</w:t>
+      </w:r>
+      <w:r>
+        <w:t xml:space="preserve"> FILLME</w:t>
+      </w:r>
+    </w:p>
+    <w:p>
+      <w:pPr>
+        <w:pStyle w:val="Normal"/>
+      </w:pPr>
+      <w:r>
+        <w:rPr>
+          <w:b/>
+          <w:bCs/>
+        </w:rPr>
+        <w:t xml:space="preserve">Date:</w:t>
+      </w:r>
+      <w:r>
+        <w:t xml:space="preserve"> 2026-05-27</w:t>
+      </w:r>
+    </w:p>
+    <w:p>
+      <w:pPr>
+        <w:pStyle w:val="Normal"/>
+      </w:pPr>
+      <w:r>
+        <w:rPr>
+          <w:b/>
+          <w:bCs/>
+        </w:rPr>
+        <w:t xml:space="preserve">Code availability:</w:t>
+      </w:r>
+      <w:r>
+        <w:t xml:space="preserve"> Not publicly released.</w:t>
+      </w:r>
+    </w:p>
+    <w:p>
+      <w:pPr>
+        <w:pStyle w:val="Normal"/>
+      </w:pPr>
+    </w:p>
+    <w:p>
+      <w:pPr>
+        <w:pStyle w:val="Heading2"/>
+      </w:pPr>
+      <w:r>
+        <w:t xml:space="preserve">Abstract</w:t>
+      </w:r>
+    </w:p>
+    <w:p>
+      <w:pPr>
+        <w:pStyle w:val="Normal"/>
+      </w:pPr>
+      <w:r>
+        <w:t xml:space="preserve">This report presents </w:t>
+      </w:r>
+      <w:r>
+        <w:rPr>
+          <w:b/>
+          <w:bCs/>
+        </w:rPr>
+        <w:t xml:space="preserve">PANDA</w:t>
+      </w:r>
+      <w:r>
+        <w:t xml:space="preserve">, short for </w:t>
+      </w:r>
+      <w:r>
+        <w:rPr>
+          <w:b/>
+          <w:bCs/>
+          <w:u w:val="single"/>
+        </w:rPr>
+        <w:t xml:space="preserve">P</w:t>
+      </w:r>
+      <w:r>
+        <w:t xml:space="preserve">ose-</w:t>
+      </w:r>
+      <w:r>
+        <w:rPr>
+          <w:b/>
+          <w:bCs/>
+          <w:u w:val="single"/>
+        </w:rPr>
+        <w:t xml:space="preserve">A</w:t>
       </w:r>
       <w:r>
         <w:t xml:space="preserve">ware </w:t>

</xml_diff>

<commit_message>
Use dataset-validated NPU live tracking
</commit_message>
<xml_diff>
--- a/air_drum_pad/docs/FINAL_REPORT_AI_AIR_DRUM_PAD.docx
+++ b/air_drum_pad/docs/FINAL_REPORT_AI_AIR_DRUM_PAD.docx
@@ -578,7 +578,7 @@
         <w:pStyle w:val="ListParagraph"/>
       </w:pPr>
       <w:r>
-        <w:t xml:space="preserve">• A mirrored selfie-view display, enabled by default, so the performer's left/right hand motion matches the visible camera feed and on-screen targets.</w:t>
+        <w:t xml:space="preserve">• A mirrored selfie-view display and guided-style windowed skeleton overlay, enabled by default, so the performer's left/right hand motion and visual feedback match the guided evaluator.</w:t>
       </w:r>
     </w:p>
     <w:p>
@@ -587,6 +587,32 @@
       </w:pPr>
       <w:r>
         <w:t xml:space="preserve">• Generated interface diagrams for both modes.</w:t>
+      </w:r>
+    </w:p>
+    <w:p>
+      <w:pPr>
+        <w:pStyle w:val="ListParagraph"/>
+      </w:pPr>
+      <w:r>
+        <w:t xml:space="preserve">• A default </w:t>
+      </w:r>
+      <w:r>
+        <w:rPr>
+          <w:rFonts w:ascii="Courier New" w:hAnsi="Courier New"/>
+        </w:rPr>
+        <w:t xml:space="preserve">main.py</w:t>
+      </w:r>
+      <w:r>
+        <w:t xml:space="preserve"> runtime that launches the final </w:t>
+      </w:r>
+      <w:r>
+        <w:rPr>
+          <w:rFonts w:ascii="Courier New" w:hAnsi="Courier New"/>
+        </w:rPr>
+        <w:t xml:space="preserve">npu-full</w:t>
+      </w:r>
+      <w:r>
+        <w:t xml:space="preserve"> CPU+NPU model path when packaged models are available.</w:t>
       </w:r>
     </w:p>
     <w:p>
@@ -1260,16 +1286,25 @@
         <w:pStyle w:val="Normal"/>
       </w:pPr>
       <w:r>
-        <w:t xml:space="preserve">Live screenshots were captured from the normal, non-guided runtime after the mirror-view update. The non-guided interface uses the same full-camera overlay style as the guided evaluator, but removes cue-specific guidance such as countdowns and "ready" prompts. The drum screenshot uses the CPU+NPU </w:t>
+        <w:t xml:space="preserve">The runtime interface screenshots use the normal, non-guided overlay on captured camera frames after the mirror-view and default-runtime updates. The default </w:t>
       </w:r>
       <w:r>
         <w:rPr>
           <w:rFonts w:ascii="Courier New" w:hAnsi="Courier New"/>
         </w:rPr>
+        <w:t xml:space="preserve">main.py</w:t>
+      </w:r>
+      <w:r>
+        <w:t xml:space="preserve"> path now starts the final CPU+NPU </w:t>
+      </w:r>
+      <w:r>
+        <w:rPr>
+          <w:rFonts w:ascii="Courier New" w:hAnsi="Courier New"/>
+        </w:rPr>
         <w:t xml:space="preserve">npu-full</w:t>
       </w:r>
       <w:r>
-        <w:t xml:space="preserve"> backend and shows the pad-based performance interface with a mirrored camera feed, fingertip landmarks, and recent strike feedback. The piano screenshot shows the live hand-to-note interface with recent strike feedback overlaid on the camera view.</w:t>
+        <w:t xml:space="preserve"> backend, uses the same hand-landmark model, layout files, and dataset-calibrated landmark correction used by the validated NPU path, and presents the same guided-style mirrored windowed interface without cue-specific guidance such as countdowns and "ready" prompts. The drum screenshot shows the pad-based performance interface with a mirrored camera feed and a simple yellow hand skeleton. The piano screenshot shows the live hand-to-note interface with the same skeleton-style visualization overlaid on the camera view.</w:t>
       </w:r>
     </w:p>
     <w:p>
@@ -2141,7 +2176,16 @@
               <w:pStyle w:val="Normal"/>
             </w:pPr>
             <w:r>
-              <w:t xml:space="preserve">Accurate palm pipeline with NPU hand inference</w:t>
+              <w:t xml:space="preserve">Accurate palm pipeline with NPU hand inference; default </w:t>
+            </w:r>
+            <w:r>
+              <w:rPr>
+                <w:rFonts w:ascii="Courier New" w:hAnsi="Courier New"/>
+              </w:rPr>
+              <w:t xml:space="preserve">main.py</w:t>
+            </w:r>
+            <w:r>
+              <w:t xml:space="preserve"> runtime</w:t>
             </w:r>
           </w:p>
         </w:tc>
@@ -2207,7 +2251,16 @@
         <w:pStyle w:val="Normal"/>
       </w:pPr>
       <w:r>
-        <w:t xml:space="preserve">The NPU-full path is architecturally preferred for accurate hand localization, but CPU palm detection dominates latency. The dual-halves NPU mode is faster because it removes palm detection, but it is a geometric approximation and should be evaluated under the target camera setup.</w:t>
+        <w:t xml:space="preserve">The NPU-full path is architecturally preferred for accurate hand localization and is the default runtime used by </w:t>
+      </w:r>
+      <w:r>
+        <w:rPr>
+          <w:rFonts w:ascii="Courier New" w:hAnsi="Courier New"/>
+        </w:rPr>
+        <w:t xml:space="preserve">main.py</w:t>
+      </w:r>
+      <w:r>
+        <w:t xml:space="preserve"> when the packaged model files are present. The default also loads the dataset-calibrated NPU landmark-correction JSON when available, because the pre-collected replay dataset shows that it reduces mean normalized NPU landmark error versus the CPU TFLite reference. CPU palm detection still dominates latency. The dual-halves NPU mode is faster because it removes palm detection, but it is a geometric approximation and should be evaluated under the target camera setup.</w:t>
       </w:r>
     </w:p>
     <w:p>
@@ -2223,7 +2276,7 @@
         <w:pStyle w:val="Normal"/>
       </w:pPr>
       <w:r>
-        <w:t xml:space="preserve">The runtime display contains the camera feed, hand/finger landmark trails, and mode-specific overlays. The camera feed is mirrored by default, producing a selfie-style interface in which moving a hand leftward in physical space also moves it leftward on the screen. This small interface detail is important for playability: without the mirror flip, the performer must mentally invert left/right motion while aiming at drum pads or piano cues. A </w:t>
+        <w:t xml:space="preserve">The runtime display contains the camera feed, a guided-evaluator-style yellow hand skeleton, fingertip points, and mode-specific overlays. It is windowed by default, matching the guided evaluator, with fullscreen available only by explicit option. Accuracy checks on the pre-collected replay dataset showed that running inference on the raw camera frame preserves the model's right-hand thumb-to-pinky identity better than running inference on an already mirrored frame. Therefore, the final interface runs palm and hand-landmark inference on the raw frame, then mirrors only the displayed image and landmark coordinates for the selfie view. This produces an interface in which moving a hand leftward in physical space also moves it leftward on the screen, while the anatomical thumb/pinky landmark order is not reversed by the display transform. A </w:t>
       </w:r>
       <w:r>
         <w:rPr>
@@ -2240,15 +2293,15 @@
         <w:pStyle w:val="Normal"/>
       </w:pPr>
       <w:r>
-        <w:t xml:space="preserve">In drum mode, rectangles are drawn directly on the mirrored camera feed and flash briefly when hit. In piano mode, the note mapping is tied to a mirror-aware physical left/right estimate rather than raw tracker hand order or raw MediaPipe handedness. This keeps the user-specified left-hand and right-hand note ranges stable even when the camera feed is flipped for the performer and even when the hand tracker changes the order of detected hands.</w:t>
-      </w:r>
-    </w:p>
-    <w:p>
-      <w:pPr>
-        <w:pStyle w:val="Normal"/>
-      </w:pPr>
-      <w:r>
-        <w:t xml:space="preserve">The piano interface also applies a mirror-aware finger-order correction for note mapping. During guided right-hand trials, the mirrored landmark model could treat the physical right hand as if it were the opposite hand, causing the physical pinky to map to the thumb note. The implemented correction swaps thumb with pinky and index with ring for mirrored piano mapping while leaving the raw landmarks unchanged for strike detection.</w:t>
+        <w:t xml:space="preserve">In drum mode, rectangles are drawn directly on the mirrored camera feed and flash briefly when hit; hit testing uses the same display-transformed landmark coordinates, so pad locations match what the performer sees. In piano mode, the note mapping is tied to a mirror-aware physical left/right estimate rather than raw tracker hand order or raw MediaPipe handedness. This keeps the user-specified left-hand and right-hand note ranges stable even when the camera feed is flipped for the performer and even when the hand tracker changes the order of detected hands.</w:t>
+      </w:r>
+    </w:p>
+    <w:p>
+      <w:pPr>
+        <w:pStyle w:val="Normal"/>
+      </w:pPr>
+      <w:r>
+        <w:t xml:space="preserve">The live interface no longer draws per-finger colored chains, fingertip trails, or thumb/pinky letter labels. Strike detection still evaluates every fingertip internally, but the visual layer uses the same simple skeleton as the guided evaluator so that non-guided and guided runs look consistent. Piano note triggering uses the model-provided fingertip landmark identity together with a mirror-aware physical left/right hand estimate.</w:t>
       </w:r>
     </w:p>
     <w:p>
@@ -3377,7 +3430,7 @@
         <w:t xml:space="preserve">C5–G5</w:t>
       </w:r>
       <w:r>
-        <w:t xml:space="preserve">, with the tracker limited to one hand and mirror-aware finger-order correction enabled. This change directly targets the observed failure mode where the physical right hand was interpreted with left-hand-like finger order, making the physical pinky behave like the thumb note.</w:t>
+        <w:t xml:space="preserve">, with the tracker limited to one hand. This restriction directly targets the observed failure mode where simultaneous two-hand piano tracking produced unstable finger identity and very low note accuracy.</w:t>
       </w:r>
     </w:p>
     <w:p>

</xml_diff>

<commit_message>
Rollback live backend and restore interface figures
</commit_message>
<xml_diff>
--- a/air_drum_pad/docs/FINAL_REPORT_AI_AIR_DRUM_PAD.docx
+++ b/air_drum_pad/docs/FINAL_REPORT_AI_AIR_DRUM_PAD.docx
@@ -1286,25 +1286,7 @@
         <w:pStyle w:val="Normal"/>
       </w:pPr>
       <w:r>
-        <w:t xml:space="preserve">The runtime interface screenshots use the normal, non-guided overlay on captured camera frames after the mirror-view and default-runtime updates. The default </w:t>
-      </w:r>
-      <w:r>
-        <w:rPr>
-          <w:rFonts w:ascii="Courier New" w:hAnsi="Courier New"/>
-        </w:rPr>
-        <w:t xml:space="preserve">main.py</w:t>
-      </w:r>
-      <w:r>
-        <w:t xml:space="preserve"> path now starts the final CPU+NPU </w:t>
-      </w:r>
-      <w:r>
-        <w:rPr>
-          <w:rFonts w:ascii="Courier New" w:hAnsi="Courier New"/>
-        </w:rPr>
-        <w:t xml:space="preserve">npu-full</w:t>
-      </w:r>
-      <w:r>
-        <w:t xml:space="preserve"> backend, uses the same hand-landmark model, layout files, and dataset-calibrated landmark correction used by the validated NPU path, and presents the same guided-style mirrored windowed interface without cue-specific guidance such as countdowns and "ready" prompts. The drum screenshot shows the pad-based performance interface with a mirrored camera feed and a simple yellow hand skeleton. The piano screenshot shows the live hand-to-note interface with the same skeleton-style visualization overlaid on the camera view.</w:t>
+        <w:t xml:space="preserve">Live screenshots were captured from the normal, non-guided runtime after the mirror-view update. The non-guided interface uses the same full-camera overlay style as the guided evaluator, but removes cue-specific guidance such as countdowns and "ready" prompts. The drum screenshot shows the pad-based performance interface with a mirrored camera feed, fingertip landmark overlays, and recent strike feedback. The piano screenshot shows the live hand-to-note interface with recent strike feedback overlaid on the camera view.</w:t>
       </w:r>
     </w:p>
     <w:p>
@@ -2276,7 +2258,7 @@
         <w:pStyle w:val="Normal"/>
       </w:pPr>
       <w:r>
-        <w:t xml:space="preserve">The runtime display contains the camera feed, a guided-evaluator-style yellow hand skeleton, fingertip points, and mode-specific overlays. It is windowed by default, matching the guided evaluator, with fullscreen available only by explicit option. Accuracy checks on the pre-collected replay dataset showed that running inference on the raw camera frame preserves the model's right-hand thumb-to-pinky identity better than running inference on an already mirrored frame. Therefore, the final interface runs palm and hand-landmark inference on the raw frame, then mirrors only the displayed image and landmark coordinates for the selfie view. This produces an interface in which moving a hand leftward in physical space also moves it leftward on the screen, while the anatomical thumb/pinky landmark order is not reversed by the display transform. A </w:t>
+        <w:t xml:space="preserve">The runtime display contains the camera feed, hand/finger landmark overlays, and mode-specific overlays. The camera feed is mirrored by default, producing a selfie-style interface in which moving a hand leftward in physical space also moves it leftward on the screen. This small interface detail is important for playability: without the mirror flip, the performer must mentally invert left/right motion while aiming at drum pads or piano cues. A </w:t>
       </w:r>
       <w:r>
         <w:rPr>
@@ -2301,7 +2283,7 @@
         <w:pStyle w:val="Normal"/>
       </w:pPr>
       <w:r>
-        <w:t xml:space="preserve">The live interface no longer draws per-finger colored chains, fingertip trails, or thumb/pinky letter labels. Strike detection still evaluates every fingertip internally, but the visual layer uses the same simple skeleton as the guided evaluator so that non-guided and guided runs look consistent. Piano note triggering uses the model-provided fingertip landmark identity together with a mirror-aware physical left/right hand estimate.</w:t>
+        <w:t xml:space="preserve">The live interface draws per-finger landmark overlays for operator feedback while strike detection evaluates every fingertip internally. Piano note triggering uses the model-provided fingertip landmark identity together with a mirror-aware physical left/right hand estimate.</w:t>
       </w:r>
     </w:p>
     <w:p>

</xml_diff>

<commit_message>
Update live interface screenshots in report
</commit_message>
<xml_diff>
--- a/air_drum_pad/docs/FINAL_REPORT_AI_AIR_DRUM_PAD.docx
+++ b/air_drum_pad/docs/FINAL_REPORT_AI_AIR_DRUM_PAD.docx
@@ -1286,7 +1286,7 @@
         <w:pStyle w:val="Normal"/>
       </w:pPr>
       <w:r>
-        <w:t xml:space="preserve">Live screenshots were captured from the normal, non-guided runtime after the mirror-view update. The non-guided interface uses the same full-camera overlay style as the guided evaluator, but removes cue-specific guidance such as countdowns and "ready" prompts. The drum screenshot shows the pad-based performance interface with a mirrored camera feed, fingertip landmark overlays, and recent strike feedback. The piano screenshot shows the live hand-to-note interface with recent strike feedback overlaid on the camera view.</w:t>
+        <w:t xml:space="preserve">Live screenshots were captured from the normal, non-guided runtime after the mirror-view and shape-preserving NPU bias-calibration updates. The non-guided interface uses the same full-camera overlay style as the guided evaluator, but removes cue-specific guidance such as countdowns and "ready" prompts. The drum screenshot shows the pad-based performance interface with a mirrored camera feed, fingertip landmark overlays, and recent strike feedback. The piano screenshot shows the live hand-to-note interface with recent strike feedback overlaid on the camera view.</w:t>
       </w:r>
     </w:p>
     <w:p>
@@ -1335,7 +1335,7 @@
         <w:pStyle w:val="Caption"/>
       </w:pPr>
       <w:r>
-        <w:t xml:space="preserve">Figure 6. Non-guided drum-pad runtime screenshot captured from the mirrored CPU+NPU interface.</w:t>
+        <w:t xml:space="preserve">Figure 6. Non-guided drum-pad runtime screenshot captured from the mirrored, bias-calibrated CPU+NPU interface.</w:t>
       </w:r>
     </w:p>
     <w:p>
@@ -1384,7 +1384,7 @@
         <w:pStyle w:val="Caption"/>
       </w:pPr>
       <w:r>
-        <w:t xml:space="preserve">Figure 7. Non-guided piano runtime screenshot captured from the mirrored interface.</w:t>
+        <w:t xml:space="preserve">Figure 7. Non-guided piano runtime screenshot captured from the mirrored, bias-calibrated CPU+NPU interface.</w:t>
       </w:r>
     </w:p>
     <w:p>
@@ -3122,22 +3122,6 @@
       <w:pPr>
         <w:pStyle w:val="Normal"/>
       </w:pPr>
-      <w:r>
-        <w:t xml:space="preserve">The following figure is still a placeholder because it requires synchronized high-speed video/audio capture.</w:t>
-      </w:r>
-    </w:p>
-    <w:p>
-      <w:pPr>
-        <w:pStyle w:val="Caption"/>
-      </w:pPr>
-      <w:r>
-        <w:t xml:space="preserve">[FILLME image placeholder: Figure 10. FILLME: high-speed-camera setup showing hand motion and speaker/audio waveform for E2E latency measurement.]</w:t>
-      </w:r>
-    </w:p>
-    <w:p>
-      <w:pPr>
-        <w:pStyle w:val="Normal"/>
-      </w:pPr>
     </w:p>
     <w:p>
       <w:pPr>
@@ -3420,7 +3404,7 @@
         <w:pStyle w:val="Normal"/>
       </w:pPr>
       <w:r>
-        <w:t xml:space="preserve">Figures 11 and 12 show the guided evaluator UI used for this measurement. Unlike the normal runtime screenshots in Section 2.2, these screens include the current cue, readiness countdown, cue index, target hint, and the accepted matching window.</w:t>
+        <w:t xml:space="preserve">Figures 10 and 11 show the guided evaluator UI used for this measurement. Unlike the normal runtime screenshots in Section 2.2, these screens include the current cue, readiness countdown, cue index, target hint, and the accepted matching window.</w:t>
       </w:r>
     </w:p>
     <w:p>
@@ -3469,7 +3453,7 @@
         <w:pStyle w:val="Caption"/>
       </w:pPr>
       <w:r>
-        <w:t xml:space="preserve">Figure 11. Guided drum evaluation screenshot showing the current pad cue and mirrored pad overlay.</w:t>
+        <w:t xml:space="preserve">Figure 10. Guided drum evaluation screenshot showing the current pad cue and mirrored pad overlay.</w:t>
       </w:r>
     </w:p>
     <w:p>
@@ -3518,7 +3502,7 @@
         <w:pStyle w:val="Caption"/>
       </w:pPr>
       <w:r>
-        <w:t xml:space="preserve">Figure 12. Guided piano evaluation screenshot showing the current note cue and suggested finger.</w:t>
+        <w:t xml:space="preserve">Figure 11. Guided piano evaluation screenshot showing the current note cue and suggested finger.</w:t>
       </w:r>
     </w:p>
     <w:tbl>
@@ -3957,7 +3941,7 @@
         <w:pStyle w:val="Caption"/>
       </w:pPr>
       <w:r>
-        <w:t xml:space="preserve">Figure 13. Guided evaluation plot generated from the mirrored </w:t>
+        <w:t xml:space="preserve">Figure 12. Guided evaluation plot generated from the mirrored </w:t>
       </w:r>
       <w:r>
         <w:rPr>

</xml_diff>